<commit_message>
docs: avancement du rapport et des diagrammes UML
Ajout de la journée du 12.05 au journal de travail.
</commit_message>
<xml_diff>
--- a/doc/GAMEZ_rapport_TPI.docx
+++ b/doc/GAMEZ_rapport_TPI.docx
@@ -4147,7 +4147,7 @@
                 <w:szCs w:val="22"/>
                 <w:lang w:val="fr-CH"/>
               </w:rPr>
-              <w:t>Authentification sécurisée</w:t>
+              <w:t>Authentification via GitHub OAuth</w:t>
             </w:r>
           </w:p>
         </w:tc>
@@ -4182,7 +4182,7 @@
                 <w:szCs w:val="22"/>
                 <w:lang w:val="fr-CH"/>
               </w:rPr>
-              <w:t>Login / logout fonctionnels, mot de passe haché, session protégée</w:t>
+              <w:t>Connexion fonctionnelle via le flux OAuth GitHub, token d'accès stocké côté serveur, session utilisateur sécurisée.</w:t>
             </w:r>
           </w:p>
         </w:tc>
@@ -5008,6 +5008,25 @@
     </w:p>
     <w:p>
       <w:pPr>
+        <w:rPr>
+          <w:lang w:val="fr-CH"/>
+        </w:rPr>
+      </w:pPr>
+      <w:r>
+        <w:rPr>
+          <w:lang w:val="fr-CH"/>
+        </w:rPr>
+        <w:tab/>
+      </w:r>
+      <w:r>
+        <w:rPr>
+          <w:lang w:val="fr-CH"/>
+        </w:rPr>
+        <w:tab/>
+      </w:r>
+    </w:p>
+    <w:p>
+      <w:pPr>
         <w:pStyle w:val="Heading1"/>
       </w:pPr>
       <w:bookmarkStart w:id="11" w:name="_Toc250790973"/>
@@ -5042,15 +5061,6 @@
     <w:p>
       <w:pPr>
         <w:rPr>
-          <w:rStyle w:val="Hinweistext"/>
-          <w:i w:val="0"/>
-          <w:sz w:val="22"/>
-          <w:szCs w:val="22"/>
-          <w:lang w:val="fr-CH"/>
-        </w:rPr>
-      </w:pPr>
-      <w:r>
-        <w:rPr>
           <w:i/>
           <w:iCs/>
           <w:color w:val="A6A6A6" w:themeColor="background1" w:themeShade="A6"/>
@@ -5058,106 +5068,182 @@
           <w:szCs w:val="22"/>
           <w:lang w:val="fr-CH"/>
         </w:rPr>
-        <w:t>Objectifs SMART du projet (base de référence).</w:t>
-      </w:r>
-    </w:p>
-    <w:p>
-      <w:pPr>
-        <w:pStyle w:val="Heading2"/>
-        <w:rPr>
-          <w:lang w:val="fr-CH"/>
-        </w:rPr>
-      </w:pPr>
-      <w:bookmarkStart w:id="16" w:name="_Toc207978008"/>
-      <w:bookmarkEnd w:id="15"/>
-      <w:r>
-        <w:rPr>
-          <w:lang w:val="fr-CH"/>
-        </w:rPr>
-        <w:t xml:space="preserve">Technologies envisagées </w:t>
-      </w:r>
-      <w:r>
-        <w:rPr>
-          <w:highlight w:val="yellow"/>
-          <w:lang w:val="fr-CH"/>
-        </w:rPr>
-        <w:t>(</w:t>
-      </w:r>
-      <w:r>
-        <w:rPr>
-          <w:highlight w:val="yellow"/>
-          <w:lang w:val="fr-CH"/>
-        </w:rPr>
-        <w:t>Analyse par domaines techno</w:t>
-      </w:r>
-      <w:r>
-        <w:rPr>
-          <w:highlight w:val="yellow"/>
-          <w:lang w:val="fr-CH"/>
-        </w:rPr>
-        <w:t>logiques</w:t>
-      </w:r>
-      <w:bookmarkEnd w:id="16"/>
-      <w:r>
-        <w:rPr>
-          <w:highlight w:val="yellow"/>
-          <w:lang w:val="fr-CH"/>
-        </w:rPr>
-        <w:t>)</w:t>
-      </w:r>
-    </w:p>
-    <w:p>
-      <w:pPr>
-        <w:pStyle w:val="BITTextkrper"/>
+      </w:pPr>
+      <w:r>
         <w:rPr>
           <w:i/>
           <w:iCs/>
           <w:color w:val="A6A6A6" w:themeColor="background1" w:themeShade="A6"/>
-          <w:lang w:val="fr-CH"/>
-        </w:rPr>
-      </w:pPr>
-      <w:r>
+          <w:sz w:val="22"/>
+          <w:szCs w:val="22"/>
+          <w:lang w:val="fr-CH"/>
+        </w:rPr>
+        <w:t>Objectifs SMART du projet (base de référence).</w:t>
+      </w:r>
+    </w:p>
+    <w:p>
+      <w:pPr>
+        <w:rPr>
+          <w:lang w:val="fr-CH"/>
+        </w:rPr>
+      </w:pPr>
+      <w:r>
+        <w:rPr>
+          <w:lang w:val="fr-CH"/>
+        </w:rPr>
+        <w:t>Permettre à un développeur</w:t>
+      </w:r>
+      <w:r>
+        <w:rPr>
+          <w:lang w:val="fr-CH"/>
+        </w:rPr>
+        <w:t>, après authentification via GitHub,</w:t>
+      </w:r>
+      <w:r>
+        <w:rPr>
+          <w:lang w:val="fr-CH"/>
+        </w:rPr>
+        <w:t xml:space="preserve"> d’obtenir une vue d’ensemble d’un dépôt GitHub (structure, </w:t>
+      </w:r>
+      <w:r>
+        <w:rPr>
+          <w:lang w:val="fr-CH"/>
+        </w:rPr>
+        <w:t>explications</w:t>
+      </w:r>
+      <w:r>
+        <w:rPr>
+          <w:lang w:val="fr-CH"/>
+        </w:rPr>
+        <w:t>, erreurs)</w:t>
+      </w:r>
+      <w:r>
+        <w:rPr>
+          <w:lang w:val="fr-CH"/>
+        </w:rPr>
+        <w:t xml:space="preserve"> sur une application web,</w:t>
+      </w:r>
+      <w:r>
+        <w:rPr>
+          <w:lang w:val="fr-CH"/>
+        </w:rPr>
+        <w:t xml:space="preserve"> sans devoir explorer manuellement les fichiers.</w:t>
+      </w:r>
+    </w:p>
+    <w:p>
+      <w:pPr>
+        <w:rPr>
+          <w:lang w:val="fr-CH"/>
+        </w:rPr>
+      </w:pPr>
+      <w:r>
+        <w:rPr>
+          <w:lang w:val="fr-CH"/>
+        </w:rPr>
+        <w:t xml:space="preserve">Permettre à un développeur </w:t>
+      </w:r>
+      <w:r>
+        <w:rPr>
+          <w:lang w:val="fr-CH"/>
+        </w:rPr>
+        <w:t>de découvrir des éventuelles erreurs présentent sur un dépôt GitHub, ainsi qu</w:t>
+      </w:r>
+      <w:r>
+        <w:rPr>
+          <w:lang w:val="fr-CH"/>
+        </w:rPr>
+        <w:t>’une proposition de correction.</w:t>
+      </w:r>
+    </w:p>
+    <w:p>
+      <w:pPr>
+        <w:rPr>
+          <w:lang w:val="fr-CH"/>
+        </w:rPr>
+      </w:pPr>
+      <w:r>
+        <w:rPr>
+          <w:lang w:val="fr-CH"/>
+        </w:rPr>
+        <w:t xml:space="preserve">Garantir un traitement asynchrone qui ne bloque jamais l’API REST, même pour des dépôts </w:t>
+      </w:r>
+      <w:r>
+        <w:rPr>
+          <w:lang w:val="fr-CH"/>
+        </w:rPr>
+        <w:t>concernant plusieurs dizaines de fichiers.</w:t>
+      </w:r>
+    </w:p>
+    <w:p>
+      <w:pPr>
+        <w:rPr>
+          <w:lang w:val="fr-CH"/>
+        </w:rPr>
+      </w:pPr>
+    </w:p>
+    <w:p>
+      <w:pPr>
+        <w:pStyle w:val="Heading2"/>
+        <w:rPr>
+          <w:lang w:val="fr-CH"/>
+        </w:rPr>
+      </w:pPr>
+      <w:bookmarkStart w:id="16" w:name="_Toc207978008"/>
+      <w:bookmarkEnd w:id="15"/>
+      <w:r>
+        <w:rPr>
+          <w:lang w:val="fr-CH"/>
+        </w:rPr>
+        <w:t xml:space="preserve">Technologies envisagées </w:t>
+      </w:r>
+      <w:r>
+        <w:rPr>
+          <w:highlight w:val="yellow"/>
+          <w:lang w:val="fr-CH"/>
+        </w:rPr>
+        <w:t>(</w:t>
+      </w:r>
+      <w:r>
+        <w:rPr>
+          <w:highlight w:val="yellow"/>
+          <w:lang w:val="fr-CH"/>
+        </w:rPr>
+        <w:t>Analyse par domaines techno</w:t>
+      </w:r>
+      <w:r>
+        <w:rPr>
+          <w:highlight w:val="yellow"/>
+          <w:lang w:val="fr-CH"/>
+        </w:rPr>
+        <w:t>logiques</w:t>
+      </w:r>
+      <w:bookmarkEnd w:id="16"/>
+      <w:r>
+        <w:rPr>
+          <w:highlight w:val="yellow"/>
+          <w:lang w:val="fr-CH"/>
+        </w:rPr>
+        <w:t>)</w:t>
+      </w:r>
+    </w:p>
+    <w:p>
+      <w:pPr>
+        <w:pStyle w:val="BITTextkrper"/>
         <w:rPr>
           <w:i/>
           <w:iCs/>
           <w:color w:val="A6A6A6" w:themeColor="background1" w:themeShade="A6"/>
           <w:lang w:val="fr-CH"/>
         </w:rPr>
+      </w:pPr>
+      <w:r>
+        <w:rPr>
+          <w:i/>
+          <w:iCs/>
+          <w:color w:val="A6A6A6" w:themeColor="background1" w:themeShade="A6"/>
+          <w:lang w:val="fr-CH"/>
+        </w:rPr>
         <w:t>Décrire chaque domaine pertinent et les variantes possibles</w:t>
-      </w:r>
-    </w:p>
-    <w:p>
-      <w:pPr>
-        <w:pStyle w:val="Heading3"/>
-        <w:rPr>
-          <w:lang w:val="fr-CH"/>
-        </w:rPr>
-      </w:pPr>
-      <w:r>
-        <w:rPr>
-          <w:lang w:val="fr-CH"/>
-        </w:rPr>
-        <w:t>Framework CSS</w:t>
-      </w:r>
-    </w:p>
-    <w:p>
-      <w:pPr>
-        <w:pStyle w:val="BITTextkrper"/>
-        <w:rPr>
-          <w:lang w:val="fr-CH"/>
-        </w:rPr>
-      </w:pPr>
-      <w:r>
-        <w:rPr>
-          <w:lang w:val="fr-CH"/>
-        </w:rPr>
-        <w:t>Tailwind CSS</w:t>
-      </w:r>
-      <w:r>
-        <w:rPr>
-          <w:lang w:val="fr-CH"/>
-        </w:rPr>
-        <w:t> :</w:t>
       </w:r>
     </w:p>
     <w:p>
@@ -5165,14 +5251,25 @@
         <w:pStyle w:val="BITTextkrper"/>
         <w:jc w:val="both"/>
         <w:rPr>
-          <w:lang w:val="fr-CH"/>
-        </w:rPr>
-      </w:pPr>
-      <w:r>
-        <w:rPr>
-          <w:lang w:val="fr-CH"/>
-        </w:rPr>
-        <w:t>Tailwind est un framework CSS dit utility-first : il met à disposition une classe pour chaque propriété de style (p-4 pour le padding, text-blue-500 pour la couleur, etc.) qui s'applique directement dans le HTML. Cette approche évite l'écriture d'une feuille de style séparée et offre un contrôle total sur le design. Le framework est entièrement personnalisable via un fichier de configuration permettant de définir ses propres couleurs, espacements et points de rupture.</w:t>
+          <w:i/>
+          <w:iCs/>
+          <w:color w:val="A6A6A6" w:themeColor="background1" w:themeShade="A6"/>
+          <w:lang w:val="fr-CH"/>
+        </w:rPr>
+      </w:pPr>
+    </w:p>
+    <w:p>
+      <w:pPr>
+        <w:pStyle w:val="Heading3"/>
+        <w:rPr>
+          <w:lang w:val="fr-CH"/>
+        </w:rPr>
+      </w:pPr>
+      <w:r>
+        <w:rPr>
+          <w:lang w:val="fr-CH"/>
+        </w:rPr>
+        <w:t>Framework CSS</w:t>
       </w:r>
     </w:p>
     <w:p>
@@ -5186,7 +5283,7 @@
         <w:rPr>
           <w:lang w:val="fr-CH"/>
         </w:rPr>
-        <w:t>Bootstrap</w:t>
+        <w:t>Tailwind CSS</w:t>
       </w:r>
       <w:r>
         <w:rPr>
@@ -5207,21 +5304,7 @@
         <w:rPr>
           <w:lang w:val="fr-CH"/>
         </w:rPr>
-        <w:t>Bootstrap propose une approche orientée composants : il fournit des blocs préfabriqués prêts à l'emploi (boutons, cartes, modales, barre de navigation, formulaires, etc.) que l'on applique via des classes regroupant plusieurs propriétés CSS. Cette approche accélère le démarrage d'un projet, mais impose un style visuel reconnaissable, plus difficile à personnaliser sans écrire des surcharges.</w:t>
-      </w:r>
-    </w:p>
-    <w:p>
-      <w:pPr>
-        <w:pStyle w:val="Heading3"/>
-        <w:rPr>
-          <w:lang w:val="fr-CH"/>
-        </w:rPr>
-      </w:pPr>
-      <w:r>
-        <w:rPr>
-          <w:lang w:val="fr-CH"/>
-        </w:rPr>
-        <w:t>Langage backend</w:t>
+        <w:t>Tailwind est un framework CSS dit utility-first : il met à disposition une classe pour chaque propriété de style (p-4 pour le padding, text-blue-500 pour la couleur, etc.) qui s'applique directement dans le HTML. Cette approche évite l'écriture d'une feuille de style séparée et offre un contrôle total sur le design. Le framework est entièrement personnalisable via un fichier de configuration permettant de définir ses propres couleurs, espacements et points de rupture.</w:t>
       </w:r>
     </w:p>
     <w:p>
@@ -5235,37 +5318,13 @@
         <w:rPr>
           <w:lang w:val="fr-CH"/>
         </w:rPr>
-        <w:t>Java</w:t>
-      </w:r>
-      <w:r>
-        <w:rPr>
-          <w:lang w:val="fr-CH"/>
-        </w:rPr>
-        <w:t>S</w:t>
-      </w:r>
-      <w:r>
-        <w:rPr>
-          <w:lang w:val="fr-CH"/>
-        </w:rPr>
-        <w:t>cript Node</w:t>
-      </w:r>
-      <w:r>
-        <w:rPr>
-          <w:lang w:val="fr-CH"/>
-        </w:rPr>
-        <w:t>.</w:t>
-      </w:r>
-      <w:r>
-        <w:rPr>
-          <w:lang w:val="fr-CH"/>
-        </w:rPr>
-        <w:t>js :</w:t>
-      </w:r>
-      <w:r>
-        <w:rPr>
-          <w:lang w:val="fr-CH"/>
-        </w:rPr>
-        <w:t xml:space="preserve"> </w:t>
+        <w:t>Bootstrap</w:t>
+      </w:r>
+      <w:r>
+        <w:rPr>
+          <w:lang w:val="fr-CH"/>
+        </w:rPr>
+        <w:t> :</w:t>
       </w:r>
     </w:p>
     <w:p>
@@ -5280,43 +5339,21 @@
         <w:rPr>
           <w:lang w:val="fr-CH"/>
         </w:rPr>
-        <w:t xml:space="preserve">Node.js est un </w:t>
-      </w:r>
-      <w:r>
-        <w:rPr>
-          <w:lang w:val="fr-CH"/>
-        </w:rPr>
-        <w:t>environnement</w:t>
-      </w:r>
-      <w:r>
-        <w:rPr>
-          <w:lang w:val="fr-CH"/>
-        </w:rPr>
-        <w:t xml:space="preserve"> </w:t>
-      </w:r>
-      <w:r>
-        <w:rPr>
-          <w:lang w:val="fr-CH"/>
-        </w:rPr>
-        <w:t xml:space="preserve">d’exécution JavaScript côté serveur, basé sur le </w:t>
-      </w:r>
-      <w:r>
-        <w:rPr>
-          <w:lang w:val="fr-CH"/>
-        </w:rPr>
-        <w:t xml:space="preserve">moteur V8 de Google Chrome. Il fonctionne sur un modèle asynchrone non bloquant </w:t>
-      </w:r>
-      <w:r>
-        <w:rPr>
-          <w:lang w:val="fr-CH"/>
-        </w:rPr>
-        <w:t xml:space="preserve">ce qui est adapté aux applications faisant de nombreux appels à des services externes. Il dispose d’un vaste écosystème de paquets disponible via NPM et permet aussi d’utiliser le même langage </w:t>
-      </w:r>
-      <w:r>
-        <w:rPr>
-          <w:lang w:val="fr-CH"/>
-        </w:rPr>
-        <w:t>que le frontend Vue.js.</w:t>
+        <w:t>Bootstrap propose une approche orientée composants : il fournit des blocs préfabriqués prêts à l'emploi (boutons, cartes, modales, barre de navigation, formulaires, etc.) que l'on applique via des classes regroupant plusieurs propriétés CSS. Cette approche accélère le démarrage d'un projet, mais impose un style visuel reconnaissable, plus difficile à personnaliser sans écrire des surcharges.</w:t>
+      </w:r>
+    </w:p>
+    <w:p>
+      <w:pPr>
+        <w:pStyle w:val="Heading3"/>
+        <w:rPr>
+          <w:lang w:val="fr-CH"/>
+        </w:rPr>
+      </w:pPr>
+      <w:r>
+        <w:rPr>
+          <w:lang w:val="fr-CH"/>
+        </w:rPr>
+        <w:t>Langage backend</w:t>
       </w:r>
     </w:p>
     <w:p>
@@ -5330,7 +5367,31 @@
         <w:rPr>
           <w:lang w:val="fr-CH"/>
         </w:rPr>
-        <w:t>PHP :</w:t>
+        <w:t>Java</w:t>
+      </w:r>
+      <w:r>
+        <w:rPr>
+          <w:lang w:val="fr-CH"/>
+        </w:rPr>
+        <w:t>S</w:t>
+      </w:r>
+      <w:r>
+        <w:rPr>
+          <w:lang w:val="fr-CH"/>
+        </w:rPr>
+        <w:t>cript Node</w:t>
+      </w:r>
+      <w:r>
+        <w:rPr>
+          <w:lang w:val="fr-CH"/>
+        </w:rPr>
+        <w:t>.</w:t>
+      </w:r>
+      <w:r>
+        <w:rPr>
+          <w:lang w:val="fr-CH"/>
+        </w:rPr>
+        <w:t>js :</w:t>
       </w:r>
       <w:r>
         <w:rPr>
@@ -5351,13 +5412,50 @@
         <w:rPr>
           <w:lang w:val="fr-CH"/>
         </w:rPr>
-        <w:t xml:space="preserve">PHP est un langage interprété </w:t>
-      </w:r>
-      <w:r>
-        <w:rPr>
-          <w:lang w:val="fr-CH"/>
-        </w:rPr>
-        <w:t>conçu spécialement pour le développement web.</w:t>
+        <w:t xml:space="preserve">Node.js est un </w:t>
+      </w:r>
+      <w:r>
+        <w:rPr>
+          <w:lang w:val="fr-CH"/>
+        </w:rPr>
+        <w:t>environnement</w:t>
+      </w:r>
+      <w:r>
+        <w:rPr>
+          <w:lang w:val="fr-CH"/>
+        </w:rPr>
+        <w:t xml:space="preserve"> </w:t>
+      </w:r>
+      <w:r>
+        <w:rPr>
+          <w:lang w:val="fr-CH"/>
+        </w:rPr>
+        <w:t xml:space="preserve">d’exécution JavaScript côté serveur, basé sur le </w:t>
+      </w:r>
+      <w:r>
+        <w:rPr>
+          <w:lang w:val="fr-CH"/>
+        </w:rPr>
+        <w:t xml:space="preserve">moteur V8 de Google Chrome. Il fonctionne sur un modèle asynchrone non bloquant </w:t>
+      </w:r>
+      <w:r>
+        <w:rPr>
+          <w:lang w:val="fr-CH"/>
+        </w:rPr>
+        <w:t xml:space="preserve">ce qui est adapté aux </w:t>
+      </w:r>
+      <w:r>
+        <w:rPr>
+          <w:lang w:val="fr-CH"/>
+        </w:rPr>
+        <w:lastRenderedPageBreak/>
+        <w:t xml:space="preserve">applications faisant de nombreux appels à des services externes. Il dispose d’un vaste écosystème de paquets disponible via NPM et permet aussi d’utiliser le même langage </w:t>
+      </w:r>
+      <w:r>
+        <w:rPr>
+          <w:lang w:val="fr-CH"/>
+        </w:rPr>
+        <w:t>que le frontend Vue.js.</w:t>
       </w:r>
     </w:p>
     <w:p>
@@ -5371,7 +5469,7 @@
         <w:rPr>
           <w:lang w:val="fr-CH"/>
         </w:rPr>
-        <w:t>Java Springboot :</w:t>
+        <w:t>PHP :</w:t>
       </w:r>
       <w:r>
         <w:rPr>
@@ -5392,7 +5490,47 @@
         <w:rPr>
           <w:lang w:val="fr-CH"/>
         </w:rPr>
-        <w:lastRenderedPageBreak/>
+        <w:t xml:space="preserve">PHP est un langage interprété </w:t>
+      </w:r>
+      <w:r>
+        <w:rPr>
+          <w:lang w:val="fr-CH"/>
+        </w:rPr>
+        <w:t>conçu spécialement pour le développement web.</w:t>
+      </w:r>
+    </w:p>
+    <w:p>
+      <w:pPr>
+        <w:pStyle w:val="BITTextkrper"/>
+        <w:rPr>
+          <w:lang w:val="fr-CH"/>
+        </w:rPr>
+      </w:pPr>
+      <w:r>
+        <w:rPr>
+          <w:lang w:val="fr-CH"/>
+        </w:rPr>
+        <w:t>Java Springboot :</w:t>
+      </w:r>
+      <w:r>
+        <w:rPr>
+          <w:lang w:val="fr-CH"/>
+        </w:rPr>
+        <w:t xml:space="preserve"> </w:t>
+      </w:r>
+    </w:p>
+    <w:p>
+      <w:pPr>
+        <w:pStyle w:val="BITTextkrper"/>
+        <w:jc w:val="both"/>
+        <w:rPr>
+          <w:lang w:val="fr-CH"/>
+        </w:rPr>
+      </w:pPr>
+      <w:r>
+        <w:rPr>
+          <w:lang w:val="fr-CH"/>
+        </w:rPr>
         <w:t>Java</w:t>
       </w:r>
       <w:r>
@@ -5602,6 +5740,39 @@
     </w:p>
     <w:p>
       <w:pPr>
+        <w:pStyle w:val="BITTextkrper"/>
+        <w:jc w:val="both"/>
+        <w:rPr>
+          <w:lang w:val="fr-CH"/>
+        </w:rPr>
+      </w:pPr>
+      <w:r>
+        <w:rPr>
+          <w:lang w:val="fr-CH"/>
+        </w:rPr>
+        <w:t>Pour ce qui est du LLM utilisé pour la génération des erreurs et des schémas, j’ai décidé d’utiliser Open</w:t>
+      </w:r>
+      <w:r>
+        <w:rPr>
+          <w:lang w:val="fr-CH"/>
+        </w:rPr>
+        <w:t>R</w:t>
+      </w:r>
+      <w:r>
+        <w:rPr>
+          <w:lang w:val="fr-CH"/>
+        </w:rPr>
+        <w:t xml:space="preserve">outer pour éviter d’avoir à choisir </w:t>
+      </w:r>
+      <w:r>
+        <w:rPr>
+          <w:lang w:val="fr-CH"/>
+        </w:rPr>
+        <w:t>un LLM précis maintenant, mais de pouvoir choisir en fonction de ce qui fonctionne le mieux.</w:t>
+      </w:r>
+    </w:p>
+    <w:p>
+      <w:pPr>
         <w:pStyle w:val="Heading2"/>
       </w:pPr>
       <w:bookmarkStart w:id="18" w:name="_Toc250790977"/>
@@ -5722,6 +5893,7 @@
       <w:bookmarkStart w:id="20" w:name="_Toc250790978"/>
       <w:bookmarkStart w:id="21" w:name="_Toc207978011"/>
       <w:r>
+        <w:lastRenderedPageBreak/>
         <w:t>Analyse de risque</w:t>
       </w:r>
       <w:bookmarkEnd w:id="20"/>
@@ -5868,7 +6040,6 @@
         <w:rPr>
           <w:lang w:val="fr-CH"/>
         </w:rPr>
-        <w:lastRenderedPageBreak/>
         <w:t>Diagramme de cas d’utilisation</w:t>
       </w:r>
     </w:p>
@@ -8559,6 +8730,7 @@
                 <w:dataBinding w:prefixMappings="xmlns:ns0='http://purl.org/dc/elements/1.1/' xmlns:ns1='http://schemas.openxmlformats.org/package/2006/metadata/core-properties' " w:xpath="/ns1:coreProperties[1]/ns0:creator[1]" w:storeItemID="{6C3C8BC8-F283-45AE-878A-BAB7291924A1}"/>
                 <w:text/>
               </w:sdtPr>
+              <w:sdtEndPr/>
               <w:sdtContent>
                 <w:tc>
                   <w:tcPr>
@@ -8735,7 +8907,7 @@
                   <w:rPr>
                     <w:lang w:val="fr-CH"/>
                   </w:rPr>
-                  <w:t>08.05.2026 16:34</w:t>
+                  <w:t>11.05.2026 16:56</w:t>
                 </w:r>
                 <w:r>
                   <w:rPr>
@@ -8910,6 +9082,7 @@
                 <w:dataBinding w:prefixMappings="xmlns:ns0='http://purl.org/dc/elements/1.1/' xmlns:ns1='http://schemas.openxmlformats.org/package/2006/metadata/core-properties' " w:xpath="/ns1:coreProperties[1]/ns0:creator[1]" w:storeItemID="{6C3C8BC8-F283-45AE-878A-BAB7291924A1}"/>
                 <w:text/>
               </w:sdtPr>
+              <w:sdtEndPr/>
               <w:sdtContent>
                 <w:tc>
                   <w:tcPr>
@@ -9068,7 +9241,7 @@
                   <w:rPr>
                     <w:lang w:val="fr-CH"/>
                   </w:rPr>
-                  <w:t>08.05.2026 16:34</w:t>
+                  <w:t>11.05.2026 16:56</w:t>
                 </w:r>
                 <w:r>
                   <w:rPr>
@@ -9161,6 +9334,7 @@
                 <w:dataBinding w:prefixMappings="xmlns:ns0='http://purl.org/dc/elements/1.1/' xmlns:ns1='http://schemas.openxmlformats.org/package/2006/metadata/core-properties' " w:xpath="/ns1:coreProperties[1]/ns0:creator[1]" w:storeItemID="{6C3C8BC8-F283-45AE-878A-BAB7291924A1}"/>
                 <w:text/>
               </w:sdtPr>
+              <w:sdtEndPr/>
               <w:sdtContent>
                 <w:tc>
                   <w:tcPr>
@@ -9319,7 +9493,7 @@
                   <w:rPr>
                     <w:lang w:val="fr-CH"/>
                   </w:rPr>
-                  <w:t>08.05.2026 16:34</w:t>
+                  <w:t>11.05.2026 16:56</w:t>
                 </w:r>
                 <w:r>
                   <w:rPr>
@@ -13689,9 +13863,11 @@
   </w:compat>
   <w:rsids>
     <w:rsidRoot w:val="00540217"/>
+    <w:rsid w:val="000364E1"/>
     <w:rsid w:val="00186045"/>
     <w:rsid w:val="00307334"/>
     <w:rsid w:val="003366A8"/>
+    <w:rsid w:val="003C52E4"/>
     <w:rsid w:val="00540217"/>
     <w:rsid w:val="006930A9"/>
     <w:rsid w:val="00803763"/>
@@ -13699,6 +13875,7 @@
     <w:rsid w:val="009B3EBE"/>
     <w:rsid w:val="00A419DC"/>
     <w:rsid w:val="00B250B0"/>
+    <w:rsid w:val="00B503AF"/>
     <w:rsid w:val="00BC344B"/>
     <w:rsid w:val="00CD64D8"/>
     <w:rsid w:val="00CE2A4B"/>
@@ -13706,6 +13883,7 @@
     <w:rsid w:val="00DF687F"/>
     <w:rsid w:val="00F2447D"/>
     <w:rsid w:val="00F8402B"/>
+    <w:rsid w:val="00F84834"/>
   </w:rsids>
   <m:mathPr>
     <m:mathFont m:val="Cambria Math"/>

</xml_diff>

<commit_message>
docs: mise à jour du planning, du rapport et des diagrammes
</commit_message>
<xml_diff>
--- a/doc/GAMEZ_rapport_TPI.docx
+++ b/doc/GAMEZ_rapport_TPI.docx
@@ -191,7 +191,7 @@
     </w:tbl>
     <w:p>
       <w:pPr>
-        <w:pStyle w:val="Lgende"/>
+        <w:pStyle w:val="Caption"/>
         <w:rPr>
           <w:bCs w:val="0"/>
           <w:sz w:val="24"/>
@@ -533,7 +533,7 @@
     </w:p>
     <w:p>
       <w:pPr>
-        <w:pStyle w:val="Titre3"/>
+        <w:pStyle w:val="Heading3"/>
         <w:numPr>
           <w:ilvl w:val="0"/>
           <w:numId w:val="0"/>
@@ -561,7 +561,7 @@
     </w:p>
     <w:p>
       <w:pPr>
-        <w:pStyle w:val="TM1"/>
+        <w:pStyle w:val="TOC1"/>
         <w:rPr>
           <w:rFonts w:asciiTheme="minorHAnsi" w:eastAsiaTheme="minorEastAsia" w:hAnsiTheme="minorHAnsi" w:cstheme="minorBidi"/>
           <w:b w:val="0"/>
@@ -639,7 +639,7 @@
     </w:p>
     <w:p>
       <w:pPr>
-        <w:pStyle w:val="TM1"/>
+        <w:pStyle w:val="TOC1"/>
         <w:rPr>
           <w:rFonts w:asciiTheme="minorHAnsi" w:eastAsiaTheme="minorEastAsia" w:hAnsiTheme="minorHAnsi" w:cstheme="minorBidi"/>
           <w:b w:val="0"/>
@@ -725,7 +725,7 @@
     </w:p>
     <w:p>
       <w:pPr>
-        <w:pStyle w:val="TM2"/>
+        <w:pStyle w:val="TOC2"/>
         <w:rPr>
           <w:rFonts w:asciiTheme="minorHAnsi" w:eastAsiaTheme="minorEastAsia" w:hAnsiTheme="minorHAnsi" w:cstheme="minorBidi"/>
           <w:kern w:val="2"/>
@@ -788,7 +788,7 @@
     </w:p>
     <w:p>
       <w:pPr>
-        <w:pStyle w:val="TM2"/>
+        <w:pStyle w:val="TOC2"/>
         <w:rPr>
           <w:rFonts w:asciiTheme="minorHAnsi" w:eastAsiaTheme="minorEastAsia" w:hAnsiTheme="minorHAnsi" w:cstheme="minorBidi"/>
           <w:kern w:val="2"/>
@@ -851,7 +851,7 @@
     </w:p>
     <w:p>
       <w:pPr>
-        <w:pStyle w:val="TM2"/>
+        <w:pStyle w:val="TOC2"/>
         <w:rPr>
           <w:rFonts w:asciiTheme="minorHAnsi" w:eastAsiaTheme="minorEastAsia" w:hAnsiTheme="minorHAnsi" w:cstheme="minorBidi"/>
           <w:kern w:val="2"/>
@@ -914,7 +914,7 @@
     </w:p>
     <w:p>
       <w:pPr>
-        <w:pStyle w:val="TM2"/>
+        <w:pStyle w:val="TOC2"/>
         <w:rPr>
           <w:rFonts w:asciiTheme="minorHAnsi" w:eastAsiaTheme="minorEastAsia" w:hAnsiTheme="minorHAnsi" w:cstheme="minorBidi"/>
           <w:kern w:val="2"/>
@@ -977,7 +977,7 @@
     </w:p>
     <w:p>
       <w:pPr>
-        <w:pStyle w:val="TM1"/>
+        <w:pStyle w:val="TOC1"/>
         <w:rPr>
           <w:rFonts w:asciiTheme="minorHAnsi" w:eastAsiaTheme="minorEastAsia" w:hAnsiTheme="minorHAnsi" w:cstheme="minorBidi"/>
           <w:b w:val="0"/>
@@ -1063,7 +1063,7 @@
     </w:p>
     <w:p>
       <w:pPr>
-        <w:pStyle w:val="TM2"/>
+        <w:pStyle w:val="TOC2"/>
         <w:rPr>
           <w:rFonts w:asciiTheme="minorHAnsi" w:eastAsiaTheme="minorEastAsia" w:hAnsiTheme="minorHAnsi" w:cstheme="minorBidi"/>
           <w:kern w:val="2"/>
@@ -1126,7 +1126,7 @@
     </w:p>
     <w:p>
       <w:pPr>
-        <w:pStyle w:val="TM2"/>
+        <w:pStyle w:val="TOC2"/>
         <w:rPr>
           <w:rFonts w:asciiTheme="minorHAnsi" w:eastAsiaTheme="minorEastAsia" w:hAnsiTheme="minorHAnsi" w:cstheme="minorBidi"/>
           <w:kern w:val="2"/>
@@ -1189,7 +1189,7 @@
     </w:p>
     <w:p>
       <w:pPr>
-        <w:pStyle w:val="TM2"/>
+        <w:pStyle w:val="TOC2"/>
         <w:rPr>
           <w:rFonts w:asciiTheme="minorHAnsi" w:eastAsiaTheme="minorEastAsia" w:hAnsiTheme="minorHAnsi" w:cstheme="minorBidi"/>
           <w:kern w:val="2"/>
@@ -1252,7 +1252,7 @@
     </w:p>
     <w:p>
       <w:pPr>
-        <w:pStyle w:val="TM2"/>
+        <w:pStyle w:val="TOC2"/>
         <w:rPr>
           <w:rFonts w:asciiTheme="minorHAnsi" w:eastAsiaTheme="minorEastAsia" w:hAnsiTheme="minorHAnsi" w:cstheme="minorBidi"/>
           <w:kern w:val="2"/>
@@ -1315,7 +1315,7 @@
     </w:p>
     <w:p>
       <w:pPr>
-        <w:pStyle w:val="TM2"/>
+        <w:pStyle w:val="TOC2"/>
         <w:rPr>
           <w:rFonts w:asciiTheme="minorHAnsi" w:eastAsiaTheme="minorEastAsia" w:hAnsiTheme="minorHAnsi" w:cstheme="minorBidi"/>
           <w:kern w:val="2"/>
@@ -1378,7 +1378,7 @@
     </w:p>
     <w:p>
       <w:pPr>
-        <w:pStyle w:val="TM2"/>
+        <w:pStyle w:val="TOC2"/>
         <w:rPr>
           <w:rFonts w:asciiTheme="minorHAnsi" w:eastAsiaTheme="minorEastAsia" w:hAnsiTheme="minorHAnsi" w:cstheme="minorBidi"/>
           <w:kern w:val="2"/>
@@ -1441,7 +1441,7 @@
     </w:p>
     <w:p>
       <w:pPr>
-        <w:pStyle w:val="TM2"/>
+        <w:pStyle w:val="TOC2"/>
         <w:rPr>
           <w:rFonts w:asciiTheme="minorHAnsi" w:eastAsiaTheme="minorEastAsia" w:hAnsiTheme="minorHAnsi" w:cstheme="minorBidi"/>
           <w:kern w:val="2"/>
@@ -1504,7 +1504,7 @@
     </w:p>
     <w:p>
       <w:pPr>
-        <w:pStyle w:val="TM2"/>
+        <w:pStyle w:val="TOC2"/>
         <w:rPr>
           <w:rFonts w:asciiTheme="minorHAnsi" w:eastAsiaTheme="minorEastAsia" w:hAnsiTheme="minorHAnsi" w:cstheme="minorBidi"/>
           <w:kern w:val="2"/>
@@ -1567,7 +1567,7 @@
     </w:p>
     <w:p>
       <w:pPr>
-        <w:pStyle w:val="TM2"/>
+        <w:pStyle w:val="TOC2"/>
         <w:rPr>
           <w:rFonts w:asciiTheme="minorHAnsi" w:eastAsiaTheme="minorEastAsia" w:hAnsiTheme="minorHAnsi" w:cstheme="minorBidi"/>
           <w:kern w:val="2"/>
@@ -1630,7 +1630,7 @@
     </w:p>
     <w:p>
       <w:pPr>
-        <w:pStyle w:val="TM1"/>
+        <w:pStyle w:val="TOC1"/>
         <w:rPr>
           <w:rFonts w:asciiTheme="minorHAnsi" w:eastAsiaTheme="minorEastAsia" w:hAnsiTheme="minorHAnsi" w:cstheme="minorBidi"/>
           <w:b w:val="0"/>
@@ -1716,7 +1716,7 @@
     </w:p>
     <w:p>
       <w:pPr>
-        <w:pStyle w:val="TM2"/>
+        <w:pStyle w:val="TOC2"/>
         <w:rPr>
           <w:rFonts w:asciiTheme="minorHAnsi" w:eastAsiaTheme="minorEastAsia" w:hAnsiTheme="minorHAnsi" w:cstheme="minorBidi"/>
           <w:kern w:val="2"/>
@@ -1779,7 +1779,7 @@
     </w:p>
     <w:p>
       <w:pPr>
-        <w:pStyle w:val="TM2"/>
+        <w:pStyle w:val="TOC2"/>
         <w:rPr>
           <w:rFonts w:asciiTheme="minorHAnsi" w:eastAsiaTheme="minorEastAsia" w:hAnsiTheme="minorHAnsi" w:cstheme="minorBidi"/>
           <w:kern w:val="2"/>
@@ -1842,7 +1842,7 @@
     </w:p>
     <w:p>
       <w:pPr>
-        <w:pStyle w:val="TM2"/>
+        <w:pStyle w:val="TOC2"/>
         <w:rPr>
           <w:rFonts w:asciiTheme="minorHAnsi" w:eastAsiaTheme="minorEastAsia" w:hAnsiTheme="minorHAnsi" w:cstheme="minorBidi"/>
           <w:kern w:val="2"/>
@@ -1907,7 +1907,7 @@
     </w:p>
     <w:p>
       <w:pPr>
-        <w:pStyle w:val="TM2"/>
+        <w:pStyle w:val="TOC2"/>
         <w:rPr>
           <w:rFonts w:asciiTheme="minorHAnsi" w:eastAsiaTheme="minorEastAsia" w:hAnsiTheme="minorHAnsi" w:cstheme="minorBidi"/>
           <w:kern w:val="2"/>
@@ -1972,7 +1972,7 @@
     </w:p>
     <w:p>
       <w:pPr>
-        <w:pStyle w:val="TM2"/>
+        <w:pStyle w:val="TOC2"/>
         <w:rPr>
           <w:rFonts w:asciiTheme="minorHAnsi" w:eastAsiaTheme="minorEastAsia" w:hAnsiTheme="minorHAnsi" w:cstheme="minorBidi"/>
           <w:kern w:val="2"/>
@@ -2035,7 +2035,7 @@
     </w:p>
     <w:p>
       <w:pPr>
-        <w:pStyle w:val="TM2"/>
+        <w:pStyle w:val="TOC2"/>
         <w:rPr>
           <w:rFonts w:asciiTheme="minorHAnsi" w:eastAsiaTheme="minorEastAsia" w:hAnsiTheme="minorHAnsi" w:cstheme="minorBidi"/>
           <w:kern w:val="2"/>
@@ -2098,7 +2098,7 @@
     </w:p>
     <w:p>
       <w:pPr>
-        <w:pStyle w:val="TM2"/>
+        <w:pStyle w:val="TOC2"/>
         <w:rPr>
           <w:rFonts w:asciiTheme="minorHAnsi" w:eastAsiaTheme="minorEastAsia" w:hAnsiTheme="minorHAnsi" w:cstheme="minorBidi"/>
           <w:kern w:val="2"/>
@@ -2161,7 +2161,7 @@
     </w:p>
     <w:p>
       <w:pPr>
-        <w:pStyle w:val="TM2"/>
+        <w:pStyle w:val="TOC2"/>
         <w:rPr>
           <w:rFonts w:asciiTheme="minorHAnsi" w:eastAsiaTheme="minorEastAsia" w:hAnsiTheme="minorHAnsi" w:cstheme="minorBidi"/>
           <w:kern w:val="2"/>
@@ -2224,7 +2224,7 @@
     </w:p>
     <w:p>
       <w:pPr>
-        <w:pStyle w:val="TM2"/>
+        <w:pStyle w:val="TOC2"/>
         <w:rPr>
           <w:rFonts w:asciiTheme="minorHAnsi" w:eastAsiaTheme="minorEastAsia" w:hAnsiTheme="minorHAnsi" w:cstheme="minorBidi"/>
           <w:kern w:val="2"/>
@@ -2287,7 +2287,7 @@
     </w:p>
     <w:p>
       <w:pPr>
-        <w:pStyle w:val="TM2"/>
+        <w:pStyle w:val="TOC2"/>
         <w:rPr>
           <w:rFonts w:asciiTheme="minorHAnsi" w:eastAsiaTheme="minorEastAsia" w:hAnsiTheme="minorHAnsi" w:cstheme="minorBidi"/>
           <w:kern w:val="2"/>
@@ -2350,7 +2350,7 @@
     </w:p>
     <w:p>
       <w:pPr>
-        <w:pStyle w:val="TM1"/>
+        <w:pStyle w:val="TOC1"/>
         <w:rPr>
           <w:rFonts w:asciiTheme="minorHAnsi" w:eastAsiaTheme="minorEastAsia" w:hAnsiTheme="minorHAnsi" w:cstheme="minorBidi"/>
           <w:b w:val="0"/>
@@ -2436,7 +2436,7 @@
     </w:p>
     <w:p>
       <w:pPr>
-        <w:pStyle w:val="TM2"/>
+        <w:pStyle w:val="TOC2"/>
         <w:rPr>
           <w:rFonts w:asciiTheme="minorHAnsi" w:eastAsiaTheme="minorEastAsia" w:hAnsiTheme="minorHAnsi" w:cstheme="minorBidi"/>
           <w:kern w:val="2"/>
@@ -2501,7 +2501,7 @@
     </w:p>
     <w:p>
       <w:pPr>
-        <w:pStyle w:val="TM2"/>
+        <w:pStyle w:val="TOC2"/>
         <w:rPr>
           <w:rFonts w:asciiTheme="minorHAnsi" w:eastAsiaTheme="minorEastAsia" w:hAnsiTheme="minorHAnsi" w:cstheme="minorBidi"/>
           <w:kern w:val="2"/>
@@ -2566,7 +2566,7 @@
     </w:p>
     <w:p>
       <w:pPr>
-        <w:pStyle w:val="TM2"/>
+        <w:pStyle w:val="TOC2"/>
         <w:rPr>
           <w:rFonts w:asciiTheme="minorHAnsi" w:eastAsiaTheme="minorEastAsia" w:hAnsiTheme="minorHAnsi" w:cstheme="minorBidi"/>
           <w:kern w:val="2"/>
@@ -2629,7 +2629,7 @@
     </w:p>
     <w:p>
       <w:pPr>
-        <w:pStyle w:val="TM2"/>
+        <w:pStyle w:val="TOC2"/>
         <w:rPr>
           <w:rFonts w:asciiTheme="minorHAnsi" w:eastAsiaTheme="minorEastAsia" w:hAnsiTheme="minorHAnsi" w:cstheme="minorBidi"/>
           <w:kern w:val="2"/>
@@ -2692,7 +2692,7 @@
     </w:p>
     <w:p>
       <w:pPr>
-        <w:pStyle w:val="TM2"/>
+        <w:pStyle w:val="TOC2"/>
         <w:rPr>
           <w:rFonts w:asciiTheme="minorHAnsi" w:eastAsiaTheme="minorEastAsia" w:hAnsiTheme="minorHAnsi" w:cstheme="minorBidi"/>
           <w:kern w:val="2"/>
@@ -2755,7 +2755,7 @@
     </w:p>
     <w:p>
       <w:pPr>
-        <w:pStyle w:val="TM1"/>
+        <w:pStyle w:val="TOC1"/>
         <w:rPr>
           <w:rFonts w:asciiTheme="minorHAnsi" w:eastAsiaTheme="minorEastAsia" w:hAnsiTheme="minorHAnsi" w:cstheme="minorBidi"/>
           <w:b w:val="0"/>
@@ -2841,7 +2841,7 @@
     </w:p>
     <w:p>
       <w:pPr>
-        <w:pStyle w:val="TM2"/>
+        <w:pStyle w:val="TOC2"/>
         <w:rPr>
           <w:rFonts w:asciiTheme="minorHAnsi" w:eastAsiaTheme="minorEastAsia" w:hAnsiTheme="minorHAnsi" w:cstheme="minorBidi"/>
           <w:kern w:val="2"/>
@@ -2904,7 +2904,7 @@
     </w:p>
     <w:p>
       <w:pPr>
-        <w:pStyle w:val="TM2"/>
+        <w:pStyle w:val="TOC2"/>
         <w:rPr>
           <w:rFonts w:asciiTheme="minorHAnsi" w:eastAsiaTheme="minorEastAsia" w:hAnsiTheme="minorHAnsi" w:cstheme="minorBidi"/>
           <w:kern w:val="2"/>
@@ -2967,7 +2967,7 @@
     </w:p>
     <w:p>
       <w:pPr>
-        <w:pStyle w:val="TM2"/>
+        <w:pStyle w:val="TOC2"/>
         <w:rPr>
           <w:rFonts w:asciiTheme="minorHAnsi" w:eastAsiaTheme="minorEastAsia" w:hAnsiTheme="minorHAnsi" w:cstheme="minorBidi"/>
           <w:kern w:val="2"/>
@@ -3030,7 +3030,7 @@
     </w:p>
     <w:p>
       <w:pPr>
-        <w:pStyle w:val="TM1"/>
+        <w:pStyle w:val="TOC1"/>
         <w:rPr>
           <w:rFonts w:asciiTheme="minorHAnsi" w:eastAsiaTheme="minorEastAsia" w:hAnsiTheme="minorHAnsi" w:cstheme="minorBidi"/>
           <w:b w:val="0"/>
@@ -3116,7 +3116,7 @@
     </w:p>
     <w:p>
       <w:pPr>
-        <w:pStyle w:val="TM2"/>
+        <w:pStyle w:val="TOC2"/>
         <w:rPr>
           <w:rFonts w:asciiTheme="minorHAnsi" w:eastAsiaTheme="minorEastAsia" w:hAnsiTheme="minorHAnsi" w:cstheme="minorBidi"/>
           <w:kern w:val="2"/>
@@ -3179,7 +3179,7 @@
     </w:p>
     <w:p>
       <w:pPr>
-        <w:pStyle w:val="TM2"/>
+        <w:pStyle w:val="TOC2"/>
         <w:rPr>
           <w:rFonts w:asciiTheme="minorHAnsi" w:eastAsiaTheme="minorEastAsia" w:hAnsiTheme="minorHAnsi" w:cstheme="minorBidi"/>
           <w:kern w:val="2"/>
@@ -3242,7 +3242,7 @@
     </w:p>
     <w:p>
       <w:pPr>
-        <w:pStyle w:val="TM2"/>
+        <w:pStyle w:val="TOC2"/>
         <w:rPr>
           <w:rFonts w:asciiTheme="minorHAnsi" w:eastAsiaTheme="minorEastAsia" w:hAnsiTheme="minorHAnsi" w:cstheme="minorBidi"/>
           <w:kern w:val="2"/>
@@ -3305,7 +3305,7 @@
     </w:p>
     <w:p>
       <w:pPr>
-        <w:pStyle w:val="TM1"/>
+        <w:pStyle w:val="TOC1"/>
         <w:rPr>
           <w:rFonts w:asciiTheme="minorHAnsi" w:eastAsiaTheme="minorEastAsia" w:hAnsiTheme="minorHAnsi" w:cstheme="minorBidi"/>
           <w:b w:val="0"/>
@@ -3391,7 +3391,7 @@
     </w:p>
     <w:p>
       <w:pPr>
-        <w:pStyle w:val="TM1"/>
+        <w:pStyle w:val="TOC1"/>
         <w:rPr>
           <w:rFonts w:asciiTheme="minorHAnsi" w:eastAsiaTheme="minorEastAsia" w:hAnsiTheme="minorHAnsi" w:cstheme="minorBidi"/>
           <w:b w:val="0"/>
@@ -3477,7 +3477,7 @@
     </w:p>
     <w:p>
       <w:pPr>
-        <w:pStyle w:val="TM1"/>
+        <w:pStyle w:val="TOC1"/>
         <w:rPr>
           <w:rFonts w:asciiTheme="minorHAnsi" w:eastAsiaTheme="minorEastAsia" w:hAnsiTheme="minorHAnsi" w:cstheme="minorBidi"/>
           <w:b w:val="0"/>
@@ -3563,7 +3563,7 @@
     </w:p>
     <w:p>
       <w:pPr>
-        <w:pStyle w:val="TM1"/>
+        <w:pStyle w:val="TOC1"/>
         <w:rPr>
           <w:rFonts w:asciiTheme="minorHAnsi" w:eastAsiaTheme="minorEastAsia" w:hAnsiTheme="minorHAnsi" w:cstheme="minorBidi"/>
           <w:b w:val="0"/>
@@ -3717,7 +3717,7 @@
     </w:p>
     <w:p>
       <w:pPr>
-        <w:pStyle w:val="Titre1"/>
+        <w:pStyle w:val="Heading1"/>
         <w:numPr>
           <w:ilvl w:val="0"/>
           <w:numId w:val="0"/>
@@ -3811,7 +3811,7 @@
       <w:commentRangeEnd w:id="4"/>
       <w:r>
         <w:rPr>
-          <w:rStyle w:val="Marquedecommentaire"/>
+          <w:rStyle w:val="CommentReference"/>
           <w:rFonts w:cs="Arial"/>
           <w:vanish/>
           <w:color w:val="0000FF"/>
@@ -3843,7 +3843,7 @@
     </w:p>
     <w:p>
       <w:pPr>
-        <w:pStyle w:val="Titre1"/>
+        <w:pStyle w:val="Heading1"/>
         <w:numPr>
           <w:ilvl w:val="0"/>
           <w:numId w:val="36"/>
@@ -3865,7 +3865,7 @@
     </w:p>
     <w:p>
       <w:pPr>
-        <w:pStyle w:val="Titre2"/>
+        <w:pStyle w:val="Heading2"/>
         <w:tabs>
           <w:tab w:val="clear" w:pos="851"/>
         </w:tabs>
@@ -3912,7 +3912,7 @@
     </w:p>
     <w:p>
       <w:pPr>
-        <w:pStyle w:val="Titre2"/>
+        <w:pStyle w:val="Heading2"/>
         <w:tabs>
           <w:tab w:val="clear" w:pos="576"/>
           <w:tab w:val="clear" w:pos="851"/>
@@ -3981,7 +3981,7 @@
     </w:p>
     <w:p>
       <w:pPr>
-        <w:pStyle w:val="Titre2"/>
+        <w:pStyle w:val="Heading2"/>
         <w:tabs>
           <w:tab w:val="clear" w:pos="851"/>
         </w:tabs>
@@ -5079,7 +5079,7 @@
     </w:p>
     <w:p>
       <w:pPr>
-        <w:pStyle w:val="Titre2"/>
+        <w:pStyle w:val="Heading2"/>
         <w:tabs>
           <w:tab w:val="clear" w:pos="851"/>
         </w:tabs>
@@ -5137,7 +5137,7 @@
     </w:p>
     <w:p>
       <w:pPr>
-        <w:pStyle w:val="Titre1"/>
+        <w:pStyle w:val="Heading1"/>
       </w:pPr>
       <w:bookmarkStart w:id="11" w:name="_Toc250790973"/>
       <w:bookmarkStart w:id="12" w:name="_Toc229743625"/>
@@ -5150,7 +5150,7 @@
     </w:p>
     <w:p>
       <w:pPr>
-        <w:pStyle w:val="Titre2"/>
+        <w:pStyle w:val="Heading2"/>
         <w:numPr>
           <w:ilvl w:val="1"/>
           <w:numId w:val="16"/>
@@ -5170,7 +5170,7 @@
     </w:p>
     <w:p>
       <w:pPr>
-        <w:pStyle w:val="Titre3"/>
+        <w:pStyle w:val="Heading3"/>
         <w:rPr>
           <w:lang w:val="fr-CH"/>
         </w:rPr>
@@ -5207,7 +5207,7 @@
     </w:p>
     <w:p>
       <w:pPr>
-        <w:pStyle w:val="Titre3"/>
+        <w:pStyle w:val="Heading3"/>
         <w:rPr>
           <w:lang w:val="fr-CH"/>
         </w:rPr>
@@ -5244,7 +5244,7 @@
     </w:p>
     <w:p>
       <w:pPr>
-        <w:pStyle w:val="Titre3"/>
+        <w:pStyle w:val="Heading3"/>
         <w:rPr>
           <w:lang w:val="fr-CH"/>
         </w:rPr>
@@ -5281,7 +5281,7 @@
     </w:p>
     <w:p>
       <w:pPr>
-        <w:pStyle w:val="Titre3"/>
+        <w:pStyle w:val="Heading3"/>
         <w:rPr>
           <w:lang w:val="fr-CH"/>
         </w:rPr>
@@ -5364,7 +5364,7 @@
     </w:p>
     <w:p>
       <w:pPr>
-        <w:pStyle w:val="Titre2"/>
+        <w:pStyle w:val="Heading2"/>
         <w:rPr>
           <w:lang w:val="fr-CH"/>
         </w:rPr>
@@ -5413,7 +5413,7 @@
     </w:p>
     <w:p>
       <w:pPr>
-        <w:pStyle w:val="Titre3"/>
+        <w:pStyle w:val="Heading3"/>
         <w:rPr>
           <w:lang w:val="fr-CH"/>
         </w:rPr>
@@ -5486,7 +5486,7 @@
     </w:p>
     <w:p>
       <w:pPr>
-        <w:pStyle w:val="Titre3"/>
+        <w:pStyle w:val="Heading3"/>
         <w:rPr>
           <w:lang w:val="fr-CH"/>
         </w:rPr>
@@ -5587,7 +5587,7 @@
     </w:p>
     <w:p>
       <w:pPr>
-        <w:pStyle w:val="Titre2"/>
+        <w:pStyle w:val="Heading2"/>
       </w:pPr>
       <w:bookmarkStart w:id="17" w:name="_Toc229743628"/>
       <w:r>
@@ -5722,7 +5722,7 @@
     </w:p>
     <w:p>
       <w:pPr>
-        <w:pStyle w:val="Titre2"/>
+        <w:pStyle w:val="Heading2"/>
       </w:pPr>
       <w:bookmarkStart w:id="18" w:name="_Toc250790977"/>
       <w:bookmarkStart w:id="19" w:name="_Toc229743629"/>
@@ -5807,7 +5807,7 @@
     </w:p>
     <w:p>
       <w:pPr>
-        <w:pStyle w:val="Titre2"/>
+        <w:pStyle w:val="Heading2"/>
       </w:pPr>
       <w:bookmarkStart w:id="20" w:name="_Toc250790978"/>
       <w:bookmarkStart w:id="21" w:name="_Toc229743630"/>
@@ -5866,7 +5866,7 @@
     </w:p>
     <w:p>
       <w:pPr>
-        <w:pStyle w:val="Titre2"/>
+        <w:pStyle w:val="Heading2"/>
         <w:numPr>
           <w:ilvl w:val="1"/>
           <w:numId w:val="16"/>
@@ -5916,7 +5916,7 @@
     </w:p>
     <w:p>
       <w:pPr>
-        <w:pStyle w:val="Titre2"/>
+        <w:pStyle w:val="Heading2"/>
         <w:rPr>
           <w:lang w:val="fr-CH"/>
         </w:rPr>
@@ -5932,7 +5932,108 @@
     </w:p>
     <w:p>
       <w:pPr>
-        <w:pStyle w:val="Titre2"/>
+        <w:pStyle w:val="BITTextkrper"/>
+        <w:rPr>
+          <w:lang w:val="fr-CH"/>
+        </w:rPr>
+      </w:pPr>
+      <w:r>
+        <w:rPr>
+          <w:lang w:val="fr-CH"/>
+        </w:rPr>
+        <w:t>Le diagramme de cas d’utilisation suivant a été modélisé sous Sparx Enterprise Architect. Il définit le périmètre fonctionnel de l’application en identifiant les acteurs qui interagissent avec CodeMentor (humains et systèmes externes) et les fonctionnalités qu’ils mettent en œuvre. Il sert de référence pour le découpage des autres diagrammes UML (séquences, activités) et pour la traçabilité des exigences.</w:t>
+      </w:r>
+    </w:p>
+    <w:p>
+      <w:pPr>
+        <w:pStyle w:val="BITTextkrper"/>
+        <w:jc w:val="center"/>
+        <w:rPr>
+          <w:noProof/>
+          <w:lang w:val="fr-CH"/>
+        </w:rPr>
+      </w:pPr>
+      <w:r>
+        <w:rPr>
+          <w:noProof/>
+          <w:lang w:val="fr-CH"/>
+        </w:rPr>
+        <w:lastRenderedPageBreak/>
+        <w:drawing>
+          <wp:inline distT="0" distB="0" distL="0" distR="0" wp14:anchorId="3D59D988" wp14:editId="3AFAFB91">
+            <wp:extent cx="5367336" cy="7200000"/>
+            <wp:effectExtent l="0" t="0" r="0" b="0"/>
+            <wp:docPr id="40" name="usecase" descr="Diagramme de cas d'utilisation de CodeMentor"/>
+            <wp:cNvGraphicFramePr>
+              <a:graphicFrameLocks xmlns:a="http://schemas.openxmlformats.org/drawingml/2006/main" noChangeAspect="1"/>
+            </wp:cNvGraphicFramePr>
+            <a:graphic xmlns:a="http://schemas.openxmlformats.org/drawingml/2006/main">
+              <a:graphicData uri="http://schemas.openxmlformats.org/drawingml/2006/picture">
+                <pic:pic xmlns:pic="http://schemas.openxmlformats.org/drawingml/2006/picture">
+                  <pic:nvPicPr>
+                    <pic:cNvPr id="40" name="usecase" descr="Diagramme de cas d'utilisation de CodeMentor"/>
+                    <pic:cNvPicPr/>
+                  </pic:nvPicPr>
+                  <pic:blipFill>
+                    <a:blip r:embed="rId19">
+                      <a:extLst>
+                        <a:ext uri="{96DAC541-7B7A-43D3-8B79-37D633B846F1}">
+                          <asvg:svgBlip xmlns:asvg="http://schemas.microsoft.com/office/drawing/2016/SVG/main" r:embed="rId20"/>
+                        </a:ext>
+                      </a:extLst>
+                    </a:blip>
+                    <a:stretch>
+                      <a:fillRect/>
+                    </a:stretch>
+                  </pic:blipFill>
+                  <pic:spPr>
+                    <a:xfrm>
+                      <a:off x="0" y="0"/>
+                      <a:ext cx="5367336" cy="7200000"/>
+                    </a:xfrm>
+                    <a:prstGeom prst="rect">
+                      <a:avLst/>
+                    </a:prstGeom>
+                  </pic:spPr>
+                </pic:pic>
+              </a:graphicData>
+            </a:graphic>
+          </wp:inline>
+        </w:drawing>
+      </w:r>
+    </w:p>
+    <w:p>
+      <w:pPr>
+        <w:pStyle w:val="BITTextkrper"/>
+        <w:jc w:val="both"/>
+        <w:rPr>
+          <w:lang w:val="fr-CH"/>
+        </w:rPr>
+      </w:pPr>
+      <w:r>
+        <w:rPr>
+          <w:b/>
+          <w:lang w:val="fr-CH"/>
+        </w:rPr>
+        <w:t xml:space="preserve">Diagramme de cas d’utilisation de CodeMentor. </w:t>
+      </w:r>
+      <w:r>
+        <w:rPr>
+          <w:lang w:val="fr-CH"/>
+        </w:rPr>
+        <w:t xml:space="preserve">Le diagramme ci-dessus représente l’ensemble des cas d’utilisation de l’application CodeMentor et les acteurs qui les déclenchent. Deux acteurs humains apparaissent : le « Visiteur », qui correspond à toute personne arrivant sur l’application sans être authentifiée, et l’« Utilisateur », qui hérite du Visiteur une fois la connexion via GitHub OAuth réalisée. Trois acteurs externes complètent le système : l’API GitHub pour l’authentification et la récupération du code, l’API OpenRouter pour l’analyse par intelligence artificielle, et la base de données interne pour la persistance des projets et de leurs </w:t>
+      </w:r>
+      <w:r>
+        <w:rPr>
+          <w:lang w:val="fr-CH"/>
+        </w:rPr>
+        <w:lastRenderedPageBreak/>
+        <w:t>analyses. Les cas d’utilisation principaux concernent la gestion des projets, le lancement et la consultation d’analyses, ainsi que la connexion et la déconnexion.</w:t>
+      </w:r>
+    </w:p>
+    <w:p>
+      <w:pPr>
+        <w:pStyle w:val="Heading2"/>
         <w:rPr>
           <w:lang w:val="fr-CH"/>
         </w:rPr>
@@ -5948,7 +6049,333 @@
     </w:p>
     <w:p>
       <w:pPr>
-        <w:pStyle w:val="Titre2"/>
+        <w:pStyle w:val="BITTextkrper"/>
+        <w:jc w:val="both"/>
+        <w:rPr>
+          <w:lang w:val="fr-CH"/>
+        </w:rPr>
+      </w:pPr>
+      <w:r>
+        <w:rPr>
+          <w:lang w:val="fr-CH"/>
+        </w:rPr>
+        <w:t>Les diagrammes de séquences système décrivent les échanges entre l’utilisateur, l’application cliente, l’application serveur et les services externes (API GitHub, API OpenRouter, base de données) pour les scénarios où la coordination temporelle est déterminante. Trois scénarios sont modélisés : la création d’une analyse, son traitement asynchrone par le worker et la consultation de son état d’avancement.</w:t>
+      </w:r>
+    </w:p>
+    <w:p>
+      <w:pPr>
+        <w:pStyle w:val="BITTextkrper"/>
+        <w:jc w:val="center"/>
+        <w:rPr>
+          <w:noProof/>
+          <w:lang w:val="fr-CH"/>
+        </w:rPr>
+      </w:pPr>
+      <w:r>
+        <w:rPr>
+          <w:noProof/>
+          <w:lang w:val="fr-CH"/>
+        </w:rPr>
+        <w:drawing>
+          <wp:inline distT="0" distB="0" distL="0" distR="0" wp14:anchorId="4991B641" wp14:editId="7609A783">
+            <wp:extent cx="5760085" cy="5181145"/>
+            <wp:effectExtent l="0" t="0" r="0" b="0"/>
+            <wp:docPr id="41" name="seq_creation_analyse" descr="Diagramme de séquences – Création d'une analyse"/>
+            <wp:cNvGraphicFramePr>
+              <a:graphicFrameLocks xmlns:a="http://schemas.openxmlformats.org/drawingml/2006/main" noChangeAspect="1"/>
+            </wp:cNvGraphicFramePr>
+            <a:graphic xmlns:a="http://schemas.openxmlformats.org/drawingml/2006/main">
+              <a:graphicData uri="http://schemas.openxmlformats.org/drawingml/2006/picture">
+                <pic:pic xmlns:pic="http://schemas.openxmlformats.org/drawingml/2006/picture">
+                  <pic:nvPicPr>
+                    <pic:cNvPr id="41" name="seq_creation_analyse" descr="Diagramme de séquences – Création d'une analyse"/>
+                    <pic:cNvPicPr/>
+                  </pic:nvPicPr>
+                  <pic:blipFill>
+                    <a:blip r:embed="rId21">
+                      <a:extLst>
+                        <a:ext uri="{96DAC541-7B7A-43D3-8B79-37D633B846F1}">
+                          <asvg:svgBlip xmlns:asvg="http://schemas.microsoft.com/office/drawing/2016/SVG/main" r:embed="rId22"/>
+                        </a:ext>
+                      </a:extLst>
+                    </a:blip>
+                    <a:stretch>
+                      <a:fillRect/>
+                    </a:stretch>
+                  </pic:blipFill>
+                  <pic:spPr>
+                    <a:xfrm>
+                      <a:off x="0" y="0"/>
+                      <a:ext cx="5760085" cy="5181145"/>
+                    </a:xfrm>
+                    <a:prstGeom prst="rect">
+                      <a:avLst/>
+                    </a:prstGeom>
+                  </pic:spPr>
+                </pic:pic>
+              </a:graphicData>
+            </a:graphic>
+          </wp:inline>
+        </w:drawing>
+      </w:r>
+    </w:p>
+    <w:p>
+      <w:pPr>
+        <w:pStyle w:val="BITTextkrper"/>
+        <w:jc w:val="both"/>
+        <w:rPr>
+          <w:lang w:val="fr-CH"/>
+        </w:rPr>
+      </w:pPr>
+      <w:r>
+        <w:rPr>
+          <w:b/>
+          <w:lang w:val="fr-CH"/>
+        </w:rPr>
+        <w:t xml:space="preserve">Diagramme de séquences – Création d’une analyse. </w:t>
+      </w:r>
+      <w:r>
+        <w:rPr>
+          <w:lang w:val="fr-CH"/>
+        </w:rPr>
+        <w:t>Ce diagramme de séquences décrit le déroulement complet du lancement d’une analyse depuis l’interface utilisateur jusqu’aux services externes. L’utilisateur déclenche l’opération via l’application cliente, qui transmet la requête à l’application serveur. Cette dernière persiste un enregistrement d’analyse dans la base de données</w:t>
+      </w:r>
+      <w:r>
+        <w:rPr>
+          <w:lang w:val="fr-CH"/>
+        </w:rPr>
+        <w:t xml:space="preserve"> et met l’analyse dans la queue en mémoire. Queue en mémoire détailler dans le prochain diagramme si dessous.</w:t>
+      </w:r>
+    </w:p>
+    <w:p>
+      <w:pPr>
+        <w:pStyle w:val="BITTextkrper"/>
+        <w:jc w:val="center"/>
+        <w:rPr>
+          <w:noProof/>
+          <w:lang w:val="fr-CH"/>
+        </w:rPr>
+      </w:pPr>
+      <w:r>
+        <w:rPr>
+          <w:noProof/>
+          <w:lang w:val="fr-CH"/>
+        </w:rPr>
+        <w:lastRenderedPageBreak/>
+        <w:drawing>
+          <wp:inline distT="0" distB="0" distL="0" distR="0" wp14:anchorId="6B6C4CDD" wp14:editId="34CDB94A">
+            <wp:extent cx="5760085" cy="4289844"/>
+            <wp:effectExtent l="0" t="0" r="0" b="0"/>
+            <wp:docPr id="42" name="seq_traitement_async" descr="Diagramme de séquences – Traitement asynchrone d'une analyse"/>
+            <wp:cNvGraphicFramePr>
+              <a:graphicFrameLocks xmlns:a="http://schemas.openxmlformats.org/drawingml/2006/main" noChangeAspect="1"/>
+            </wp:cNvGraphicFramePr>
+            <a:graphic xmlns:a="http://schemas.openxmlformats.org/drawingml/2006/main">
+              <a:graphicData uri="http://schemas.openxmlformats.org/drawingml/2006/picture">
+                <pic:pic xmlns:pic="http://schemas.openxmlformats.org/drawingml/2006/picture">
+                  <pic:nvPicPr>
+                    <pic:cNvPr id="42" name="seq_traitement_async" descr="Diagramme de séquences – Traitement asynchrone d'une analyse"/>
+                    <pic:cNvPicPr/>
+                  </pic:nvPicPr>
+                  <pic:blipFill>
+                    <a:blip r:embed="rId23">
+                      <a:extLst>
+                        <a:ext uri="{96DAC541-7B7A-43D3-8B79-37D633B846F1}">
+                          <asvg:svgBlip xmlns:asvg="http://schemas.microsoft.com/office/drawing/2016/SVG/main" r:embed="rId24"/>
+                        </a:ext>
+                      </a:extLst>
+                    </a:blip>
+                    <a:stretch>
+                      <a:fillRect/>
+                    </a:stretch>
+                  </pic:blipFill>
+                  <pic:spPr>
+                    <a:xfrm>
+                      <a:off x="0" y="0"/>
+                      <a:ext cx="5760085" cy="4289844"/>
+                    </a:xfrm>
+                    <a:prstGeom prst="rect">
+                      <a:avLst/>
+                    </a:prstGeom>
+                  </pic:spPr>
+                </pic:pic>
+              </a:graphicData>
+            </a:graphic>
+          </wp:inline>
+        </w:drawing>
+      </w:r>
+    </w:p>
+    <w:p>
+      <w:pPr>
+        <w:pStyle w:val="BITTextkrper"/>
+        <w:jc w:val="both"/>
+        <w:rPr>
+          <w:lang w:val="fr-CH"/>
+        </w:rPr>
+      </w:pPr>
+      <w:r>
+        <w:rPr>
+          <w:b/>
+          <w:lang w:val="fr-CH"/>
+        </w:rPr>
+        <w:t xml:space="preserve">Diagramme de séquences – Traitement asynchrone d’une analyse. </w:t>
+      </w:r>
+      <w:r>
+        <w:rPr>
+          <w:lang w:val="fr-CH"/>
+        </w:rPr>
+        <w:t>Une fois l’analyse créée, son traitement effectif est confié à un worker côté serveur qui s’exécute en arrière-plan. Le diagramme représente cette boucle asynchrone</w:t>
+      </w:r>
+      <w:r>
+        <w:rPr>
+          <w:lang w:val="fr-CH"/>
+        </w:rPr>
+        <w:t>.</w:t>
+      </w:r>
+      <w:r>
+        <w:rPr>
+          <w:lang w:val="fr-CH"/>
+        </w:rPr>
+        <w:t xml:space="preserve"> </w:t>
+      </w:r>
+      <w:r>
+        <w:rPr>
+          <w:lang w:val="fr-CH"/>
+        </w:rPr>
+        <w:t>L</w:t>
+      </w:r>
+      <w:r>
+        <w:rPr>
+          <w:lang w:val="fr-CH"/>
+        </w:rPr>
+        <w:t>’application serveur dialogue successivement avec l’API GitHub pour lire les fichiers, puis avec l’API OpenRouter pour les passes d’analyse, et met à jour à chaque étape l’état d’avancement dans la base de données. Ce découplage garantit que les requêtes des autres utilisateurs continuent d’être servies pendant qu’une analyse longue</w:t>
+      </w:r>
+      <w:r>
+        <w:rPr>
+          <w:lang w:val="fr-CH"/>
+        </w:rPr>
+        <w:t xml:space="preserve"> est en cours.</w:t>
+      </w:r>
+    </w:p>
+    <w:p>
+      <w:pPr>
+        <w:pStyle w:val="BITTextkrper"/>
+        <w:jc w:val="center"/>
+        <w:rPr>
+          <w:noProof/>
+          <w:lang w:val="fr-CH"/>
+        </w:rPr>
+      </w:pPr>
+      <w:r>
+        <w:rPr>
+          <w:noProof/>
+          <w:lang w:val="fr-CH"/>
+        </w:rPr>
+        <w:lastRenderedPageBreak/>
+        <w:drawing>
+          <wp:inline distT="0" distB="0" distL="0" distR="0" wp14:anchorId="534A213A" wp14:editId="5DE983A3">
+            <wp:extent cx="5760085" cy="4822704"/>
+            <wp:effectExtent l="0" t="0" r="0" b="0"/>
+            <wp:docPr id="43" name="seq_etat_avancement" descr="Diagramme de séquences – Consultation de l'état d'avancement"/>
+            <wp:cNvGraphicFramePr>
+              <a:graphicFrameLocks xmlns:a="http://schemas.openxmlformats.org/drawingml/2006/main" noChangeAspect="1"/>
+            </wp:cNvGraphicFramePr>
+            <a:graphic xmlns:a="http://schemas.openxmlformats.org/drawingml/2006/main">
+              <a:graphicData uri="http://schemas.openxmlformats.org/drawingml/2006/picture">
+                <pic:pic xmlns:pic="http://schemas.openxmlformats.org/drawingml/2006/picture">
+                  <pic:nvPicPr>
+                    <pic:cNvPr id="43" name="seq_etat_avancement" descr="Diagramme de séquences – Consultation de l'état d'avancement"/>
+                    <pic:cNvPicPr/>
+                  </pic:nvPicPr>
+                  <pic:blipFill>
+                    <a:blip r:embed="rId25">
+                      <a:extLst>
+                        <a:ext uri="{96DAC541-7B7A-43D3-8B79-37D633B846F1}">
+                          <asvg:svgBlip xmlns:asvg="http://schemas.microsoft.com/office/drawing/2016/SVG/main" r:embed="rId26"/>
+                        </a:ext>
+                      </a:extLst>
+                    </a:blip>
+                    <a:stretch>
+                      <a:fillRect/>
+                    </a:stretch>
+                  </pic:blipFill>
+                  <pic:spPr>
+                    <a:xfrm>
+                      <a:off x="0" y="0"/>
+                      <a:ext cx="5760085" cy="4822704"/>
+                    </a:xfrm>
+                    <a:prstGeom prst="rect">
+                      <a:avLst/>
+                    </a:prstGeom>
+                  </pic:spPr>
+                </pic:pic>
+              </a:graphicData>
+            </a:graphic>
+          </wp:inline>
+        </w:drawing>
+      </w:r>
+    </w:p>
+    <w:p>
+      <w:pPr>
+        <w:pStyle w:val="BITTextkrper"/>
+        <w:jc w:val="both"/>
+        <w:rPr>
+          <w:lang w:val="fr-CH"/>
+        </w:rPr>
+      </w:pPr>
+      <w:r>
+        <w:rPr>
+          <w:b/>
+          <w:lang w:val="fr-CH"/>
+        </w:rPr>
+        <w:t xml:space="preserve">Diagramme de séquences – Consultation de l’état d’avancement. </w:t>
+      </w:r>
+      <w:r>
+        <w:rPr>
+          <w:lang w:val="fr-CH"/>
+        </w:rPr>
+        <w:t>Pendant qu’une analyse est en cours, l’utilisateur peut interroger sa progression. Ce diagramme illustre le mécanisme de polling</w:t>
+      </w:r>
+      <w:r>
+        <w:rPr>
+          <w:lang w:val="fr-CH"/>
+        </w:rPr>
+        <w:t>. L</w:t>
+      </w:r>
+      <w:r>
+        <w:rPr>
+          <w:lang w:val="fr-CH"/>
+        </w:rPr>
+        <w:t>’application cliente envoie périodiquement une requête d’état à l’application serveur, qui consulte la base de données pour récupérer l’avancement courant (pourcentag</w:t>
+      </w:r>
+      <w:r>
+        <w:rPr>
+          <w:lang w:val="fr-CH"/>
+        </w:rPr>
+        <w:t>e</w:t>
+      </w:r>
+      <w:r>
+        <w:rPr>
+          <w:lang w:val="fr-CH"/>
+        </w:rPr>
+        <w:t>), puis renvoie cette information au client. Cette boucle alimente la barre de progression et le stepper visibles sur l’écran « Analyse en cours » des maquettes, et rend l’attente lisible pour l’utilisateu</w:t>
+      </w:r>
+      <w:r>
+        <w:rPr>
+          <w:lang w:val="fr-CH"/>
+        </w:rPr>
+        <w:t>r</w:t>
+      </w:r>
+      <w:r>
+        <w:rPr>
+          <w:lang w:val="fr-CH"/>
+        </w:rPr>
+        <w:t>.</w:t>
+      </w:r>
+    </w:p>
+    <w:p>
+      <w:pPr>
+        <w:pStyle w:val="Heading2"/>
         <w:rPr>
           <w:lang w:val="fr-CH"/>
         </w:rPr>
@@ -5964,21 +6391,356 @@
     </w:p>
     <w:p>
       <w:pPr>
-        <w:pStyle w:val="Titre2"/>
-        <w:rPr>
-          <w:lang w:val="fr-CH"/>
-        </w:rPr>
-      </w:pPr>
-      <w:r>
-        <w:rPr>
-          <w:lang w:val="fr-CH"/>
-        </w:rPr>
+        <w:pStyle w:val="BITTextkrper"/>
+        <w:jc w:val="both"/>
+        <w:rPr>
+          <w:lang w:val="fr-CH"/>
+        </w:rPr>
+      </w:pPr>
+      <w:r>
+        <w:rPr>
+          <w:lang w:val="fr-CH"/>
+        </w:rPr>
+        <w:t>Les diagrammes d’activités modélisent le déroulement des principaux parcours utilisateur côté interface, en mettant l’accent sur les décisions et les chemins alternatifs. Ils complètent les diagrammes de séquences en se plaçant du point de vue de l’utilisateur plutôt que de celui des composants techniques.</w:t>
+      </w:r>
+    </w:p>
+    <w:p>
+      <w:pPr>
+        <w:pStyle w:val="BITTextkrper"/>
+        <w:jc w:val="center"/>
+        <w:rPr>
+          <w:noProof/>
+          <w:lang w:val="fr-CH"/>
+        </w:rPr>
+      </w:pPr>
+      <w:r>
+        <w:rPr>
+          <w:noProof/>
+          <w:lang w:val="fr-CH"/>
+        </w:rPr>
+        <w:lastRenderedPageBreak/>
+        <w:drawing>
+          <wp:inline distT="0" distB="0" distL="0" distR="0" wp14:anchorId="626BEEB0" wp14:editId="61B0B40C">
+            <wp:extent cx="5204585" cy="7200000"/>
+            <wp:effectExtent l="0" t="0" r="0" b="0"/>
+            <wp:docPr id="44" name="act_ajouter_projet" descr="Diagramme d'activités – Ajouter un projet"/>
+            <wp:cNvGraphicFramePr>
+              <a:graphicFrameLocks xmlns:a="http://schemas.openxmlformats.org/drawingml/2006/main" noChangeAspect="1"/>
+            </wp:cNvGraphicFramePr>
+            <a:graphic xmlns:a="http://schemas.openxmlformats.org/drawingml/2006/main">
+              <a:graphicData uri="http://schemas.openxmlformats.org/drawingml/2006/picture">
+                <pic:pic xmlns:pic="http://schemas.openxmlformats.org/drawingml/2006/picture">
+                  <pic:nvPicPr>
+                    <pic:cNvPr id="44" name="act_ajouter_projet" descr="Diagramme d'activités – Ajouter un projet"/>
+                    <pic:cNvPicPr/>
+                  </pic:nvPicPr>
+                  <pic:blipFill>
+                    <a:blip r:embed="rId27">
+                      <a:extLst>
+                        <a:ext uri="{96DAC541-7B7A-43D3-8B79-37D633B846F1}">
+                          <asvg:svgBlip xmlns:asvg="http://schemas.microsoft.com/office/drawing/2016/SVG/main" r:embed="rId28"/>
+                        </a:ext>
+                      </a:extLst>
+                    </a:blip>
+                    <a:stretch>
+                      <a:fillRect/>
+                    </a:stretch>
+                  </pic:blipFill>
+                  <pic:spPr>
+                    <a:xfrm>
+                      <a:off x="0" y="0"/>
+                      <a:ext cx="5204585" cy="7200000"/>
+                    </a:xfrm>
+                    <a:prstGeom prst="rect">
+                      <a:avLst/>
+                    </a:prstGeom>
+                  </pic:spPr>
+                </pic:pic>
+              </a:graphicData>
+            </a:graphic>
+          </wp:inline>
+        </w:drawing>
+      </w:r>
+    </w:p>
+    <w:p>
+      <w:pPr>
+        <w:pStyle w:val="BITTextkrper"/>
+        <w:jc w:val="both"/>
+        <w:rPr>
+          <w:lang w:val="fr-CH"/>
+        </w:rPr>
+      </w:pPr>
+      <w:r>
+        <w:rPr>
+          <w:b/>
+          <w:lang w:val="fr-CH"/>
+        </w:rPr>
+        <w:t xml:space="preserve">Diagramme d’activités – Ajouter un projet. </w:t>
+      </w:r>
+      <w:r>
+        <w:rPr>
+          <w:lang w:val="fr-CH"/>
+        </w:rPr>
+        <w:t>Ce diagramme d’activités décrit le parcours utilisateur pour ajouter un nouveau dépôt GitHub à analyser. L’utilisateur authentifié saisit l’URL du dépôt, clique sur « Ajouter un projet » et valide la saisie. Le système contrôle alors deux conditions successives</w:t>
+      </w:r>
+      <w:r>
+        <w:rPr>
+          <w:lang w:val="fr-CH"/>
+        </w:rPr>
+        <w:t>.</w:t>
+      </w:r>
+      <w:r>
+        <w:rPr>
+          <w:lang w:val="fr-CH"/>
+        </w:rPr>
+        <w:t xml:space="preserve"> </w:t>
+      </w:r>
+      <w:r>
+        <w:rPr>
+          <w:lang w:val="fr-CH"/>
+        </w:rPr>
+        <w:t>L</w:t>
+      </w:r>
+      <w:r>
+        <w:rPr>
+          <w:lang w:val="fr-CH"/>
+        </w:rPr>
+        <w:t xml:space="preserve">’existence du dépôt (« Dépôt GitHub détecté ? ») puis les permissions de lecture de l’utilisateur sur ce dépôt. En cas d’échec sur l’une ou l’autre vérification, un message d’erreur dédié est affiché (dépôt introuvable ou accès refusé). Si les deux conditions sont remplies, le projet est créé dans CodeMentor et l’utilisateur est redirigé vers sa page </w:t>
+      </w:r>
+      <w:r>
+        <w:rPr>
+          <w:lang w:val="fr-CH"/>
+        </w:rPr>
+        <w:lastRenderedPageBreak/>
+        <w:t>projet. Ce flux justifie les messages d’erreur visibles à l’écran et les cas limites à couvrir lors des tests.</w:t>
+      </w:r>
+    </w:p>
+    <w:p>
+      <w:pPr>
+        <w:pStyle w:val="BITTextkrper"/>
+        <w:jc w:val="center"/>
+        <w:rPr>
+          <w:noProof/>
+          <w:lang w:val="fr-CH"/>
+        </w:rPr>
+      </w:pPr>
+      <w:r>
+        <w:rPr>
+          <w:noProof/>
+          <w:lang w:val="fr-CH"/>
+        </w:rPr>
+        <w:drawing>
+          <wp:inline distT="0" distB="0" distL="0" distR="0" wp14:anchorId="52F80F98" wp14:editId="117B0EE4">
+            <wp:extent cx="5760085" cy="5838067"/>
+            <wp:effectExtent l="0" t="0" r="0" b="0"/>
+            <wp:docPr id="45" name="act_consulter_analyse" descr="Diagramme d'activités – Consulter une analyse"/>
+            <wp:cNvGraphicFramePr>
+              <a:graphicFrameLocks xmlns:a="http://schemas.openxmlformats.org/drawingml/2006/main" noChangeAspect="1"/>
+            </wp:cNvGraphicFramePr>
+            <a:graphic xmlns:a="http://schemas.openxmlformats.org/drawingml/2006/main">
+              <a:graphicData uri="http://schemas.openxmlformats.org/drawingml/2006/picture">
+                <pic:pic xmlns:pic="http://schemas.openxmlformats.org/drawingml/2006/picture">
+                  <pic:nvPicPr>
+                    <pic:cNvPr id="45" name="act_consulter_analyse" descr="Diagramme d'activités – Consulter une analyse"/>
+                    <pic:cNvPicPr/>
+                  </pic:nvPicPr>
+                  <pic:blipFill>
+                    <a:blip r:embed="rId29">
+                      <a:extLst>
+                        <a:ext uri="{96DAC541-7B7A-43D3-8B79-37D633B846F1}">
+                          <asvg:svgBlip xmlns:asvg="http://schemas.microsoft.com/office/drawing/2016/SVG/main" r:embed="rId30"/>
+                        </a:ext>
+                      </a:extLst>
+                    </a:blip>
+                    <a:stretch>
+                      <a:fillRect/>
+                    </a:stretch>
+                  </pic:blipFill>
+                  <pic:spPr>
+                    <a:xfrm>
+                      <a:off x="0" y="0"/>
+                      <a:ext cx="5760085" cy="5838067"/>
+                    </a:xfrm>
+                    <a:prstGeom prst="rect">
+                      <a:avLst/>
+                    </a:prstGeom>
+                  </pic:spPr>
+                </pic:pic>
+              </a:graphicData>
+            </a:graphic>
+          </wp:inline>
+        </w:drawing>
+      </w:r>
+    </w:p>
+    <w:p>
+      <w:pPr>
+        <w:pStyle w:val="BITTextkrper"/>
+        <w:jc w:val="both"/>
+        <w:rPr>
+          <w:lang w:val="fr-CH"/>
+        </w:rPr>
+      </w:pPr>
+      <w:r>
+        <w:rPr>
+          <w:b/>
+          <w:lang w:val="fr-CH"/>
+        </w:rPr>
+        <w:t xml:space="preserve">Diagramme d’activités – Consulter une analyse. </w:t>
+      </w:r>
+      <w:r>
+        <w:rPr>
+          <w:lang w:val="fr-CH"/>
+        </w:rPr>
+        <w:t>Depuis la vue d’un projet, l’utilisateur sélectionne une analyse à consulter. Le système vérifie d’abord si l’analyse est toujours en cours</w:t>
+      </w:r>
+      <w:r>
+        <w:rPr>
+          <w:lang w:val="fr-CH"/>
+        </w:rPr>
+        <w:t>. S</w:t>
+      </w:r>
+      <w:r>
+        <w:rPr>
+          <w:lang w:val="fr-CH"/>
+        </w:rPr>
+        <w:t>i oui, l’écran d’avancement est affiché (avec la progression décrite plus haut)</w:t>
+      </w:r>
+      <w:r>
+        <w:rPr>
+          <w:lang w:val="fr-CH"/>
+        </w:rPr>
+        <w:t>. Si</w:t>
+      </w:r>
+      <w:r>
+        <w:rPr>
+          <w:lang w:val="fr-CH"/>
+        </w:rPr>
+        <w:t xml:space="preserve"> non, l’utilisateur dispose de trois actions parallèles sur les résultats consolidés : consulter les explications du code, dérouler les erreurs détectées et leurs suggestions de correction, et visualiser le diagramme structurel généré. Cette logique reflète directement le contenu de l’écran « Résultats d’analyse » présenté dans la section Maquette Web.</w:t>
+      </w:r>
+    </w:p>
+    <w:p>
+      <w:pPr>
+        <w:pStyle w:val="BITTextkrper"/>
+        <w:jc w:val="center"/>
+        <w:rPr>
+          <w:noProof/>
+          <w:lang w:val="fr-CH"/>
+        </w:rPr>
+      </w:pPr>
+      <w:r>
+        <w:rPr>
+          <w:noProof/>
+          <w:lang w:val="fr-CH"/>
+        </w:rPr>
+        <w:lastRenderedPageBreak/>
+        <w:drawing>
+          <wp:inline distT="0" distB="0" distL="0" distR="0" wp14:anchorId="38F6FE0C" wp14:editId="767CD531">
+            <wp:extent cx="4604962" cy="7200000"/>
+            <wp:effectExtent l="0" t="0" r="0" b="0"/>
+            <wp:docPr id="46" name="act_supprimer_projet" descr="Diagramme d'activités – Supprimer un projet"/>
+            <wp:cNvGraphicFramePr>
+              <a:graphicFrameLocks xmlns:a="http://schemas.openxmlformats.org/drawingml/2006/main" noChangeAspect="1"/>
+            </wp:cNvGraphicFramePr>
+            <a:graphic xmlns:a="http://schemas.openxmlformats.org/drawingml/2006/main">
+              <a:graphicData uri="http://schemas.openxmlformats.org/drawingml/2006/picture">
+                <pic:pic xmlns:pic="http://schemas.openxmlformats.org/drawingml/2006/picture">
+                  <pic:nvPicPr>
+                    <pic:cNvPr id="46" name="act_supprimer_projet" descr="Diagramme d'activités – Supprimer un projet"/>
+                    <pic:cNvPicPr/>
+                  </pic:nvPicPr>
+                  <pic:blipFill>
+                    <a:blip r:embed="rId31">
+                      <a:extLst>
+                        <a:ext uri="{96DAC541-7B7A-43D3-8B79-37D633B846F1}">
+                          <asvg:svgBlip xmlns:asvg="http://schemas.microsoft.com/office/drawing/2016/SVG/main" r:embed="rId32"/>
+                        </a:ext>
+                      </a:extLst>
+                    </a:blip>
+                    <a:stretch>
+                      <a:fillRect/>
+                    </a:stretch>
+                  </pic:blipFill>
+                  <pic:spPr>
+                    <a:xfrm>
+                      <a:off x="0" y="0"/>
+                      <a:ext cx="4604962" cy="7200000"/>
+                    </a:xfrm>
+                    <a:prstGeom prst="rect">
+                      <a:avLst/>
+                    </a:prstGeom>
+                  </pic:spPr>
+                </pic:pic>
+              </a:graphicData>
+            </a:graphic>
+          </wp:inline>
+        </w:drawing>
+      </w:r>
+    </w:p>
+    <w:p>
+      <w:pPr>
+        <w:pStyle w:val="BITTextkrper"/>
+        <w:jc w:val="both"/>
+        <w:rPr>
+          <w:lang w:val="fr-CH"/>
+        </w:rPr>
+      </w:pPr>
+      <w:r>
+        <w:rPr>
+          <w:b/>
+          <w:lang w:val="fr-CH"/>
+        </w:rPr>
+        <w:t xml:space="preserve">Diagramme d’activités – Supprimer un projet. </w:t>
+      </w:r>
+      <w:r>
+        <w:rPr>
+          <w:lang w:val="fr-CH"/>
+        </w:rPr>
+        <w:t>La suppression d’un projet est volontairement encadrée par deux garde-fous successifs. Après que l’utilisateur a sélectionné un projet et cliqué sur le bouton « Supprimer », le système vérifie d’abord si une analyse est en cours sur ce projet</w:t>
+      </w:r>
+      <w:r>
+        <w:rPr>
+          <w:lang w:val="fr-CH"/>
+        </w:rPr>
+        <w:t>. S</w:t>
+      </w:r>
+      <w:r>
+        <w:rPr>
+          <w:lang w:val="fr-CH"/>
+        </w:rPr>
+        <w:t>i c’est le cas, la suppression est bloquée et un message le signale, afin d’éviter de laisser des tâches orphelines dans le worker asynchrone. Si aucune analyse n’est en cours, une boîte de confirmation est présentée à l’utilisateur</w:t>
+      </w:r>
+      <w:r>
+        <w:rPr>
+          <w:lang w:val="fr-CH"/>
+        </w:rPr>
+        <w:t>. C</w:t>
+      </w:r>
+      <w:r>
+        <w:rPr>
+          <w:lang w:val="fr-CH"/>
+        </w:rPr>
+        <w:t>e n’est qu’après confirmation explicite que le projet et toutes ses analyses associées sont effectivement supprimés. L’utilisateur est ensuite renvoyé vers la liste mise à jour de ses projets.</w:t>
+      </w:r>
+    </w:p>
+    <w:p>
+      <w:pPr>
+        <w:pStyle w:val="Heading2"/>
+        <w:rPr>
+          <w:lang w:val="fr-CH"/>
+        </w:rPr>
+      </w:pPr>
+      <w:r>
+        <w:rPr>
+          <w:lang w:val="fr-CH"/>
+        </w:rPr>
+        <w:lastRenderedPageBreak/>
         <w:t xml:space="preserve"> Maquette Web</w:t>
       </w:r>
     </w:p>
     <w:p>
       <w:pPr>
         <w:pStyle w:val="BITTextkrper"/>
+        <w:jc w:val="both"/>
         <w:rPr>
           <w:lang w:val="fr-CH"/>
         </w:rPr>
@@ -5991,29 +6753,29 @@
       </w:r>
       <w:r>
         <w:rPr>
+          <w:bCs/>
+          <w:lang w:val="fr-CH"/>
+        </w:rPr>
+        <w:t>Stitch</w:t>
+      </w:r>
+      <w:r>
+        <w:rPr>
+          <w:lang w:val="fr-CH"/>
+        </w:rPr>
+        <w:t xml:space="preserve">, un outil de design UI assisté par IA développé par Google. Stitch permet de générer rapidement des maquettes d’interfaces web et mobiles à partir de simples descriptions textuelles, en proposant un rendu cohérent en termes de couleurs, de typographie et de composants. Cet outil a été choisi pour prototyper visuellement l’application </w:t>
+      </w:r>
+      <w:r>
+        <w:rPr>
           <w:b/>
           <w:lang w:val="fr-CH"/>
         </w:rPr>
-        <w:t>Stitch</w:t>
-      </w:r>
-      <w:r>
-        <w:rPr>
-          <w:lang w:val="fr-CH"/>
-        </w:rPr>
-        <w:t xml:space="preserve">, un outil de design UI assisté par IA développé par Google. Stitch permet de générer rapidement des maquettes d’interfaces web et mobiles à partir de simples descriptions textuelles, en proposant un rendu cohérent en termes de couleurs, de typographie et de composants. Cet outil a été choisi pour prototyper visuellement l’application </w:t>
-      </w:r>
-      <w:r>
-        <w:rPr>
-          <w:b/>
-          <w:lang w:val="fr-CH"/>
-        </w:rPr>
         <w:t>CodeMentor</w:t>
       </w:r>
       <w:r>
         <w:rPr>
           <w:lang w:val="fr-CH"/>
         </w:rPr>
-        <w:t xml:space="preserve"> avant d’entamer la phase de développement, afin de valider l’expérience utilisateur et la structure des principaux écrans. Chaque maquette est accompagnée d’une brève description précisant son rôle et les actions disponibles pour l’utilisateur.</w:t>
+        <w:t>.</w:t>
       </w:r>
     </w:p>
     <w:p>
@@ -6028,7 +6790,6 @@
           <w:noProof/>
           <w:lang w:val="fr-CH"/>
         </w:rPr>
-        <w:lastRenderedPageBreak/>
         <w:drawing>
           <wp:inline distT="0" distB="0" distL="0" distR="0" wp14:anchorId="4B360FFD" wp14:editId="224D997B">
             <wp:extent cx="5760085" cy="4608195"/>
@@ -6045,7 +6806,7 @@
                     <pic:cNvPicPr/>
                   </pic:nvPicPr>
                   <pic:blipFill>
-                    <a:blip r:embed="rId19"/>
+                    <a:blip r:embed="rId33"/>
                     <a:stretch>
                       <a:fillRect/>
                     </a:stretch>
@@ -6069,6 +6830,7 @@
     <w:p>
       <w:pPr>
         <w:pStyle w:val="BITTextkrper"/>
+        <w:jc w:val="both"/>
         <w:rPr>
           <w:lang w:val="fr-CH"/>
         </w:rPr>
@@ -6078,13 +6840,32 @@
           <w:b/>
           <w:lang w:val="fr-CH"/>
         </w:rPr>
-        <w:t xml:space="preserve">Figure 1 - Page de connexion. </w:t>
-      </w:r>
-      <w:r>
-        <w:rPr>
-          <w:lang w:val="fr-CH"/>
-        </w:rPr>
-        <w:t>Première page rencontrée par l’utilisateur lors de son arrivée sur CodeMentor. Elle présente brièvement la promesse de l’application « Comprenez votre code, instantanément » et propose un unique bouton d’authentification via GitHub. Ce choix d’OAuth GitHub simplifie le parcours utilisateur et garantit que la personne dispose bien d’un compte permettant d’accéder à ses dépôts. Une mention rappelle l’acceptation des conditions d’utilisation au moment de la connexion.</w:t>
+        <w:t xml:space="preserve">Page de connexion. </w:t>
+      </w:r>
+      <w:r>
+        <w:rPr>
+          <w:lang w:val="fr-CH"/>
+        </w:rPr>
+        <w:t xml:space="preserve">Première page rencontrée par l’utilisateur lors de son arrivée sur CodeMentor. Elle </w:t>
+      </w:r>
+      <w:r>
+        <w:rPr>
+          <w:lang w:val="fr-CH"/>
+        </w:rPr>
+        <w:t xml:space="preserve">propose </w:t>
+      </w:r>
+      <w:r>
+        <w:rPr>
+          <w:lang w:val="fr-CH"/>
+        </w:rPr>
+        <w:t xml:space="preserve">un unique bouton d’authentification via GitHub. Ce choix d’OAuth GitHub simplifie le parcours utilisateur et garantit que la personne dispose bien d’un compte permettant d’accéder à ses dépôts. </w:t>
+      </w:r>
+      <w:r>
+        <w:rPr>
+          <w:highlight w:val="yellow"/>
+          <w:lang w:val="fr-CH"/>
+        </w:rPr>
+        <w:t>Une mention rappelle l’acceptation des conditions d’utilisation au moment de la connexion.</w:t>
       </w:r>
     </w:p>
     <w:p>
@@ -6124,7 +6905,7 @@
                     <pic:cNvPicPr/>
                   </pic:nvPicPr>
                   <pic:blipFill>
-                    <a:blip r:embed="rId20"/>
+                    <a:blip r:embed="rId34"/>
                     <a:stretch>
                       <a:fillRect/>
                     </a:stretch>
@@ -6148,6 +6929,7 @@
     <w:p>
       <w:pPr>
         <w:pStyle w:val="BITTextkrper"/>
+        <w:jc w:val="both"/>
         <w:rPr>
           <w:lang w:val="fr-CH"/>
         </w:rPr>
@@ -6157,13 +6939,13 @@
           <w:b/>
           <w:lang w:val="fr-CH"/>
         </w:rPr>
-        <w:t xml:space="preserve">Figure 2 - Ajout d’un projet. </w:t>
-      </w:r>
-      <w:r>
-        <w:rPr>
-          <w:lang w:val="fr-CH"/>
-        </w:rPr>
-        <w:t>Cette fenêtre modale s’ouvre lorsque l’utilisateur souhaite ajouter un nouveau dépôt à analyser depuis la liste de ses projets. Il lui suffit de coller l’URL d’un dépôt GitHub au format « https://github.com/username/repository » pour que le projet soit rattaché à son compte. Le bouton « Ajouter le projet » valide la saisie tandis que « Annuler » referme la modale sans modification. Cette étape constitue le point d’entrée de toute analyse effectuée par CodeMentor.</w:t>
+        <w:t xml:space="preserve">Ajout d’un projet. </w:t>
+      </w:r>
+      <w:r>
+        <w:rPr>
+          <w:lang w:val="fr-CH"/>
+        </w:rPr>
+        <w:t>Cette fenêtre modale s’ouvre lorsque l’utilisateur souhaite ajouter un nouveau dépôt à analyser depuis la liste de ses projets. Il lui suffit de coller l’URL d’un dépôt GitHub au format « https://github.com/username/repository » pour que le projet soit rattaché à son compte. Le bouton « Ajouter le projet » valide la saisie tandis que « Annuler » referme la modale sans modification.</w:t>
       </w:r>
     </w:p>
     <w:p>
@@ -6175,15 +6957,14 @@
       </w:pPr>
       <w:r>
         <w:rPr>
-          <w:noProof/>
           <w:lang w:val="fr-CH"/>
         </w:rPr>
         <w:lastRenderedPageBreak/>
         <w:drawing>
-          <wp:inline distT="0" distB="0" distL="0" distR="0" wp14:anchorId="370DDAEA" wp14:editId="64ABDD88">
+          <wp:inline distT="0" distB="0" distL="0" distR="0" wp14:anchorId="020F4601" wp14:editId="3FBD1646">
             <wp:extent cx="5760085" cy="4608195"/>
             <wp:effectExtent l="0" t="0" r="0" b="1905"/>
-            <wp:docPr id="337136074" name="Picture 1"/>
+            <wp:docPr id="1434007648" name="Picture 1"/>
             <wp:cNvGraphicFramePr>
               <a:graphicFrameLocks xmlns:a="http://schemas.openxmlformats.org/drawingml/2006/main" noChangeAspect="1"/>
             </wp:cNvGraphicFramePr>
@@ -6191,11 +6972,11 @@
               <a:graphicData uri="http://schemas.openxmlformats.org/drawingml/2006/picture">
                 <pic:pic xmlns:pic="http://schemas.openxmlformats.org/drawingml/2006/picture">
                   <pic:nvPicPr>
-                    <pic:cNvPr id="337136074" name=""/>
+                    <pic:cNvPr id="1434007648" name=""/>
                     <pic:cNvPicPr/>
                   </pic:nvPicPr>
                   <pic:blipFill>
-                    <a:blip r:embed="rId21"/>
+                    <a:blip r:embed="rId35"/>
                     <a:stretch>
                       <a:fillRect/>
                     </a:stretch>
@@ -6219,6 +7000,7 @@
     <w:p>
       <w:pPr>
         <w:pStyle w:val="BITTextkrper"/>
+        <w:jc w:val="both"/>
         <w:rPr>
           <w:lang w:val="fr-CH"/>
         </w:rPr>
@@ -6228,13 +7010,25 @@
           <w:b/>
           <w:lang w:val="fr-CH"/>
         </w:rPr>
-        <w:t xml:space="preserve">Figure 3 - Paramètres API et modèles IA. </w:t>
-      </w:r>
-      <w:r>
-        <w:rPr>
-          <w:lang w:val="fr-CH"/>
-        </w:rPr>
-        <w:t>L’écran de configuration permet à l’utilisateur de choisir le modèle d’IA utilisé par défaut pour analyser ses projets, ici « GPT-4 Turbo (Recommandé) ». Un curseur de température permet de doser le comportement de l’IA entre des réponses précises (faible température, idéales pour l’analyse de code) et des réponses plus créatives. Cette page rend l’application flexible en laissant l’utilisateur adapter le moteur d’analyse à ses besoins. La navigation latérale donne accès aux projets et aux réglages généraux du compte.</w:t>
+        <w:t xml:space="preserve">Paramètres API et modèles IA. </w:t>
+      </w:r>
+      <w:r>
+        <w:rPr>
+          <w:lang w:val="fr-CH"/>
+        </w:rPr>
+        <w:t xml:space="preserve">L’écran de configuration permet à l’utilisateur de choisir le modèle d’IA </w:t>
+      </w:r>
+      <w:r>
+        <w:rPr>
+          <w:lang w:val="fr-CH"/>
+        </w:rPr>
+        <w:t xml:space="preserve">utiliser </w:t>
+      </w:r>
+      <w:r>
+        <w:rPr>
+          <w:lang w:val="fr-CH"/>
+        </w:rPr>
+        <w:t>pour analyser ses projets, ici « GPT-4 Turbo (Recommandé) ».</w:t>
       </w:r>
     </w:p>
     <w:p>
@@ -6266,7 +7060,7 @@
                     <pic:cNvPicPr/>
                   </pic:nvPicPr>
                   <pic:blipFill>
-                    <a:blip r:embed="rId22"/>
+                    <a:blip r:embed="rId36"/>
                     <a:stretch>
                       <a:fillRect/>
                     </a:stretch>
@@ -6290,6 +7084,7 @@
     <w:p>
       <w:pPr>
         <w:pStyle w:val="BITTextkrper"/>
+        <w:jc w:val="both"/>
         <w:rPr>
           <w:lang w:val="fr-CH"/>
         </w:rPr>
@@ -6299,13 +7094,13 @@
           <w:b/>
           <w:lang w:val="fr-CH"/>
         </w:rPr>
-        <w:t xml:space="preserve">Figure 4 - Analyse en cours. </w:t>
-      </w:r>
-      <w:r>
-        <w:rPr>
-          <w:lang w:val="fr-CH"/>
-        </w:rPr>
-        <w:t>Écran de progression affiché pendant que CodeMentor traite un dépôt. Une barre indique le pourcentage d’avancement (62 % dans l’exemple) tandis qu’un stepper détaille les quatre étapes du processus : connexion GitHub, téléchargement du code, analyse par l’IA puis génération du diagramme. Une indication informe l’utilisateur que l’opération peut durer entre une et trois minutes, et un bouton « Annuler » permet d’interrompre l’analyse à tout moment. Cet écran rassure l’utilisateur sur le bon déroulement du traitement.</w:t>
+        <w:t xml:space="preserve">Analyse en cours. </w:t>
+      </w:r>
+      <w:r>
+        <w:rPr>
+          <w:lang w:val="fr-CH"/>
+        </w:rPr>
+        <w:t>Écran de progression affiché pendant que CodeMentor traite un dépôt. Une barre indique le pourcentage d’avancement (62 % dans l’exemple).</w:t>
       </w:r>
     </w:p>
     <w:p>
@@ -6317,15 +7112,14 @@
       </w:pPr>
       <w:r>
         <w:rPr>
-          <w:noProof/>
           <w:lang w:val="fr-CH"/>
         </w:rPr>
         <w:lastRenderedPageBreak/>
         <w:drawing>
-          <wp:inline distT="0" distB="0" distL="0" distR="0" wp14:anchorId="5D9CE709" wp14:editId="78DC5B87">
-            <wp:extent cx="5760085" cy="6062980"/>
-            <wp:effectExtent l="0" t="0" r="0" b="0"/>
-            <wp:docPr id="509542608" name="Picture 1"/>
+          <wp:inline distT="0" distB="0" distL="0" distR="0" wp14:anchorId="6207365F" wp14:editId="2C12E78F">
+            <wp:extent cx="5760085" cy="6151880"/>
+            <wp:effectExtent l="0" t="0" r="0" b="1270"/>
+            <wp:docPr id="813641194" name="Picture 1"/>
             <wp:cNvGraphicFramePr>
               <a:graphicFrameLocks xmlns:a="http://schemas.openxmlformats.org/drawingml/2006/main" noChangeAspect="1"/>
             </wp:cNvGraphicFramePr>
@@ -6333,11 +7127,11 @@
               <a:graphicData uri="http://schemas.openxmlformats.org/drawingml/2006/picture">
                 <pic:pic xmlns:pic="http://schemas.openxmlformats.org/drawingml/2006/picture">
                   <pic:nvPicPr>
-                    <pic:cNvPr id="509542608" name=""/>
+                    <pic:cNvPr id="813641194" name=""/>
                     <pic:cNvPicPr/>
                   </pic:nvPicPr>
                   <pic:blipFill>
-                    <a:blip r:embed="rId23"/>
+                    <a:blip r:embed="rId37"/>
                     <a:stretch>
                       <a:fillRect/>
                     </a:stretch>
@@ -6345,7 +7139,7 @@
                   <pic:spPr>
                     <a:xfrm>
                       <a:off x="0" y="0"/>
-                      <a:ext cx="5760085" cy="6062980"/>
+                      <a:ext cx="5760085" cy="6151880"/>
                     </a:xfrm>
                     <a:prstGeom prst="rect">
                       <a:avLst/>
@@ -6361,6 +7155,7 @@
     <w:p>
       <w:pPr>
         <w:pStyle w:val="BITTextkrper"/>
+        <w:jc w:val="both"/>
         <w:rPr>
           <w:lang w:val="fr-CH"/>
         </w:rPr>
@@ -6370,13 +7165,25 @@
           <w:b/>
           <w:lang w:val="fr-CH"/>
         </w:rPr>
-        <w:t xml:space="preserve">Figure 5 - Résultats d’analyse. </w:t>
-      </w:r>
-      <w:r>
-        <w:rPr>
-          <w:lang w:val="fr-CH"/>
-        </w:rPr>
-        <w:t>Page principale présentant le résultat complet d’une analyse, composée de plusieurs blocs. En haut, un diagramme interactif représente la structure du projet (composants, dépendances) généré automatiquement par l’IA. Au-dessous, une « Vue d’ensemble » résume l’état global du dépôt (technologies utilisées, couverture de tests, points de friction) puis une section « Erreurs détectées » liste les problèmes repérés avec leur niveau de criticité, un extrait de code et une correction suggérée. Les boutons « Relancer » et « Export » permettent respectivement de refaire l’analyse ou d’en télécharger un rapport.</w:t>
+        <w:t xml:space="preserve">Résultats d’analyse. </w:t>
+      </w:r>
+      <w:r>
+        <w:rPr>
+          <w:lang w:val="fr-CH"/>
+        </w:rPr>
+        <w:t>Page principale présentant le résultat complet d’une analyse, composée de plusieurs blocs. En haut, un diagramme interactif représente la structure du projet (composants, dépendances) généré automatiquement par l’IA. Au-dessous, une « Vue d’ensemble » résume l’état global du dépôt</w:t>
+      </w:r>
+      <w:r>
+        <w:rPr>
+          <w:lang w:val="fr-CH"/>
+        </w:rPr>
+        <w:t>. P</w:t>
+      </w:r>
+      <w:r>
+        <w:rPr>
+          <w:lang w:val="fr-CH"/>
+        </w:rPr>
+        <w:t>uis une section « Erreurs détectées » liste les problèmes repérés avec leur niveau de criticité, un extrait de code et une correction suggérée.</w:t>
       </w:r>
     </w:p>
     <w:p>
@@ -6388,15 +7195,14 @@
       </w:pPr>
       <w:r>
         <w:rPr>
-          <w:noProof/>
           <w:lang w:val="fr-CH"/>
         </w:rPr>
         <w:lastRenderedPageBreak/>
         <w:drawing>
-          <wp:inline distT="0" distB="0" distL="0" distR="0" wp14:anchorId="022105A1" wp14:editId="4721D06D">
+          <wp:inline distT="0" distB="0" distL="0" distR="0" wp14:anchorId="077D3537" wp14:editId="2E31258A">
             <wp:extent cx="5760085" cy="4608195"/>
             <wp:effectExtent l="0" t="0" r="0" b="1905"/>
-            <wp:docPr id="1326362673" name="Picture 1"/>
+            <wp:docPr id="1874453088" name="Picture 1"/>
             <wp:cNvGraphicFramePr>
               <a:graphicFrameLocks xmlns:a="http://schemas.openxmlformats.org/drawingml/2006/main" noChangeAspect="1"/>
             </wp:cNvGraphicFramePr>
@@ -6404,11 +7210,11 @@
               <a:graphicData uri="http://schemas.openxmlformats.org/drawingml/2006/picture">
                 <pic:pic xmlns:pic="http://schemas.openxmlformats.org/drawingml/2006/picture">
                   <pic:nvPicPr>
-                    <pic:cNvPr id="1326362673" name=""/>
+                    <pic:cNvPr id="1874453088" name=""/>
                     <pic:cNvPicPr/>
                   </pic:nvPicPr>
                   <pic:blipFill>
-                    <a:blip r:embed="rId24"/>
+                    <a:blip r:embed="rId38"/>
                     <a:stretch>
                       <a:fillRect/>
                     </a:stretch>
@@ -6432,6 +7238,7 @@
     <w:p>
       <w:pPr>
         <w:pStyle w:val="BITTextkrper"/>
+        <w:jc w:val="both"/>
         <w:rPr>
           <w:lang w:val="fr-CH"/>
         </w:rPr>
@@ -6441,13 +7248,19 @@
           <w:b/>
           <w:lang w:val="fr-CH"/>
         </w:rPr>
-        <w:t xml:space="preserve">Figure 6 - Liste des projets. </w:t>
-      </w:r>
-      <w:r>
-        <w:rPr>
-          <w:lang w:val="fr-CH"/>
-        </w:rPr>
-        <w:t>Tableau de bord regroupant l’ensemble des dépôts GitHub que l’utilisateur a ajoutés à CodeMentor. Chaque projet est représenté sous forme de carte affichant son nom, une brève description, le langage principal et le nombre d’analyses déjà effectuées. Une barre de recherche et des filtres (« Tous », « Analysé », « En cours », « Jamais analysé ») facilitent la navigation lorsque le nombre de projets devient important. Le bouton « + Nouveau projet » en haut à droite ouvre la modale d’ajout présentée en figure 2.</w:t>
+        <w:t xml:space="preserve">Liste des projets. </w:t>
+      </w:r>
+      <w:r>
+        <w:rPr>
+          <w:lang w:val="fr-CH"/>
+        </w:rPr>
+        <w:t xml:space="preserve">Tableau de bord regroupant l’ensemble des dépôts GitHub que l’utilisateur a ajoutés à CodeMentor. Chaque projet est représenté sous forme de carte affichant son nom, le langage principal et le nombre d’analyses déjà effectuées. Une barre de recherche et des filtres (« Tous », « Analysé », « En cours », « Jamais analysé ») facilitent la navigation lorsque le nombre de projets devient important. Le bouton « + Nouveau projet » en haut à droite ouvre la modale d’ajout présentée </w:t>
+      </w:r>
+      <w:r>
+        <w:rPr>
+          <w:lang w:val="fr-CH"/>
+        </w:rPr>
+        <w:t>sur la maquette 2.</w:t>
       </w:r>
     </w:p>
     <w:p>
@@ -6459,15 +7272,14 @@
       </w:pPr>
       <w:r>
         <w:rPr>
-          <w:noProof/>
           <w:lang w:val="fr-CH"/>
         </w:rPr>
         <w:lastRenderedPageBreak/>
         <w:drawing>
-          <wp:inline distT="0" distB="0" distL="0" distR="0" wp14:anchorId="500C7329" wp14:editId="676AAB50">
+          <wp:inline distT="0" distB="0" distL="0" distR="0" wp14:anchorId="70890852" wp14:editId="34320180">
             <wp:extent cx="5760085" cy="4608195"/>
             <wp:effectExtent l="0" t="0" r="0" b="1905"/>
-            <wp:docPr id="317171713" name="Picture 1"/>
+            <wp:docPr id="1706974292" name="Picture 1"/>
             <wp:cNvGraphicFramePr>
               <a:graphicFrameLocks xmlns:a="http://schemas.openxmlformats.org/drawingml/2006/main" noChangeAspect="1"/>
             </wp:cNvGraphicFramePr>
@@ -6475,11 +7287,11 @@
               <a:graphicData uri="http://schemas.openxmlformats.org/drawingml/2006/picture">
                 <pic:pic xmlns:pic="http://schemas.openxmlformats.org/drawingml/2006/picture">
                   <pic:nvPicPr>
-                    <pic:cNvPr id="317171713" name=""/>
+                    <pic:cNvPr id="1706974292" name=""/>
                     <pic:cNvPicPr/>
                   </pic:nvPicPr>
                   <pic:blipFill>
-                    <a:blip r:embed="rId25"/>
+                    <a:blip r:embed="rId39"/>
                     <a:stretch>
                       <a:fillRect/>
                     </a:stretch>
@@ -6503,6 +7315,7 @@
     <w:p>
       <w:pPr>
         <w:pStyle w:val="BITTextkrper"/>
+        <w:jc w:val="both"/>
         <w:rPr>
           <w:lang w:val="fr-CH"/>
         </w:rPr>
@@ -6512,58 +7325,18 @@
           <w:b/>
           <w:lang w:val="fr-CH"/>
         </w:rPr>
-        <w:t xml:space="preserve">Figure 7 - Détail d’un projet. </w:t>
-      </w:r>
-      <w:r>
-        <w:rPr>
-          <w:lang w:val="fr-CH"/>
-        </w:rPr>
-        <w:t>Page dédiée à un dépôt sélectionné (ici « my-awesome-repo »), affichant ses métadonnées principales : langage, visibilité, nombre d’étoiles et date de création. La section « Historique des analyses » récapitule dans un tableau toutes les analyses lancées sur le projet avec leur identifiant, leur date, leur durée, leur statut (succès, avertissement, échec) et le nombre d’erreurs détectées. Les boutons « Voir sur GitHub » et « Lancer une analyse » permettent respectivement d’ouvrir le dépôt en ligne ou de déclencher une nouvelle analyse, tandis que « Consulter » réouvre les résultats d’une analyse passée.</w:t>
-      </w:r>
-    </w:p>
-    <w:p>
-      <w:pPr>
-        <w:pStyle w:val="BITTextkrper"/>
-        <w:rPr>
-          <w:lang w:val="fr-CH"/>
-        </w:rPr>
-      </w:pPr>
-    </w:p>
-    <w:p>
-      <w:pPr>
-        <w:pStyle w:val="BITTextkrper"/>
-        <w:rPr>
-          <w:lang w:val="fr-CH"/>
-        </w:rPr>
-      </w:pPr>
-    </w:p>
-    <w:p>
-      <w:pPr>
-        <w:pStyle w:val="BITTextkrper"/>
-        <w:rPr>
-          <w:lang w:val="fr-CH"/>
-        </w:rPr>
-      </w:pPr>
-    </w:p>
-    <w:p>
-      <w:pPr>
-        <w:pStyle w:val="BITTextkrper"/>
-        <w:rPr>
-          <w:lang w:val="fr-CH"/>
-        </w:rPr>
-      </w:pPr>
-    </w:p>
-    <w:p>
-      <w:pPr>
-        <w:pStyle w:val="BITTextkrper"/>
-        <w:rPr>
-          <w:lang w:val="fr-CH"/>
-        </w:rPr>
-      </w:pPr>
-    </w:p>
-    <w:p>
-      <w:pPr>
-        <w:pStyle w:val="Titre1"/>
+        <w:t xml:space="preserve">Détail d’un projet. </w:t>
+      </w:r>
+      <w:r>
+        <w:rPr>
+          <w:lang w:val="fr-CH"/>
+        </w:rPr>
+        <w:t>Page dédiée à un dépôt sélectionné (ici « my-awesome-repo »), affichant ses métadonnées principales : langage, visibilité, nombre d’étoiles et date de création. La section « Historique des analyses » récapitule dans un tableau toutes les analyses lancées sur le projet avec leur identifiant, leur date, leur statut (succès, échec) et le nombre d’erreurs détectées. Les boutons « Voir sur GitHub » et « Lancer une analyse » permettent respectivement d’ouvrir le dépôt en ligne ou de déclencher une nouvelle analyse, tandis que « Consulter » réouvre les résultats d’une analyse passée.</w:t>
+      </w:r>
+    </w:p>
+    <w:p>
+      <w:pPr>
+        <w:pStyle w:val="Heading1"/>
         <w:numPr>
           <w:ilvl w:val="0"/>
           <w:numId w:val="16"/>
@@ -6584,7 +7357,7 @@
     </w:p>
     <w:p>
       <w:pPr>
-        <w:pStyle w:val="Titre2"/>
+        <w:pStyle w:val="Heading2"/>
         <w:numPr>
           <w:ilvl w:val="1"/>
           <w:numId w:val="16"/>
@@ -6608,7 +7381,7 @@
     </w:p>
     <w:p>
       <w:pPr>
-        <w:pStyle w:val="Titre2"/>
+        <w:pStyle w:val="Heading2"/>
         <w:numPr>
           <w:ilvl w:val="1"/>
           <w:numId w:val="16"/>
@@ -6629,7 +7402,7 @@
     </w:p>
     <w:p>
       <w:pPr>
-        <w:pStyle w:val="Titre2"/>
+        <w:pStyle w:val="Heading2"/>
         <w:numPr>
           <w:ilvl w:val="1"/>
           <w:numId w:val="16"/>
@@ -6672,7 +7445,7 @@
     </w:p>
     <w:p>
       <w:pPr>
-        <w:pStyle w:val="Titre2"/>
+        <w:pStyle w:val="Heading2"/>
         <w:numPr>
           <w:ilvl w:val="1"/>
           <w:numId w:val="16"/>
@@ -6713,7 +7486,7 @@
     </w:p>
     <w:p>
       <w:pPr>
-        <w:pStyle w:val="Titre2"/>
+        <w:pStyle w:val="Heading2"/>
         <w:rPr>
           <w:lang w:val="fr-CH"/>
         </w:rPr>
@@ -6771,7 +7544,7 @@
                     <pic:cNvPicPr/>
                   </pic:nvPicPr>
                   <pic:blipFill>
-                    <a:blip r:embed="rId26"/>
+                    <a:blip r:embed="rId40"/>
                     <a:stretch>
                       <a:fillRect/>
                     </a:stretch>
@@ -6808,7 +7581,7 @@
     </w:p>
     <w:p>
       <w:pPr>
-        <w:pStyle w:val="Titre3"/>
+        <w:pStyle w:val="Heading3"/>
         <w:rPr>
           <w:lang w:val="fr-CH"/>
         </w:rPr>
@@ -7548,7 +8321,7 @@
     </w:p>
     <w:p>
       <w:pPr>
-        <w:pStyle w:val="Titre3"/>
+        <w:pStyle w:val="Heading3"/>
         <w:rPr>
           <w:lang w:val="fr-CH"/>
         </w:rPr>
@@ -8421,7 +9194,7 @@
     </w:p>
     <w:p>
       <w:pPr>
-        <w:pStyle w:val="Titre3"/>
+        <w:pStyle w:val="Heading3"/>
         <w:rPr>
           <w:lang w:val="fr-CH"/>
         </w:rPr>
@@ -9831,7 +10604,7 @@
     </w:p>
     <w:p>
       <w:pPr>
-        <w:pStyle w:val="Titre3"/>
+        <w:pStyle w:val="Heading3"/>
         <w:rPr>
           <w:lang w:val="fr-CH"/>
         </w:rPr>
@@ -10712,7 +11485,7 @@
     </w:p>
     <w:p>
       <w:pPr>
-        <w:pStyle w:val="Titre3"/>
+        <w:pStyle w:val="Heading3"/>
         <w:rPr>
           <w:lang w:val="fr-CH"/>
         </w:rPr>
@@ -11854,7 +12627,7 @@
     </w:p>
     <w:p>
       <w:pPr>
-        <w:pStyle w:val="Titre3"/>
+        <w:pStyle w:val="Heading3"/>
         <w:rPr>
           <w:lang w:val="fr-CH"/>
         </w:rPr>
@@ -12585,7 +13358,7 @@
     </w:tbl>
     <w:p>
       <w:pPr>
-        <w:pStyle w:val="Titre2"/>
+        <w:pStyle w:val="Heading2"/>
         <w:rPr>
           <w:lang w:val="fr-CH"/>
         </w:rPr>
@@ -12601,7 +13374,7 @@
     </w:p>
     <w:p>
       <w:pPr>
-        <w:pStyle w:val="Titre2"/>
+        <w:pStyle w:val="Heading2"/>
         <w:rPr>
           <w:lang w:val="fr-CH"/>
         </w:rPr>
@@ -12617,7 +13390,15 @@
     </w:p>
     <w:p>
       <w:pPr>
-        <w:pStyle w:val="Titre2"/>
+        <w:pStyle w:val="BITTextkrper"/>
+        <w:rPr>
+          <w:lang w:val="fr-CH"/>
+        </w:rPr>
+      </w:pPr>
+    </w:p>
+    <w:p>
+      <w:pPr>
+        <w:pStyle w:val="Heading2"/>
         <w:numPr>
           <w:ilvl w:val="1"/>
           <w:numId w:val="16"/>
@@ -12651,7 +13432,7 @@
     </w:p>
     <w:p>
       <w:pPr>
-        <w:pStyle w:val="Titre2"/>
+        <w:pStyle w:val="Heading2"/>
         <w:numPr>
           <w:ilvl w:val="1"/>
           <w:numId w:val="16"/>
@@ -12699,7 +13480,7 @@
     </w:p>
     <w:p>
       <w:pPr>
-        <w:pStyle w:val="Titre2"/>
+        <w:pStyle w:val="Heading2"/>
         <w:numPr>
           <w:ilvl w:val="1"/>
           <w:numId w:val="16"/>
@@ -12761,7 +13542,7 @@
     </w:p>
     <w:p>
       <w:pPr>
-        <w:pStyle w:val="Titre1"/>
+        <w:pStyle w:val="Heading1"/>
         <w:numPr>
           <w:ilvl w:val="0"/>
           <w:numId w:val="16"/>
@@ -12778,7 +13559,7 @@
     </w:p>
     <w:p>
       <w:pPr>
-        <w:pStyle w:val="Titre2"/>
+        <w:pStyle w:val="Heading2"/>
         <w:numPr>
           <w:ilvl w:val="1"/>
           <w:numId w:val="16"/>
@@ -12819,7 +13600,7 @@
     </w:p>
     <w:p>
       <w:pPr>
-        <w:pStyle w:val="Titre2"/>
+        <w:pStyle w:val="Heading2"/>
         <w:numPr>
           <w:ilvl w:val="1"/>
           <w:numId w:val="16"/>
@@ -12865,7 +13646,7 @@
     </w:p>
     <w:p>
       <w:pPr>
-        <w:pStyle w:val="Titre2"/>
+        <w:pStyle w:val="Heading2"/>
         <w:rPr>
           <w:lang w:val="fr-CH"/>
         </w:rPr>
@@ -12881,7 +13662,7 @@
     </w:p>
     <w:p>
       <w:pPr>
-        <w:pStyle w:val="Titre2"/>
+        <w:pStyle w:val="Heading2"/>
         <w:numPr>
           <w:ilvl w:val="1"/>
           <w:numId w:val="16"/>
@@ -12932,7 +13713,7 @@
     </w:p>
     <w:p>
       <w:pPr>
-        <w:pStyle w:val="Titre2"/>
+        <w:pStyle w:val="Heading2"/>
       </w:pPr>
       <w:bookmarkStart w:id="63" w:name="_Toc229743651"/>
       <w:r>
@@ -12942,7 +13723,7 @@
     </w:p>
     <w:p>
       <w:pPr>
-        <w:pStyle w:val="Titre1"/>
+        <w:pStyle w:val="Heading1"/>
         <w:numPr>
           <w:ilvl w:val="0"/>
           <w:numId w:val="16"/>
@@ -12963,7 +13744,7 @@
     </w:p>
     <w:p>
       <w:pPr>
-        <w:pStyle w:val="Titre2"/>
+        <w:pStyle w:val="Heading2"/>
         <w:numPr>
           <w:ilvl w:val="1"/>
           <w:numId w:val="16"/>
@@ -13011,7 +13792,7 @@
     </w:p>
     <w:p>
       <w:pPr>
-        <w:pStyle w:val="Titre2"/>
+        <w:pStyle w:val="Heading2"/>
         <w:numPr>
           <w:ilvl w:val="1"/>
           <w:numId w:val="16"/>
@@ -13306,7 +14087,7 @@
     </w:p>
     <w:p>
       <w:pPr>
-        <w:pStyle w:val="Titre2"/>
+        <w:pStyle w:val="Heading2"/>
         <w:numPr>
           <w:ilvl w:val="1"/>
           <w:numId w:val="16"/>
@@ -13467,7 +14248,7 @@
     </w:p>
     <w:p>
       <w:pPr>
-        <w:pStyle w:val="Titre1"/>
+        <w:pStyle w:val="Heading1"/>
       </w:pPr>
       <w:bookmarkStart w:id="72" w:name="_Toc229743656"/>
       <w:bookmarkStart w:id="73" w:name="_Toc250790996"/>
@@ -13490,7 +14271,7 @@
     </w:p>
     <w:p>
       <w:pPr>
-        <w:pStyle w:val="Titre2"/>
+        <w:pStyle w:val="Heading2"/>
       </w:pPr>
       <w:bookmarkStart w:id="74" w:name="_Toc229743657"/>
       <w:r>
@@ -13518,7 +14299,7 @@
     </w:p>
     <w:p>
       <w:pPr>
-        <w:pStyle w:val="Titre2"/>
+        <w:pStyle w:val="Heading2"/>
       </w:pPr>
       <w:bookmarkStart w:id="75" w:name="_Toc229743658"/>
       <w:r>
@@ -13572,7 +14353,7 @@
     </w:p>
     <w:p>
       <w:pPr>
-        <w:pStyle w:val="Titre2"/>
+        <w:pStyle w:val="Heading2"/>
       </w:pPr>
       <w:bookmarkStart w:id="76" w:name="_Toc229743659"/>
       <w:r>
@@ -13621,7 +14402,7 @@
     </w:p>
     <w:p>
       <w:pPr>
-        <w:pStyle w:val="Titre1"/>
+        <w:pStyle w:val="Heading1"/>
         <w:numPr>
           <w:ilvl w:val="0"/>
           <w:numId w:val="16"/>
@@ -13690,7 +14471,7 @@
     </w:p>
     <w:p>
       <w:pPr>
-        <w:pStyle w:val="Titre1"/>
+        <w:pStyle w:val="Heading1"/>
         <w:numPr>
           <w:ilvl w:val="0"/>
           <w:numId w:val="16"/>
@@ -13957,7 +14738,7 @@
     </w:p>
     <w:p>
       <w:pPr>
-        <w:pStyle w:val="Titre1"/>
+        <w:pStyle w:val="Heading1"/>
         <w:numPr>
           <w:ilvl w:val="0"/>
           <w:numId w:val="16"/>
@@ -14180,7 +14961,7 @@
     </w:p>
     <w:p>
       <w:pPr>
-        <w:pStyle w:val="Titre1"/>
+        <w:pStyle w:val="Heading1"/>
         <w:numPr>
           <w:ilvl w:val="0"/>
           <w:numId w:val="16"/>
@@ -14339,10 +15120,10 @@
       </w:r>
     </w:p>
     <w:sectPr>
-      <w:headerReference w:type="default" r:id="rId27"/>
-      <w:footerReference w:type="default" r:id="rId28"/>
-      <w:headerReference w:type="first" r:id="rId29"/>
-      <w:footerReference w:type="first" r:id="rId30"/>
+      <w:headerReference w:type="default" r:id="rId41"/>
+      <w:footerReference w:type="default" r:id="rId42"/>
+      <w:headerReference w:type="first" r:id="rId43"/>
+      <w:footerReference w:type="first" r:id="rId44"/>
       <w:pgSz w:w="11906" w:h="16838" w:code="9"/>
       <w:pgMar w:top="1861" w:right="1134" w:bottom="907" w:left="1701" w:header="851" w:footer="340" w:gutter="0"/>
       <w:cols w:space="708"/>
@@ -14358,11 +15139,11 @@
   <w:comment w:id="4" w:author="Stéphane Schwab" w:date="2025-07-07T16:49:00Z" w:initials="SS">
     <w:p>
       <w:pPr>
-        <w:pStyle w:val="Commentaire"/>
-      </w:pPr>
-      <w:r>
-        <w:rPr>
-          <w:rStyle w:val="Marquedecommentaire"/>
+        <w:pStyle w:val="CommentText"/>
+      </w:pPr>
+      <w:r>
+        <w:rPr>
+          <w:rStyle w:val="CommentReference"/>
         </w:rPr>
         <w:annotationRef/>
       </w:r>
@@ -14431,7 +15212,7 @@
 <w:ftr xmlns:wpc="http://schemas.microsoft.com/office/word/2010/wordprocessingCanvas" xmlns:cx="http://schemas.microsoft.com/office/drawing/2014/chartex" xmlns:cx1="http://schemas.microsoft.com/office/drawing/2015/9/8/chartex" xmlns:cx2="http://schemas.microsoft.com/office/drawing/2015/10/21/chartex" xmlns:cx3="http://schemas.microsoft.com/office/drawing/2016/5/9/chartex" xmlns:cx4="http://schemas.microsoft.com/office/drawing/2016/5/10/chartex" xmlns:cx5="http://schemas.microsoft.com/office/drawing/2016/5/11/chartex" xmlns:cx6="http://schemas.microsoft.com/office/drawing/2016/5/12/chartex" xmlns:cx7="http://schemas.microsoft.com/office/drawing/2016/5/13/chartex" xmlns:cx8="http://schemas.microsoft.com/office/drawing/2016/5/14/chartex" xmlns:mc="http://schemas.openxmlformats.org/markup-compatibility/2006" xmlns:aink="http://schemas.microsoft.com/office/drawing/2016/ink" xmlns:am3d="http://schemas.microsoft.com/office/drawing/2017/model3d" xmlns:o="urn:schemas-microsoft-com:office:office" xmlns:oel="http://schemas.microsoft.com/office/2019/extlst" xmlns:r="http://schemas.openxmlformats.org/officeDocument/2006/relationships" xmlns:m="http://schemas.openxmlformats.org/officeDocument/2006/math" xmlns:v="urn:schemas-microsoft-com:vml" xmlns:wp14="http://schemas.microsoft.com/office/word/2010/wordprocessingDrawing" xmlns:wp="http://schemas.openxmlformats.org/drawingml/2006/wordprocessingDrawing" xmlns:w10="urn:schemas-microsoft-com:office:word" xmlns:w="http://schemas.openxmlformats.org/wordprocessingml/2006/main" xmlns:w14="http://schemas.microsoft.com/office/word/2010/wordml" xmlns:w15="http://schemas.microsoft.com/office/word/2012/wordml" xmlns:w16cex="http://schemas.microsoft.com/office/word/2018/wordml/cex" xmlns:w16cid="http://schemas.microsoft.com/office/word/2016/wordml/cid" xmlns:w16="http://schemas.microsoft.com/office/word/2018/wordml" xmlns:w16du="http://schemas.microsoft.com/office/word/2023/wordml/word16du" xmlns:w16sdtdh="http://schemas.microsoft.com/office/word/2020/wordml/sdtdatahash" xmlns:w16sdtfl="http://schemas.microsoft.com/office/word/2024/wordml/sdtformatlock" xmlns:w16se="http://schemas.microsoft.com/office/word/2015/wordml/symex" xmlns:wpg="http://schemas.microsoft.com/office/word/2010/wordprocessingGroup" xmlns:wpi="http://schemas.microsoft.com/office/word/2010/wordprocessingInk" xmlns:wne="http://schemas.microsoft.com/office/word/2006/wordml" xmlns:wps="http://schemas.microsoft.com/office/word/2010/wordprocessingShape" mc:Ignorable="w14 w15 w16se w16cid w16 w16cex w16sdtdh w16sdtfl w16du wp14">
   <w:p>
     <w:pPr>
-      <w:pStyle w:val="Pieddepage"/>
+      <w:pStyle w:val="Footer"/>
     </w:pPr>
   </w:p>
 </w:ftr>
@@ -14465,7 +15246,7 @@
         </w:tcPr>
         <w:tbl>
           <w:tblPr>
-            <w:tblStyle w:val="Grilledutableau"/>
+            <w:tblStyle w:val="TableGrid"/>
             <w:tblW w:w="9781" w:type="dxa"/>
             <w:tblBorders>
               <w:top w:val="none" w:sz="0" w:space="0" w:color="auto"/>
@@ -14674,7 +15455,7 @@
                   <w:rPr>
                     <w:lang w:val="fr-CH"/>
                   </w:rPr>
-                  <w:t>15.05.2026 14:28</w:t>
+                  <w:t>15.05.2026 18:02</w:t>
                 </w:r>
                 <w:r>
                   <w:rPr>
@@ -14703,7 +15484,7 @@
   </w:tbl>
   <w:p>
     <w:pPr>
-      <w:pStyle w:val="Pieddepage"/>
+      <w:pStyle w:val="Footer"/>
     </w:pPr>
   </w:p>
 </w:ftr>
@@ -14713,7 +15494,7 @@
 <w:ftr xmlns:wpc="http://schemas.microsoft.com/office/word/2010/wordprocessingCanvas" xmlns:cx="http://schemas.microsoft.com/office/drawing/2014/chartex" xmlns:cx1="http://schemas.microsoft.com/office/drawing/2015/9/8/chartex" xmlns:cx2="http://schemas.microsoft.com/office/drawing/2015/10/21/chartex" xmlns:cx3="http://schemas.microsoft.com/office/drawing/2016/5/9/chartex" xmlns:cx4="http://schemas.microsoft.com/office/drawing/2016/5/10/chartex" xmlns:cx5="http://schemas.microsoft.com/office/drawing/2016/5/11/chartex" xmlns:cx6="http://schemas.microsoft.com/office/drawing/2016/5/12/chartex" xmlns:cx7="http://schemas.microsoft.com/office/drawing/2016/5/13/chartex" xmlns:cx8="http://schemas.microsoft.com/office/drawing/2016/5/14/chartex" xmlns:mc="http://schemas.openxmlformats.org/markup-compatibility/2006" xmlns:aink="http://schemas.microsoft.com/office/drawing/2016/ink" xmlns:am3d="http://schemas.microsoft.com/office/drawing/2017/model3d" xmlns:o="urn:schemas-microsoft-com:office:office" xmlns:oel="http://schemas.microsoft.com/office/2019/extlst" xmlns:r="http://schemas.openxmlformats.org/officeDocument/2006/relationships" xmlns:m="http://schemas.openxmlformats.org/officeDocument/2006/math" xmlns:v="urn:schemas-microsoft-com:vml" xmlns:wp14="http://schemas.microsoft.com/office/word/2010/wordprocessingDrawing" xmlns:wp="http://schemas.openxmlformats.org/drawingml/2006/wordprocessingDrawing" xmlns:w10="urn:schemas-microsoft-com:office:word" xmlns:w="http://schemas.openxmlformats.org/wordprocessingml/2006/main" xmlns:w14="http://schemas.microsoft.com/office/word/2010/wordml" xmlns:w15="http://schemas.microsoft.com/office/word/2012/wordml" xmlns:w16cex="http://schemas.microsoft.com/office/word/2018/wordml/cex" xmlns:w16cid="http://schemas.microsoft.com/office/word/2016/wordml/cid" xmlns:w16="http://schemas.microsoft.com/office/word/2018/wordml" xmlns:w16du="http://schemas.microsoft.com/office/word/2023/wordml/word16du" xmlns:w16sdtdh="http://schemas.microsoft.com/office/word/2020/wordml/sdtdatahash" xmlns:w16sdtfl="http://schemas.microsoft.com/office/word/2024/wordml/sdtformatlock" xmlns:w16se="http://schemas.microsoft.com/office/word/2015/wordml/symex" xmlns:wpg="http://schemas.microsoft.com/office/word/2010/wordprocessingGroup" xmlns:wpi="http://schemas.microsoft.com/office/word/2010/wordprocessingInk" xmlns:wne="http://schemas.microsoft.com/office/word/2006/wordml" xmlns:wps="http://schemas.microsoft.com/office/word/2010/wordprocessingShape" mc:Ignorable="w14 w15 w16se w16cid w16 w16cex w16sdtdh w16sdtfl w16du wp14">
   <w:p>
     <w:pPr>
-      <w:pStyle w:val="Pieddepage"/>
+      <w:pStyle w:val="Footer"/>
     </w:pPr>
     <w:r>
       <w:fldChar w:fldCharType="begin"/>
@@ -14813,7 +15594,7 @@
         </w:tcPr>
         <w:tbl>
           <w:tblPr>
-            <w:tblStyle w:val="Grilledutableau"/>
+            <w:tblStyle w:val="TableGrid"/>
             <w:tblW w:w="0" w:type="auto"/>
             <w:tblBorders>
               <w:top w:val="none" w:sz="0" w:space="0" w:color="auto"/>
@@ -15001,7 +15782,7 @@
                   <w:rPr>
                     <w:lang w:val="fr-CH"/>
                   </w:rPr>
-                  <w:t>15.05.2026 14:28</w:t>
+                  <w:t>15.05.2026 18:02</w:t>
                 </w:r>
                 <w:r>
                   <w:rPr>
@@ -15062,7 +15843,7 @@
         </w:tcPr>
         <w:tbl>
           <w:tblPr>
-            <w:tblStyle w:val="Grilledutableau"/>
+            <w:tblStyle w:val="TableGrid"/>
             <w:tblW w:w="0" w:type="auto"/>
             <w:tblBorders>
               <w:top w:val="none" w:sz="0" w:space="0" w:color="auto"/>
@@ -15252,7 +16033,7 @@
                   <w:rPr>
                     <w:lang w:val="fr-CH"/>
                   </w:rPr>
-                  <w:t>15.05.2026 14:28</w:t>
+                  <w:t>15.05.2026 18:02</w:t>
                 </w:r>
                 <w:r>
                   <w:rPr>
@@ -15331,7 +16112,7 @@
 <w:hdr xmlns:wpc="http://schemas.microsoft.com/office/word/2010/wordprocessingCanvas" xmlns:cx="http://schemas.microsoft.com/office/drawing/2014/chartex" xmlns:cx1="http://schemas.microsoft.com/office/drawing/2015/9/8/chartex" xmlns:cx2="http://schemas.microsoft.com/office/drawing/2015/10/21/chartex" xmlns:cx3="http://schemas.microsoft.com/office/drawing/2016/5/9/chartex" xmlns:cx4="http://schemas.microsoft.com/office/drawing/2016/5/10/chartex" xmlns:cx5="http://schemas.microsoft.com/office/drawing/2016/5/11/chartex" xmlns:cx6="http://schemas.microsoft.com/office/drawing/2016/5/12/chartex" xmlns:cx7="http://schemas.microsoft.com/office/drawing/2016/5/13/chartex" xmlns:cx8="http://schemas.microsoft.com/office/drawing/2016/5/14/chartex" xmlns:mc="http://schemas.openxmlformats.org/markup-compatibility/2006" xmlns:aink="http://schemas.microsoft.com/office/drawing/2016/ink" xmlns:am3d="http://schemas.microsoft.com/office/drawing/2017/model3d" xmlns:o="urn:schemas-microsoft-com:office:office" xmlns:oel="http://schemas.microsoft.com/office/2019/extlst" xmlns:r="http://schemas.openxmlformats.org/officeDocument/2006/relationships" xmlns:m="http://schemas.openxmlformats.org/officeDocument/2006/math" xmlns:v="urn:schemas-microsoft-com:vml" xmlns:wp14="http://schemas.microsoft.com/office/word/2010/wordprocessingDrawing" xmlns:wp="http://schemas.openxmlformats.org/drawingml/2006/wordprocessingDrawing" xmlns:w10="urn:schemas-microsoft-com:office:word" xmlns:w="http://schemas.openxmlformats.org/wordprocessingml/2006/main" xmlns:w14="http://schemas.microsoft.com/office/word/2010/wordml" xmlns:w15="http://schemas.microsoft.com/office/word/2012/wordml" xmlns:w16cex="http://schemas.microsoft.com/office/word/2018/wordml/cex" xmlns:w16cid="http://schemas.microsoft.com/office/word/2016/wordml/cid" xmlns:w16="http://schemas.microsoft.com/office/word/2018/wordml" xmlns:w16du="http://schemas.microsoft.com/office/word/2023/wordml/word16du" xmlns:w16sdtdh="http://schemas.microsoft.com/office/word/2020/wordml/sdtdatahash" xmlns:w16sdtfl="http://schemas.microsoft.com/office/word/2024/wordml/sdtformatlock" xmlns:w16se="http://schemas.microsoft.com/office/word/2015/wordml/symex" xmlns:wpg="http://schemas.microsoft.com/office/word/2010/wordprocessingGroup" xmlns:wpi="http://schemas.microsoft.com/office/word/2010/wordprocessingInk" xmlns:wne="http://schemas.microsoft.com/office/word/2006/wordml" xmlns:wps="http://schemas.microsoft.com/office/word/2010/wordprocessingShape" mc:Ignorable="w14 w15 w16se w16cid w16 w16cex w16sdtdh w16sdtfl w16du wp14">
   <w:p>
     <w:pPr>
-      <w:pStyle w:val="En-tte"/>
+      <w:pStyle w:val="Header"/>
     </w:pPr>
   </w:p>
 </w:hdr>
@@ -15341,7 +16122,7 @@
 <w:hdr xmlns:wpc="http://schemas.microsoft.com/office/word/2010/wordprocessingCanvas" xmlns:cx="http://schemas.microsoft.com/office/drawing/2014/chartex" xmlns:cx1="http://schemas.microsoft.com/office/drawing/2015/9/8/chartex" xmlns:cx2="http://schemas.microsoft.com/office/drawing/2015/10/21/chartex" xmlns:cx3="http://schemas.microsoft.com/office/drawing/2016/5/9/chartex" xmlns:cx4="http://schemas.microsoft.com/office/drawing/2016/5/10/chartex" xmlns:cx5="http://schemas.microsoft.com/office/drawing/2016/5/11/chartex" xmlns:cx6="http://schemas.microsoft.com/office/drawing/2016/5/12/chartex" xmlns:cx7="http://schemas.microsoft.com/office/drawing/2016/5/13/chartex" xmlns:cx8="http://schemas.microsoft.com/office/drawing/2016/5/14/chartex" xmlns:mc="http://schemas.openxmlformats.org/markup-compatibility/2006" xmlns:aink="http://schemas.microsoft.com/office/drawing/2016/ink" xmlns:am3d="http://schemas.microsoft.com/office/drawing/2017/model3d" xmlns:o="urn:schemas-microsoft-com:office:office" xmlns:oel="http://schemas.microsoft.com/office/2019/extlst" xmlns:r="http://schemas.openxmlformats.org/officeDocument/2006/relationships" xmlns:m="http://schemas.openxmlformats.org/officeDocument/2006/math" xmlns:v="urn:schemas-microsoft-com:vml" xmlns:wp14="http://schemas.microsoft.com/office/word/2010/wordprocessingDrawing" xmlns:wp="http://schemas.openxmlformats.org/drawingml/2006/wordprocessingDrawing" xmlns:w10="urn:schemas-microsoft-com:office:word" xmlns:w="http://schemas.openxmlformats.org/wordprocessingml/2006/main" xmlns:w14="http://schemas.microsoft.com/office/word/2010/wordml" xmlns:w15="http://schemas.microsoft.com/office/word/2012/wordml" xmlns:w16cex="http://schemas.microsoft.com/office/word/2018/wordml/cex" xmlns:w16cid="http://schemas.microsoft.com/office/word/2016/wordml/cid" xmlns:w16="http://schemas.microsoft.com/office/word/2018/wordml" xmlns:w16du="http://schemas.microsoft.com/office/word/2023/wordml/word16du" xmlns:w16sdtdh="http://schemas.microsoft.com/office/word/2020/wordml/sdtdatahash" xmlns:w16sdtfl="http://schemas.microsoft.com/office/word/2024/wordml/sdtformatlock" xmlns:w16se="http://schemas.microsoft.com/office/word/2015/wordml/symex" xmlns:wpg="http://schemas.microsoft.com/office/word/2010/wordprocessingGroup" xmlns:wpi="http://schemas.microsoft.com/office/word/2010/wordprocessingInk" xmlns:wne="http://schemas.microsoft.com/office/word/2006/wordml" xmlns:wps="http://schemas.microsoft.com/office/word/2010/wordprocessingShape" mc:Ignorable="w14 w15 w16se w16cid w16 w16cex w16sdtdh w16sdtfl w16du wp14">
   <w:p>
     <w:pPr>
-      <w:pStyle w:val="En-tte"/>
+      <w:pStyle w:val="Header"/>
     </w:pPr>
   </w:p>
 </w:hdr>
@@ -15351,7 +16132,7 @@
 <w:hdr xmlns:wpc="http://schemas.microsoft.com/office/word/2010/wordprocessingCanvas" xmlns:cx="http://schemas.microsoft.com/office/drawing/2014/chartex" xmlns:cx1="http://schemas.microsoft.com/office/drawing/2015/9/8/chartex" xmlns:cx2="http://schemas.microsoft.com/office/drawing/2015/10/21/chartex" xmlns:cx3="http://schemas.microsoft.com/office/drawing/2016/5/9/chartex" xmlns:cx4="http://schemas.microsoft.com/office/drawing/2016/5/10/chartex" xmlns:cx5="http://schemas.microsoft.com/office/drawing/2016/5/11/chartex" xmlns:cx6="http://schemas.microsoft.com/office/drawing/2016/5/12/chartex" xmlns:cx7="http://schemas.microsoft.com/office/drawing/2016/5/13/chartex" xmlns:cx8="http://schemas.microsoft.com/office/drawing/2016/5/14/chartex" xmlns:mc="http://schemas.openxmlformats.org/markup-compatibility/2006" xmlns:aink="http://schemas.microsoft.com/office/drawing/2016/ink" xmlns:am3d="http://schemas.microsoft.com/office/drawing/2017/model3d" xmlns:o="urn:schemas-microsoft-com:office:office" xmlns:oel="http://schemas.microsoft.com/office/2019/extlst" xmlns:r="http://schemas.openxmlformats.org/officeDocument/2006/relationships" xmlns:m="http://schemas.openxmlformats.org/officeDocument/2006/math" xmlns:v="urn:schemas-microsoft-com:vml" xmlns:wp14="http://schemas.microsoft.com/office/word/2010/wordprocessingDrawing" xmlns:wp="http://schemas.openxmlformats.org/drawingml/2006/wordprocessingDrawing" xmlns:w10="urn:schemas-microsoft-com:office:word" xmlns:w="http://schemas.openxmlformats.org/wordprocessingml/2006/main" xmlns:w14="http://schemas.microsoft.com/office/word/2010/wordml" xmlns:w15="http://schemas.microsoft.com/office/word/2012/wordml" xmlns:w16cex="http://schemas.microsoft.com/office/word/2018/wordml/cex" xmlns:w16cid="http://schemas.microsoft.com/office/word/2016/wordml/cid" xmlns:w16="http://schemas.microsoft.com/office/word/2018/wordml" xmlns:w16du="http://schemas.microsoft.com/office/word/2023/wordml/word16du" xmlns:w16sdtdh="http://schemas.microsoft.com/office/word/2020/wordml/sdtdatahash" xmlns:w16sdtfl="http://schemas.microsoft.com/office/word/2024/wordml/sdtformatlock" xmlns:w16se="http://schemas.microsoft.com/office/word/2015/wordml/symex" xmlns:wpg="http://schemas.microsoft.com/office/word/2010/wordprocessingGroup" xmlns:wpi="http://schemas.microsoft.com/office/word/2010/wordprocessingInk" xmlns:wne="http://schemas.microsoft.com/office/word/2006/wordml" xmlns:wps="http://schemas.microsoft.com/office/word/2010/wordprocessingShape" mc:Ignorable="w14 w15 w16se w16cid w16 w16cex w16sdtdh w16sdtfl w16du wp14">
   <w:p>
     <w:pPr>
-      <w:pStyle w:val="En-tte"/>
+      <w:pStyle w:val="Header"/>
     </w:pPr>
   </w:p>
 </w:hdr>
@@ -15603,7 +16384,7 @@
   </w:p>
   <w:p>
     <w:pPr>
-      <w:pStyle w:val="En-tte"/>
+      <w:pStyle w:val="Header"/>
       <w:tabs>
         <w:tab w:val="left" w:pos="5550"/>
       </w:tabs>
@@ -15955,7 +16736,7 @@
     <w:lvl w:ilvl="0">
       <w:start w:val="1"/>
       <w:numFmt w:val="decimal"/>
-      <w:pStyle w:val="Titre1"/>
+      <w:pStyle w:val="Heading1"/>
       <w:lvlText w:val="%1"/>
       <w:lvlJc w:val="left"/>
       <w:pPr>
@@ -15971,7 +16752,7 @@
     <w:lvl w:ilvl="1">
       <w:start w:val="1"/>
       <w:numFmt w:val="decimal"/>
-      <w:pStyle w:val="Titre2"/>
+      <w:pStyle w:val="Heading2"/>
       <w:lvlText w:val="%1.%2"/>
       <w:lvlJc w:val="left"/>
       <w:pPr>
@@ -15984,7 +16765,7 @@
     <w:lvl w:ilvl="2">
       <w:start w:val="1"/>
       <w:numFmt w:val="decimal"/>
-      <w:pStyle w:val="Titre3"/>
+      <w:pStyle w:val="Heading3"/>
       <w:lvlText w:val="%1.%2.%3"/>
       <w:lvlJc w:val="left"/>
       <w:pPr>
@@ -15997,7 +16778,7 @@
     <w:lvl w:ilvl="3">
       <w:start w:val="1"/>
       <w:numFmt w:val="decimal"/>
-      <w:pStyle w:val="Titre4"/>
+      <w:pStyle w:val="Heading4"/>
       <w:lvlText w:val="%1.%2.%3.%4"/>
       <w:lvlJc w:val="left"/>
       <w:pPr>
@@ -16010,7 +16791,7 @@
     <w:lvl w:ilvl="4">
       <w:start w:val="1"/>
       <w:numFmt w:val="decimal"/>
-      <w:pStyle w:val="Titre5"/>
+      <w:pStyle w:val="Heading5"/>
       <w:lvlText w:val="%1.%2.%3.%4.%5"/>
       <w:lvlJc w:val="left"/>
       <w:pPr>
@@ -16023,7 +16804,7 @@
     <w:lvl w:ilvl="5">
       <w:start w:val="1"/>
       <w:numFmt w:val="decimal"/>
-      <w:pStyle w:val="Titre6"/>
+      <w:pStyle w:val="Heading6"/>
       <w:lvlText w:val="%1.%2.%3.%4.%5.%6"/>
       <w:lvlJc w:val="left"/>
       <w:pPr>
@@ -16036,7 +16817,7 @@
     <w:lvl w:ilvl="6">
       <w:start w:val="1"/>
       <w:numFmt w:val="decimal"/>
-      <w:pStyle w:val="Titre7"/>
+      <w:pStyle w:val="Heading7"/>
       <w:lvlText w:val="%1.%2.%3.%4.%5.%6.%7"/>
       <w:lvlJc w:val="left"/>
       <w:pPr>
@@ -16049,7 +16830,7 @@
     <w:lvl w:ilvl="7">
       <w:start w:val="1"/>
       <w:numFmt w:val="decimal"/>
-      <w:pStyle w:val="Titre8"/>
+      <w:pStyle w:val="Heading8"/>
       <w:lvlText w:val="%1.%2.%3.%4.%5.%6.%7.%8"/>
       <w:lvlJc w:val="left"/>
       <w:pPr>
@@ -16062,7 +16843,7 @@
     <w:lvl w:ilvl="8">
       <w:start w:val="1"/>
       <w:numFmt w:val="decimal"/>
-      <w:pStyle w:val="Titre9"/>
+      <w:pStyle w:val="Heading9"/>
       <w:lvlText w:val="%1.%2.%3.%4.%5.%6.%7.%8.%9"/>
       <w:lvlJc w:val="left"/>
       <w:pPr>
@@ -18444,7 +19225,7 @@
       <w:lang w:eastAsia="de-DE"/>
     </w:rPr>
   </w:style>
-  <w:style w:type="paragraph" w:styleId="Titre1">
+  <w:style w:type="paragraph" w:styleId="Heading1">
     <w:name w:val="heading 1"/>
     <w:basedOn w:val="Normal"/>
     <w:next w:val="BITTextkrper"/>
@@ -18472,7 +19253,7 @@
       <w:lang w:val="de-DE"/>
     </w:rPr>
   </w:style>
-  <w:style w:type="paragraph" w:styleId="Titre2">
+  <w:style w:type="paragraph" w:styleId="Heading2">
     <w:name w:val="heading 2"/>
     <w:basedOn w:val="Normal"/>
     <w:next w:val="BITTextkrper"/>
@@ -18496,7 +19277,7 @@
       <w:sz w:val="28"/>
     </w:rPr>
   </w:style>
-  <w:style w:type="paragraph" w:styleId="Titre3">
+  <w:style w:type="paragraph" w:styleId="Heading3">
     <w:name w:val="heading 3"/>
     <w:basedOn w:val="Normal"/>
     <w:next w:val="BITTextkrper"/>
@@ -18518,7 +19299,7 @@
       <w:sz w:val="22"/>
     </w:rPr>
   </w:style>
-  <w:style w:type="paragraph" w:styleId="Titre4">
+  <w:style w:type="paragraph" w:styleId="Heading4">
     <w:name w:val="heading 4"/>
     <w:basedOn w:val="Normal"/>
     <w:next w:val="BITTextkrper"/>
@@ -18540,7 +19321,7 @@
       <w:szCs w:val="28"/>
     </w:rPr>
   </w:style>
-  <w:style w:type="paragraph" w:styleId="Titre5">
+  <w:style w:type="paragraph" w:styleId="Heading5">
     <w:name w:val="heading 5"/>
     <w:basedOn w:val="Normal"/>
     <w:next w:val="BITTextkrper"/>
@@ -18563,7 +19344,7 @@
       <w:szCs w:val="26"/>
     </w:rPr>
   </w:style>
-  <w:style w:type="paragraph" w:styleId="Titre6">
+  <w:style w:type="paragraph" w:styleId="Heading6">
     <w:name w:val="heading 6"/>
     <w:basedOn w:val="Normal"/>
     <w:next w:val="Normal"/>
@@ -18584,7 +19365,7 @@
       <w:szCs w:val="22"/>
     </w:rPr>
   </w:style>
-  <w:style w:type="paragraph" w:styleId="Titre7">
+  <w:style w:type="paragraph" w:styleId="Heading7">
     <w:name w:val="heading 7"/>
     <w:basedOn w:val="Normal"/>
     <w:next w:val="Normal"/>
@@ -18602,7 +19383,7 @@
       <w:sz w:val="22"/>
     </w:rPr>
   </w:style>
-  <w:style w:type="paragraph" w:styleId="Titre8">
+  <w:style w:type="paragraph" w:styleId="Heading8">
     <w:name w:val="heading 8"/>
     <w:basedOn w:val="Normal"/>
     <w:next w:val="Normal"/>
@@ -18621,7 +19402,7 @@
       <w:sz w:val="22"/>
     </w:rPr>
   </w:style>
-  <w:style w:type="paragraph" w:styleId="Titre9">
+  <w:style w:type="paragraph" w:styleId="Heading9">
     <w:name w:val="heading 9"/>
     <w:basedOn w:val="Normal"/>
     <w:next w:val="Normal"/>
@@ -18641,13 +19422,13 @@
       <w:szCs w:val="22"/>
     </w:rPr>
   </w:style>
-  <w:style w:type="character" w:default="1" w:styleId="Policepardfaut">
+  <w:style w:type="character" w:default="1" w:styleId="DefaultParagraphFont">
     <w:name w:val="Default Paragraph Font"/>
     <w:uiPriority w:val="1"/>
     <w:semiHidden/>
     <w:unhideWhenUsed/>
   </w:style>
-  <w:style w:type="table" w:default="1" w:styleId="TableauNormal">
+  <w:style w:type="table" w:default="1" w:styleId="TableNormal">
     <w:name w:val="Normal Table"/>
     <w:uiPriority w:val="99"/>
     <w:semiHidden/>
@@ -18662,7 +19443,7 @@
       </w:tblCellMar>
     </w:tblPr>
   </w:style>
-  <w:style w:type="numbering" w:default="1" w:styleId="Aucuneliste">
+  <w:style w:type="numbering" w:default="1" w:styleId="NoList">
     <w:name w:val="No List"/>
     <w:uiPriority w:val="99"/>
     <w:semiHidden/>
@@ -18679,7 +19460,7 @@
       <w:sz w:val="22"/>
     </w:rPr>
   </w:style>
-  <w:style w:type="paragraph" w:styleId="En-tte">
+  <w:style w:type="paragraph" w:styleId="Header">
     <w:name w:val="header"/>
     <w:basedOn w:val="Normal"/>
     <w:rsid w:val="006F1A78"/>
@@ -18693,7 +19474,7 @@
       <w:lang w:eastAsia="de-CH"/>
     </w:rPr>
   </w:style>
-  <w:style w:type="paragraph" w:styleId="Pieddepage">
+  <w:style w:type="paragraph" w:styleId="Footer">
     <w:name w:val="footer"/>
     <w:basedOn w:val="Normal"/>
     <w:rsid w:val="006F1A78"/>
@@ -18731,7 +19512,7 @@
       <w:sz w:val="15"/>
     </w:rPr>
   </w:style>
-  <w:style w:type="paragraph" w:styleId="Titre">
+  <w:style w:type="paragraph" w:styleId="Title">
     <w:name w:val="Title"/>
     <w:basedOn w:val="Normal"/>
     <w:next w:val="Normal"/>
@@ -18750,9 +19531,9 @@
       <w:szCs w:val="32"/>
     </w:rPr>
   </w:style>
-  <w:style w:type="paragraph" w:styleId="Sous-titre">
+  <w:style w:type="paragraph" w:styleId="Subtitle">
     <w:name w:val="Subtitle"/>
-    <w:basedOn w:val="Titre"/>
+    <w:basedOn w:val="Title"/>
     <w:next w:val="Normal"/>
     <w:qFormat/>
     <w:rsid w:val="006F1A78"/>
@@ -18802,10 +19583,10 @@
   </w:style>
   <w:style w:type="paragraph" w:customStyle="1" w:styleId="CDBHierarchie">
     <w:name w:val="CDB_Hierarchie"/>
-    <w:basedOn w:val="En-tte"/>
+    <w:basedOn w:val="Header"/>
     <w:rsid w:val="006F1A78"/>
   </w:style>
-  <w:style w:type="paragraph" w:styleId="TM4">
+  <w:style w:type="paragraph" w:styleId="TOC4">
     <w:name w:val="toc 4"/>
     <w:basedOn w:val="Normal"/>
     <w:next w:val="Normal"/>
@@ -18933,7 +19714,7 @@
       <w:lang w:eastAsia="en-US"/>
     </w:rPr>
   </w:style>
-  <w:style w:type="paragraph" w:styleId="TM1">
+  <w:style w:type="paragraph" w:styleId="TOC1">
     <w:name w:val="toc 1"/>
     <w:basedOn w:val="Normal"/>
     <w:next w:val="Normal"/>
@@ -18952,7 +19733,7 @@
       <w:sz w:val="22"/>
     </w:rPr>
   </w:style>
-  <w:style w:type="paragraph" w:styleId="TM2">
+  <w:style w:type="paragraph" w:styleId="TOC2">
     <w:name w:val="toc 2"/>
     <w:basedOn w:val="Normal"/>
     <w:next w:val="Normal"/>
@@ -18994,7 +19775,7 @@
       <w:bCs/>
     </w:rPr>
   </w:style>
-  <w:style w:type="paragraph" w:styleId="TM3">
+  <w:style w:type="paragraph" w:styleId="TOC3">
     <w:name w:val="toc 3"/>
     <w:basedOn w:val="Normal"/>
     <w:next w:val="Normal"/>
@@ -19011,9 +19792,9 @@
       <w:sz w:val="22"/>
     </w:rPr>
   </w:style>
-  <w:style w:type="character" w:styleId="Lienhypertexte">
+  <w:style w:type="character" w:styleId="Hyperlink">
     <w:name w:val="Hyperlink"/>
-    <w:basedOn w:val="Policepardfaut"/>
+    <w:basedOn w:val="DefaultParagraphFont"/>
     <w:uiPriority w:val="99"/>
     <w:rsid w:val="006F1A78"/>
     <w:rPr>
@@ -19021,7 +19802,7 @@
       <w:u w:val="single"/>
     </w:rPr>
   </w:style>
-  <w:style w:type="paragraph" w:styleId="Lgende">
+  <w:style w:type="paragraph" w:styleId="Caption">
     <w:name w:val="caption"/>
     <w:basedOn w:val="Normal"/>
     <w:next w:val="BITTextkrper"/>
@@ -19068,7 +19849,7 @@
   </w:style>
   <w:style w:type="character" w:customStyle="1" w:styleId="BITTextkrperfettChar">
     <w:name w:val="_BIT_Textkörper_fett Char"/>
-    <w:basedOn w:val="Policepardfaut"/>
+    <w:basedOn w:val="DefaultParagraphFont"/>
     <w:rsid w:val="006F1A78"/>
     <w:rPr>
       <w:rFonts w:ascii="Arial" w:hAnsi="Arial"/>
@@ -19080,7 +19861,7 @@
   </w:style>
   <w:style w:type="character" w:customStyle="1" w:styleId="BITTextkrperkursivChar">
     <w:name w:val="_BIT_Textkörper_kursiv Char"/>
-    <w:basedOn w:val="Policepardfaut"/>
+    <w:basedOn w:val="DefaultParagraphFont"/>
     <w:rsid w:val="006F1A78"/>
     <w:rPr>
       <w:rFonts w:ascii="Arial" w:hAnsi="Arial"/>
@@ -19129,7 +19910,7 @@
       <w:sz w:val="22"/>
     </w:rPr>
   </w:style>
-  <w:style w:type="paragraph" w:styleId="TM5">
+  <w:style w:type="paragraph" w:styleId="TOC5">
     <w:name w:val="toc 5"/>
     <w:basedOn w:val="Normal"/>
     <w:next w:val="Normal"/>
@@ -19140,7 +19921,7 @@
       <w:ind w:left="800"/>
     </w:pPr>
   </w:style>
-  <w:style w:type="paragraph" w:styleId="TM6">
+  <w:style w:type="paragraph" w:styleId="TOC6">
     <w:name w:val="toc 6"/>
     <w:basedOn w:val="Normal"/>
     <w:next w:val="Normal"/>
@@ -19151,7 +19932,7 @@
       <w:ind w:left="1000"/>
     </w:pPr>
   </w:style>
-  <w:style w:type="paragraph" w:styleId="TM7">
+  <w:style w:type="paragraph" w:styleId="TOC7">
     <w:name w:val="toc 7"/>
     <w:basedOn w:val="Normal"/>
     <w:next w:val="Normal"/>
@@ -19162,7 +19943,7 @@
       <w:ind w:left="1200"/>
     </w:pPr>
   </w:style>
-  <w:style w:type="paragraph" w:styleId="TM8">
+  <w:style w:type="paragraph" w:styleId="TOC8">
     <w:name w:val="toc 8"/>
     <w:basedOn w:val="Normal"/>
     <w:next w:val="Normal"/>
@@ -19173,7 +19954,7 @@
       <w:ind w:left="1400"/>
     </w:pPr>
   </w:style>
-  <w:style w:type="paragraph" w:styleId="TM9">
+  <w:style w:type="paragraph" w:styleId="TOC9">
     <w:name w:val="toc 9"/>
     <w:basedOn w:val="Normal"/>
     <w:next w:val="Normal"/>
@@ -19239,7 +20020,7 @@
   </w:style>
   <w:style w:type="character" w:customStyle="1" w:styleId="Hinweistext">
     <w:name w:val="Hinweistext"/>
-    <w:basedOn w:val="Policepardfaut"/>
+    <w:basedOn w:val="DefaultParagraphFont"/>
     <w:rsid w:val="00D344D9"/>
     <w:rPr>
       <w:rFonts w:ascii="Arial" w:hAnsi="Arial" w:cs="Arial"/>
@@ -19271,7 +20052,7 @@
   </w:style>
   <w:style w:type="paragraph" w:customStyle="1" w:styleId="TitelohneNummer">
     <w:name w:val="Titel ohne Nummer"/>
-    <w:basedOn w:val="Titre"/>
+    <w:basedOn w:val="Title"/>
     <w:next w:val="BITTextkrper"/>
     <w:rsid w:val="005479BD"/>
     <w:pPr>
@@ -19322,7 +20103,7 @@
   </w:style>
   <w:style w:type="character" w:customStyle="1" w:styleId="Verzeichnisberschrift2Char">
     <w:name w:val="Verzeichnisüberschrift 2 Char"/>
-    <w:basedOn w:val="Policepardfaut"/>
+    <w:basedOn w:val="DefaultParagraphFont"/>
     <w:link w:val="Verzeichnisberschrift2"/>
     <w:rsid w:val="008E791F"/>
     <w:rPr>
@@ -19333,9 +20114,9 @@
       <w:lang w:val="de-CH" w:eastAsia="de-DE" w:bidi="ar-SA"/>
     </w:rPr>
   </w:style>
-  <w:style w:type="table" w:styleId="Grilledutableau">
+  <w:style w:type="table" w:styleId="TableGrid">
     <w:name w:val="Table Grid"/>
-    <w:basedOn w:val="TableauNormal"/>
+    <w:basedOn w:val="TableNormal"/>
     <w:rsid w:val="00391E8B"/>
     <w:pPr>
       <w:spacing w:before="60" w:after="60"/>
@@ -19351,10 +20132,10 @@
       </w:tblBorders>
     </w:tblPr>
   </w:style>
-  <w:style w:type="paragraph" w:styleId="Textedebulles">
+  <w:style w:type="paragraph" w:styleId="BalloonText">
     <w:name w:val="Balloon Text"/>
     <w:basedOn w:val="Normal"/>
-    <w:link w:val="TextedebullesCar"/>
+    <w:link w:val="BalloonTextChar"/>
     <w:uiPriority w:val="99"/>
     <w:semiHidden/>
     <w:unhideWhenUsed/>
@@ -19368,10 +20149,10 @@
       <w:szCs w:val="16"/>
     </w:rPr>
   </w:style>
-  <w:style w:type="character" w:customStyle="1" w:styleId="TextedebullesCar">
-    <w:name w:val="Texte de bulles Car"/>
-    <w:basedOn w:val="Policepardfaut"/>
-    <w:link w:val="Textedebulles"/>
+  <w:style w:type="character" w:customStyle="1" w:styleId="BalloonTextChar">
+    <w:name w:val="Balloon Text Char"/>
+    <w:basedOn w:val="DefaultParagraphFont"/>
+    <w:link w:val="BalloonText"/>
     <w:uiPriority w:val="99"/>
     <w:semiHidden/>
     <w:rsid w:val="00383EAE"/>
@@ -19402,7 +20183,7 @@
   </w:style>
   <w:style w:type="character" w:customStyle="1" w:styleId="Puce1Car">
     <w:name w:val="Puce 1 Car"/>
-    <w:basedOn w:val="Policepardfaut"/>
+    <w:basedOn w:val="DefaultParagraphFont"/>
     <w:link w:val="Puce1"/>
     <w:rsid w:val="00030FFE"/>
     <w:rPr>
@@ -19412,9 +20193,9 @@
       <w:lang w:val="fr-FR" w:eastAsia="en-US"/>
     </w:rPr>
   </w:style>
-  <w:style w:type="character" w:styleId="Textedelespacerserv">
+  <w:style w:type="character" w:styleId="PlaceholderText">
     <w:name w:val="Placeholder Text"/>
-    <w:basedOn w:val="Policepardfaut"/>
+    <w:basedOn w:val="DefaultParagraphFont"/>
     <w:uiPriority w:val="99"/>
     <w:semiHidden/>
     <w:rsid w:val="00920673"/>
@@ -19422,9 +20203,9 @@
       <w:color w:val="808080"/>
     </w:rPr>
   </w:style>
-  <w:style w:type="character" w:styleId="Marquedecommentaire">
+  <w:style w:type="character" w:styleId="CommentReference">
     <w:name w:val="annotation reference"/>
-    <w:basedOn w:val="Policepardfaut"/>
+    <w:basedOn w:val="DefaultParagraphFont"/>
     <w:uiPriority w:val="99"/>
     <w:semiHidden/>
     <w:unhideWhenUsed/>
@@ -19434,10 +20215,10 @@
       <w:szCs w:val="16"/>
     </w:rPr>
   </w:style>
-  <w:style w:type="paragraph" w:styleId="Commentaire">
+  <w:style w:type="paragraph" w:styleId="CommentText">
     <w:name w:val="annotation text"/>
     <w:basedOn w:val="Normal"/>
-    <w:link w:val="CommentaireCar"/>
+    <w:link w:val="CommentTextChar"/>
     <w:uiPriority w:val="99"/>
     <w:unhideWhenUsed/>
     <w:rsid w:val="00245BBE"/>
@@ -19445,10 +20226,10 @@
       <w:szCs w:val="20"/>
     </w:rPr>
   </w:style>
-  <w:style w:type="character" w:customStyle="1" w:styleId="CommentaireCar">
-    <w:name w:val="Commentaire Car"/>
-    <w:basedOn w:val="Policepardfaut"/>
-    <w:link w:val="Commentaire"/>
+  <w:style w:type="character" w:customStyle="1" w:styleId="CommentTextChar">
+    <w:name w:val="Comment Text Char"/>
+    <w:basedOn w:val="DefaultParagraphFont"/>
+    <w:link w:val="CommentText"/>
     <w:uiPriority w:val="99"/>
     <w:rsid w:val="00245BBE"/>
     <w:rPr>
@@ -19456,11 +20237,11 @@
       <w:lang w:eastAsia="de-DE"/>
     </w:rPr>
   </w:style>
-  <w:style w:type="paragraph" w:styleId="Objetducommentaire">
+  <w:style w:type="paragraph" w:styleId="CommentSubject">
     <w:name w:val="annotation subject"/>
-    <w:basedOn w:val="Commentaire"/>
-    <w:next w:val="Commentaire"/>
-    <w:link w:val="ObjetducommentaireCar"/>
+    <w:basedOn w:val="CommentText"/>
+    <w:next w:val="CommentText"/>
+    <w:link w:val="CommentSubjectChar"/>
     <w:uiPriority w:val="99"/>
     <w:semiHidden/>
     <w:unhideWhenUsed/>
@@ -19470,10 +20251,10 @@
       <w:bCs/>
     </w:rPr>
   </w:style>
-  <w:style w:type="character" w:customStyle="1" w:styleId="ObjetducommentaireCar">
-    <w:name w:val="Objet du commentaire Car"/>
-    <w:basedOn w:val="CommentaireCar"/>
-    <w:link w:val="Objetducommentaire"/>
+  <w:style w:type="character" w:customStyle="1" w:styleId="CommentSubjectChar">
+    <w:name w:val="Comment Subject Char"/>
+    <w:basedOn w:val="CommentTextChar"/>
+    <w:link w:val="CommentSubject"/>
     <w:uiPriority w:val="99"/>
     <w:semiHidden/>
     <w:rsid w:val="00245BBE"/>
@@ -19527,7 +20308,7 @@
           </w:pPr>
           <w:r>
             <w:rPr>
-              <w:rStyle w:val="Textedelespacerserv"/>
+              <w:rStyle w:val="PlaceholderText"/>
             </w:rPr>
             <w:t>[Auteur ]</w:t>
           </w:r>
@@ -19596,17 +20377,12 @@
     <w:pitch w:val="variable"/>
     <w:sig w:usb0="E00006FF" w:usb1="420024FF" w:usb2="02000000" w:usb3="00000000" w:csb0="0000019F" w:csb1="00000000"/>
   </w:font>
-  <w:font w:name="Aptos">
+  <w:font w:name="Calibri Light">
+    <w:panose1 w:val="020F0302020204030204"/>
     <w:charset w:val="00"/>
     <w:family w:val="swiss"/>
     <w:pitch w:val="variable"/>
-    <w:sig w:usb0="20000287" w:usb1="00000003" w:usb2="00000000" w:usb3="00000000" w:csb0="0000019F" w:csb1="00000000"/>
-  </w:font>
-  <w:font w:name="Aptos Display">
-    <w:charset w:val="00"/>
-    <w:family w:val="swiss"/>
-    <w:pitch w:val="variable"/>
-    <w:sig w:usb0="20000287" w:usb1="00000003" w:usb2="00000000" w:usb3="00000000" w:csb0="0000019F" w:csb1="00000000"/>
+    <w:sig w:usb0="E4002EFF" w:usb1="C200247B" w:usb2="00000009" w:usb3="00000000" w:csb0="000001FF" w:csb1="00000000"/>
   </w:font>
 </w:fonts>
 </file>
@@ -19636,6 +20412,7 @@
     <w:rsid w:val="003366A8"/>
     <w:rsid w:val="003C52E4"/>
     <w:rsid w:val="00477435"/>
+    <w:rsid w:val="005021BB"/>
     <w:rsid w:val="00540217"/>
     <w:rsid w:val="006930A9"/>
     <w:rsid w:val="006D7F9F"/>
@@ -19647,6 +20424,7 @@
     <w:rsid w:val="00AD1A8F"/>
     <w:rsid w:val="00B250B0"/>
     <w:rsid w:val="00B503AF"/>
+    <w:rsid w:val="00B515CE"/>
     <w:rsid w:val="00BC344B"/>
     <w:rsid w:val="00BE5347"/>
     <w:rsid w:val="00CD64D8"/>
@@ -19676,7 +20454,7 @@
   </m:mathPr>
   <w:themeFontLang w:val="fr-CH"/>
   <w:clrSchemeMapping w:bg1="light1" w:t1="dark1" w:bg2="light2" w:t2="dark2" w:accent1="accent1" w:accent2="accent2" w:accent3="accent3" w:accent4="accent4" w:accent5="accent5" w:accent6="accent6" w:hyperlink="hyperlink" w:followedHyperlink="followedHyperlink"/>
-  <w:decimalSymbol w:val="."/>
+  <w:decimalSymbol w:val=","/>
   <w:listSeparator w:val=";"/>
   <w15:chartTrackingRefBased/>
 </w:settings>
@@ -20087,13 +20865,13 @@
       <w:szCs w:val="3276"/>
     </w:rPr>
   </w:style>
-  <w:style w:type="character" w:default="1" w:styleId="Policepardfaut">
+  <w:style w:type="character" w:default="1" w:styleId="DefaultParagraphFont">
     <w:name w:val="Default Paragraph Font"/>
     <w:uiPriority w:val="1"/>
     <w:semiHidden/>
     <w:unhideWhenUsed/>
   </w:style>
-  <w:style w:type="table" w:default="1" w:styleId="TableauNormal">
+  <w:style w:type="table" w:default="1" w:styleId="TableNormal">
     <w:name w:val="Normal Table"/>
     <w:uiPriority w:val="99"/>
     <w:semiHidden/>
@@ -20108,15 +20886,15 @@
       </w:tblCellMar>
     </w:tblPr>
   </w:style>
-  <w:style w:type="numbering" w:default="1" w:styleId="Aucuneliste">
+  <w:style w:type="numbering" w:default="1" w:styleId="NoList">
     <w:name w:val="No List"/>
     <w:uiPriority w:val="99"/>
     <w:semiHidden/>
     <w:unhideWhenUsed/>
   </w:style>
-  <w:style w:type="character" w:styleId="Textedelespacerserv">
+  <w:style w:type="character" w:styleId="PlaceholderText">
     <w:name w:val="Placeholder Text"/>
-    <w:basedOn w:val="Policepardfaut"/>
+    <w:basedOn w:val="DefaultParagraphFont"/>
     <w:uiPriority w:val="99"/>
     <w:semiHidden/>
     <w:rsid w:val="00540217"/>

</xml_diff>

<commit_message>
feat(server): début de l'implémentation du backend
Avancement du rapport et des diagrammes.
</commit_message>
<xml_diff>
--- a/doc/GAMEZ_rapport_TPI.docx
+++ b/doc/GAMEZ_rapport_TPI.docx
@@ -5023,11 +5023,7 @@
               </w:rPr>
             </w:pPr>
             <w:r>
-              <w:rPr>
-                <w:szCs w:val="22"/>
-                <w:lang w:val="fr-CH"/>
-              </w:rPr>
-              <w:t>Interface responsive et code maintenable</w:t>
+              <w:t>Interface ergonomique et code maintenable</w:t>
             </w:r>
           </w:p>
         </w:tc>
@@ -5058,11 +5054,7 @@
               </w:rPr>
             </w:pPr>
             <w:r>
-              <w:rPr>
-                <w:szCs w:val="22"/>
-                <w:lang w:val="fr-CH"/>
-              </w:rPr>
-              <w:t>Affichage adapté desktop et mobile, code commenté, pattern MVC ou parente</w:t>
+              <w:t>Interface adaptée aux écrans desktop, code commenté, pattern MVC ou équivalent</w:t>
             </w:r>
           </w:p>
         </w:tc>
@@ -6021,7 +6013,13 @@
         <w:rPr>
           <w:lang w:val="fr-CH"/>
         </w:rPr>
-        <w:t xml:space="preserve">Le diagramme ci-dessus représente l’ensemble des cas d’utilisation de l’application CodeMentor et les acteurs qui les déclenchent. Deux acteurs humains apparaissent : le « Visiteur », qui correspond à toute personne arrivant sur l’application sans être authentifiée, et l’« Utilisateur », qui hérite du Visiteur une fois la connexion via GitHub OAuth réalisée. Trois acteurs externes complètent le système : l’API GitHub pour l’authentification et la récupération du code, l’API OpenRouter pour l’analyse par intelligence artificielle, et la base de données interne pour la persistance des projets et de leurs </w:t>
+        <w:t>Le diagramme ci-dessus représente l’ensemble des cas d’utilisation de l’application CodeMentor et les acteurs qui les déclenchent. Deux acteurs humains apparaissent : le « Visiteur », qui correspond à toute personne arrivant sur l’application sans être authentifiée, et l’« Utilisateur », qui hérite du Visiteur une fois la connexion via GitHub OAuth réalisée. Trois acteurs externes complètent le système : l’API GitHub pour l’authentification et la récupération du code, l’API OpenRouter pour l’analyse par int</w:t>
+      </w:r>
+      <w:r>
+        <w:rPr>
+          <w:lang w:val="fr-CH"/>
+        </w:rPr>
+        <w:t xml:space="preserve">elligence artificielle, et la base de données interne pour la persistance des projets et de leurs </w:t>
       </w:r>
       <w:r>
         <w:rPr>
@@ -6505,7 +6503,13 @@
         <w:rPr>
           <w:lang w:val="fr-CH"/>
         </w:rPr>
-        <w:t xml:space="preserve">’existence du dépôt (« Dépôt GitHub détecté ? ») puis les permissions de lecture de l’utilisateur sur ce dépôt. En cas d’échec sur l’une ou l’autre vérification, un message d’erreur dédié est affiché (dépôt introuvable ou accès refusé). Si les deux conditions sont remplies, le projet est créé dans CodeMentor et l’utilisateur est redirigé vers sa page </w:t>
+        <w:t>’existence du dépôt (« Dépôt GitHub détecté ? ») puis les permissions de lecture de l’utilisateur sur ce dépôt. En cas d’échec sur l’une ou l’autre vérification, un message d’erreur dédié est affiché (dépôt introuvable ou accès refusé). Si les deux</w:t>
+      </w:r>
+      <w:r>
+        <w:rPr>
+          <w:lang w:val="fr-CH"/>
+        </w:rPr>
+        <w:t xml:space="preserve"> conditions sont remplies, le projet est créé dans CodeMentor et l’utilisateur est redirigé vers sa page </w:t>
       </w:r>
       <w:r>
         <w:rPr>
@@ -6615,7 +6619,13 @@
         <w:rPr>
           <w:lang w:val="fr-CH"/>
         </w:rPr>
-        <w:t xml:space="preserve"> non, l’utilisateur dispose de trois actions parallèles sur les résultats consolidés : consulter les explications du code, dérouler les erreurs détectées et leurs suggestions de correction, et visualiser le diagramme structurel généré. Cette logique reflète directement le contenu de l’écran « Résultats d’analyse » présenté dans la section Maquette Web.</w:t>
+        <w:t xml:space="preserve"> non, l’utilisateur dispose de trois actions parallèles sur les résultats consolidés : consulter les explications du code, dérouler les erreurs détectées et leurs suggestions de correction, et visualiser le diagramme structurel généré. Cette logique reflète directement le contenu de l’é</w:t>
+      </w:r>
+      <w:r>
+        <w:rPr>
+          <w:lang w:val="fr-CH"/>
+        </w:rPr>
+        <w:t>cran « Résultats d’analyse » présenté dans la section Maquette Web.</w:t>
       </w:r>
     </w:p>
     <w:p>
@@ -6719,7 +6729,13 @@
         <w:rPr>
           <w:lang w:val="fr-CH"/>
         </w:rPr>
-        <w:t>e n’est qu’après confirmation explicite que le projet et toutes ses analyses associées sont effectivement supprimés. L’utilisateur est ensuite renvoyé vers la liste mise à jour de ses projets.</w:t>
+        <w:t>e n’est qu’après confirmation ex</w:t>
+      </w:r>
+      <w:r>
+        <w:rPr>
+          <w:lang w:val="fr-CH"/>
+        </w:rPr>
+        <w:t>plicite que le projet et toutes ses analyses associées sont effectivement supprimés. L’utilisateur est ensuite renvoyé vers la liste mise à jour de ses projets.</w:t>
       </w:r>
     </w:p>
     <w:p>
@@ -6957,6 +6973,7 @@
       </w:pPr>
       <w:r>
         <w:rPr>
+          <w:noProof/>
           <w:lang w:val="fr-CH"/>
         </w:rPr>
         <w:lastRenderedPageBreak/>
@@ -7112,6 +7129,7 @@
       </w:pPr>
       <w:r>
         <w:rPr>
+          <w:noProof/>
           <w:lang w:val="fr-CH"/>
         </w:rPr>
         <w:lastRenderedPageBreak/>
@@ -7195,6 +7213,7 @@
       </w:pPr>
       <w:r>
         <w:rPr>
+          <w:noProof/>
           <w:lang w:val="fr-CH"/>
         </w:rPr>
         <w:lastRenderedPageBreak/>
@@ -7272,6 +7291,7 @@
       </w:pPr>
       <w:r>
         <w:rPr>
+          <w:noProof/>
           <w:lang w:val="fr-CH"/>
         </w:rPr>
         <w:lastRenderedPageBreak/>
@@ -7331,7 +7351,13 @@
         <w:rPr>
           <w:lang w:val="fr-CH"/>
         </w:rPr>
-        <w:t>Page dédiée à un dépôt sélectionné (ici « my-awesome-repo »), affichant ses métadonnées principales : langage, visibilité, nombre d’étoiles et date de création. La section « Historique des analyses » récapitule dans un tableau toutes les analyses lancées sur le projet avec leur identifiant, leur date, leur statut (succès, échec) et le nombre d’erreurs détectées. Les boutons « Voir sur GitHub » et « Lancer une analyse » permettent respectivement d’ouvrir le dépôt en ligne ou de déclencher une nouvelle analyse, tandis que « Consulter » réouvre les résultats d’une analyse passée.</w:t>
+        <w:t>Page dédiée à un dépôt sélectionné (ici « my-awesome-repo »), affichant ses métadonnées principales : langage, visibilité, nombre d’étoiles et date de création. La section « Historique des analyses » récapitule dans un tableau toutes les analyses lancées sur le projet avec leur identifiant, leur date, leur statut (succès, échec) et le nombre d’erreurs détectées. Les boutons « Voir sur GitHub » et « Lancer une analyse » permettent respectivement d’ouvrir le dépôt en ligne ou de déclencher une nouvelle analys</w:t>
+      </w:r>
+      <w:r>
+        <w:rPr>
+          <w:lang w:val="fr-CH"/>
+        </w:rPr>
+        <w:t>e, tandis que « Consulter » réouvre les résultats d’une analyse passée.</w:t>
       </w:r>
     </w:p>
     <w:p>
@@ -7467,23 +7493,1179 @@
     </w:p>
     <w:p>
       <w:pPr>
+        <w:pStyle w:val="Heading3"/>
+      </w:pPr>
+      <w:r>
+        <w:t>Conception de l’API REST</w:t>
+      </w:r>
+    </w:p>
+    <w:p>
+      <w:pPr>
         <w:pStyle w:val="BITTextkrper"/>
-        <w:rPr>
-          <w:i/>
-          <w:iCs/>
-          <w:color w:val="A6A6A6" w:themeColor="background1" w:themeShade="A6"/>
-        </w:rPr>
-      </w:pPr>
-      <w:r>
-        <w:rPr>
-          <w:i/>
-          <w:iCs/>
-          <w:color w:val="A6A6A6" w:themeColor="background1" w:themeShade="A6"/>
-          <w:highlight w:val="yellow"/>
-        </w:rPr>
-        <w:t>Phases, étapes clés</w:t>
-      </w:r>
-    </w:p>
+        <w:jc w:val="both"/>
+        <w:rPr>
+          <w:lang w:val="fr-CH"/>
+        </w:rPr>
+      </w:pPr>
+      <w:r>
+        <w:rPr>
+          <w:lang w:val="fr-CH"/>
+        </w:rPr>
+        <w:t>L’API REST de CodeMentor expose les fonctionnalités de l’application sous forme d’endpoints HTTP consommés par le frontend Vue.js. Toutes les réponses sont au format JSON et la documentation interactive de l’API est générée avec Swagger, accessible sur l’URL /api/docs.</w:t>
+      </w:r>
+    </w:p>
+    <w:p>
+      <w:pPr>
+        <w:pStyle w:val="BITTextkrper"/>
+        <w:jc w:val="both"/>
+        <w:rPr>
+          <w:lang w:val="fr-CH"/>
+        </w:rPr>
+      </w:pPr>
+      <w:r>
+        <w:t>L’authentification repose sur une session HTTP-only ouverte après le flux OAuth GitHub. Toutes les routes en dehors de /auth/* requièrent une session valide et retournent un code 401 sinon. Une ressource qui appartient à un autre utilisateur est traitée comme inexistante (code 404) pour éviter toute fuite d’information.</w:t>
+      </w:r>
+    </w:p>
+    <w:p>
+      <w:pPr>
+        <w:pStyle w:val="BITTextkrper"/>
+        <w:jc w:val="both"/>
+        <w:rPr>
+          <w:b/>
+          <w:bCs/>
+        </w:rPr>
+      </w:pPr>
+      <w:r>
+        <w:rPr>
+          <w:b/>
+          <w:bCs/>
+        </w:rPr>
+        <w:t>Authentification</w:t>
+      </w:r>
+      <w:r>
+        <w:rPr>
+          <w:b/>
+          <w:bCs/>
+        </w:rPr>
+        <w:t xml:space="preserve"> :</w:t>
+      </w:r>
+    </w:p>
+    <w:p>
+      <w:pPr>
+        <w:pStyle w:val="BITBullet1"/>
+      </w:pPr>
+      <w:r>
+        <w:rPr>
+          <w:b/>
+          <w:bCs/>
+        </w:rPr>
+        <w:t>GET /auth/github/login</w:t>
+      </w:r>
+      <w:r>
+        <w:t xml:space="preserve"> </w:t>
+      </w:r>
+      <w:r>
+        <w:t>:</w:t>
+      </w:r>
+      <w:r>
+        <w:t xml:space="preserve"> redirige vers le flux OAuth GitHub.</w:t>
+      </w:r>
+    </w:p>
+    <w:p>
+      <w:pPr>
+        <w:pStyle w:val="BITBullet1"/>
+        <w:rPr>
+          <w:lang w:val="fr-CH"/>
+        </w:rPr>
+      </w:pPr>
+      <w:r>
+        <w:rPr>
+          <w:b/>
+          <w:bCs/>
+          <w:lang w:val="fr-CH"/>
+        </w:rPr>
+        <w:t>GET /auth/github/callback</w:t>
+      </w:r>
+      <w:r>
+        <w:rPr>
+          <w:lang w:val="fr-CH"/>
+        </w:rPr>
+        <w:t> :</w:t>
+      </w:r>
+      <w:r>
+        <w:rPr>
+          <w:lang w:val="fr-CH"/>
+        </w:rPr>
+        <w:t xml:space="preserve"> reçoit le code GitHub, crée ou met à jour l’utilisateur et ouvre la session.</w:t>
+      </w:r>
+    </w:p>
+    <w:p>
+      <w:pPr>
+        <w:pStyle w:val="BITBullet1"/>
+        <w:rPr>
+          <w:lang w:val="fr-CH"/>
+        </w:rPr>
+      </w:pPr>
+      <w:r>
+        <w:rPr>
+          <w:b/>
+          <w:bCs/>
+          <w:lang w:val="fr-CH"/>
+        </w:rPr>
+        <w:t>POST /auth/logout</w:t>
+      </w:r>
+      <w:r>
+        <w:rPr>
+          <w:lang w:val="fr-CH"/>
+        </w:rPr>
+        <w:t> :</w:t>
+      </w:r>
+      <w:r>
+        <w:rPr>
+          <w:lang w:val="fr-CH"/>
+        </w:rPr>
+        <w:t xml:space="preserve"> termine la session (code 204).</w:t>
+      </w:r>
+    </w:p>
+    <w:p>
+      <w:pPr>
+        <w:pStyle w:val="BITTextkrper"/>
+        <w:jc w:val="both"/>
+        <w:rPr>
+          <w:b/>
+          <w:bCs/>
+        </w:rPr>
+      </w:pPr>
+      <w:r>
+        <w:rPr>
+          <w:b/>
+          <w:bCs/>
+        </w:rPr>
+        <w:t>Projets</w:t>
+      </w:r>
+      <w:r>
+        <w:rPr>
+          <w:b/>
+          <w:bCs/>
+        </w:rPr>
+        <w:t xml:space="preserve"> : </w:t>
+      </w:r>
+    </w:p>
+    <w:p>
+      <w:pPr>
+        <w:pStyle w:val="BITBullet1"/>
+        <w:rPr>
+          <w:lang w:val="fr-CH"/>
+        </w:rPr>
+      </w:pPr>
+      <w:r>
+        <w:rPr>
+          <w:b/>
+          <w:bCs/>
+          <w:lang w:val="fr-CH"/>
+        </w:rPr>
+        <w:t>GET /projects</w:t>
+      </w:r>
+      <w:r>
+        <w:rPr>
+          <w:lang w:val="fr-CH"/>
+        </w:rPr>
+        <w:t> :</w:t>
+      </w:r>
+      <w:r>
+        <w:rPr>
+          <w:lang w:val="fr-CH"/>
+        </w:rPr>
+        <w:t xml:space="preserve"> liste les projets de l’utilisateur.</w:t>
+      </w:r>
+    </w:p>
+    <w:p>
+      <w:pPr>
+        <w:pStyle w:val="BITBullet1"/>
+        <w:rPr>
+          <w:lang w:val="fr-CH"/>
+        </w:rPr>
+      </w:pPr>
+      <w:r>
+        <w:rPr>
+          <w:b/>
+          <w:bCs/>
+          <w:lang w:val="fr-CH"/>
+        </w:rPr>
+        <w:t>POST /projects</w:t>
+      </w:r>
+      <w:r>
+        <w:rPr>
+          <w:lang w:val="fr-CH"/>
+        </w:rPr>
+        <w:t> :</w:t>
+      </w:r>
+      <w:r>
+        <w:rPr>
+          <w:lang w:val="fr-CH"/>
+        </w:rPr>
+        <w:t xml:space="preserve"> ajoute un projet à partir d’une URL GitHub. Renvoie 201 si tout va bien, 404 si le dépôt est introuvable, 403 si l’utilisateur n’a pas accès au dépôt, 409 si le projet existe déjà pour cet utilisateur.</w:t>
+      </w:r>
+    </w:p>
+    <w:p>
+      <w:pPr>
+        <w:pStyle w:val="BITBullet1"/>
+        <w:rPr>
+          <w:lang w:val="fr-CH"/>
+        </w:rPr>
+      </w:pPr>
+      <w:r>
+        <w:t>GET /projects/:id : détail d’un projet, de ses métadonnées GitHub et de son historique d’analyses.</w:t>
+      </w:r>
+    </w:p>
+    <w:p>
+      <w:pPr>
+        <w:pStyle w:val="BITBullet1"/>
+        <w:rPr>
+          <w:lang w:val="fr-CH"/>
+        </w:rPr>
+      </w:pPr>
+      <w:r>
+        <w:rPr>
+          <w:b/>
+          <w:bCs/>
+          <w:lang w:val="fr-CH"/>
+        </w:rPr>
+        <w:lastRenderedPageBreak/>
+        <w:t>DELETE /projects/:id</w:t>
+      </w:r>
+      <w:r>
+        <w:rPr>
+          <w:lang w:val="fr-CH"/>
+        </w:rPr>
+        <w:t> :</w:t>
+      </w:r>
+      <w:r>
+        <w:rPr>
+          <w:lang w:val="fr-CH"/>
+        </w:rPr>
+        <w:t xml:space="preserve"> supprime le projet et son historique d’analyses. Renvoie 409 si une analyse est en cours sur ce projet, conformément au diagramme d’activité de la suppression.</w:t>
+      </w:r>
+    </w:p>
+    <w:p>
+      <w:pPr>
+        <w:pStyle w:val="BITTextkrper"/>
+        <w:jc w:val="both"/>
+        <w:rPr>
+          <w:b/>
+          <w:bCs/>
+        </w:rPr>
+      </w:pPr>
+      <w:r>
+        <w:rPr>
+          <w:b/>
+          <w:bCs/>
+        </w:rPr>
+        <w:t>Analyses</w:t>
+      </w:r>
+      <w:r>
+        <w:rPr>
+          <w:b/>
+          <w:bCs/>
+        </w:rPr>
+        <w:t xml:space="preserve"> :</w:t>
+      </w:r>
+    </w:p>
+    <w:p>
+      <w:pPr>
+        <w:pStyle w:val="BITBullet1"/>
+        <w:rPr>
+          <w:lang w:val="fr-CH"/>
+        </w:rPr>
+      </w:pPr>
+      <w:r>
+        <w:rPr>
+          <w:b/>
+          <w:bCs/>
+          <w:lang w:val="fr-CH"/>
+        </w:rPr>
+        <w:t>POST /projects/:id/analyses</w:t>
+      </w:r>
+      <w:r>
+        <w:rPr>
+          <w:lang w:val="fr-CH"/>
+        </w:rPr>
+        <w:t> :</w:t>
+      </w:r>
+      <w:r>
+        <w:rPr>
+          <w:lang w:val="fr-CH"/>
+        </w:rPr>
+        <w:t xml:space="preserve"> lance une nouvelle analyse. L’API enregistre l’analyse en base avec le statut queued et renvoie immédiatement le code 202 avec l’identifiant de l’analyse ; le traitement effectif est délégué au worker asynchrone.</w:t>
+      </w:r>
+    </w:p>
+    <w:p>
+      <w:pPr>
+        <w:pStyle w:val="BITBullet1"/>
+        <w:rPr>
+          <w:lang w:val="fr-CH"/>
+        </w:rPr>
+      </w:pPr>
+      <w:r>
+        <w:rPr>
+          <w:lang w:val="fr-CH"/>
+        </w:rPr>
+        <w:t>GET /analyses/:id : résultat complet d’une analyse terminée : vue d’ensemble, fichiers analysés, erreurs détectées avec leurs corrections suggérées et diagramme Mermaid.</w:t>
+      </w:r>
+    </w:p>
+    <w:p>
+      <w:pPr>
+        <w:pStyle w:val="BITBullet1"/>
+        <w:rPr>
+          <w:lang w:val="fr-CH"/>
+        </w:rPr>
+      </w:pPr>
+      <w:r>
+        <w:rPr>
+          <w:b/>
+          <w:bCs/>
+          <w:lang w:val="fr-CH"/>
+        </w:rPr>
+        <w:t>GET /analyses/:id/status</w:t>
+      </w:r>
+      <w:r>
+        <w:rPr>
+          <w:b/>
+          <w:bCs/>
+          <w:lang w:val="fr-CH"/>
+        </w:rPr>
+        <w:t> </w:t>
+      </w:r>
+      <w:r>
+        <w:rPr>
+          <w:lang w:val="fr-CH"/>
+        </w:rPr>
+        <w:t>:</w:t>
+      </w:r>
+      <w:r>
+        <w:rPr>
+          <w:lang w:val="fr-CH"/>
+        </w:rPr>
+        <w:t xml:space="preserve"> endpoint léger interrogé en boucle par le frontend pour afficher la barre de progression ; renvoie le statut courant et le pourcentage d’avancement.</w:t>
+      </w:r>
+    </w:p>
+    <w:p>
+      <w:pPr>
+        <w:pStyle w:val="BITTextkrper"/>
+        <w:jc w:val="both"/>
+        <w:rPr>
+          <w:lang w:val="fr-CH"/>
+        </w:rPr>
+      </w:pPr>
+      <w:r>
+        <w:rPr>
+          <w:lang w:val="fr-CH"/>
+        </w:rPr>
+        <w:t>Les codes HTTP utilisés suivent les conventions REST : 200 pour une lecture, 201 pour une création, 202 pour une création asynchrone, 204 pour une suppression, 400 pour un payload invalide, 401 pour une session manquante, 404 pour une ressource introuvable et 409 pour un conflit (doublon ou analyse en cours).</w:t>
+      </w:r>
+    </w:p>
+    <w:p>
+      <w:pPr>
+        <w:pStyle w:val="Heading3"/>
+      </w:pPr>
+      <w:r>
+        <w:t>Conception des tests</w:t>
+      </w:r>
+    </w:p>
+    <w:tbl>
+      <w:tblPr>
+        <w:tblStyle w:val="TableGrid"/>
+        <w:tblW w:w="0" w:type="auto"/>
+        <w:tblLook w:val="04A0" w:firstRow="1" w:lastRow="0" w:firstColumn="1" w:lastColumn="0" w:noHBand="0" w:noVBand="1"/>
+      </w:tblPr>
+      <w:tblGrid>
+        <w:gridCol w:w="600"/>
+        <w:gridCol w:w="1900"/>
+        <w:gridCol w:w="3263"/>
+        <w:gridCol w:w="3263"/>
+      </w:tblGrid>
+      <w:tr>
+        <w:tc>
+          <w:tcPr>
+            <w:tcW w:w="600" w:type="dxa"/>
+          </w:tcPr>
+          <w:p>
+            <w:r>
+              <w:rPr>
+                <w:b/>
+              </w:rPr>
+              <w:t>N°</w:t>
+            </w:r>
+          </w:p>
+        </w:tc>
+        <w:tc>
+          <w:tcPr>
+            <w:tcW w:w="1900" w:type="dxa"/>
+          </w:tcPr>
+          <w:p>
+            <w:r>
+              <w:rPr>
+                <w:b/>
+              </w:rPr>
+              <w:t>Objet testé</w:t>
+            </w:r>
+          </w:p>
+        </w:tc>
+        <w:tc>
+          <w:tcPr>
+            <w:tcW w:w="3263" w:type="dxa"/>
+          </w:tcPr>
+          <w:p>
+            <w:r>
+              <w:rPr>
+                <w:b/>
+              </w:rPr>
+              <w:t>Description du test</w:t>
+            </w:r>
+          </w:p>
+        </w:tc>
+        <w:tc>
+          <w:tcPr>
+            <w:tcW w:w="3263" w:type="dxa"/>
+          </w:tcPr>
+          <w:p>
+            <w:r>
+              <w:rPr>
+                <w:b/>
+              </w:rPr>
+              <w:t>Résultat attendu</w:t>
+            </w:r>
+          </w:p>
+        </w:tc>
+      </w:tr>
+      <w:tr>
+        <w:tc>
+          <w:tcPr>
+            <w:tcW w:w="600" w:type="dxa"/>
+          </w:tcPr>
+          <w:p>
+            <w:r>
+              <w:t>1</w:t>
+            </w:r>
+          </w:p>
+        </w:tc>
+        <w:tc>
+          <w:tcPr>
+            <w:tcW w:w="1900" w:type="dxa"/>
+          </w:tcPr>
+          <w:p>
+            <w:r>
+              <w:t>Connexion GitHub</w:t>
+            </w:r>
+          </w:p>
+        </w:tc>
+        <w:tc>
+          <w:tcPr>
+            <w:tcW w:w="3263" w:type="dxa"/>
+          </w:tcPr>
+          <w:p>
+            <w:r>
+              <w:t>L’utilisateur clique sur « Se connecter » et autorise l’application sur GitHub.</w:t>
+            </w:r>
+          </w:p>
+        </w:tc>
+        <w:tc>
+          <w:tcPr>
+            <w:tcW w:w="3263" w:type="dxa"/>
+          </w:tcPr>
+          <w:p>
+            <w:r>
+              <w:t>L’utilisateur est redirigé vers la liste de ses projets, sa session est active.</w:t>
+            </w:r>
+          </w:p>
+        </w:tc>
+      </w:tr>
+      <w:tr>
+        <w:tc>
+          <w:tcPr>
+            <w:tcW w:w="600" w:type="dxa"/>
+          </w:tcPr>
+          <w:p>
+            <w:r>
+              <w:t>2</w:t>
+            </w:r>
+          </w:p>
+        </w:tc>
+        <w:tc>
+          <w:tcPr>
+            <w:tcW w:w="1900" w:type="dxa"/>
+          </w:tcPr>
+          <w:p>
+            <w:r>
+              <w:t>Déconnexion</w:t>
+            </w:r>
+          </w:p>
+        </w:tc>
+        <w:tc>
+          <w:tcPr>
+            <w:tcW w:w="3263" w:type="dxa"/>
+          </w:tcPr>
+          <w:p>
+            <w:r>
+              <w:t>L’utilisateur authentifié clique sur « Se déconnecter ».</w:t>
+            </w:r>
+          </w:p>
+        </w:tc>
+        <w:tc>
+          <w:tcPr>
+            <w:tcW w:w="3263" w:type="dxa"/>
+          </w:tcPr>
+          <w:p>
+            <w:r>
+              <w:t>La session est fermée et l’utilisateur retourne sur la page de connexion.</w:t>
+            </w:r>
+          </w:p>
+        </w:tc>
+      </w:tr>
+      <w:tr>
+        <w:tc>
+          <w:tcPr>
+            <w:tcW w:w="600" w:type="dxa"/>
+          </w:tcPr>
+          <w:p>
+            <w:r>
+              <w:t>3</w:t>
+            </w:r>
+          </w:p>
+        </w:tc>
+        <w:tc>
+          <w:tcPr>
+            <w:tcW w:w="1900" w:type="dxa"/>
+          </w:tcPr>
+          <w:p>
+            <w:r>
+              <w:t>Liste des projets</w:t>
+            </w:r>
+          </w:p>
+        </w:tc>
+        <w:tc>
+          <w:tcPr>
+            <w:tcW w:w="3263" w:type="dxa"/>
+          </w:tcPr>
+          <w:p>
+            <w:r>
+              <w:t>L’utilisateur consulte sa liste de projets.</w:t>
+            </w:r>
+          </w:p>
+        </w:tc>
+        <w:tc>
+          <w:tcPr>
+            <w:tcW w:w="3263" w:type="dxa"/>
+          </w:tcPr>
+          <w:p>
+            <w:r>
+              <w:t>Ses projets s’affichent avec leur nom, leur langage principal et le nombre d’analyses.</w:t>
+            </w:r>
+          </w:p>
+        </w:tc>
+      </w:tr>
+      <w:tr>
+        <w:tc>
+          <w:tcPr>
+            <w:tcW w:w="600" w:type="dxa"/>
+          </w:tcPr>
+          <w:p>
+            <w:r>
+              <w:t>4</w:t>
+            </w:r>
+          </w:p>
+        </w:tc>
+        <w:tc>
+          <w:tcPr>
+            <w:tcW w:w="1900" w:type="dxa"/>
+          </w:tcPr>
+          <w:p>
+            <w:r>
+              <w:t>Ajout d’un projet valide</w:t>
+            </w:r>
+          </w:p>
+        </w:tc>
+        <w:tc>
+          <w:tcPr>
+            <w:tcW w:w="3263" w:type="dxa"/>
+          </w:tcPr>
+          <w:p>
+            <w:r>
+              <w:t>L’utilisateur saisit l’URL d’un dépôt GitHub auquel il a accès.</w:t>
+            </w:r>
+          </w:p>
+        </w:tc>
+        <w:tc>
+          <w:tcPr>
+            <w:tcW w:w="3263" w:type="dxa"/>
+          </w:tcPr>
+          <w:p>
+            <w:r>
+              <w:t>Le projet est créé et l’utilisateur est redirigé vers la page du projet.</w:t>
+            </w:r>
+          </w:p>
+        </w:tc>
+      </w:tr>
+      <w:tr>
+        <w:tc>
+          <w:tcPr>
+            <w:tcW w:w="600" w:type="dxa"/>
+          </w:tcPr>
+          <w:p>
+            <w:r>
+              <w:t>5</w:t>
+            </w:r>
+          </w:p>
+        </w:tc>
+        <w:tc>
+          <w:tcPr>
+            <w:tcW w:w="1900" w:type="dxa"/>
+          </w:tcPr>
+          <w:p>
+            <w:r>
+              <w:t>Ajout d’un dépôt inexistant</w:t>
+            </w:r>
+          </w:p>
+        </w:tc>
+        <w:tc>
+          <w:tcPr>
+            <w:tcW w:w="3263" w:type="dxa"/>
+          </w:tcPr>
+          <w:p>
+            <w:r>
+              <w:t>L’utilisateur saisit une URL pointant vers un dépôt qui n’existe pas.</w:t>
+            </w:r>
+          </w:p>
+        </w:tc>
+        <w:tc>
+          <w:tcPr>
+            <w:tcW w:w="3263" w:type="dxa"/>
+          </w:tcPr>
+          <w:p>
+            <w:r>
+              <w:t>Un message « dépôt introuvable » est affiché et aucun projet n’est créé.</w:t>
+            </w:r>
+          </w:p>
+        </w:tc>
+      </w:tr>
+      <w:tr>
+        <w:tc>
+          <w:tcPr>
+            <w:tcW w:w="600" w:type="dxa"/>
+          </w:tcPr>
+          <w:p>
+            <w:r>
+              <w:t>6</w:t>
+            </w:r>
+          </w:p>
+        </w:tc>
+        <w:tc>
+          <w:tcPr>
+            <w:tcW w:w="1900" w:type="dxa"/>
+          </w:tcPr>
+          <w:p>
+            <w:r>
+              <w:t>Ajout d’un dépôt sans accès</w:t>
+            </w:r>
+          </w:p>
+        </w:tc>
+        <w:tc>
+          <w:tcPr>
+            <w:tcW w:w="3263" w:type="dxa"/>
+          </w:tcPr>
+          <w:p>
+            <w:r>
+              <w:t>L’utilisateur saisit l’URL d’un dépôt privé auquel il n’a pas accès.</w:t>
+            </w:r>
+          </w:p>
+        </w:tc>
+        <w:tc>
+          <w:tcPr>
+            <w:tcW w:w="3263" w:type="dxa"/>
+          </w:tcPr>
+          <w:p>
+            <w:r>
+              <w:t>Un message « accès refusé » est affiché et aucun projet n’est créé.</w:t>
+            </w:r>
+          </w:p>
+        </w:tc>
+      </w:tr>
+      <w:tr>
+        <w:tc>
+          <w:tcPr>
+            <w:tcW w:w="600" w:type="dxa"/>
+          </w:tcPr>
+          <w:p>
+            <w:r>
+              <w:t>7</w:t>
+            </w:r>
+          </w:p>
+        </w:tc>
+        <w:tc>
+          <w:tcPr>
+            <w:tcW w:w="1900" w:type="dxa"/>
+          </w:tcPr>
+          <w:p>
+            <w:r>
+              <w:t>Ajout d’un projet en doublon</w:t>
+            </w:r>
+          </w:p>
+        </w:tc>
+        <w:tc>
+          <w:tcPr>
+            <w:tcW w:w="3263" w:type="dxa"/>
+          </w:tcPr>
+          <w:p>
+            <w:r>
+              <w:t>L’utilisateur ajoute deux fois le même dépôt sur son compte.</w:t>
+            </w:r>
+          </w:p>
+        </w:tc>
+        <w:tc>
+          <w:tcPr>
+            <w:tcW w:w="3263" w:type="dxa"/>
+          </w:tcPr>
+          <w:p>
+            <w:r>
+              <w:t>Un message « projet déjà existant » est affiché et aucun doublon n’est créé.</w:t>
+            </w:r>
+          </w:p>
+        </w:tc>
+      </w:tr>
+      <w:tr>
+        <w:tc>
+          <w:tcPr>
+            <w:tcW w:w="600" w:type="dxa"/>
+          </w:tcPr>
+          <w:p>
+            <w:r>
+              <w:t>8</w:t>
+            </w:r>
+          </w:p>
+        </w:tc>
+        <w:tc>
+          <w:tcPr>
+            <w:tcW w:w="1900" w:type="dxa"/>
+          </w:tcPr>
+          <w:p>
+            <w:r>
+              <w:t>Consultation d’un projet</w:t>
+            </w:r>
+          </w:p>
+        </w:tc>
+        <w:tc>
+          <w:tcPr>
+            <w:tcW w:w="3263" w:type="dxa"/>
+          </w:tcPr>
+          <w:p>
+            <w:r>
+              <w:t>L’utilisateur ouvre la page de détail d’un projet.</w:t>
+            </w:r>
+          </w:p>
+        </w:tc>
+        <w:tc>
+          <w:tcPr>
+            <w:tcW w:w="3263" w:type="dxa"/>
+          </w:tcPr>
+          <w:p>
+            <w:r>
+              <w:t>Les métadonnées GitHub et l’historique des analyses du projet s’affichent.</w:t>
+            </w:r>
+          </w:p>
+        </w:tc>
+      </w:tr>
+      <w:tr>
+        <w:tc>
+          <w:tcPr>
+            <w:tcW w:w="600" w:type="dxa"/>
+          </w:tcPr>
+          <w:p>
+            <w:r>
+              <w:t>9</w:t>
+            </w:r>
+          </w:p>
+        </w:tc>
+        <w:tc>
+          <w:tcPr>
+            <w:tcW w:w="1900" w:type="dxa"/>
+          </w:tcPr>
+          <w:p>
+            <w:r>
+              <w:t>Lancement d’une analyse</w:t>
+            </w:r>
+          </w:p>
+        </w:tc>
+        <w:tc>
+          <w:tcPr>
+            <w:tcW w:w="3263" w:type="dxa"/>
+          </w:tcPr>
+          <w:p>
+            <w:r>
+              <w:t>L’utilisateur clique sur « Lancer une analyse » depuis la page d’un projet.</w:t>
+            </w:r>
+          </w:p>
+        </w:tc>
+        <w:tc>
+          <w:tcPr>
+            <w:tcW w:w="3263" w:type="dxa"/>
+          </w:tcPr>
+          <w:p>
+            <w:r>
+              <w:t>L’analyse passe au statut « en cours » et l’écran de progression s’affiche.</w:t>
+            </w:r>
+          </w:p>
+        </w:tc>
+      </w:tr>
+      <w:tr>
+        <w:tc>
+          <w:tcPr>
+            <w:tcW w:w="600" w:type="dxa"/>
+          </w:tcPr>
+          <w:p>
+            <w:r>
+              <w:lastRenderedPageBreak/>
+              <w:t>10</w:t>
+            </w:r>
+          </w:p>
+        </w:tc>
+        <w:tc>
+          <w:tcPr>
+            <w:tcW w:w="1900" w:type="dxa"/>
+          </w:tcPr>
+          <w:p>
+            <w:r>
+              <w:t>Suivi de la progression</w:t>
+            </w:r>
+          </w:p>
+        </w:tc>
+        <w:tc>
+          <w:tcPr>
+            <w:tcW w:w="3263" w:type="dxa"/>
+          </w:tcPr>
+          <w:p>
+            <w:pPr>
+              <w:rPr>
+                <w:lang w:val="fr-CH"/>
+              </w:rPr>
+            </w:pPr>
+            <w:r>
+              <w:rPr>
+                <w:lang w:val="fr-CH"/>
+              </w:rPr>
+              <w:t>L’utilisateur reste sur l’écran de progression pendant qu’une analyse est en cours.</w:t>
+            </w:r>
+          </w:p>
+        </w:tc>
+        <w:tc>
+          <w:tcPr>
+            <w:tcW w:w="3263" w:type="dxa"/>
+          </w:tcPr>
+          <w:p>
+            <w:pPr>
+              <w:rPr>
+                <w:lang w:val="fr-CH"/>
+              </w:rPr>
+            </w:pPr>
+            <w:r>
+              <w:rPr>
+                <w:lang w:val="fr-CH"/>
+              </w:rPr>
+              <w:t>La barre de progression se met à jour régulièrement jusqu’à atteindre 100 %.</w:t>
+            </w:r>
+          </w:p>
+        </w:tc>
+      </w:tr>
+      <w:tr>
+        <w:tc>
+          <w:tcPr>
+            <w:tcW w:w="600" w:type="dxa"/>
+          </w:tcPr>
+          <w:p>
+            <w:r>
+              <w:t>11</w:t>
+            </w:r>
+          </w:p>
+        </w:tc>
+        <w:tc>
+          <w:tcPr>
+            <w:tcW w:w="1900" w:type="dxa"/>
+          </w:tcPr>
+          <w:p>
+            <w:r>
+              <w:t>Consultation des résultats</w:t>
+            </w:r>
+          </w:p>
+        </w:tc>
+        <w:tc>
+          <w:tcPr>
+            <w:tcW w:w="3263" w:type="dxa"/>
+          </w:tcPr>
+          <w:p>
+            <w:pPr>
+              <w:rPr>
+                <w:lang w:val="fr-CH"/>
+              </w:rPr>
+            </w:pPr>
+            <w:r>
+              <w:rPr>
+                <w:lang w:val="fr-CH"/>
+              </w:rPr>
+              <w:t>L’utilisateur ouvre une analyse terminée.</w:t>
+            </w:r>
+          </w:p>
+        </w:tc>
+        <w:tc>
+          <w:tcPr>
+            <w:tcW w:w="3263" w:type="dxa"/>
+          </w:tcPr>
+          <w:p>
+            <w:pPr>
+              <w:rPr>
+                <w:lang w:val="fr-CH"/>
+              </w:rPr>
+            </w:pPr>
+            <w:r>
+              <w:rPr>
+                <w:lang w:val="fr-CH"/>
+              </w:rPr>
+              <w:t>Le diagramme Mermaid, la vue d’ensemble et la liste des erreurs avec leurs corrections suggérées s’affichent.</w:t>
+            </w:r>
+          </w:p>
+        </w:tc>
+      </w:tr>
+      <w:tr>
+        <w:tc>
+          <w:tcPr>
+            <w:tcW w:w="600" w:type="dxa"/>
+          </w:tcPr>
+          <w:p>
+            <w:r>
+              <w:t>12</w:t>
+            </w:r>
+          </w:p>
+        </w:tc>
+        <w:tc>
+          <w:tcPr>
+            <w:tcW w:w="1900" w:type="dxa"/>
+          </w:tcPr>
+          <w:p>
+            <w:r>
+              <w:t>Échec d’analyse</w:t>
+            </w:r>
+          </w:p>
+        </w:tc>
+        <w:tc>
+          <w:tcPr>
+            <w:tcW w:w="3263" w:type="dxa"/>
+          </w:tcPr>
+          <w:p>
+            <w:pPr>
+              <w:rPr>
+                <w:lang w:val="fr-CH"/>
+              </w:rPr>
+            </w:pPr>
+            <w:r>
+              <w:rPr>
+                <w:lang w:val="fr-CH"/>
+              </w:rPr>
+              <w:t>L’API OpenRouter renvoie une erreur pendant le traitement d’une analyse.</w:t>
+            </w:r>
+          </w:p>
+        </w:tc>
+        <w:tc>
+          <w:tcPr>
+            <w:tcW w:w="3263" w:type="dxa"/>
+          </w:tcPr>
+          <w:p>
+            <w:pPr>
+              <w:rPr>
+                <w:lang w:val="fr-CH"/>
+              </w:rPr>
+            </w:pPr>
+            <w:r>
+              <w:rPr>
+                <w:lang w:val="fr-CH"/>
+              </w:rPr>
+              <w:t>L’analyse passe au statut « échoué » avec un message d’erreur, sans bloquer le worker.</w:t>
+            </w:r>
+          </w:p>
+        </w:tc>
+      </w:tr>
+      <w:tr>
+        <w:tc>
+          <w:tcPr>
+            <w:tcW w:w="600" w:type="dxa"/>
+          </w:tcPr>
+          <w:p>
+            <w:r>
+              <w:t>13</w:t>
+            </w:r>
+          </w:p>
+        </w:tc>
+        <w:tc>
+          <w:tcPr>
+            <w:tcW w:w="1900" w:type="dxa"/>
+          </w:tcPr>
+          <w:p>
+            <w:r>
+              <w:t>Suppression d’un projet</w:t>
+            </w:r>
+          </w:p>
+        </w:tc>
+        <w:tc>
+          <w:tcPr>
+            <w:tcW w:w="3263" w:type="dxa"/>
+          </w:tcPr>
+          <w:p>
+            <w:pPr>
+              <w:rPr>
+                <w:lang w:val="fr-CH"/>
+              </w:rPr>
+            </w:pPr>
+            <w:r>
+              <w:rPr>
+                <w:lang w:val="fr-CH"/>
+              </w:rPr>
+              <w:t>L’utilisateur supprime un projet qui n’a aucune analyse en cours.</w:t>
+            </w:r>
+          </w:p>
+        </w:tc>
+        <w:tc>
+          <w:tcPr>
+            <w:tcW w:w="3263" w:type="dxa"/>
+          </w:tcPr>
+          <w:p>
+            <w:pPr>
+              <w:rPr>
+                <w:lang w:val="fr-CH"/>
+              </w:rPr>
+            </w:pPr>
+            <w:r>
+              <w:rPr>
+                <w:lang w:val="fr-CH"/>
+              </w:rPr>
+              <w:t>Le projet et son historique d’analyses sont supprimés et la liste est mise à jour.</w:t>
+            </w:r>
+          </w:p>
+        </w:tc>
+      </w:tr>
+      <w:tr>
+        <w:tc>
+          <w:tcPr>
+            <w:tcW w:w="600" w:type="dxa"/>
+          </w:tcPr>
+          <w:p>
+            <w:r>
+              <w:t>14</w:t>
+            </w:r>
+          </w:p>
+        </w:tc>
+        <w:tc>
+          <w:tcPr>
+            <w:tcW w:w="1900" w:type="dxa"/>
+          </w:tcPr>
+          <w:p>
+            <w:r>
+              <w:t>Suppression bloquée</w:t>
+            </w:r>
+          </w:p>
+        </w:tc>
+        <w:tc>
+          <w:tcPr>
+            <w:tcW w:w="3263" w:type="dxa"/>
+          </w:tcPr>
+          <w:p>
+            <w:pPr>
+              <w:rPr>
+                <w:lang w:val="fr-CH"/>
+              </w:rPr>
+            </w:pPr>
+            <w:r>
+              <w:rPr>
+                <w:lang w:val="fr-CH"/>
+              </w:rPr>
+              <w:t>L’utilisateur tente de supprimer un projet pendant qu’une analyse est en cours.</w:t>
+            </w:r>
+          </w:p>
+        </w:tc>
+        <w:tc>
+          <w:tcPr>
+            <w:tcW w:w="3263" w:type="dxa"/>
+          </w:tcPr>
+          <w:p>
+            <w:pPr>
+              <w:rPr>
+                <w:lang w:val="fr-CH"/>
+              </w:rPr>
+            </w:pPr>
+            <w:r>
+              <w:rPr>
+                <w:lang w:val="fr-CH"/>
+              </w:rPr>
+              <w:t>La suppression est refusée avec un message expliquant qu’une analyse est en cours.</w:t>
+            </w:r>
+          </w:p>
+        </w:tc>
+      </w:tr>
+      <w:tr>
+        <w:tc>
+          <w:tcPr>
+            <w:tcW w:w="600" w:type="dxa"/>
+          </w:tcPr>
+          <w:p>
+            <w:r>
+              <w:t>15</w:t>
+            </w:r>
+          </w:p>
+        </w:tc>
+        <w:tc>
+          <w:tcPr>
+            <w:tcW w:w="1900" w:type="dxa"/>
+          </w:tcPr>
+          <w:p>
+            <w:r>
+              <w:t>Accès non authentifié</w:t>
+            </w:r>
+          </w:p>
+        </w:tc>
+        <w:tc>
+          <w:tcPr>
+            <w:tcW w:w="3263" w:type="dxa"/>
+          </w:tcPr>
+          <w:p>
+            <w:pPr>
+              <w:rPr>
+                <w:lang w:val="fr-CH"/>
+              </w:rPr>
+            </w:pPr>
+            <w:r>
+              <w:rPr>
+                <w:lang w:val="fr-CH"/>
+              </w:rPr>
+              <w:t>Un visiteur tente d’accéder directement à une page nécessitant une session.</w:t>
+            </w:r>
+          </w:p>
+        </w:tc>
+        <w:tc>
+          <w:tcPr>
+            <w:tcW w:w="3263" w:type="dxa"/>
+          </w:tcPr>
+          <w:p>
+            <w:pPr>
+              <w:rPr>
+                <w:lang w:val="fr-CH"/>
+              </w:rPr>
+            </w:pPr>
+            <w:r>
+              <w:rPr>
+                <w:lang w:val="fr-CH"/>
+              </w:rPr>
+              <w:t>Il est redirigé vers la page de connexion et la ressource n’est pas exposée.</w:t>
+            </w:r>
+          </w:p>
+        </w:tc>
+      </w:tr>
+    </w:tbl>
     <w:p>
       <w:pPr>
         <w:pStyle w:val="Heading2"/>
@@ -9617,6 +10799,12 @@
                 <w:lang w:val="en-US"/>
               </w:rPr>
               <w:t>NOT NULL, FK → t_project, ON DELETE CASCADE</w:t>
+            </w:r>
+            <w:r>
+              <w:rPr>
+                <w:lang w:val="en-US"/>
+              </w:rPr>
+              <w:t>ss</w:t>
             </w:r>
           </w:p>
         </w:tc>
@@ -15279,6 +16467,7 @@
                 <w:dataBinding w:prefixMappings="xmlns:ns0='http://purl.org/dc/elements/1.1/' xmlns:ns1='http://schemas.openxmlformats.org/package/2006/metadata/core-properties' " w:xpath="/ns1:coreProperties[1]/ns0:creator[1]" w:storeItemID="{6C3C8BC8-F283-45AE-878A-BAB7291924A1}"/>
                 <w:text/>
               </w:sdtPr>
+              <w:sdtEndPr/>
               <w:sdtContent>
                 <w:tc>
                   <w:tcPr>
@@ -15455,7 +16644,7 @@
                   <w:rPr>
                     <w:lang w:val="fr-CH"/>
                   </w:rPr>
-                  <w:t>15.05.2026 18:02</w:t>
+                  <w:t>18.05.2026 16:08</w:t>
                 </w:r>
                 <w:r>
                   <w:rPr>
@@ -15624,6 +16813,7 @@
                 <w:dataBinding w:prefixMappings="xmlns:ns0='http://purl.org/dc/elements/1.1/' xmlns:ns1='http://schemas.openxmlformats.org/package/2006/metadata/core-properties' " w:xpath="/ns1:coreProperties[1]/ns0:creator[1]" w:storeItemID="{6C3C8BC8-F283-45AE-878A-BAB7291924A1}"/>
                 <w:text/>
               </w:sdtPr>
+              <w:sdtEndPr/>
               <w:sdtContent>
                 <w:tc>
                   <w:tcPr>
@@ -15782,7 +16972,7 @@
                   <w:rPr>
                     <w:lang w:val="fr-CH"/>
                   </w:rPr>
-                  <w:t>15.05.2026 18:02</w:t>
+                  <w:t>18.05.2026 16:08</w:t>
                 </w:r>
                 <w:r>
                   <w:rPr>
@@ -15875,6 +17065,7 @@
                 <w:dataBinding w:prefixMappings="xmlns:ns0='http://purl.org/dc/elements/1.1/' xmlns:ns1='http://schemas.openxmlformats.org/package/2006/metadata/core-properties' " w:xpath="/ns1:coreProperties[1]/ns0:creator[1]" w:storeItemID="{6C3C8BC8-F283-45AE-878A-BAB7291924A1}"/>
                 <w:text/>
               </w:sdtPr>
+              <w:sdtEndPr/>
               <w:sdtContent>
                 <w:tc>
                   <w:tcPr>
@@ -16033,7 +17224,7 @@
                   <w:rPr>
                     <w:lang w:val="fr-CH"/>
                   </w:rPr>
-                  <w:t>15.05.2026 18:02</w:t>
+                  <w:t>18.05.2026 16:08</w:t>
                 </w:r>
                 <w:r>
                   <w:rPr>
@@ -19819,12 +21010,13 @@
   <w:style w:type="paragraph" w:customStyle="1" w:styleId="BITBullet1">
     <w:name w:val="_BIT_Bullet_1"/>
     <w:basedOn w:val="Normal"/>
-    <w:rsid w:val="006F1A78"/>
+    <w:rsid w:val="00E35600"/>
     <w:pPr>
       <w:numPr>
         <w:numId w:val="27"/>
       </w:numPr>
       <w:spacing w:after="130"/>
+      <w:jc w:val="both"/>
     </w:pPr>
     <w:rPr>
       <w:rFonts w:cs="Arial"/>
@@ -20410,18 +21602,22 @@
     <w:rsid w:val="00307334"/>
     <w:rsid w:val="00327665"/>
     <w:rsid w:val="003366A8"/>
+    <w:rsid w:val="003656C0"/>
     <w:rsid w:val="003C52E4"/>
     <w:rsid w:val="00477435"/>
     <w:rsid w:val="005021BB"/>
     <w:rsid w:val="00540217"/>
     <w:rsid w:val="006930A9"/>
     <w:rsid w:val="006D7F9F"/>
+    <w:rsid w:val="00723586"/>
     <w:rsid w:val="00803763"/>
     <w:rsid w:val="00834A29"/>
     <w:rsid w:val="00883A3B"/>
+    <w:rsid w:val="00891F8D"/>
     <w:rsid w:val="009B3EBE"/>
     <w:rsid w:val="00A419DC"/>
     <w:rsid w:val="00AD1A8F"/>
+    <w:rsid w:val="00AE4ABD"/>
     <w:rsid w:val="00B250B0"/>
     <w:rsid w:val="00B503AF"/>
     <w:rsid w:val="00B515CE"/>

</xml_diff>

<commit_message>
feat(server): OAuth GitHub, services projet/GitHub et middleware d'authentification
Mise à jour du rapport, du planning et du journal.
</commit_message>
<xml_diff>
--- a/doc/GAMEZ_rapport_TPI.docx
+++ b/doc/GAMEZ_rapport_TPI.docx
@@ -191,7 +191,7 @@
     </w:tbl>
     <w:p>
       <w:pPr>
-        <w:pStyle w:val="Caption"/>
+        <w:pStyle w:val="Lgende"/>
         <w:rPr>
           <w:bCs w:val="0"/>
           <w:sz w:val="24"/>
@@ -533,7 +533,7 @@
     </w:p>
     <w:p>
       <w:pPr>
-        <w:pStyle w:val="Heading3"/>
+        <w:pStyle w:val="Titre3"/>
         <w:numPr>
           <w:ilvl w:val="0"/>
           <w:numId w:val="0"/>
@@ -561,7 +561,7 @@
     </w:p>
     <w:p>
       <w:pPr>
-        <w:pStyle w:val="TOC1"/>
+        <w:pStyle w:val="TM1"/>
         <w:rPr>
           <w:rFonts w:asciiTheme="minorHAnsi" w:eastAsiaTheme="minorEastAsia" w:hAnsiTheme="minorHAnsi" w:cstheme="minorBidi"/>
           <w:b w:val="0"/>
@@ -639,7 +639,7 @@
     </w:p>
     <w:p>
       <w:pPr>
-        <w:pStyle w:val="TOC1"/>
+        <w:pStyle w:val="TM1"/>
         <w:rPr>
           <w:rFonts w:asciiTheme="minorHAnsi" w:eastAsiaTheme="minorEastAsia" w:hAnsiTheme="minorHAnsi" w:cstheme="minorBidi"/>
           <w:b w:val="0"/>
@@ -725,7 +725,7 @@
     </w:p>
     <w:p>
       <w:pPr>
-        <w:pStyle w:val="TOC2"/>
+        <w:pStyle w:val="TM2"/>
         <w:rPr>
           <w:rFonts w:asciiTheme="minorHAnsi" w:eastAsiaTheme="minorEastAsia" w:hAnsiTheme="minorHAnsi" w:cstheme="minorBidi"/>
           <w:kern w:val="2"/>
@@ -788,7 +788,7 @@
     </w:p>
     <w:p>
       <w:pPr>
-        <w:pStyle w:val="TOC2"/>
+        <w:pStyle w:val="TM2"/>
         <w:rPr>
           <w:rFonts w:asciiTheme="minorHAnsi" w:eastAsiaTheme="minorEastAsia" w:hAnsiTheme="minorHAnsi" w:cstheme="minorBidi"/>
           <w:kern w:val="2"/>
@@ -851,7 +851,7 @@
     </w:p>
     <w:p>
       <w:pPr>
-        <w:pStyle w:val="TOC2"/>
+        <w:pStyle w:val="TM2"/>
         <w:rPr>
           <w:rFonts w:asciiTheme="minorHAnsi" w:eastAsiaTheme="minorEastAsia" w:hAnsiTheme="minorHAnsi" w:cstheme="minorBidi"/>
           <w:kern w:val="2"/>
@@ -914,7 +914,7 @@
     </w:p>
     <w:p>
       <w:pPr>
-        <w:pStyle w:val="TOC2"/>
+        <w:pStyle w:val="TM2"/>
         <w:rPr>
           <w:rFonts w:asciiTheme="minorHAnsi" w:eastAsiaTheme="minorEastAsia" w:hAnsiTheme="minorHAnsi" w:cstheme="minorBidi"/>
           <w:kern w:val="2"/>
@@ -977,7 +977,7 @@
     </w:p>
     <w:p>
       <w:pPr>
-        <w:pStyle w:val="TOC1"/>
+        <w:pStyle w:val="TM1"/>
         <w:rPr>
           <w:rFonts w:asciiTheme="minorHAnsi" w:eastAsiaTheme="minorEastAsia" w:hAnsiTheme="minorHAnsi" w:cstheme="minorBidi"/>
           <w:b w:val="0"/>
@@ -1063,7 +1063,7 @@
     </w:p>
     <w:p>
       <w:pPr>
-        <w:pStyle w:val="TOC2"/>
+        <w:pStyle w:val="TM2"/>
         <w:rPr>
           <w:rFonts w:asciiTheme="minorHAnsi" w:eastAsiaTheme="minorEastAsia" w:hAnsiTheme="minorHAnsi" w:cstheme="minorBidi"/>
           <w:kern w:val="2"/>
@@ -1126,7 +1126,7 @@
     </w:p>
     <w:p>
       <w:pPr>
-        <w:pStyle w:val="TOC2"/>
+        <w:pStyle w:val="TM2"/>
         <w:rPr>
           <w:rFonts w:asciiTheme="minorHAnsi" w:eastAsiaTheme="minorEastAsia" w:hAnsiTheme="minorHAnsi" w:cstheme="minorBidi"/>
           <w:kern w:val="2"/>
@@ -1189,7 +1189,7 @@
     </w:p>
     <w:p>
       <w:pPr>
-        <w:pStyle w:val="TOC2"/>
+        <w:pStyle w:val="TM2"/>
         <w:rPr>
           <w:rFonts w:asciiTheme="minorHAnsi" w:eastAsiaTheme="minorEastAsia" w:hAnsiTheme="minorHAnsi" w:cstheme="minorBidi"/>
           <w:kern w:val="2"/>
@@ -1252,7 +1252,7 @@
     </w:p>
     <w:p>
       <w:pPr>
-        <w:pStyle w:val="TOC2"/>
+        <w:pStyle w:val="TM2"/>
         <w:rPr>
           <w:rFonts w:asciiTheme="minorHAnsi" w:eastAsiaTheme="minorEastAsia" w:hAnsiTheme="minorHAnsi" w:cstheme="minorBidi"/>
           <w:kern w:val="2"/>
@@ -1315,7 +1315,7 @@
     </w:p>
     <w:p>
       <w:pPr>
-        <w:pStyle w:val="TOC2"/>
+        <w:pStyle w:val="TM2"/>
         <w:rPr>
           <w:rFonts w:asciiTheme="minorHAnsi" w:eastAsiaTheme="minorEastAsia" w:hAnsiTheme="minorHAnsi" w:cstheme="minorBidi"/>
           <w:kern w:val="2"/>
@@ -1378,7 +1378,7 @@
     </w:p>
     <w:p>
       <w:pPr>
-        <w:pStyle w:val="TOC2"/>
+        <w:pStyle w:val="TM2"/>
         <w:rPr>
           <w:rFonts w:asciiTheme="minorHAnsi" w:eastAsiaTheme="minorEastAsia" w:hAnsiTheme="minorHAnsi" w:cstheme="minorBidi"/>
           <w:kern w:val="2"/>
@@ -1441,7 +1441,7 @@
     </w:p>
     <w:p>
       <w:pPr>
-        <w:pStyle w:val="TOC2"/>
+        <w:pStyle w:val="TM2"/>
         <w:rPr>
           <w:rFonts w:asciiTheme="minorHAnsi" w:eastAsiaTheme="minorEastAsia" w:hAnsiTheme="minorHAnsi" w:cstheme="minorBidi"/>
           <w:kern w:val="2"/>
@@ -1504,7 +1504,7 @@
     </w:p>
     <w:p>
       <w:pPr>
-        <w:pStyle w:val="TOC2"/>
+        <w:pStyle w:val="TM2"/>
         <w:rPr>
           <w:rFonts w:asciiTheme="minorHAnsi" w:eastAsiaTheme="minorEastAsia" w:hAnsiTheme="minorHAnsi" w:cstheme="minorBidi"/>
           <w:kern w:val="2"/>
@@ -1567,7 +1567,7 @@
     </w:p>
     <w:p>
       <w:pPr>
-        <w:pStyle w:val="TOC2"/>
+        <w:pStyle w:val="TM2"/>
         <w:rPr>
           <w:rFonts w:asciiTheme="minorHAnsi" w:eastAsiaTheme="minorEastAsia" w:hAnsiTheme="minorHAnsi" w:cstheme="minorBidi"/>
           <w:kern w:val="2"/>
@@ -1630,7 +1630,7 @@
     </w:p>
     <w:p>
       <w:pPr>
-        <w:pStyle w:val="TOC1"/>
+        <w:pStyle w:val="TM1"/>
         <w:rPr>
           <w:rFonts w:asciiTheme="minorHAnsi" w:eastAsiaTheme="minorEastAsia" w:hAnsiTheme="minorHAnsi" w:cstheme="minorBidi"/>
           <w:b w:val="0"/>
@@ -1716,7 +1716,7 @@
     </w:p>
     <w:p>
       <w:pPr>
-        <w:pStyle w:val="TOC2"/>
+        <w:pStyle w:val="TM2"/>
         <w:rPr>
           <w:rFonts w:asciiTheme="minorHAnsi" w:eastAsiaTheme="minorEastAsia" w:hAnsiTheme="minorHAnsi" w:cstheme="minorBidi"/>
           <w:kern w:val="2"/>
@@ -1779,7 +1779,7 @@
     </w:p>
     <w:p>
       <w:pPr>
-        <w:pStyle w:val="TOC2"/>
+        <w:pStyle w:val="TM2"/>
         <w:rPr>
           <w:rFonts w:asciiTheme="minorHAnsi" w:eastAsiaTheme="minorEastAsia" w:hAnsiTheme="minorHAnsi" w:cstheme="minorBidi"/>
           <w:kern w:val="2"/>
@@ -1842,7 +1842,7 @@
     </w:p>
     <w:p>
       <w:pPr>
-        <w:pStyle w:val="TOC2"/>
+        <w:pStyle w:val="TM2"/>
         <w:rPr>
           <w:rFonts w:asciiTheme="minorHAnsi" w:eastAsiaTheme="minorEastAsia" w:hAnsiTheme="minorHAnsi" w:cstheme="minorBidi"/>
           <w:kern w:val="2"/>
@@ -1907,7 +1907,7 @@
     </w:p>
     <w:p>
       <w:pPr>
-        <w:pStyle w:val="TOC2"/>
+        <w:pStyle w:val="TM2"/>
         <w:rPr>
           <w:rFonts w:asciiTheme="minorHAnsi" w:eastAsiaTheme="minorEastAsia" w:hAnsiTheme="minorHAnsi" w:cstheme="minorBidi"/>
           <w:kern w:val="2"/>
@@ -1972,7 +1972,7 @@
     </w:p>
     <w:p>
       <w:pPr>
-        <w:pStyle w:val="TOC2"/>
+        <w:pStyle w:val="TM2"/>
         <w:rPr>
           <w:rFonts w:asciiTheme="minorHAnsi" w:eastAsiaTheme="minorEastAsia" w:hAnsiTheme="minorHAnsi" w:cstheme="minorBidi"/>
           <w:kern w:val="2"/>
@@ -2035,7 +2035,7 @@
     </w:p>
     <w:p>
       <w:pPr>
-        <w:pStyle w:val="TOC2"/>
+        <w:pStyle w:val="TM2"/>
         <w:rPr>
           <w:rFonts w:asciiTheme="minorHAnsi" w:eastAsiaTheme="minorEastAsia" w:hAnsiTheme="minorHAnsi" w:cstheme="minorBidi"/>
           <w:kern w:val="2"/>
@@ -2098,7 +2098,7 @@
     </w:p>
     <w:p>
       <w:pPr>
-        <w:pStyle w:val="TOC2"/>
+        <w:pStyle w:val="TM2"/>
         <w:rPr>
           <w:rFonts w:asciiTheme="minorHAnsi" w:eastAsiaTheme="minorEastAsia" w:hAnsiTheme="minorHAnsi" w:cstheme="minorBidi"/>
           <w:kern w:val="2"/>
@@ -2161,7 +2161,7 @@
     </w:p>
     <w:p>
       <w:pPr>
-        <w:pStyle w:val="TOC2"/>
+        <w:pStyle w:val="TM2"/>
         <w:rPr>
           <w:rFonts w:asciiTheme="minorHAnsi" w:eastAsiaTheme="minorEastAsia" w:hAnsiTheme="minorHAnsi" w:cstheme="minorBidi"/>
           <w:kern w:val="2"/>
@@ -2224,7 +2224,7 @@
     </w:p>
     <w:p>
       <w:pPr>
-        <w:pStyle w:val="TOC2"/>
+        <w:pStyle w:val="TM2"/>
         <w:rPr>
           <w:rFonts w:asciiTheme="minorHAnsi" w:eastAsiaTheme="minorEastAsia" w:hAnsiTheme="minorHAnsi" w:cstheme="minorBidi"/>
           <w:kern w:val="2"/>
@@ -2287,7 +2287,7 @@
     </w:p>
     <w:p>
       <w:pPr>
-        <w:pStyle w:val="TOC2"/>
+        <w:pStyle w:val="TM2"/>
         <w:rPr>
           <w:rFonts w:asciiTheme="minorHAnsi" w:eastAsiaTheme="minorEastAsia" w:hAnsiTheme="minorHAnsi" w:cstheme="minorBidi"/>
           <w:kern w:val="2"/>
@@ -2350,7 +2350,7 @@
     </w:p>
     <w:p>
       <w:pPr>
-        <w:pStyle w:val="TOC1"/>
+        <w:pStyle w:val="TM1"/>
         <w:rPr>
           <w:rFonts w:asciiTheme="minorHAnsi" w:eastAsiaTheme="minorEastAsia" w:hAnsiTheme="minorHAnsi" w:cstheme="minorBidi"/>
           <w:b w:val="0"/>
@@ -2436,7 +2436,7 @@
     </w:p>
     <w:p>
       <w:pPr>
-        <w:pStyle w:val="TOC2"/>
+        <w:pStyle w:val="TM2"/>
         <w:rPr>
           <w:rFonts w:asciiTheme="minorHAnsi" w:eastAsiaTheme="minorEastAsia" w:hAnsiTheme="minorHAnsi" w:cstheme="minorBidi"/>
           <w:kern w:val="2"/>
@@ -2501,7 +2501,7 @@
     </w:p>
     <w:p>
       <w:pPr>
-        <w:pStyle w:val="TOC2"/>
+        <w:pStyle w:val="TM2"/>
         <w:rPr>
           <w:rFonts w:asciiTheme="minorHAnsi" w:eastAsiaTheme="minorEastAsia" w:hAnsiTheme="minorHAnsi" w:cstheme="minorBidi"/>
           <w:kern w:val="2"/>
@@ -2566,7 +2566,7 @@
     </w:p>
     <w:p>
       <w:pPr>
-        <w:pStyle w:val="TOC2"/>
+        <w:pStyle w:val="TM2"/>
         <w:rPr>
           <w:rFonts w:asciiTheme="minorHAnsi" w:eastAsiaTheme="minorEastAsia" w:hAnsiTheme="minorHAnsi" w:cstheme="minorBidi"/>
           <w:kern w:val="2"/>
@@ -2629,7 +2629,7 @@
     </w:p>
     <w:p>
       <w:pPr>
-        <w:pStyle w:val="TOC2"/>
+        <w:pStyle w:val="TM2"/>
         <w:rPr>
           <w:rFonts w:asciiTheme="minorHAnsi" w:eastAsiaTheme="minorEastAsia" w:hAnsiTheme="minorHAnsi" w:cstheme="minorBidi"/>
           <w:kern w:val="2"/>
@@ -2692,7 +2692,7 @@
     </w:p>
     <w:p>
       <w:pPr>
-        <w:pStyle w:val="TOC2"/>
+        <w:pStyle w:val="TM2"/>
         <w:rPr>
           <w:rFonts w:asciiTheme="minorHAnsi" w:eastAsiaTheme="minorEastAsia" w:hAnsiTheme="minorHAnsi" w:cstheme="minorBidi"/>
           <w:kern w:val="2"/>
@@ -2755,7 +2755,7 @@
     </w:p>
     <w:p>
       <w:pPr>
-        <w:pStyle w:val="TOC1"/>
+        <w:pStyle w:val="TM1"/>
         <w:rPr>
           <w:rFonts w:asciiTheme="minorHAnsi" w:eastAsiaTheme="minorEastAsia" w:hAnsiTheme="minorHAnsi" w:cstheme="minorBidi"/>
           <w:b w:val="0"/>
@@ -2841,7 +2841,7 @@
     </w:p>
     <w:p>
       <w:pPr>
-        <w:pStyle w:val="TOC2"/>
+        <w:pStyle w:val="TM2"/>
         <w:rPr>
           <w:rFonts w:asciiTheme="minorHAnsi" w:eastAsiaTheme="minorEastAsia" w:hAnsiTheme="minorHAnsi" w:cstheme="minorBidi"/>
           <w:kern w:val="2"/>
@@ -2904,7 +2904,7 @@
     </w:p>
     <w:p>
       <w:pPr>
-        <w:pStyle w:val="TOC2"/>
+        <w:pStyle w:val="TM2"/>
         <w:rPr>
           <w:rFonts w:asciiTheme="minorHAnsi" w:eastAsiaTheme="minorEastAsia" w:hAnsiTheme="minorHAnsi" w:cstheme="minorBidi"/>
           <w:kern w:val="2"/>
@@ -2967,7 +2967,7 @@
     </w:p>
     <w:p>
       <w:pPr>
-        <w:pStyle w:val="TOC2"/>
+        <w:pStyle w:val="TM2"/>
         <w:rPr>
           <w:rFonts w:asciiTheme="minorHAnsi" w:eastAsiaTheme="minorEastAsia" w:hAnsiTheme="minorHAnsi" w:cstheme="minorBidi"/>
           <w:kern w:val="2"/>
@@ -3030,7 +3030,7 @@
     </w:p>
     <w:p>
       <w:pPr>
-        <w:pStyle w:val="TOC1"/>
+        <w:pStyle w:val="TM1"/>
         <w:rPr>
           <w:rFonts w:asciiTheme="minorHAnsi" w:eastAsiaTheme="minorEastAsia" w:hAnsiTheme="minorHAnsi" w:cstheme="minorBidi"/>
           <w:b w:val="0"/>
@@ -3116,7 +3116,7 @@
     </w:p>
     <w:p>
       <w:pPr>
-        <w:pStyle w:val="TOC2"/>
+        <w:pStyle w:val="TM2"/>
         <w:rPr>
           <w:rFonts w:asciiTheme="minorHAnsi" w:eastAsiaTheme="minorEastAsia" w:hAnsiTheme="minorHAnsi" w:cstheme="minorBidi"/>
           <w:kern w:val="2"/>
@@ -3179,7 +3179,7 @@
     </w:p>
     <w:p>
       <w:pPr>
-        <w:pStyle w:val="TOC2"/>
+        <w:pStyle w:val="TM2"/>
         <w:rPr>
           <w:rFonts w:asciiTheme="minorHAnsi" w:eastAsiaTheme="minorEastAsia" w:hAnsiTheme="minorHAnsi" w:cstheme="minorBidi"/>
           <w:kern w:val="2"/>
@@ -3242,7 +3242,7 @@
     </w:p>
     <w:p>
       <w:pPr>
-        <w:pStyle w:val="TOC2"/>
+        <w:pStyle w:val="TM2"/>
         <w:rPr>
           <w:rFonts w:asciiTheme="minorHAnsi" w:eastAsiaTheme="minorEastAsia" w:hAnsiTheme="minorHAnsi" w:cstheme="minorBidi"/>
           <w:kern w:val="2"/>
@@ -3305,7 +3305,7 @@
     </w:p>
     <w:p>
       <w:pPr>
-        <w:pStyle w:val="TOC1"/>
+        <w:pStyle w:val="TM1"/>
         <w:rPr>
           <w:rFonts w:asciiTheme="minorHAnsi" w:eastAsiaTheme="minorEastAsia" w:hAnsiTheme="minorHAnsi" w:cstheme="minorBidi"/>
           <w:b w:val="0"/>
@@ -3391,7 +3391,7 @@
     </w:p>
     <w:p>
       <w:pPr>
-        <w:pStyle w:val="TOC1"/>
+        <w:pStyle w:val="TM1"/>
         <w:rPr>
           <w:rFonts w:asciiTheme="minorHAnsi" w:eastAsiaTheme="minorEastAsia" w:hAnsiTheme="minorHAnsi" w:cstheme="minorBidi"/>
           <w:b w:val="0"/>
@@ -3477,7 +3477,7 @@
     </w:p>
     <w:p>
       <w:pPr>
-        <w:pStyle w:val="TOC1"/>
+        <w:pStyle w:val="TM1"/>
         <w:rPr>
           <w:rFonts w:asciiTheme="minorHAnsi" w:eastAsiaTheme="minorEastAsia" w:hAnsiTheme="minorHAnsi" w:cstheme="minorBidi"/>
           <w:b w:val="0"/>
@@ -3563,7 +3563,7 @@
     </w:p>
     <w:p>
       <w:pPr>
-        <w:pStyle w:val="TOC1"/>
+        <w:pStyle w:val="TM1"/>
         <w:rPr>
           <w:rFonts w:asciiTheme="minorHAnsi" w:eastAsiaTheme="minorEastAsia" w:hAnsiTheme="minorHAnsi" w:cstheme="minorBidi"/>
           <w:b w:val="0"/>
@@ -3717,7 +3717,7 @@
     </w:p>
     <w:p>
       <w:pPr>
-        <w:pStyle w:val="Heading1"/>
+        <w:pStyle w:val="Titre1"/>
         <w:numPr>
           <w:ilvl w:val="0"/>
           <w:numId w:val="0"/>
@@ -3811,7 +3811,7 @@
       <w:commentRangeEnd w:id="4"/>
       <w:r>
         <w:rPr>
-          <w:rStyle w:val="CommentReference"/>
+          <w:rStyle w:val="Marquedecommentaire"/>
           <w:rFonts w:cs="Arial"/>
           <w:vanish/>
           <w:color w:val="0000FF"/>
@@ -3843,7 +3843,7 @@
     </w:p>
     <w:p>
       <w:pPr>
-        <w:pStyle w:val="Heading1"/>
+        <w:pStyle w:val="Titre1"/>
         <w:numPr>
           <w:ilvl w:val="0"/>
           <w:numId w:val="36"/>
@@ -3865,7 +3865,7 @@
     </w:p>
     <w:p>
       <w:pPr>
-        <w:pStyle w:val="Heading2"/>
+        <w:pStyle w:val="Titre2"/>
         <w:tabs>
           <w:tab w:val="clear" w:pos="851"/>
         </w:tabs>
@@ -3912,7 +3912,7 @@
     </w:p>
     <w:p>
       <w:pPr>
-        <w:pStyle w:val="Heading2"/>
+        <w:pStyle w:val="Titre2"/>
         <w:tabs>
           <w:tab w:val="clear" w:pos="576"/>
           <w:tab w:val="clear" w:pos="851"/>
@@ -3984,7 +3984,7 @@
     </w:p>
     <w:p>
       <w:pPr>
-        <w:pStyle w:val="Heading2"/>
+        <w:pStyle w:val="Titre2"/>
         <w:tabs>
           <w:tab w:val="clear" w:pos="851"/>
         </w:tabs>
@@ -4060,7 +4060,7 @@
     </w:p>
     <w:p>
       <w:pPr>
-        <w:pStyle w:val="Heading2"/>
+        <w:pStyle w:val="Titre2"/>
         <w:tabs>
           <w:tab w:val="clear" w:pos="851"/>
         </w:tabs>
@@ -4196,7 +4196,7 @@
       <w:hyperlink r:id="rId19" w:history="1">
         <w:r>
           <w:rPr>
-            <w:rStyle w:val="Hyperlink"/>
+            <w:rStyle w:val="Lienhypertexte"/>
             <w:lang w:val="en-US"/>
           </w:rPr>
           <w:t>thibaudfrederic.gamez@studentfr.ch</w:t>
@@ -4268,7 +4268,7 @@
       <w:hyperlink r:id="rId20" w:history="1">
         <w:r>
           <w:rPr>
-            <w:rStyle w:val="Hyperlink"/>
+            <w:rStyle w:val="Lienhypertexte"/>
             <w:lang w:val="fr-CH"/>
           </w:rPr>
           <w:t>silvin.meylan@edufr.ch</w:t>
@@ -4347,7 +4347,7 @@
       <w:hyperlink r:id="rId21" w:history="1">
         <w:r>
           <w:rPr>
-            <w:rStyle w:val="Hyperlink"/>
+            <w:rStyle w:val="Lienhypertexte"/>
             <w:lang w:val="fr-CH"/>
           </w:rPr>
           <w:t>frederic.hertling@edufr.ch</w:t>
@@ -4389,7 +4389,7 @@
       <w:hyperlink r:id="rId22" w:history="1">
         <w:r>
           <w:rPr>
-            <w:rStyle w:val="Hyperlink"/>
+            <w:rStyle w:val="Lienhypertexte"/>
             <w:lang w:val="fr-CH"/>
           </w:rPr>
           <w:t>yves.caloz@caloz-family.ch</w:t>
@@ -4443,7 +4443,7 @@
       <w:hyperlink r:id="rId23" w:history="1">
         <w:r>
           <w:rPr>
-            <w:rStyle w:val="Hyperlink"/>
+            <w:rStyle w:val="Lienhypertexte"/>
             <w:lang w:val="fr-CH"/>
           </w:rPr>
           <w:t>julien@schenevey.ch</w:t>
@@ -4478,7 +4478,7 @@
     </w:p>
     <w:p>
       <w:pPr>
-        <w:pStyle w:val="Heading1"/>
+        <w:pStyle w:val="Titre1"/>
       </w:pPr>
       <w:bookmarkStart w:id="11" w:name="_Toc250790973"/>
       <w:bookmarkStart w:id="12" w:name="_Toc229743625"/>
@@ -4491,7 +4491,7 @@
     </w:p>
     <w:p>
       <w:pPr>
-        <w:pStyle w:val="Heading2"/>
+        <w:pStyle w:val="Titre2"/>
         <w:numPr>
           <w:ilvl w:val="1"/>
           <w:numId w:val="16"/>
@@ -4511,7 +4511,7 @@
     </w:p>
     <w:p>
       <w:pPr>
-        <w:pStyle w:val="Heading3"/>
+        <w:pStyle w:val="Titre3"/>
         <w:rPr>
           <w:lang w:val="fr-CH"/>
         </w:rPr>
@@ -4574,7 +4574,7 @@
     </w:p>
     <w:p>
       <w:pPr>
-        <w:pStyle w:val="Heading3"/>
+        <w:pStyle w:val="Titre3"/>
         <w:rPr>
           <w:lang w:val="fr-CH"/>
         </w:rPr>
@@ -4638,7 +4638,7 @@
     </w:p>
     <w:p>
       <w:pPr>
-        <w:pStyle w:val="Heading3"/>
+        <w:pStyle w:val="Titre3"/>
         <w:rPr>
           <w:lang w:val="fr-CH"/>
         </w:rPr>
@@ -4675,7 +4675,7 @@
     </w:p>
     <w:p>
       <w:pPr>
-        <w:pStyle w:val="Heading3"/>
+        <w:pStyle w:val="Titre3"/>
         <w:rPr>
           <w:lang w:val="fr-CH"/>
         </w:rPr>
@@ -5009,7 +5009,7 @@
     <w:bookmarkEnd w:id="15"/>
     <w:p>
       <w:pPr>
-        <w:pStyle w:val="Heading2"/>
+        <w:pStyle w:val="Titre2"/>
         <w:rPr>
           <w:lang w:val="fr-CH"/>
         </w:rPr>
@@ -5043,7 +5043,7 @@
     </w:p>
     <w:p>
       <w:pPr>
-        <w:pStyle w:val="Heading3"/>
+        <w:pStyle w:val="Titre3"/>
         <w:rPr>
           <w:lang w:val="fr-CH"/>
         </w:rPr>
@@ -5115,7 +5115,7 @@
     </w:p>
     <w:p>
       <w:pPr>
-        <w:pStyle w:val="Heading3"/>
+        <w:pStyle w:val="Titre3"/>
         <w:rPr>
           <w:lang w:val="fr-CH"/>
         </w:rPr>
@@ -5217,7 +5217,7 @@
     </w:p>
     <w:p>
       <w:pPr>
-        <w:pStyle w:val="Heading2"/>
+        <w:pStyle w:val="Titre2"/>
       </w:pPr>
       <w:bookmarkStart w:id="16" w:name="_Toc229743628"/>
       <w:r>
@@ -5376,7 +5376,7 @@
     </w:p>
     <w:p>
       <w:pPr>
-        <w:pStyle w:val="Heading2"/>
+        <w:pStyle w:val="Titre2"/>
       </w:pPr>
       <w:bookmarkStart w:id="17" w:name="_Toc250790977"/>
       <w:bookmarkStart w:id="18" w:name="_Toc229743629"/>
@@ -5445,7 +5445,7 @@
     </w:p>
     <w:p>
       <w:pPr>
-        <w:pStyle w:val="Heading2"/>
+        <w:pStyle w:val="Titre2"/>
       </w:pPr>
       <w:bookmarkStart w:id="19" w:name="_Toc250790978"/>
       <w:bookmarkStart w:id="20" w:name="_Toc229743630"/>
@@ -5528,33 +5528,26 @@
           <w:szCs w:val="22"/>
           <w:lang w:val="fr-CH"/>
         </w:rPr>
-        <w:t xml:space="preserve"> risque</w:t>
+        <w:t xml:space="preserve"> risque du projet, est une dépense excessive lié à l’utilisation de token pour les LLM, mais pour palier à cela, une limite à crédit est fixé sur OpenRouter, il n’y a donc aucu</w:t>
       </w:r>
       <w:r>
         <w:rPr>
           <w:szCs w:val="22"/>
           <w:lang w:val="fr-CH"/>
         </w:rPr>
-        <w:t xml:space="preserve"> du projet, est une dépense excessive lié à l’utilisation de token pour les LLM, mais pour palier à cela, une limite à crédit est fixé sur OpenRouter, il n’y a donc aucu</w:t>
+        <w:t xml:space="preserve">n risque réel </w:t>
       </w:r>
       <w:r>
         <w:rPr>
           <w:szCs w:val="22"/>
           <w:lang w:val="fr-CH"/>
         </w:rPr>
-        <w:t xml:space="preserve">n risque réel </w:t>
-      </w:r>
-      <w:r>
-        <w:rPr>
-          <w:szCs w:val="22"/>
-          <w:lang w:val="fr-CH"/>
-        </w:rPr>
         <w:t>lié au projet.</w:t>
       </w:r>
     </w:p>
     <w:p>
       <w:pPr>
-        <w:pStyle w:val="Heading2"/>
+        <w:pStyle w:val="Titre2"/>
         <w:numPr>
           <w:ilvl w:val="1"/>
           <w:numId w:val="16"/>
@@ -5704,7 +5697,7 @@
     </w:p>
     <w:p>
       <w:pPr>
-        <w:pStyle w:val="Heading2"/>
+        <w:pStyle w:val="Titre2"/>
         <w:rPr>
           <w:lang w:val="fr-CH"/>
         </w:rPr>
@@ -6005,7 +5998,7 @@
     </w:p>
     <w:p>
       <w:pPr>
-        <w:pStyle w:val="Heading2"/>
+        <w:pStyle w:val="Titre2"/>
         <w:rPr>
           <w:lang w:val="fr-CH"/>
         </w:rPr>
@@ -6261,7 +6254,7 @@
     </w:p>
     <w:p>
       <w:pPr>
-        <w:pStyle w:val="Heading2"/>
+        <w:pStyle w:val="Titre2"/>
         <w:rPr>
           <w:lang w:val="fr-CH"/>
         </w:rPr>
@@ -6517,7 +6510,7 @@
     </w:p>
     <w:p>
       <w:pPr>
-        <w:pStyle w:val="Heading2"/>
+        <w:pStyle w:val="Titre2"/>
         <w:rPr>
           <w:lang w:val="fr-CH"/>
         </w:rPr>
@@ -7076,7 +7069,7 @@
     </w:p>
     <w:p>
       <w:pPr>
-        <w:pStyle w:val="Heading1"/>
+        <w:pStyle w:val="Titre1"/>
         <w:numPr>
           <w:ilvl w:val="0"/>
           <w:numId w:val="16"/>
@@ -7097,17 +7090,21 @@
     </w:p>
     <w:p>
       <w:pPr>
-        <w:pStyle w:val="Heading2"/>
+        <w:pStyle w:val="Titre2"/>
         <w:numPr>
           <w:ilvl w:val="1"/>
           <w:numId w:val="16"/>
         </w:numPr>
+        <w:rPr>
+          <w:highlight w:val="yellow"/>
+        </w:rPr>
       </w:pPr>
       <w:bookmarkStart w:id="30" w:name="_Toc250790981"/>
       <w:bookmarkStart w:id="31" w:name="_Toc229743636"/>
       <w:bookmarkEnd w:id="30"/>
       <w:r>
         <w:rPr>
+          <w:highlight w:val="yellow"/>
           <w:lang w:val="fr-CH"/>
         </w:rPr>
         <w:t>Exigences du système</w:t>
@@ -7121,7 +7118,7 @@
     </w:p>
     <w:p>
       <w:pPr>
-        <w:pStyle w:val="Heading2"/>
+        <w:pStyle w:val="Titre2"/>
         <w:numPr>
           <w:ilvl w:val="1"/>
           <w:numId w:val="16"/>
@@ -7139,10 +7136,26 @@
       <w:pPr>
         <w:pStyle w:val="BITTextkrper"/>
       </w:pPr>
-    </w:p>
-    <w:p>
-      <w:pPr>
-        <w:pStyle w:val="Heading2"/>
+      <w:r>
+        <w:t>Schéma de principe</w:t>
+      </w:r>
+    </w:p>
+    <w:p>
+      <w:pPr>
+        <w:pStyle w:val="BITTextkrper"/>
+      </w:pPr>
+    </w:p>
+    <w:p>
+      <w:pPr>
+        <w:pStyle w:val="BITTextkrper"/>
+      </w:pPr>
+      <w:r>
+        <w:t>s</w:t>
+      </w:r>
+    </w:p>
+    <w:p>
+      <w:pPr>
+        <w:pStyle w:val="Titre2"/>
         <w:numPr>
           <w:ilvl w:val="1"/>
           <w:numId w:val="16"/>
@@ -7185,21 +7198,15 @@
     </w:p>
     <w:p>
       <w:pPr>
-        <w:pStyle w:val="Heading2"/>
+        <w:pStyle w:val="Titre2"/>
         <w:numPr>
           <w:ilvl w:val="1"/>
           <w:numId w:val="16"/>
         </w:numPr>
-        <w:rPr>
-          <w:highlight w:val="yellow"/>
-        </w:rPr>
       </w:pPr>
       <w:bookmarkStart w:id="36" w:name="_Toc250790984"/>
       <w:bookmarkStart w:id="37" w:name="_Toc229743639"/>
       <w:r>
-        <w:rPr>
-          <w:highlight w:val="yellow"/>
-        </w:rPr>
         <w:t>Concept d‘implémentation</w:t>
       </w:r>
       <w:bookmarkEnd w:id="36"/>
@@ -7207,7 +7214,7 @@
     </w:p>
     <w:p>
       <w:pPr>
-        <w:pStyle w:val="Heading3"/>
+        <w:pStyle w:val="Titre3"/>
       </w:pPr>
       <w:r>
         <w:t>Conception de l’API REST</w:t>
@@ -7391,6 +7398,7 @@
         <w:rPr>
           <w:lang w:val="fr-CH"/>
         </w:rPr>
+        <w:lastRenderedPageBreak/>
         <w:t>GET /projects/:id : détail d’un projet, de ses métadonnées GitHub et de son historique d’analyses.</w:t>
       </w:r>
     </w:p>
@@ -7407,7 +7415,6 @@
           <w:bCs/>
           <w:lang w:val="fr-CH"/>
         </w:rPr>
-        <w:lastRenderedPageBreak/>
         <w:t>DELETE /projects/:id</w:t>
       </w:r>
       <w:r>
@@ -7509,7 +7516,7 @@
     </w:p>
     <w:p>
       <w:pPr>
-        <w:pStyle w:val="Heading2"/>
+        <w:pStyle w:val="Titre2"/>
         <w:rPr>
           <w:lang w:val="fr-CH"/>
         </w:rPr>
@@ -7546,6 +7553,7 @@
       </w:pPr>
       <w:r>
         <w:rPr>
+          <w:noProof/>
           <w:lang w:val="fr-CH"/>
         </w:rPr>
         <w:lastRenderedPageBreak/>
@@ -7602,7 +7610,7 @@
     </w:p>
     <w:p>
       <w:pPr>
-        <w:pStyle w:val="Heading3"/>
+        <w:pStyle w:val="Titre3"/>
         <w:rPr>
           <w:lang w:val="fr-CH"/>
         </w:rPr>
@@ -8342,7 +8350,7 @@
     </w:p>
     <w:p>
       <w:pPr>
-        <w:pStyle w:val="Heading3"/>
+        <w:pStyle w:val="Titre3"/>
         <w:rPr>
           <w:lang w:val="fr-CH"/>
         </w:rPr>
@@ -9215,7 +9223,7 @@
     </w:p>
     <w:p>
       <w:pPr>
-        <w:pStyle w:val="Heading3"/>
+        <w:pStyle w:val="Titre3"/>
         <w:rPr>
           <w:lang w:val="fr-CH"/>
         </w:rPr>
@@ -10625,7 +10633,7 @@
     </w:p>
     <w:p>
       <w:pPr>
-        <w:pStyle w:val="Heading3"/>
+        <w:pStyle w:val="Titre3"/>
         <w:rPr>
           <w:lang w:val="fr-CH"/>
         </w:rPr>
@@ -11499,7 +11507,7 @@
     </w:p>
     <w:p>
       <w:pPr>
-        <w:pStyle w:val="Heading3"/>
+        <w:pStyle w:val="Titre3"/>
         <w:rPr>
           <w:lang w:val="fr-CH"/>
         </w:rPr>
@@ -12901,7 +12909,7 @@
     </w:tbl>
     <w:p>
       <w:pPr>
-        <w:pStyle w:val="Heading2"/>
+        <w:pStyle w:val="Titre2"/>
         <w:rPr>
           <w:lang w:val="fr-CH"/>
         </w:rPr>
@@ -13103,7 +13111,7 @@
     </w:p>
     <w:p>
       <w:pPr>
-        <w:pStyle w:val="Heading2"/>
+        <w:pStyle w:val="Titre2"/>
         <w:rPr>
           <w:lang w:val="fr-CH"/>
         </w:rPr>
@@ -13409,7 +13417,7 @@
     </w:p>
     <w:p>
       <w:pPr>
-        <w:pStyle w:val="Heading2"/>
+        <w:pStyle w:val="Titre2"/>
         <w:numPr>
           <w:ilvl w:val="1"/>
           <w:numId w:val="16"/>
@@ -13449,7 +13457,7 @@
     </w:p>
     <w:p>
       <w:pPr>
-        <w:pStyle w:val="Heading2"/>
+        <w:pStyle w:val="Titre2"/>
         <w:numPr>
           <w:ilvl w:val="1"/>
           <w:numId w:val="16"/>
@@ -13488,7 +13496,7 @@
     </w:p>
     <w:tbl>
       <w:tblPr>
-        <w:tblStyle w:val="TableGrid"/>
+        <w:tblStyle w:val="Grilledutableau"/>
         <w:tblW w:w="0" w:type="auto"/>
         <w:tblLook w:val="04A0" w:firstRow="1" w:lastRow="0" w:firstColumn="1" w:lastColumn="0" w:noHBand="0" w:noVBand="1"/>
       </w:tblPr>
@@ -14442,7 +14450,7 @@
     </w:tbl>
     <w:p>
       <w:pPr>
-        <w:pStyle w:val="Heading2"/>
+        <w:pStyle w:val="Titre2"/>
         <w:numPr>
           <w:ilvl w:val="1"/>
           <w:numId w:val="16"/>
@@ -14518,7 +14526,7 @@
     </w:p>
     <w:p>
       <w:pPr>
-        <w:pStyle w:val="Heading1"/>
+        <w:pStyle w:val="Titre1"/>
         <w:numPr>
           <w:ilvl w:val="0"/>
           <w:numId w:val="16"/>
@@ -14535,7 +14543,7 @@
     </w:p>
     <w:p>
       <w:pPr>
-        <w:pStyle w:val="Heading2"/>
+        <w:pStyle w:val="Titre2"/>
         <w:numPr>
           <w:ilvl w:val="1"/>
           <w:numId w:val="16"/>
@@ -14576,7 +14584,7 @@
     </w:p>
     <w:p>
       <w:pPr>
-        <w:pStyle w:val="Heading2"/>
+        <w:pStyle w:val="Titre2"/>
         <w:numPr>
           <w:ilvl w:val="1"/>
           <w:numId w:val="16"/>
@@ -14622,7 +14630,7 @@
     </w:p>
     <w:p>
       <w:pPr>
-        <w:pStyle w:val="Heading2"/>
+        <w:pStyle w:val="Titre2"/>
         <w:rPr>
           <w:lang w:val="fr-CH"/>
         </w:rPr>
@@ -14638,7 +14646,7 @@
     </w:p>
     <w:p>
       <w:pPr>
-        <w:pStyle w:val="Heading2"/>
+        <w:pStyle w:val="Titre2"/>
         <w:numPr>
           <w:ilvl w:val="1"/>
           <w:numId w:val="16"/>
@@ -14689,7 +14697,7 @@
     </w:p>
     <w:p>
       <w:pPr>
-        <w:pStyle w:val="Heading2"/>
+        <w:pStyle w:val="Titre2"/>
       </w:pPr>
       <w:bookmarkStart w:id="61" w:name="_Toc229743651"/>
       <w:r>
@@ -14699,7 +14707,7 @@
     </w:p>
     <w:p>
       <w:pPr>
-        <w:pStyle w:val="Heading1"/>
+        <w:pStyle w:val="Titre1"/>
         <w:numPr>
           <w:ilvl w:val="0"/>
           <w:numId w:val="16"/>
@@ -14720,7 +14728,7 @@
     </w:p>
     <w:p>
       <w:pPr>
-        <w:pStyle w:val="Heading2"/>
+        <w:pStyle w:val="Titre2"/>
         <w:numPr>
           <w:ilvl w:val="1"/>
           <w:numId w:val="16"/>
@@ -14768,7 +14776,7 @@
     </w:p>
     <w:p>
       <w:pPr>
-        <w:pStyle w:val="Heading2"/>
+        <w:pStyle w:val="Titre2"/>
         <w:numPr>
           <w:ilvl w:val="1"/>
           <w:numId w:val="16"/>
@@ -15063,7 +15071,7 @@
     </w:p>
     <w:p>
       <w:pPr>
-        <w:pStyle w:val="Heading2"/>
+        <w:pStyle w:val="Titre2"/>
         <w:numPr>
           <w:ilvl w:val="1"/>
           <w:numId w:val="16"/>
@@ -15224,7 +15232,7 @@
     </w:p>
     <w:p>
       <w:pPr>
-        <w:pStyle w:val="Heading1"/>
+        <w:pStyle w:val="Titre1"/>
       </w:pPr>
       <w:bookmarkStart w:id="70" w:name="_Toc229743656"/>
       <w:bookmarkStart w:id="71" w:name="_Toc250790996"/>
@@ -15247,7 +15255,7 @@
     </w:p>
     <w:p>
       <w:pPr>
-        <w:pStyle w:val="Heading2"/>
+        <w:pStyle w:val="Titre2"/>
       </w:pPr>
       <w:bookmarkStart w:id="72" w:name="_Toc229743657"/>
       <w:r>
@@ -15275,7 +15283,7 @@
     </w:p>
     <w:p>
       <w:pPr>
-        <w:pStyle w:val="Heading2"/>
+        <w:pStyle w:val="Titre2"/>
       </w:pPr>
       <w:bookmarkStart w:id="73" w:name="_Toc229743658"/>
       <w:r>
@@ -15329,7 +15337,7 @@
     </w:p>
     <w:p>
       <w:pPr>
-        <w:pStyle w:val="Heading2"/>
+        <w:pStyle w:val="Titre2"/>
       </w:pPr>
       <w:bookmarkStart w:id="74" w:name="_Toc229743659"/>
       <w:r>
@@ -15378,7 +15386,7 @@
     </w:p>
     <w:p>
       <w:pPr>
-        <w:pStyle w:val="Heading1"/>
+        <w:pStyle w:val="Titre1"/>
         <w:numPr>
           <w:ilvl w:val="0"/>
           <w:numId w:val="16"/>
@@ -15447,7 +15455,7 @@
     </w:p>
     <w:p>
       <w:pPr>
-        <w:pStyle w:val="Heading1"/>
+        <w:pStyle w:val="Titre1"/>
         <w:numPr>
           <w:ilvl w:val="0"/>
           <w:numId w:val="16"/>
@@ -15714,7 +15722,7 @@
     </w:p>
     <w:p>
       <w:pPr>
-        <w:pStyle w:val="Heading1"/>
+        <w:pStyle w:val="Titre1"/>
         <w:numPr>
           <w:ilvl w:val="0"/>
           <w:numId w:val="16"/>
@@ -15937,7 +15945,7 @@
     </w:p>
     <w:p>
       <w:pPr>
-        <w:pStyle w:val="Heading1"/>
+        <w:pStyle w:val="Titre1"/>
         <w:numPr>
           <w:ilvl w:val="0"/>
           <w:numId w:val="16"/>
@@ -16115,11 +16123,11 @@
   <w:comment w:id="4" w:author="Stéphane Schwab" w:date="2025-07-07T16:49:00Z" w:initials="SS">
     <w:p>
       <w:pPr>
-        <w:pStyle w:val="CommentText"/>
-      </w:pPr>
-      <w:r>
-        <w:rPr>
-          <w:rStyle w:val="CommentReference"/>
+        <w:pStyle w:val="Commentaire"/>
+      </w:pPr>
+      <w:r>
+        <w:rPr>
+          <w:rStyle w:val="Marquedecommentaire"/>
         </w:rPr>
         <w:annotationRef/>
       </w:r>
@@ -16188,7 +16196,7 @@
 <w:ftr xmlns:wpc="http://schemas.microsoft.com/office/word/2010/wordprocessingCanvas" xmlns:cx="http://schemas.microsoft.com/office/drawing/2014/chartex" xmlns:cx1="http://schemas.microsoft.com/office/drawing/2015/9/8/chartex" xmlns:cx2="http://schemas.microsoft.com/office/drawing/2015/10/21/chartex" xmlns:cx3="http://schemas.microsoft.com/office/drawing/2016/5/9/chartex" xmlns:cx4="http://schemas.microsoft.com/office/drawing/2016/5/10/chartex" xmlns:cx5="http://schemas.microsoft.com/office/drawing/2016/5/11/chartex" xmlns:cx6="http://schemas.microsoft.com/office/drawing/2016/5/12/chartex" xmlns:cx7="http://schemas.microsoft.com/office/drawing/2016/5/13/chartex" xmlns:cx8="http://schemas.microsoft.com/office/drawing/2016/5/14/chartex" xmlns:mc="http://schemas.openxmlformats.org/markup-compatibility/2006" xmlns:aink="http://schemas.microsoft.com/office/drawing/2016/ink" xmlns:am3d="http://schemas.microsoft.com/office/drawing/2017/model3d" xmlns:o="urn:schemas-microsoft-com:office:office" xmlns:oel="http://schemas.microsoft.com/office/2019/extlst" xmlns:r="http://schemas.openxmlformats.org/officeDocument/2006/relationships" xmlns:m="http://schemas.openxmlformats.org/officeDocument/2006/math" xmlns:v="urn:schemas-microsoft-com:vml" xmlns:wp14="http://schemas.microsoft.com/office/word/2010/wordprocessingDrawing" xmlns:wp="http://schemas.openxmlformats.org/drawingml/2006/wordprocessingDrawing" xmlns:w10="urn:schemas-microsoft-com:office:word" xmlns:w="http://schemas.openxmlformats.org/wordprocessingml/2006/main" xmlns:w14="http://schemas.microsoft.com/office/word/2010/wordml" xmlns:w15="http://schemas.microsoft.com/office/word/2012/wordml" xmlns:w16cex="http://schemas.microsoft.com/office/word/2018/wordml/cex" xmlns:w16cid="http://schemas.microsoft.com/office/word/2016/wordml/cid" xmlns:w16="http://schemas.microsoft.com/office/word/2018/wordml" xmlns:w16du="http://schemas.microsoft.com/office/word/2023/wordml/word16du" xmlns:w16sdtdh="http://schemas.microsoft.com/office/word/2020/wordml/sdtdatahash" xmlns:w16sdtfl="http://schemas.microsoft.com/office/word/2024/wordml/sdtformatlock" xmlns:w16se="http://schemas.microsoft.com/office/word/2015/wordml/symex" xmlns:wpg="http://schemas.microsoft.com/office/word/2010/wordprocessingGroup" xmlns:wpi="http://schemas.microsoft.com/office/word/2010/wordprocessingInk" xmlns:wne="http://schemas.microsoft.com/office/word/2006/wordml" xmlns:wps="http://schemas.microsoft.com/office/word/2010/wordprocessingShape" mc:Ignorable="w14 w15 w16se w16cid w16 w16cex w16sdtdh w16sdtfl w16du wp14">
   <w:p>
     <w:pPr>
-      <w:pStyle w:val="Footer"/>
+      <w:pStyle w:val="Pieddepage"/>
     </w:pPr>
   </w:p>
 </w:ftr>
@@ -16222,7 +16230,7 @@
         </w:tcPr>
         <w:tbl>
           <w:tblPr>
-            <w:tblStyle w:val="TableGrid"/>
+            <w:tblStyle w:val="Grilledutableau"/>
             <w:tblW w:w="9781" w:type="dxa"/>
             <w:tblBorders>
               <w:top w:val="none" w:sz="0" w:space="0" w:color="auto"/>
@@ -16255,7 +16263,6 @@
                 <w:dataBinding w:prefixMappings="xmlns:ns0='http://purl.org/dc/elements/1.1/' xmlns:ns1='http://schemas.openxmlformats.org/package/2006/metadata/core-properties' " w:xpath="/ns1:coreProperties[1]/ns0:creator[1]" w:storeItemID="{6C3C8BC8-F283-45AE-878A-BAB7291924A1}"/>
                 <w:text/>
               </w:sdtPr>
-              <w:sdtEndPr/>
               <w:sdtContent>
                 <w:tc>
                   <w:tcPr>
@@ -16432,13 +16439,7 @@
                   <w:rPr>
                     <w:lang w:val="fr-CH"/>
                   </w:rPr>
-                  <w:t>21.05.2026 13:</w:t>
-                </w:r>
-                <w:r>
-                  <w:rPr>
-                    <w:lang w:val="fr-CH"/>
-                  </w:rPr>
-                  <w:t>20</w:t>
+                  <w:t>21.05.2026 16:46</w:t>
                 </w:r>
                 <w:r>
                   <w:rPr>
@@ -16467,7 +16468,7 @@
   </w:tbl>
   <w:p>
     <w:pPr>
-      <w:pStyle w:val="Footer"/>
+      <w:pStyle w:val="Pieddepage"/>
     </w:pPr>
   </w:p>
 </w:ftr>
@@ -16477,7 +16478,7 @@
 <w:ftr xmlns:wpc="http://schemas.microsoft.com/office/word/2010/wordprocessingCanvas" xmlns:cx="http://schemas.microsoft.com/office/drawing/2014/chartex" xmlns:cx1="http://schemas.microsoft.com/office/drawing/2015/9/8/chartex" xmlns:cx2="http://schemas.microsoft.com/office/drawing/2015/10/21/chartex" xmlns:cx3="http://schemas.microsoft.com/office/drawing/2016/5/9/chartex" xmlns:cx4="http://schemas.microsoft.com/office/drawing/2016/5/10/chartex" xmlns:cx5="http://schemas.microsoft.com/office/drawing/2016/5/11/chartex" xmlns:cx6="http://schemas.microsoft.com/office/drawing/2016/5/12/chartex" xmlns:cx7="http://schemas.microsoft.com/office/drawing/2016/5/13/chartex" xmlns:cx8="http://schemas.microsoft.com/office/drawing/2016/5/14/chartex" xmlns:mc="http://schemas.openxmlformats.org/markup-compatibility/2006" xmlns:aink="http://schemas.microsoft.com/office/drawing/2016/ink" xmlns:am3d="http://schemas.microsoft.com/office/drawing/2017/model3d" xmlns:o="urn:schemas-microsoft-com:office:office" xmlns:oel="http://schemas.microsoft.com/office/2019/extlst" xmlns:r="http://schemas.openxmlformats.org/officeDocument/2006/relationships" xmlns:m="http://schemas.openxmlformats.org/officeDocument/2006/math" xmlns:v="urn:schemas-microsoft-com:vml" xmlns:wp14="http://schemas.microsoft.com/office/word/2010/wordprocessingDrawing" xmlns:wp="http://schemas.openxmlformats.org/drawingml/2006/wordprocessingDrawing" xmlns:w10="urn:schemas-microsoft-com:office:word" xmlns:w="http://schemas.openxmlformats.org/wordprocessingml/2006/main" xmlns:w14="http://schemas.microsoft.com/office/word/2010/wordml" xmlns:w15="http://schemas.microsoft.com/office/word/2012/wordml" xmlns:w16cex="http://schemas.microsoft.com/office/word/2018/wordml/cex" xmlns:w16cid="http://schemas.microsoft.com/office/word/2016/wordml/cid" xmlns:w16="http://schemas.microsoft.com/office/word/2018/wordml" xmlns:w16du="http://schemas.microsoft.com/office/word/2023/wordml/word16du" xmlns:w16sdtdh="http://schemas.microsoft.com/office/word/2020/wordml/sdtdatahash" xmlns:w16sdtfl="http://schemas.microsoft.com/office/word/2024/wordml/sdtformatlock" xmlns:w16se="http://schemas.microsoft.com/office/word/2015/wordml/symex" xmlns:wpg="http://schemas.microsoft.com/office/word/2010/wordprocessingGroup" xmlns:wpi="http://schemas.microsoft.com/office/word/2010/wordprocessingInk" xmlns:wne="http://schemas.microsoft.com/office/word/2006/wordml" xmlns:wps="http://schemas.microsoft.com/office/word/2010/wordprocessingShape" mc:Ignorable="w14 w15 w16se w16cid w16 w16cex w16sdtdh w16sdtfl w16du wp14">
   <w:p>
     <w:pPr>
-      <w:pStyle w:val="Footer"/>
+      <w:pStyle w:val="Pieddepage"/>
     </w:pPr>
     <w:r>
       <w:fldChar w:fldCharType="begin"/>
@@ -16577,7 +16578,7 @@
         </w:tcPr>
         <w:tbl>
           <w:tblPr>
-            <w:tblStyle w:val="TableGrid"/>
+            <w:tblStyle w:val="Grilledutableau"/>
             <w:tblW w:w="0" w:type="auto"/>
             <w:tblBorders>
               <w:top w:val="none" w:sz="0" w:space="0" w:color="auto"/>
@@ -16607,7 +16608,6 @@
                 <w:dataBinding w:prefixMappings="xmlns:ns0='http://purl.org/dc/elements/1.1/' xmlns:ns1='http://schemas.openxmlformats.org/package/2006/metadata/core-properties' " w:xpath="/ns1:coreProperties[1]/ns0:creator[1]" w:storeItemID="{6C3C8BC8-F283-45AE-878A-BAB7291924A1}"/>
                 <w:text/>
               </w:sdtPr>
-              <w:sdtEndPr/>
               <w:sdtContent>
                 <w:tc>
                   <w:tcPr>
@@ -16766,13 +16766,7 @@
                   <w:rPr>
                     <w:lang w:val="fr-CH"/>
                   </w:rPr>
-                  <w:t>21.05.2026 13:</w:t>
-                </w:r>
-                <w:r>
-                  <w:rPr>
-                    <w:lang w:val="fr-CH"/>
-                  </w:rPr>
-                  <w:t>20</w:t>
+                  <w:t>21.05.2026 16:46</w:t>
                 </w:r>
                 <w:r>
                   <w:rPr>
@@ -16833,7 +16827,7 @@
         </w:tcPr>
         <w:tbl>
           <w:tblPr>
-            <w:tblStyle w:val="TableGrid"/>
+            <w:tblStyle w:val="Grilledutableau"/>
             <w:tblW w:w="0" w:type="auto"/>
             <w:tblBorders>
               <w:top w:val="none" w:sz="0" w:space="0" w:color="auto"/>
@@ -16865,7 +16859,6 @@
                 <w:dataBinding w:prefixMappings="xmlns:ns0='http://purl.org/dc/elements/1.1/' xmlns:ns1='http://schemas.openxmlformats.org/package/2006/metadata/core-properties' " w:xpath="/ns1:coreProperties[1]/ns0:creator[1]" w:storeItemID="{6C3C8BC8-F283-45AE-878A-BAB7291924A1}"/>
                 <w:text/>
               </w:sdtPr>
-              <w:sdtEndPr/>
               <w:sdtContent>
                 <w:tc>
                   <w:tcPr>
@@ -17024,13 +17017,7 @@
                   <w:rPr>
                     <w:lang w:val="fr-CH"/>
                   </w:rPr>
-                  <w:t>21.05.2026 13:</w:t>
-                </w:r>
-                <w:r>
-                  <w:rPr>
-                    <w:lang w:val="fr-CH"/>
-                  </w:rPr>
-                  <w:t>20</w:t>
+                  <w:t>21.05.2026 16:46</w:t>
                 </w:r>
                 <w:r>
                   <w:rPr>
@@ -17109,7 +17096,7 @@
 <w:hdr xmlns:wpc="http://schemas.microsoft.com/office/word/2010/wordprocessingCanvas" xmlns:cx="http://schemas.microsoft.com/office/drawing/2014/chartex" xmlns:cx1="http://schemas.microsoft.com/office/drawing/2015/9/8/chartex" xmlns:cx2="http://schemas.microsoft.com/office/drawing/2015/10/21/chartex" xmlns:cx3="http://schemas.microsoft.com/office/drawing/2016/5/9/chartex" xmlns:cx4="http://schemas.microsoft.com/office/drawing/2016/5/10/chartex" xmlns:cx5="http://schemas.microsoft.com/office/drawing/2016/5/11/chartex" xmlns:cx6="http://schemas.microsoft.com/office/drawing/2016/5/12/chartex" xmlns:cx7="http://schemas.microsoft.com/office/drawing/2016/5/13/chartex" xmlns:cx8="http://schemas.microsoft.com/office/drawing/2016/5/14/chartex" xmlns:mc="http://schemas.openxmlformats.org/markup-compatibility/2006" xmlns:aink="http://schemas.microsoft.com/office/drawing/2016/ink" xmlns:am3d="http://schemas.microsoft.com/office/drawing/2017/model3d" xmlns:o="urn:schemas-microsoft-com:office:office" xmlns:oel="http://schemas.microsoft.com/office/2019/extlst" xmlns:r="http://schemas.openxmlformats.org/officeDocument/2006/relationships" xmlns:m="http://schemas.openxmlformats.org/officeDocument/2006/math" xmlns:v="urn:schemas-microsoft-com:vml" xmlns:wp14="http://schemas.microsoft.com/office/word/2010/wordprocessingDrawing" xmlns:wp="http://schemas.openxmlformats.org/drawingml/2006/wordprocessingDrawing" xmlns:w10="urn:schemas-microsoft-com:office:word" xmlns:w="http://schemas.openxmlformats.org/wordprocessingml/2006/main" xmlns:w14="http://schemas.microsoft.com/office/word/2010/wordml" xmlns:w15="http://schemas.microsoft.com/office/word/2012/wordml" xmlns:w16cex="http://schemas.microsoft.com/office/word/2018/wordml/cex" xmlns:w16cid="http://schemas.microsoft.com/office/word/2016/wordml/cid" xmlns:w16="http://schemas.microsoft.com/office/word/2018/wordml" xmlns:w16du="http://schemas.microsoft.com/office/word/2023/wordml/word16du" xmlns:w16sdtdh="http://schemas.microsoft.com/office/word/2020/wordml/sdtdatahash" xmlns:w16sdtfl="http://schemas.microsoft.com/office/word/2024/wordml/sdtformatlock" xmlns:w16se="http://schemas.microsoft.com/office/word/2015/wordml/symex" xmlns:wpg="http://schemas.microsoft.com/office/word/2010/wordprocessingGroup" xmlns:wpi="http://schemas.microsoft.com/office/word/2010/wordprocessingInk" xmlns:wne="http://schemas.microsoft.com/office/word/2006/wordml" xmlns:wps="http://schemas.microsoft.com/office/word/2010/wordprocessingShape" mc:Ignorable="w14 w15 w16se w16cid w16 w16cex w16sdtdh w16sdtfl w16du wp14">
   <w:p>
     <w:pPr>
-      <w:pStyle w:val="Header"/>
+      <w:pStyle w:val="En-tte"/>
     </w:pPr>
   </w:p>
 </w:hdr>
@@ -17119,7 +17106,7 @@
 <w:hdr xmlns:wpc="http://schemas.microsoft.com/office/word/2010/wordprocessingCanvas" xmlns:cx="http://schemas.microsoft.com/office/drawing/2014/chartex" xmlns:cx1="http://schemas.microsoft.com/office/drawing/2015/9/8/chartex" xmlns:cx2="http://schemas.microsoft.com/office/drawing/2015/10/21/chartex" xmlns:cx3="http://schemas.microsoft.com/office/drawing/2016/5/9/chartex" xmlns:cx4="http://schemas.microsoft.com/office/drawing/2016/5/10/chartex" xmlns:cx5="http://schemas.microsoft.com/office/drawing/2016/5/11/chartex" xmlns:cx6="http://schemas.microsoft.com/office/drawing/2016/5/12/chartex" xmlns:cx7="http://schemas.microsoft.com/office/drawing/2016/5/13/chartex" xmlns:cx8="http://schemas.microsoft.com/office/drawing/2016/5/14/chartex" xmlns:mc="http://schemas.openxmlformats.org/markup-compatibility/2006" xmlns:aink="http://schemas.microsoft.com/office/drawing/2016/ink" xmlns:am3d="http://schemas.microsoft.com/office/drawing/2017/model3d" xmlns:o="urn:schemas-microsoft-com:office:office" xmlns:oel="http://schemas.microsoft.com/office/2019/extlst" xmlns:r="http://schemas.openxmlformats.org/officeDocument/2006/relationships" xmlns:m="http://schemas.openxmlformats.org/officeDocument/2006/math" xmlns:v="urn:schemas-microsoft-com:vml" xmlns:wp14="http://schemas.microsoft.com/office/word/2010/wordprocessingDrawing" xmlns:wp="http://schemas.openxmlformats.org/drawingml/2006/wordprocessingDrawing" xmlns:w10="urn:schemas-microsoft-com:office:word" xmlns:w="http://schemas.openxmlformats.org/wordprocessingml/2006/main" xmlns:w14="http://schemas.microsoft.com/office/word/2010/wordml" xmlns:w15="http://schemas.microsoft.com/office/word/2012/wordml" xmlns:w16cex="http://schemas.microsoft.com/office/word/2018/wordml/cex" xmlns:w16cid="http://schemas.microsoft.com/office/word/2016/wordml/cid" xmlns:w16="http://schemas.microsoft.com/office/word/2018/wordml" xmlns:w16du="http://schemas.microsoft.com/office/word/2023/wordml/word16du" xmlns:w16sdtdh="http://schemas.microsoft.com/office/word/2020/wordml/sdtdatahash" xmlns:w16sdtfl="http://schemas.microsoft.com/office/word/2024/wordml/sdtformatlock" xmlns:w16se="http://schemas.microsoft.com/office/word/2015/wordml/symex" xmlns:wpg="http://schemas.microsoft.com/office/word/2010/wordprocessingGroup" xmlns:wpi="http://schemas.microsoft.com/office/word/2010/wordprocessingInk" xmlns:wne="http://schemas.microsoft.com/office/word/2006/wordml" xmlns:wps="http://schemas.microsoft.com/office/word/2010/wordprocessingShape" mc:Ignorable="w14 w15 w16se w16cid w16 w16cex w16sdtdh w16sdtfl w16du wp14">
   <w:p>
     <w:pPr>
-      <w:pStyle w:val="Header"/>
+      <w:pStyle w:val="En-tte"/>
     </w:pPr>
   </w:p>
 </w:hdr>
@@ -17129,7 +17116,7 @@
 <w:hdr xmlns:wpc="http://schemas.microsoft.com/office/word/2010/wordprocessingCanvas" xmlns:cx="http://schemas.microsoft.com/office/drawing/2014/chartex" xmlns:cx1="http://schemas.microsoft.com/office/drawing/2015/9/8/chartex" xmlns:cx2="http://schemas.microsoft.com/office/drawing/2015/10/21/chartex" xmlns:cx3="http://schemas.microsoft.com/office/drawing/2016/5/9/chartex" xmlns:cx4="http://schemas.microsoft.com/office/drawing/2016/5/10/chartex" xmlns:cx5="http://schemas.microsoft.com/office/drawing/2016/5/11/chartex" xmlns:cx6="http://schemas.microsoft.com/office/drawing/2016/5/12/chartex" xmlns:cx7="http://schemas.microsoft.com/office/drawing/2016/5/13/chartex" xmlns:cx8="http://schemas.microsoft.com/office/drawing/2016/5/14/chartex" xmlns:mc="http://schemas.openxmlformats.org/markup-compatibility/2006" xmlns:aink="http://schemas.microsoft.com/office/drawing/2016/ink" xmlns:am3d="http://schemas.microsoft.com/office/drawing/2017/model3d" xmlns:o="urn:schemas-microsoft-com:office:office" xmlns:oel="http://schemas.microsoft.com/office/2019/extlst" xmlns:r="http://schemas.openxmlformats.org/officeDocument/2006/relationships" xmlns:m="http://schemas.openxmlformats.org/officeDocument/2006/math" xmlns:v="urn:schemas-microsoft-com:vml" xmlns:wp14="http://schemas.microsoft.com/office/word/2010/wordprocessingDrawing" xmlns:wp="http://schemas.openxmlformats.org/drawingml/2006/wordprocessingDrawing" xmlns:w10="urn:schemas-microsoft-com:office:word" xmlns:w="http://schemas.openxmlformats.org/wordprocessingml/2006/main" xmlns:w14="http://schemas.microsoft.com/office/word/2010/wordml" xmlns:w15="http://schemas.microsoft.com/office/word/2012/wordml" xmlns:w16cex="http://schemas.microsoft.com/office/word/2018/wordml/cex" xmlns:w16cid="http://schemas.microsoft.com/office/word/2016/wordml/cid" xmlns:w16="http://schemas.microsoft.com/office/word/2018/wordml" xmlns:w16du="http://schemas.microsoft.com/office/word/2023/wordml/word16du" xmlns:w16sdtdh="http://schemas.microsoft.com/office/word/2020/wordml/sdtdatahash" xmlns:w16sdtfl="http://schemas.microsoft.com/office/word/2024/wordml/sdtformatlock" xmlns:w16se="http://schemas.microsoft.com/office/word/2015/wordml/symex" xmlns:wpg="http://schemas.microsoft.com/office/word/2010/wordprocessingGroup" xmlns:wpi="http://schemas.microsoft.com/office/word/2010/wordprocessingInk" xmlns:wne="http://schemas.microsoft.com/office/word/2006/wordml" xmlns:wps="http://schemas.microsoft.com/office/word/2010/wordprocessingShape" mc:Ignorable="w14 w15 w16se w16cid w16 w16cex w16sdtdh w16sdtfl w16du wp14">
   <w:p>
     <w:pPr>
-      <w:pStyle w:val="Header"/>
+      <w:pStyle w:val="En-tte"/>
     </w:pPr>
   </w:p>
 </w:hdr>
@@ -17381,7 +17368,7 @@
   </w:p>
   <w:p>
     <w:pPr>
-      <w:pStyle w:val="Header"/>
+      <w:pStyle w:val="En-tte"/>
       <w:tabs>
         <w:tab w:val="left" w:pos="5550"/>
       </w:tabs>
@@ -17733,7 +17720,7 @@
     <w:lvl w:ilvl="0">
       <w:start w:val="1"/>
       <w:numFmt w:val="decimal"/>
-      <w:pStyle w:val="Heading1"/>
+      <w:pStyle w:val="Titre1"/>
       <w:lvlText w:val="%1"/>
       <w:lvlJc w:val="left"/>
       <w:pPr>
@@ -17749,7 +17736,7 @@
     <w:lvl w:ilvl="1">
       <w:start w:val="1"/>
       <w:numFmt w:val="decimal"/>
-      <w:pStyle w:val="Heading2"/>
+      <w:pStyle w:val="Titre2"/>
       <w:lvlText w:val="%1.%2"/>
       <w:lvlJc w:val="left"/>
       <w:pPr>
@@ -17762,7 +17749,7 @@
     <w:lvl w:ilvl="2">
       <w:start w:val="1"/>
       <w:numFmt w:val="decimal"/>
-      <w:pStyle w:val="Heading3"/>
+      <w:pStyle w:val="Titre3"/>
       <w:lvlText w:val="%1.%2.%3"/>
       <w:lvlJc w:val="left"/>
       <w:pPr>
@@ -17775,7 +17762,7 @@
     <w:lvl w:ilvl="3">
       <w:start w:val="1"/>
       <w:numFmt w:val="decimal"/>
-      <w:pStyle w:val="Heading4"/>
+      <w:pStyle w:val="Titre4"/>
       <w:lvlText w:val="%1.%2.%3.%4"/>
       <w:lvlJc w:val="left"/>
       <w:pPr>
@@ -17788,7 +17775,7 @@
     <w:lvl w:ilvl="4">
       <w:start w:val="1"/>
       <w:numFmt w:val="decimal"/>
-      <w:pStyle w:val="Heading5"/>
+      <w:pStyle w:val="Titre5"/>
       <w:lvlText w:val="%1.%2.%3.%4.%5"/>
       <w:lvlJc w:val="left"/>
       <w:pPr>
@@ -17801,7 +17788,7 @@
     <w:lvl w:ilvl="5">
       <w:start w:val="1"/>
       <w:numFmt w:val="decimal"/>
-      <w:pStyle w:val="Heading6"/>
+      <w:pStyle w:val="Titre6"/>
       <w:lvlText w:val="%1.%2.%3.%4.%5.%6"/>
       <w:lvlJc w:val="left"/>
       <w:pPr>
@@ -17814,7 +17801,7 @@
     <w:lvl w:ilvl="6">
       <w:start w:val="1"/>
       <w:numFmt w:val="decimal"/>
-      <w:pStyle w:val="Heading7"/>
+      <w:pStyle w:val="Titre7"/>
       <w:lvlText w:val="%1.%2.%3.%4.%5.%6.%7"/>
       <w:lvlJc w:val="left"/>
       <w:pPr>
@@ -17827,7 +17814,7 @@
     <w:lvl w:ilvl="7">
       <w:start w:val="1"/>
       <w:numFmt w:val="decimal"/>
-      <w:pStyle w:val="Heading8"/>
+      <w:pStyle w:val="Titre8"/>
       <w:lvlText w:val="%1.%2.%3.%4.%5.%6.%7.%8"/>
       <w:lvlJc w:val="left"/>
       <w:pPr>
@@ -17840,7 +17827,7 @@
     <w:lvl w:ilvl="8">
       <w:start w:val="1"/>
       <w:numFmt w:val="decimal"/>
-      <w:pStyle w:val="Heading9"/>
+      <w:pStyle w:val="Titre9"/>
       <w:lvlText w:val="%1.%2.%3.%4.%5.%6.%7.%8.%9"/>
       <w:lvlJc w:val="left"/>
       <w:pPr>
@@ -20406,7 +20393,7 @@
       <w:lang w:eastAsia="de-DE"/>
     </w:rPr>
   </w:style>
-  <w:style w:type="paragraph" w:styleId="Heading1">
+  <w:style w:type="paragraph" w:styleId="Titre1">
     <w:name w:val="heading 1"/>
     <w:basedOn w:val="Normal"/>
     <w:next w:val="BITTextkrper"/>
@@ -20434,7 +20421,7 @@
       <w:lang w:val="de-DE"/>
     </w:rPr>
   </w:style>
-  <w:style w:type="paragraph" w:styleId="Heading2">
+  <w:style w:type="paragraph" w:styleId="Titre2">
     <w:name w:val="heading 2"/>
     <w:basedOn w:val="Normal"/>
     <w:next w:val="BITTextkrper"/>
@@ -20458,7 +20445,7 @@
       <w:sz w:val="28"/>
     </w:rPr>
   </w:style>
-  <w:style w:type="paragraph" w:styleId="Heading3">
+  <w:style w:type="paragraph" w:styleId="Titre3">
     <w:name w:val="heading 3"/>
     <w:basedOn w:val="Normal"/>
     <w:next w:val="BITTextkrper"/>
@@ -20480,7 +20467,7 @@
       <w:sz w:val="22"/>
     </w:rPr>
   </w:style>
-  <w:style w:type="paragraph" w:styleId="Heading4">
+  <w:style w:type="paragraph" w:styleId="Titre4">
     <w:name w:val="heading 4"/>
     <w:basedOn w:val="Normal"/>
     <w:next w:val="BITTextkrper"/>
@@ -20502,7 +20489,7 @@
       <w:szCs w:val="28"/>
     </w:rPr>
   </w:style>
-  <w:style w:type="paragraph" w:styleId="Heading5">
+  <w:style w:type="paragraph" w:styleId="Titre5">
     <w:name w:val="heading 5"/>
     <w:basedOn w:val="Normal"/>
     <w:next w:val="BITTextkrper"/>
@@ -20525,7 +20512,7 @@
       <w:szCs w:val="26"/>
     </w:rPr>
   </w:style>
-  <w:style w:type="paragraph" w:styleId="Heading6">
+  <w:style w:type="paragraph" w:styleId="Titre6">
     <w:name w:val="heading 6"/>
     <w:basedOn w:val="Normal"/>
     <w:next w:val="Normal"/>
@@ -20546,7 +20533,7 @@
       <w:szCs w:val="22"/>
     </w:rPr>
   </w:style>
-  <w:style w:type="paragraph" w:styleId="Heading7">
+  <w:style w:type="paragraph" w:styleId="Titre7">
     <w:name w:val="heading 7"/>
     <w:basedOn w:val="Normal"/>
     <w:next w:val="Normal"/>
@@ -20564,7 +20551,7 @@
       <w:sz w:val="22"/>
     </w:rPr>
   </w:style>
-  <w:style w:type="paragraph" w:styleId="Heading8">
+  <w:style w:type="paragraph" w:styleId="Titre8">
     <w:name w:val="heading 8"/>
     <w:basedOn w:val="Normal"/>
     <w:next w:val="Normal"/>
@@ -20583,7 +20570,7 @@
       <w:sz w:val="22"/>
     </w:rPr>
   </w:style>
-  <w:style w:type="paragraph" w:styleId="Heading9">
+  <w:style w:type="paragraph" w:styleId="Titre9">
     <w:name w:val="heading 9"/>
     <w:basedOn w:val="Normal"/>
     <w:next w:val="Normal"/>
@@ -20603,12 +20590,13 @@
       <w:szCs w:val="22"/>
     </w:rPr>
   </w:style>
-  <w:style w:type="character" w:default="1" w:styleId="DefaultParagraphFont">
+  <w:style w:type="character" w:default="1" w:styleId="Policepardfaut">
     <w:name w:val="Default Paragraph Font"/>
     <w:uiPriority w:val="1"/>
+    <w:semiHidden/>
     <w:unhideWhenUsed/>
   </w:style>
-  <w:style w:type="table" w:default="1" w:styleId="TableNormal">
+  <w:style w:type="table" w:default="1" w:styleId="TableauNormal">
     <w:name w:val="Normal Table"/>
     <w:uiPriority w:val="99"/>
     <w:semiHidden/>
@@ -20623,7 +20611,7 @@
       </w:tblCellMar>
     </w:tblPr>
   </w:style>
-  <w:style w:type="numbering" w:default="1" w:styleId="NoList">
+  <w:style w:type="numbering" w:default="1" w:styleId="Aucuneliste">
     <w:name w:val="No List"/>
     <w:uiPriority w:val="99"/>
     <w:semiHidden/>
@@ -20640,7 +20628,7 @@
       <w:sz w:val="22"/>
     </w:rPr>
   </w:style>
-  <w:style w:type="paragraph" w:styleId="Header">
+  <w:style w:type="paragraph" w:styleId="En-tte">
     <w:name w:val="header"/>
     <w:basedOn w:val="Normal"/>
     <w:rsid w:val="006F1A78"/>
@@ -20654,7 +20642,7 @@
       <w:lang w:eastAsia="de-CH"/>
     </w:rPr>
   </w:style>
-  <w:style w:type="paragraph" w:styleId="Footer">
+  <w:style w:type="paragraph" w:styleId="Pieddepage">
     <w:name w:val="footer"/>
     <w:basedOn w:val="Normal"/>
     <w:rsid w:val="006F1A78"/>
@@ -20692,7 +20680,7 @@
       <w:sz w:val="15"/>
     </w:rPr>
   </w:style>
-  <w:style w:type="paragraph" w:styleId="Title">
+  <w:style w:type="paragraph" w:styleId="Titre">
     <w:name w:val="Title"/>
     <w:basedOn w:val="Normal"/>
     <w:next w:val="Normal"/>
@@ -20711,9 +20699,9 @@
       <w:szCs w:val="32"/>
     </w:rPr>
   </w:style>
-  <w:style w:type="paragraph" w:styleId="Subtitle">
+  <w:style w:type="paragraph" w:styleId="Sous-titre">
     <w:name w:val="Subtitle"/>
-    <w:basedOn w:val="Title"/>
+    <w:basedOn w:val="Titre"/>
     <w:next w:val="Normal"/>
     <w:qFormat/>
     <w:rsid w:val="006F1A78"/>
@@ -20763,10 +20751,10 @@
   </w:style>
   <w:style w:type="paragraph" w:customStyle="1" w:styleId="CDBHierarchie">
     <w:name w:val="CDB_Hierarchie"/>
-    <w:basedOn w:val="Header"/>
+    <w:basedOn w:val="En-tte"/>
     <w:rsid w:val="006F1A78"/>
   </w:style>
-  <w:style w:type="paragraph" w:styleId="TOC4">
+  <w:style w:type="paragraph" w:styleId="TM4">
     <w:name w:val="toc 4"/>
     <w:basedOn w:val="Normal"/>
     <w:next w:val="Normal"/>
@@ -20894,7 +20882,7 @@
       <w:lang w:eastAsia="en-US"/>
     </w:rPr>
   </w:style>
-  <w:style w:type="paragraph" w:styleId="TOC1">
+  <w:style w:type="paragraph" w:styleId="TM1">
     <w:name w:val="toc 1"/>
     <w:basedOn w:val="Normal"/>
     <w:next w:val="Normal"/>
@@ -20913,7 +20901,7 @@
       <w:sz w:val="22"/>
     </w:rPr>
   </w:style>
-  <w:style w:type="paragraph" w:styleId="TOC2">
+  <w:style w:type="paragraph" w:styleId="TM2">
     <w:name w:val="toc 2"/>
     <w:basedOn w:val="Normal"/>
     <w:next w:val="Normal"/>
@@ -20955,7 +20943,7 @@
       <w:bCs/>
     </w:rPr>
   </w:style>
-  <w:style w:type="paragraph" w:styleId="TOC3">
+  <w:style w:type="paragraph" w:styleId="TM3">
     <w:name w:val="toc 3"/>
     <w:basedOn w:val="Normal"/>
     <w:next w:val="Normal"/>
@@ -20972,9 +20960,9 @@
       <w:sz w:val="22"/>
     </w:rPr>
   </w:style>
-  <w:style w:type="character" w:styleId="Hyperlink">
+  <w:style w:type="character" w:styleId="Lienhypertexte">
     <w:name w:val="Hyperlink"/>
-    <w:basedOn w:val="DefaultParagraphFont"/>
+    <w:basedOn w:val="Policepardfaut"/>
     <w:uiPriority w:val="99"/>
     <w:rsid w:val="006F1A78"/>
     <w:rPr>
@@ -20982,7 +20970,7 @@
       <w:u w:val="single"/>
     </w:rPr>
   </w:style>
-  <w:style w:type="paragraph" w:styleId="Caption">
+  <w:style w:type="paragraph" w:styleId="Lgende">
     <w:name w:val="caption"/>
     <w:basedOn w:val="Normal"/>
     <w:next w:val="BITTextkrper"/>
@@ -21030,7 +21018,7 @@
   </w:style>
   <w:style w:type="character" w:customStyle="1" w:styleId="BITTextkrperfettChar">
     <w:name w:val="_BIT_Textkörper_fett Char"/>
-    <w:basedOn w:val="DefaultParagraphFont"/>
+    <w:basedOn w:val="Policepardfaut"/>
     <w:rsid w:val="006F1A78"/>
     <w:rPr>
       <w:rFonts w:ascii="Arial" w:hAnsi="Arial"/>
@@ -21042,7 +21030,7 @@
   </w:style>
   <w:style w:type="character" w:customStyle="1" w:styleId="BITTextkrperkursivChar">
     <w:name w:val="_BIT_Textkörper_kursiv Char"/>
-    <w:basedOn w:val="DefaultParagraphFont"/>
+    <w:basedOn w:val="Policepardfaut"/>
     <w:rsid w:val="006F1A78"/>
     <w:rPr>
       <w:rFonts w:ascii="Arial" w:hAnsi="Arial"/>
@@ -21091,7 +21079,7 @@
       <w:sz w:val="22"/>
     </w:rPr>
   </w:style>
-  <w:style w:type="paragraph" w:styleId="TOC5">
+  <w:style w:type="paragraph" w:styleId="TM5">
     <w:name w:val="toc 5"/>
     <w:basedOn w:val="Normal"/>
     <w:next w:val="Normal"/>
@@ -21102,7 +21090,7 @@
       <w:ind w:left="800"/>
     </w:pPr>
   </w:style>
-  <w:style w:type="paragraph" w:styleId="TOC6">
+  <w:style w:type="paragraph" w:styleId="TM6">
     <w:name w:val="toc 6"/>
     <w:basedOn w:val="Normal"/>
     <w:next w:val="Normal"/>
@@ -21113,7 +21101,7 @@
       <w:ind w:left="1000"/>
     </w:pPr>
   </w:style>
-  <w:style w:type="paragraph" w:styleId="TOC7">
+  <w:style w:type="paragraph" w:styleId="TM7">
     <w:name w:val="toc 7"/>
     <w:basedOn w:val="Normal"/>
     <w:next w:val="Normal"/>
@@ -21124,7 +21112,7 @@
       <w:ind w:left="1200"/>
     </w:pPr>
   </w:style>
-  <w:style w:type="paragraph" w:styleId="TOC8">
+  <w:style w:type="paragraph" w:styleId="TM8">
     <w:name w:val="toc 8"/>
     <w:basedOn w:val="Normal"/>
     <w:next w:val="Normal"/>
@@ -21135,7 +21123,7 @@
       <w:ind w:left="1400"/>
     </w:pPr>
   </w:style>
-  <w:style w:type="paragraph" w:styleId="TOC9">
+  <w:style w:type="paragraph" w:styleId="TM9">
     <w:name w:val="toc 9"/>
     <w:basedOn w:val="Normal"/>
     <w:next w:val="Normal"/>
@@ -21201,7 +21189,7 @@
   </w:style>
   <w:style w:type="character" w:customStyle="1" w:styleId="Hinweistext">
     <w:name w:val="Hinweistext"/>
-    <w:basedOn w:val="DefaultParagraphFont"/>
+    <w:basedOn w:val="Policepardfaut"/>
     <w:rsid w:val="00D344D9"/>
     <w:rPr>
       <w:rFonts w:ascii="Arial" w:hAnsi="Arial" w:cs="Arial"/>
@@ -21233,7 +21221,7 @@
   </w:style>
   <w:style w:type="paragraph" w:customStyle="1" w:styleId="TitelohneNummer">
     <w:name w:val="Titel ohne Nummer"/>
-    <w:basedOn w:val="Title"/>
+    <w:basedOn w:val="Titre"/>
     <w:next w:val="BITTextkrper"/>
     <w:rsid w:val="005479BD"/>
     <w:pPr>
@@ -21284,7 +21272,7 @@
   </w:style>
   <w:style w:type="character" w:customStyle="1" w:styleId="Verzeichnisberschrift2Char">
     <w:name w:val="Verzeichnisüberschrift 2 Char"/>
-    <w:basedOn w:val="DefaultParagraphFont"/>
+    <w:basedOn w:val="Policepardfaut"/>
     <w:link w:val="Verzeichnisberschrift2"/>
     <w:rsid w:val="008E791F"/>
     <w:rPr>
@@ -21295,9 +21283,9 @@
       <w:lang w:val="de-CH" w:eastAsia="de-DE" w:bidi="ar-SA"/>
     </w:rPr>
   </w:style>
-  <w:style w:type="table" w:styleId="TableGrid">
+  <w:style w:type="table" w:styleId="Grilledutableau">
     <w:name w:val="Table Grid"/>
-    <w:basedOn w:val="TableNormal"/>
+    <w:basedOn w:val="TableauNormal"/>
     <w:rsid w:val="00391E8B"/>
     <w:pPr>
       <w:spacing w:before="60" w:after="60"/>
@@ -21313,10 +21301,10 @@
       </w:tblBorders>
     </w:tblPr>
   </w:style>
-  <w:style w:type="paragraph" w:styleId="BalloonText">
+  <w:style w:type="paragraph" w:styleId="Textedebulles">
     <w:name w:val="Balloon Text"/>
     <w:basedOn w:val="Normal"/>
-    <w:link w:val="BalloonTextChar"/>
+    <w:link w:val="TextedebullesCar"/>
     <w:uiPriority w:val="99"/>
     <w:semiHidden/>
     <w:unhideWhenUsed/>
@@ -21330,10 +21318,10 @@
       <w:szCs w:val="16"/>
     </w:rPr>
   </w:style>
-  <w:style w:type="character" w:customStyle="1" w:styleId="BalloonTextChar">
-    <w:name w:val="Balloon Text Char"/>
-    <w:basedOn w:val="DefaultParagraphFont"/>
-    <w:link w:val="BalloonText"/>
+  <w:style w:type="character" w:customStyle="1" w:styleId="TextedebullesCar">
+    <w:name w:val="Texte de bulles Car"/>
+    <w:basedOn w:val="Policepardfaut"/>
+    <w:link w:val="Textedebulles"/>
     <w:uiPriority w:val="99"/>
     <w:semiHidden/>
     <w:rsid w:val="00383EAE"/>
@@ -21364,7 +21352,7 @@
   </w:style>
   <w:style w:type="character" w:customStyle="1" w:styleId="Puce1Car">
     <w:name w:val="Puce 1 Car"/>
-    <w:basedOn w:val="DefaultParagraphFont"/>
+    <w:basedOn w:val="Policepardfaut"/>
     <w:link w:val="Puce1"/>
     <w:rsid w:val="00030FFE"/>
     <w:rPr>
@@ -21374,9 +21362,9 @@
       <w:lang w:val="fr-FR" w:eastAsia="en-US"/>
     </w:rPr>
   </w:style>
-  <w:style w:type="character" w:styleId="PlaceholderText">
+  <w:style w:type="character" w:styleId="Textedelespacerserv">
     <w:name w:val="Placeholder Text"/>
-    <w:basedOn w:val="DefaultParagraphFont"/>
+    <w:basedOn w:val="Policepardfaut"/>
     <w:uiPriority w:val="99"/>
     <w:semiHidden/>
     <w:rsid w:val="00920673"/>
@@ -21384,9 +21372,9 @@
       <w:color w:val="808080"/>
     </w:rPr>
   </w:style>
-  <w:style w:type="character" w:styleId="CommentReference">
+  <w:style w:type="character" w:styleId="Marquedecommentaire">
     <w:name w:val="annotation reference"/>
-    <w:basedOn w:val="DefaultParagraphFont"/>
+    <w:basedOn w:val="Policepardfaut"/>
     <w:uiPriority w:val="99"/>
     <w:semiHidden/>
     <w:unhideWhenUsed/>
@@ -21396,10 +21384,10 @@
       <w:szCs w:val="16"/>
     </w:rPr>
   </w:style>
-  <w:style w:type="paragraph" w:styleId="CommentText">
+  <w:style w:type="paragraph" w:styleId="Commentaire">
     <w:name w:val="annotation text"/>
     <w:basedOn w:val="Normal"/>
-    <w:link w:val="CommentTextChar"/>
+    <w:link w:val="CommentaireCar"/>
     <w:uiPriority w:val="99"/>
     <w:unhideWhenUsed/>
     <w:rsid w:val="00245BBE"/>
@@ -21407,10 +21395,10 @@
       <w:szCs w:val="20"/>
     </w:rPr>
   </w:style>
-  <w:style w:type="character" w:customStyle="1" w:styleId="CommentTextChar">
-    <w:name w:val="Comment Text Char"/>
-    <w:basedOn w:val="DefaultParagraphFont"/>
-    <w:link w:val="CommentText"/>
+  <w:style w:type="character" w:customStyle="1" w:styleId="CommentaireCar">
+    <w:name w:val="Commentaire Car"/>
+    <w:basedOn w:val="Policepardfaut"/>
+    <w:link w:val="Commentaire"/>
     <w:uiPriority w:val="99"/>
     <w:rsid w:val="00245BBE"/>
     <w:rPr>
@@ -21418,11 +21406,11 @@
       <w:lang w:eastAsia="de-DE"/>
     </w:rPr>
   </w:style>
-  <w:style w:type="paragraph" w:styleId="CommentSubject">
+  <w:style w:type="paragraph" w:styleId="Objetducommentaire">
     <w:name w:val="annotation subject"/>
-    <w:basedOn w:val="CommentText"/>
-    <w:next w:val="CommentText"/>
-    <w:link w:val="CommentSubjectChar"/>
+    <w:basedOn w:val="Commentaire"/>
+    <w:next w:val="Commentaire"/>
+    <w:link w:val="ObjetducommentaireCar"/>
     <w:uiPriority w:val="99"/>
     <w:semiHidden/>
     <w:unhideWhenUsed/>
@@ -21432,10 +21420,10 @@
       <w:bCs/>
     </w:rPr>
   </w:style>
-  <w:style w:type="character" w:customStyle="1" w:styleId="CommentSubjectChar">
-    <w:name w:val="Comment Subject Char"/>
-    <w:basedOn w:val="CommentTextChar"/>
-    <w:link w:val="CommentSubject"/>
+  <w:style w:type="character" w:customStyle="1" w:styleId="ObjetducommentaireCar">
+    <w:name w:val="Objet du commentaire Car"/>
+    <w:basedOn w:val="CommentaireCar"/>
+    <w:link w:val="Objetducommentaire"/>
     <w:uiPriority w:val="99"/>
     <w:semiHidden/>
     <w:rsid w:val="00245BBE"/>
@@ -21461,9 +21449,9 @@
       <w:sz w:val="24"/>
     </w:rPr>
   </w:style>
-  <w:style w:type="character" w:styleId="UnresolvedMention">
+  <w:style w:type="character" w:styleId="Mentionnonrsolue">
     <w:name w:val="Unresolved Mention"/>
-    <w:basedOn w:val="DefaultParagraphFont"/>
+    <w:basedOn w:val="Policepardfaut"/>
     <w:uiPriority w:val="99"/>
     <w:semiHidden/>
     <w:unhideWhenUsed/>
@@ -21501,7 +21489,7 @@
           </w:pPr>
           <w:r>
             <w:rPr>
-              <w:rStyle w:val="PlaceholderText"/>
+              <w:rStyle w:val="Textedelespacerserv"/>
             </w:rPr>
             <w:t>[Auteur ]</w:t>
           </w:r>
@@ -21604,6 +21592,7 @@
     <w:rsidRoot w:val="00540217"/>
     <w:rsid w:val="000364E1"/>
     <w:rsid w:val="00037017"/>
+    <w:rsid w:val="00106FA8"/>
     <w:rsid w:val="00186045"/>
     <w:rsid w:val="001A139A"/>
     <w:rsid w:val="002B4E71"/>
@@ -21631,6 +21620,7 @@
     <w:rsid w:val="00B503AF"/>
     <w:rsid w:val="00B515CE"/>
     <w:rsid w:val="00BC344B"/>
+    <w:rsid w:val="00BD620C"/>
     <w:rsid w:val="00BE5347"/>
     <w:rsid w:val="00CD64D8"/>
     <w:rsid w:val="00CE2A4B"/>
@@ -21660,7 +21650,7 @@
   </m:mathPr>
   <w:themeFontLang w:val="fr-CH"/>
   <w:clrSchemeMapping w:bg1="light1" w:t1="dark1" w:bg2="light2" w:t2="dark2" w:accent1="accent1" w:accent2="accent2" w:accent3="accent3" w:accent4="accent4" w:accent5="accent5" w:accent6="accent6" w:hyperlink="hyperlink" w:followedHyperlink="followedHyperlink"/>
-  <w:decimalSymbol w:val=","/>
+  <w:decimalSymbol w:val="."/>
   <w:listSeparator w:val=";"/>
   <w15:chartTrackingRefBased/>
 </w:settings>
@@ -22071,13 +22061,13 @@
       <w:szCs w:val="3276"/>
     </w:rPr>
   </w:style>
-  <w:style w:type="character" w:default="1" w:styleId="DefaultParagraphFont">
+  <w:style w:type="character" w:default="1" w:styleId="Policepardfaut">
     <w:name w:val="Default Paragraph Font"/>
     <w:uiPriority w:val="1"/>
     <w:semiHidden/>
     <w:unhideWhenUsed/>
   </w:style>
-  <w:style w:type="table" w:default="1" w:styleId="TableNormal">
+  <w:style w:type="table" w:default="1" w:styleId="TableauNormal">
     <w:name w:val="Normal Table"/>
     <w:uiPriority w:val="99"/>
     <w:semiHidden/>
@@ -22092,15 +22082,15 @@
       </w:tblCellMar>
     </w:tblPr>
   </w:style>
-  <w:style w:type="numbering" w:default="1" w:styleId="NoList">
+  <w:style w:type="numbering" w:default="1" w:styleId="Aucuneliste">
     <w:name w:val="No List"/>
     <w:uiPriority w:val="99"/>
     <w:semiHidden/>
     <w:unhideWhenUsed/>
   </w:style>
-  <w:style w:type="character" w:styleId="PlaceholderText">
+  <w:style w:type="character" w:styleId="Textedelespacerserv">
     <w:name w:val="Placeholder Text"/>
-    <w:basedOn w:val="DefaultParagraphFont"/>
+    <w:basedOn w:val="Policepardfaut"/>
     <w:uiPriority w:val="99"/>
     <w:semiHidden/>
     <w:rsid w:val="00540217"/>

</xml_diff>

<commit_message>
feat(server): pipeline d'analyse complet et documentation Swagger
- Pipeline d'analyse fonctionnel (création, exécution, résultats)
- Documentation Swagger des routes
- Suppression des modèles inutilisés
- Mise à jour du journal, du planning et du rapport
</commit_message>
<xml_diff>
--- a/doc/GAMEZ_rapport_TPI.docx
+++ b/doc/GAMEZ_rapport_TPI.docx
@@ -7232,7 +7232,25 @@
         <w:rPr>
           <w:lang w:val="fr-CH"/>
         </w:rPr>
-        <w:t>L’API REST de CodeMentor expose les fonctionnalités de l’application sous forme d’endpoints HTTP consommés par le frontend Vue.js. Toutes les réponses sont au format JSON et la documentation interactive de l’API est générée avec Swagger, accessible sur l’URL /api/docs.</w:t>
+        <w:t>L’API REST de CodeMentor expose les fonctionnalités de l’application sous forme d’endpoints HTTP consommés par le frontend Vue.js. Toutes les réponses sont au format JSON et la documentation interactive de l’API est générée avec Swagger, accessible sur l’URL /</w:t>
+      </w:r>
+      <w:r>
+        <w:rPr>
+          <w:lang w:val="fr-CH"/>
+        </w:rPr>
+        <w:t>codementor/api</w:t>
+      </w:r>
+      <w:r>
+        <w:rPr>
+          <w:lang w:val="fr-CH"/>
+        </w:rPr>
+        <w:t>-docs</w:t>
+      </w:r>
+      <w:r>
+        <w:rPr>
+          <w:lang w:val="fr-CH"/>
+        </w:rPr>
+        <w:t>.</w:t>
       </w:r>
     </w:p>
     <w:p>
@@ -12997,6 +13015,22 @@
     </w:p>
     <w:p>
       <w:pPr>
+        <w:rPr>
+          <w:noProof/>
+          <w:lang w:val="fr-CH"/>
+        </w:rPr>
+      </w:pPr>
+      <w:r>
+        <w:rPr>
+          <w:noProof/>
+          <w:highlight w:val="yellow"/>
+          <w:lang w:val="fr-CH"/>
+        </w:rPr>
+        <w:t>Retirer les models</w:t>
+      </w:r>
+    </w:p>
+    <w:p>
+      <w:pPr>
         <w:pStyle w:val="BITTextkrper"/>
         <w:jc w:val="both"/>
         <w:rPr>
@@ -13083,6 +13117,22 @@
     </w:p>
     <w:p>
       <w:pPr>
+        <w:rPr>
+          <w:noProof/>
+          <w:lang w:val="fr-CH"/>
+        </w:rPr>
+      </w:pPr>
+      <w:r>
+        <w:rPr>
+          <w:noProof/>
+          <w:highlight w:val="yellow"/>
+          <w:lang w:val="fr-CH"/>
+        </w:rPr>
+        <w:t>Retirer les modeles</w:t>
+      </w:r>
+    </w:p>
+    <w:p>
+      <w:pPr>
         <w:pStyle w:val="BITTextkrper"/>
         <w:jc w:val="both"/>
         <w:rPr>
@@ -13199,6 +13249,22 @@
     </w:p>
     <w:p>
       <w:pPr>
+        <w:rPr>
+          <w:noProof/>
+          <w:lang w:val="fr-CH"/>
+        </w:rPr>
+      </w:pPr>
+      <w:r>
+        <w:rPr>
+          <w:noProof/>
+          <w:highlight w:val="yellow"/>
+          <w:lang w:val="fr-CH"/>
+        </w:rPr>
+        <w:t>Alt au lieux de loop</w:t>
+      </w:r>
+    </w:p>
+    <w:p>
+      <w:pPr>
         <w:pStyle w:val="BITTextkrper"/>
         <w:jc w:val="both"/>
         <w:rPr>
@@ -13362,7 +13428,7 @@
         <w:rPr>
           <w:lang w:val="fr-CH"/>
         </w:rPr>
-        <w:t>Génère la vue d'ensemble et le diagramme Mermaid en fin de traitement.</w:t>
+        <w:t>Génère le diagramme Mermaid en fin de traitement.</w:t>
       </w:r>
     </w:p>
     <w:p>
@@ -14450,14 +14516,35 @@
     </w:tbl>
     <w:p>
       <w:pPr>
+        <w:rPr>
+          <w:lang w:val="fr-CH"/>
+        </w:rPr>
+      </w:pPr>
+      <w:bookmarkStart w:id="50" w:name="_Toc250790987"/>
+      <w:bookmarkStart w:id="51" w:name="_Toc229743645"/>
+      <w:r>
+        <w:rPr>
+          <w:highlight w:val="yellow"/>
+          <w:lang w:val="fr-CH"/>
+        </w:rPr>
+        <w:t xml:space="preserve">Ajouter les codes backend et tests </w:t>
+      </w:r>
+      <w:r>
+        <w:rPr>
+          <w:highlight w:val="yellow"/>
+          <w:lang w:val="fr-CH"/>
+        </w:rPr>
+        <w:t>backend</w:t>
+      </w:r>
+    </w:p>
+    <w:p>
+      <w:pPr>
         <w:pStyle w:val="Titre2"/>
         <w:numPr>
           <w:ilvl w:val="1"/>
           <w:numId w:val="16"/>
         </w:numPr>
       </w:pPr>
-      <w:bookmarkStart w:id="50" w:name="_Toc250790987"/>
-      <w:bookmarkStart w:id="51" w:name="_Toc229743645"/>
       <w:r>
         <w:t>Moyens nécessaires</w:t>
       </w:r>
@@ -16439,7 +16526,7 @@
                   <w:rPr>
                     <w:lang w:val="fr-CH"/>
                   </w:rPr>
-                  <w:t>21.05.2026 16:46</w:t>
+                  <w:t>29.05.2026 13:22</w:t>
                 </w:r>
                 <w:r>
                   <w:rPr>
@@ -16766,7 +16853,7 @@
                   <w:rPr>
                     <w:lang w:val="fr-CH"/>
                   </w:rPr>
-                  <w:t>21.05.2026 16:46</w:t>
+                  <w:t>29.05.2026 13:22</w:t>
                 </w:r>
                 <w:r>
                   <w:rPr>
@@ -17017,7 +17104,7 @@
                   <w:rPr>
                     <w:lang w:val="fr-CH"/>
                   </w:rPr>
-                  <w:t>21.05.2026 16:46</w:t>
+                  <w:t>29.05.2026 13:22</w:t>
                 </w:r>
                 <w:r>
                   <w:rPr>
@@ -21592,6 +21679,8 @@
     <w:rsidRoot w:val="00540217"/>
     <w:rsid w:val="000364E1"/>
     <w:rsid w:val="00037017"/>
+    <w:rsid w:val="000444A3"/>
+    <w:rsid w:val="00066786"/>
     <w:rsid w:val="00106FA8"/>
     <w:rsid w:val="00186045"/>
     <w:rsid w:val="001A139A"/>
@@ -21604,11 +21693,14 @@
     <w:rsid w:val="00477435"/>
     <w:rsid w:val="005021BB"/>
     <w:rsid w:val="00540217"/>
+    <w:rsid w:val="00590662"/>
     <w:rsid w:val="005D3EF7"/>
     <w:rsid w:val="006930A9"/>
     <w:rsid w:val="006D7F9F"/>
     <w:rsid w:val="00723586"/>
+    <w:rsid w:val="00744BE1"/>
     <w:rsid w:val="007D3C18"/>
+    <w:rsid w:val="007D7F3D"/>
     <w:rsid w:val="007F0A4A"/>
     <w:rsid w:val="00803763"/>
     <w:rsid w:val="00834A29"/>
@@ -21627,6 +21719,7 @@
     <w:rsid w:val="00D0033D"/>
     <w:rsid w:val="00D87FE6"/>
     <w:rsid w:val="00DF687F"/>
+    <w:rsid w:val="00E06D36"/>
     <w:rsid w:val="00E37842"/>
     <w:rsid w:val="00F00C93"/>
     <w:rsid w:val="00F2447D"/>
@@ -22406,6 +22499,9 @@
   <wetp:taskpane dockstate="right" visibility="0" width="350" row="3">
     <wetp:webextensionref xmlns:r="http://schemas.openxmlformats.org/officeDocument/2006/relationships" r:id="rId3"/>
   </wetp:taskpane>
+  <wetp:taskpane dockstate="right" visibility="0" width="350" row="1">
+    <wetp:webextensionref xmlns:r="http://schemas.openxmlformats.org/officeDocument/2006/relationships" r:id="rId4"/>
+  </wetp:taskpane>
 </wetp:taskpanes>
 </file>
 
@@ -22449,6 +22545,18 @@
 </we:webextension>
 </file>
 
+<file path=word/webextensions/webextension4.xml><?xml version="1.0" encoding="utf-8"?>
+<we:webextension xmlns:we="http://schemas.microsoft.com/office/webextensions/webextension/2010/11" id="{95FA6A28-44D2-437C-9F86-99D86198A214}">
+  <we:reference id="wa200008397" version="1.1.4.0" store="de-DE" storeType="OMEX"/>
+  <we:alternateReferences>
+    <we:reference id="WA200008397" version="1.1.4.0" store="" storeType="OMEX"/>
+  </we:alternateReferences>
+  <we:properties/>
+  <we:bindings/>
+  <we:snapshot xmlns:r="http://schemas.openxmlformats.org/officeDocument/2006/relationships"/>
+</we:webextension>
+</file>
+
 <file path=customXml/item1.xml><?xml version="1.0" encoding="utf-8"?>
 <b:Sources xmlns:b="http://schemas.openxmlformats.org/officeDocument/2006/bibliography" xmlns="http://schemas.openxmlformats.org/officeDocument/2006/bibliography" SelectedStyle="\APA.XSL" StyleName="APA"/>
 </file>

</xml_diff>

<commit_message>
feat: moteur d'analyse IA opérationnel et frontend Vue 3 complet
- server : orchestration de l'analyse (exécution, parallélisation des
  fichiers), intégration OpenRouter, chiffrement AES du token GitHub
- client : application Vue 3 (router, store Pinia, service API), pages
  connexion/projets/détail, polling de progression, rendu Mermaid
  (zoom/pan), filtre des erreurs par sévérité
- docs : planning et journal mis à jour
</commit_message>
<xml_diff>
--- a/doc/GAMEZ_rapport_TPI.docx
+++ b/doc/GAMEZ_rapport_TPI.docx
@@ -191,7 +191,7 @@
     </w:tbl>
     <w:p>
       <w:pPr>
-        <w:pStyle w:val="Lgende"/>
+        <w:pStyle w:val="Caption"/>
         <w:rPr>
           <w:bCs w:val="0"/>
           <w:sz w:val="24"/>
@@ -533,7 +533,7 @@
     </w:p>
     <w:p>
       <w:pPr>
-        <w:pStyle w:val="Titre3"/>
+        <w:pStyle w:val="Heading3"/>
         <w:numPr>
           <w:ilvl w:val="0"/>
           <w:numId w:val="0"/>
@@ -561,7 +561,7 @@
     </w:p>
     <w:p>
       <w:pPr>
-        <w:pStyle w:val="TM1"/>
+        <w:pStyle w:val="TOC1"/>
         <w:rPr>
           <w:rFonts w:asciiTheme="minorHAnsi" w:eastAsiaTheme="minorEastAsia" w:hAnsiTheme="minorHAnsi" w:cstheme="minorBidi"/>
           <w:b w:val="0"/>
@@ -639,7 +639,7 @@
     </w:p>
     <w:p>
       <w:pPr>
-        <w:pStyle w:val="TM1"/>
+        <w:pStyle w:val="TOC1"/>
         <w:rPr>
           <w:rFonts w:asciiTheme="minorHAnsi" w:eastAsiaTheme="minorEastAsia" w:hAnsiTheme="minorHAnsi" w:cstheme="minorBidi"/>
           <w:b w:val="0"/>
@@ -725,7 +725,7 @@
     </w:p>
     <w:p>
       <w:pPr>
-        <w:pStyle w:val="TM2"/>
+        <w:pStyle w:val="TOC2"/>
         <w:rPr>
           <w:rFonts w:asciiTheme="minorHAnsi" w:eastAsiaTheme="minorEastAsia" w:hAnsiTheme="minorHAnsi" w:cstheme="minorBidi"/>
           <w:kern w:val="2"/>
@@ -788,7 +788,7 @@
     </w:p>
     <w:p>
       <w:pPr>
-        <w:pStyle w:val="TM2"/>
+        <w:pStyle w:val="TOC2"/>
         <w:rPr>
           <w:rFonts w:asciiTheme="minorHAnsi" w:eastAsiaTheme="minorEastAsia" w:hAnsiTheme="minorHAnsi" w:cstheme="minorBidi"/>
           <w:kern w:val="2"/>
@@ -851,7 +851,7 @@
     </w:p>
     <w:p>
       <w:pPr>
-        <w:pStyle w:val="TM2"/>
+        <w:pStyle w:val="TOC2"/>
         <w:rPr>
           <w:rFonts w:asciiTheme="minorHAnsi" w:eastAsiaTheme="minorEastAsia" w:hAnsiTheme="minorHAnsi" w:cstheme="minorBidi"/>
           <w:kern w:val="2"/>
@@ -914,7 +914,7 @@
     </w:p>
     <w:p>
       <w:pPr>
-        <w:pStyle w:val="TM2"/>
+        <w:pStyle w:val="TOC2"/>
         <w:rPr>
           <w:rFonts w:asciiTheme="minorHAnsi" w:eastAsiaTheme="minorEastAsia" w:hAnsiTheme="minorHAnsi" w:cstheme="minorBidi"/>
           <w:kern w:val="2"/>
@@ -977,7 +977,7 @@
     </w:p>
     <w:p>
       <w:pPr>
-        <w:pStyle w:val="TM1"/>
+        <w:pStyle w:val="TOC1"/>
         <w:rPr>
           <w:rFonts w:asciiTheme="minorHAnsi" w:eastAsiaTheme="minorEastAsia" w:hAnsiTheme="minorHAnsi" w:cstheme="minorBidi"/>
           <w:b w:val="0"/>
@@ -1063,7 +1063,7 @@
     </w:p>
     <w:p>
       <w:pPr>
-        <w:pStyle w:val="TM2"/>
+        <w:pStyle w:val="TOC2"/>
         <w:rPr>
           <w:rFonts w:asciiTheme="minorHAnsi" w:eastAsiaTheme="minorEastAsia" w:hAnsiTheme="minorHAnsi" w:cstheme="minorBidi"/>
           <w:kern w:val="2"/>
@@ -1126,7 +1126,7 @@
     </w:p>
     <w:p>
       <w:pPr>
-        <w:pStyle w:val="TM2"/>
+        <w:pStyle w:val="TOC2"/>
         <w:rPr>
           <w:rFonts w:asciiTheme="minorHAnsi" w:eastAsiaTheme="minorEastAsia" w:hAnsiTheme="minorHAnsi" w:cstheme="minorBidi"/>
           <w:kern w:val="2"/>
@@ -1189,7 +1189,7 @@
     </w:p>
     <w:p>
       <w:pPr>
-        <w:pStyle w:val="TM2"/>
+        <w:pStyle w:val="TOC2"/>
         <w:rPr>
           <w:rFonts w:asciiTheme="minorHAnsi" w:eastAsiaTheme="minorEastAsia" w:hAnsiTheme="minorHAnsi" w:cstheme="minorBidi"/>
           <w:kern w:val="2"/>
@@ -1252,7 +1252,7 @@
     </w:p>
     <w:p>
       <w:pPr>
-        <w:pStyle w:val="TM2"/>
+        <w:pStyle w:val="TOC2"/>
         <w:rPr>
           <w:rFonts w:asciiTheme="minorHAnsi" w:eastAsiaTheme="minorEastAsia" w:hAnsiTheme="minorHAnsi" w:cstheme="minorBidi"/>
           <w:kern w:val="2"/>
@@ -1315,7 +1315,7 @@
     </w:p>
     <w:p>
       <w:pPr>
-        <w:pStyle w:val="TM2"/>
+        <w:pStyle w:val="TOC2"/>
         <w:rPr>
           <w:rFonts w:asciiTheme="minorHAnsi" w:eastAsiaTheme="minorEastAsia" w:hAnsiTheme="minorHAnsi" w:cstheme="minorBidi"/>
           <w:kern w:val="2"/>
@@ -1378,7 +1378,7 @@
     </w:p>
     <w:p>
       <w:pPr>
-        <w:pStyle w:val="TM2"/>
+        <w:pStyle w:val="TOC2"/>
         <w:rPr>
           <w:rFonts w:asciiTheme="minorHAnsi" w:eastAsiaTheme="minorEastAsia" w:hAnsiTheme="minorHAnsi" w:cstheme="minorBidi"/>
           <w:kern w:val="2"/>
@@ -1441,7 +1441,7 @@
     </w:p>
     <w:p>
       <w:pPr>
-        <w:pStyle w:val="TM2"/>
+        <w:pStyle w:val="TOC2"/>
         <w:rPr>
           <w:rFonts w:asciiTheme="minorHAnsi" w:eastAsiaTheme="minorEastAsia" w:hAnsiTheme="minorHAnsi" w:cstheme="minorBidi"/>
           <w:kern w:val="2"/>
@@ -1504,7 +1504,7 @@
     </w:p>
     <w:p>
       <w:pPr>
-        <w:pStyle w:val="TM2"/>
+        <w:pStyle w:val="TOC2"/>
         <w:rPr>
           <w:rFonts w:asciiTheme="minorHAnsi" w:eastAsiaTheme="minorEastAsia" w:hAnsiTheme="minorHAnsi" w:cstheme="minorBidi"/>
           <w:kern w:val="2"/>
@@ -1567,7 +1567,7 @@
     </w:p>
     <w:p>
       <w:pPr>
-        <w:pStyle w:val="TM2"/>
+        <w:pStyle w:val="TOC2"/>
         <w:rPr>
           <w:rFonts w:asciiTheme="minorHAnsi" w:eastAsiaTheme="minorEastAsia" w:hAnsiTheme="minorHAnsi" w:cstheme="minorBidi"/>
           <w:kern w:val="2"/>
@@ -1630,7 +1630,7 @@
     </w:p>
     <w:p>
       <w:pPr>
-        <w:pStyle w:val="TM1"/>
+        <w:pStyle w:val="TOC1"/>
         <w:rPr>
           <w:rFonts w:asciiTheme="minorHAnsi" w:eastAsiaTheme="minorEastAsia" w:hAnsiTheme="minorHAnsi" w:cstheme="minorBidi"/>
           <w:b w:val="0"/>
@@ -1716,7 +1716,7 @@
     </w:p>
     <w:p>
       <w:pPr>
-        <w:pStyle w:val="TM2"/>
+        <w:pStyle w:val="TOC2"/>
         <w:rPr>
           <w:rFonts w:asciiTheme="minorHAnsi" w:eastAsiaTheme="minorEastAsia" w:hAnsiTheme="minorHAnsi" w:cstheme="minorBidi"/>
           <w:kern w:val="2"/>
@@ -1779,7 +1779,7 @@
     </w:p>
     <w:p>
       <w:pPr>
-        <w:pStyle w:val="TM2"/>
+        <w:pStyle w:val="TOC2"/>
         <w:rPr>
           <w:rFonts w:asciiTheme="minorHAnsi" w:eastAsiaTheme="minorEastAsia" w:hAnsiTheme="minorHAnsi" w:cstheme="minorBidi"/>
           <w:kern w:val="2"/>
@@ -1842,7 +1842,7 @@
     </w:p>
     <w:p>
       <w:pPr>
-        <w:pStyle w:val="TM2"/>
+        <w:pStyle w:val="TOC2"/>
         <w:rPr>
           <w:rFonts w:asciiTheme="minorHAnsi" w:eastAsiaTheme="minorEastAsia" w:hAnsiTheme="minorHAnsi" w:cstheme="minorBidi"/>
           <w:kern w:val="2"/>
@@ -1907,7 +1907,7 @@
     </w:p>
     <w:p>
       <w:pPr>
-        <w:pStyle w:val="TM2"/>
+        <w:pStyle w:val="TOC2"/>
         <w:rPr>
           <w:rFonts w:asciiTheme="minorHAnsi" w:eastAsiaTheme="minorEastAsia" w:hAnsiTheme="minorHAnsi" w:cstheme="minorBidi"/>
           <w:kern w:val="2"/>
@@ -1972,7 +1972,7 @@
     </w:p>
     <w:p>
       <w:pPr>
-        <w:pStyle w:val="TM2"/>
+        <w:pStyle w:val="TOC2"/>
         <w:rPr>
           <w:rFonts w:asciiTheme="minorHAnsi" w:eastAsiaTheme="minorEastAsia" w:hAnsiTheme="minorHAnsi" w:cstheme="minorBidi"/>
           <w:kern w:val="2"/>
@@ -2035,7 +2035,7 @@
     </w:p>
     <w:p>
       <w:pPr>
-        <w:pStyle w:val="TM2"/>
+        <w:pStyle w:val="TOC2"/>
         <w:rPr>
           <w:rFonts w:asciiTheme="minorHAnsi" w:eastAsiaTheme="minorEastAsia" w:hAnsiTheme="minorHAnsi" w:cstheme="minorBidi"/>
           <w:kern w:val="2"/>
@@ -2098,7 +2098,7 @@
     </w:p>
     <w:p>
       <w:pPr>
-        <w:pStyle w:val="TM2"/>
+        <w:pStyle w:val="TOC2"/>
         <w:rPr>
           <w:rFonts w:asciiTheme="minorHAnsi" w:eastAsiaTheme="minorEastAsia" w:hAnsiTheme="minorHAnsi" w:cstheme="minorBidi"/>
           <w:kern w:val="2"/>
@@ -2161,7 +2161,7 @@
     </w:p>
     <w:p>
       <w:pPr>
-        <w:pStyle w:val="TM2"/>
+        <w:pStyle w:val="TOC2"/>
         <w:rPr>
           <w:rFonts w:asciiTheme="minorHAnsi" w:eastAsiaTheme="minorEastAsia" w:hAnsiTheme="minorHAnsi" w:cstheme="minorBidi"/>
           <w:kern w:val="2"/>
@@ -2224,7 +2224,7 @@
     </w:p>
     <w:p>
       <w:pPr>
-        <w:pStyle w:val="TM2"/>
+        <w:pStyle w:val="TOC2"/>
         <w:rPr>
           <w:rFonts w:asciiTheme="minorHAnsi" w:eastAsiaTheme="minorEastAsia" w:hAnsiTheme="minorHAnsi" w:cstheme="minorBidi"/>
           <w:kern w:val="2"/>
@@ -2287,7 +2287,7 @@
     </w:p>
     <w:p>
       <w:pPr>
-        <w:pStyle w:val="TM2"/>
+        <w:pStyle w:val="TOC2"/>
         <w:rPr>
           <w:rFonts w:asciiTheme="minorHAnsi" w:eastAsiaTheme="minorEastAsia" w:hAnsiTheme="minorHAnsi" w:cstheme="minorBidi"/>
           <w:kern w:val="2"/>
@@ -2350,7 +2350,7 @@
     </w:p>
     <w:p>
       <w:pPr>
-        <w:pStyle w:val="TM1"/>
+        <w:pStyle w:val="TOC1"/>
         <w:rPr>
           <w:rFonts w:asciiTheme="minorHAnsi" w:eastAsiaTheme="minorEastAsia" w:hAnsiTheme="minorHAnsi" w:cstheme="minorBidi"/>
           <w:b w:val="0"/>
@@ -2436,7 +2436,7 @@
     </w:p>
     <w:p>
       <w:pPr>
-        <w:pStyle w:val="TM2"/>
+        <w:pStyle w:val="TOC2"/>
         <w:rPr>
           <w:rFonts w:asciiTheme="minorHAnsi" w:eastAsiaTheme="minorEastAsia" w:hAnsiTheme="minorHAnsi" w:cstheme="minorBidi"/>
           <w:kern w:val="2"/>
@@ -2501,7 +2501,7 @@
     </w:p>
     <w:p>
       <w:pPr>
-        <w:pStyle w:val="TM2"/>
+        <w:pStyle w:val="TOC2"/>
         <w:rPr>
           <w:rFonts w:asciiTheme="minorHAnsi" w:eastAsiaTheme="minorEastAsia" w:hAnsiTheme="minorHAnsi" w:cstheme="minorBidi"/>
           <w:kern w:val="2"/>
@@ -2566,7 +2566,7 @@
     </w:p>
     <w:p>
       <w:pPr>
-        <w:pStyle w:val="TM2"/>
+        <w:pStyle w:val="TOC2"/>
         <w:rPr>
           <w:rFonts w:asciiTheme="minorHAnsi" w:eastAsiaTheme="minorEastAsia" w:hAnsiTheme="minorHAnsi" w:cstheme="minorBidi"/>
           <w:kern w:val="2"/>
@@ -2629,7 +2629,7 @@
     </w:p>
     <w:p>
       <w:pPr>
-        <w:pStyle w:val="TM2"/>
+        <w:pStyle w:val="TOC2"/>
         <w:rPr>
           <w:rFonts w:asciiTheme="minorHAnsi" w:eastAsiaTheme="minorEastAsia" w:hAnsiTheme="minorHAnsi" w:cstheme="minorBidi"/>
           <w:kern w:val="2"/>
@@ -2692,7 +2692,7 @@
     </w:p>
     <w:p>
       <w:pPr>
-        <w:pStyle w:val="TM2"/>
+        <w:pStyle w:val="TOC2"/>
         <w:rPr>
           <w:rFonts w:asciiTheme="minorHAnsi" w:eastAsiaTheme="minorEastAsia" w:hAnsiTheme="minorHAnsi" w:cstheme="minorBidi"/>
           <w:kern w:val="2"/>
@@ -2755,7 +2755,7 @@
     </w:p>
     <w:p>
       <w:pPr>
-        <w:pStyle w:val="TM1"/>
+        <w:pStyle w:val="TOC1"/>
         <w:rPr>
           <w:rFonts w:asciiTheme="minorHAnsi" w:eastAsiaTheme="minorEastAsia" w:hAnsiTheme="minorHAnsi" w:cstheme="minorBidi"/>
           <w:b w:val="0"/>
@@ -2841,7 +2841,7 @@
     </w:p>
     <w:p>
       <w:pPr>
-        <w:pStyle w:val="TM2"/>
+        <w:pStyle w:val="TOC2"/>
         <w:rPr>
           <w:rFonts w:asciiTheme="minorHAnsi" w:eastAsiaTheme="minorEastAsia" w:hAnsiTheme="minorHAnsi" w:cstheme="minorBidi"/>
           <w:kern w:val="2"/>
@@ -2904,7 +2904,7 @@
     </w:p>
     <w:p>
       <w:pPr>
-        <w:pStyle w:val="TM2"/>
+        <w:pStyle w:val="TOC2"/>
         <w:rPr>
           <w:rFonts w:asciiTheme="minorHAnsi" w:eastAsiaTheme="minorEastAsia" w:hAnsiTheme="minorHAnsi" w:cstheme="minorBidi"/>
           <w:kern w:val="2"/>
@@ -2967,7 +2967,7 @@
     </w:p>
     <w:p>
       <w:pPr>
-        <w:pStyle w:val="TM2"/>
+        <w:pStyle w:val="TOC2"/>
         <w:rPr>
           <w:rFonts w:asciiTheme="minorHAnsi" w:eastAsiaTheme="minorEastAsia" w:hAnsiTheme="minorHAnsi" w:cstheme="minorBidi"/>
           <w:kern w:val="2"/>
@@ -3030,7 +3030,7 @@
     </w:p>
     <w:p>
       <w:pPr>
-        <w:pStyle w:val="TM1"/>
+        <w:pStyle w:val="TOC1"/>
         <w:rPr>
           <w:rFonts w:asciiTheme="minorHAnsi" w:eastAsiaTheme="minorEastAsia" w:hAnsiTheme="minorHAnsi" w:cstheme="minorBidi"/>
           <w:b w:val="0"/>
@@ -3116,7 +3116,7 @@
     </w:p>
     <w:p>
       <w:pPr>
-        <w:pStyle w:val="TM2"/>
+        <w:pStyle w:val="TOC2"/>
         <w:rPr>
           <w:rFonts w:asciiTheme="minorHAnsi" w:eastAsiaTheme="minorEastAsia" w:hAnsiTheme="minorHAnsi" w:cstheme="minorBidi"/>
           <w:kern w:val="2"/>
@@ -3179,7 +3179,7 @@
     </w:p>
     <w:p>
       <w:pPr>
-        <w:pStyle w:val="TM2"/>
+        <w:pStyle w:val="TOC2"/>
         <w:rPr>
           <w:rFonts w:asciiTheme="minorHAnsi" w:eastAsiaTheme="minorEastAsia" w:hAnsiTheme="minorHAnsi" w:cstheme="minorBidi"/>
           <w:kern w:val="2"/>
@@ -3242,7 +3242,7 @@
     </w:p>
     <w:p>
       <w:pPr>
-        <w:pStyle w:val="TM2"/>
+        <w:pStyle w:val="TOC2"/>
         <w:rPr>
           <w:rFonts w:asciiTheme="minorHAnsi" w:eastAsiaTheme="minorEastAsia" w:hAnsiTheme="minorHAnsi" w:cstheme="minorBidi"/>
           <w:kern w:val="2"/>
@@ -3305,7 +3305,7 @@
     </w:p>
     <w:p>
       <w:pPr>
-        <w:pStyle w:val="TM1"/>
+        <w:pStyle w:val="TOC1"/>
         <w:rPr>
           <w:rFonts w:asciiTheme="minorHAnsi" w:eastAsiaTheme="minorEastAsia" w:hAnsiTheme="minorHAnsi" w:cstheme="minorBidi"/>
           <w:b w:val="0"/>
@@ -3391,7 +3391,7 @@
     </w:p>
     <w:p>
       <w:pPr>
-        <w:pStyle w:val="TM1"/>
+        <w:pStyle w:val="TOC1"/>
         <w:rPr>
           <w:rFonts w:asciiTheme="minorHAnsi" w:eastAsiaTheme="minorEastAsia" w:hAnsiTheme="minorHAnsi" w:cstheme="minorBidi"/>
           <w:b w:val="0"/>
@@ -3477,7 +3477,7 @@
     </w:p>
     <w:p>
       <w:pPr>
-        <w:pStyle w:val="TM1"/>
+        <w:pStyle w:val="TOC1"/>
         <w:rPr>
           <w:rFonts w:asciiTheme="minorHAnsi" w:eastAsiaTheme="minorEastAsia" w:hAnsiTheme="minorHAnsi" w:cstheme="minorBidi"/>
           <w:b w:val="0"/>
@@ -3563,7 +3563,7 @@
     </w:p>
     <w:p>
       <w:pPr>
-        <w:pStyle w:val="TM1"/>
+        <w:pStyle w:val="TOC1"/>
         <w:rPr>
           <w:rFonts w:asciiTheme="minorHAnsi" w:eastAsiaTheme="minorEastAsia" w:hAnsiTheme="minorHAnsi" w:cstheme="minorBidi"/>
           <w:b w:val="0"/>
@@ -3717,7 +3717,7 @@
     </w:p>
     <w:p>
       <w:pPr>
-        <w:pStyle w:val="Titre1"/>
+        <w:pStyle w:val="Heading1"/>
         <w:numPr>
           <w:ilvl w:val="0"/>
           <w:numId w:val="0"/>
@@ -3811,7 +3811,7 @@
       <w:commentRangeEnd w:id="4"/>
       <w:r>
         <w:rPr>
-          <w:rStyle w:val="Marquedecommentaire"/>
+          <w:rStyle w:val="CommentReference"/>
           <w:rFonts w:cs="Arial"/>
           <w:vanish/>
           <w:color w:val="0000FF"/>
@@ -3843,7 +3843,7 @@
     </w:p>
     <w:p>
       <w:pPr>
-        <w:pStyle w:val="Titre1"/>
+        <w:pStyle w:val="Heading1"/>
         <w:numPr>
           <w:ilvl w:val="0"/>
           <w:numId w:val="36"/>
@@ -3865,7 +3865,7 @@
     </w:p>
     <w:p>
       <w:pPr>
-        <w:pStyle w:val="Titre2"/>
+        <w:pStyle w:val="Heading2"/>
         <w:tabs>
           <w:tab w:val="clear" w:pos="851"/>
         </w:tabs>
@@ -3912,7 +3912,7 @@
     </w:p>
     <w:p>
       <w:pPr>
-        <w:pStyle w:val="Titre2"/>
+        <w:pStyle w:val="Heading2"/>
         <w:tabs>
           <w:tab w:val="clear" w:pos="576"/>
           <w:tab w:val="clear" w:pos="851"/>
@@ -3984,7 +3984,7 @@
     </w:p>
     <w:p>
       <w:pPr>
-        <w:pStyle w:val="Titre2"/>
+        <w:pStyle w:val="Heading2"/>
         <w:tabs>
           <w:tab w:val="clear" w:pos="851"/>
         </w:tabs>
@@ -4060,7 +4060,7 @@
     </w:p>
     <w:p>
       <w:pPr>
-        <w:pStyle w:val="Titre2"/>
+        <w:pStyle w:val="Heading2"/>
         <w:tabs>
           <w:tab w:val="clear" w:pos="851"/>
         </w:tabs>
@@ -4196,7 +4196,7 @@
       <w:hyperlink r:id="rId19" w:history="1">
         <w:r>
           <w:rPr>
-            <w:rStyle w:val="Lienhypertexte"/>
+            <w:rStyle w:val="Hyperlink"/>
             <w:lang w:val="en-US"/>
           </w:rPr>
           <w:t>thibaudfrederic.gamez@studentfr.ch</w:t>
@@ -4268,7 +4268,7 @@
       <w:hyperlink r:id="rId20" w:history="1">
         <w:r>
           <w:rPr>
-            <w:rStyle w:val="Lienhypertexte"/>
+            <w:rStyle w:val="Hyperlink"/>
             <w:lang w:val="fr-CH"/>
           </w:rPr>
           <w:t>silvin.meylan@edufr.ch</w:t>
@@ -4347,7 +4347,7 @@
       <w:hyperlink r:id="rId21" w:history="1">
         <w:r>
           <w:rPr>
-            <w:rStyle w:val="Lienhypertexte"/>
+            <w:rStyle w:val="Hyperlink"/>
             <w:lang w:val="fr-CH"/>
           </w:rPr>
           <w:t>frederic.hertling@edufr.ch</w:t>
@@ -4389,7 +4389,7 @@
       <w:hyperlink r:id="rId22" w:history="1">
         <w:r>
           <w:rPr>
-            <w:rStyle w:val="Lienhypertexte"/>
+            <w:rStyle w:val="Hyperlink"/>
             <w:lang w:val="fr-CH"/>
           </w:rPr>
           <w:t>yves.caloz@caloz-family.ch</w:t>
@@ -4443,7 +4443,7 @@
       <w:hyperlink r:id="rId23" w:history="1">
         <w:r>
           <w:rPr>
-            <w:rStyle w:val="Lienhypertexte"/>
+            <w:rStyle w:val="Hyperlink"/>
             <w:lang w:val="fr-CH"/>
           </w:rPr>
           <w:t>julien@schenevey.ch</w:t>
@@ -4478,7 +4478,7 @@
     </w:p>
     <w:p>
       <w:pPr>
-        <w:pStyle w:val="Titre1"/>
+        <w:pStyle w:val="Heading1"/>
       </w:pPr>
       <w:bookmarkStart w:id="11" w:name="_Toc250790973"/>
       <w:bookmarkStart w:id="12" w:name="_Toc229743625"/>
@@ -4491,7 +4491,7 @@
     </w:p>
     <w:p>
       <w:pPr>
-        <w:pStyle w:val="Titre2"/>
+        <w:pStyle w:val="Heading2"/>
         <w:numPr>
           <w:ilvl w:val="1"/>
           <w:numId w:val="16"/>
@@ -4511,7 +4511,7 @@
     </w:p>
     <w:p>
       <w:pPr>
-        <w:pStyle w:val="Titre3"/>
+        <w:pStyle w:val="Heading3"/>
         <w:rPr>
           <w:lang w:val="fr-CH"/>
         </w:rPr>
@@ -4574,7 +4574,7 @@
     </w:p>
     <w:p>
       <w:pPr>
-        <w:pStyle w:val="Titre3"/>
+        <w:pStyle w:val="Heading3"/>
         <w:rPr>
           <w:lang w:val="fr-CH"/>
         </w:rPr>
@@ -4638,7 +4638,7 @@
     </w:p>
     <w:p>
       <w:pPr>
-        <w:pStyle w:val="Titre3"/>
+        <w:pStyle w:val="Heading3"/>
         <w:rPr>
           <w:lang w:val="fr-CH"/>
         </w:rPr>
@@ -4675,7 +4675,7 @@
     </w:p>
     <w:p>
       <w:pPr>
-        <w:pStyle w:val="Titre3"/>
+        <w:pStyle w:val="Heading3"/>
         <w:rPr>
           <w:lang w:val="fr-CH"/>
         </w:rPr>
@@ -5009,7 +5009,7 @@
     <w:bookmarkEnd w:id="15"/>
     <w:p>
       <w:pPr>
-        <w:pStyle w:val="Titre2"/>
+        <w:pStyle w:val="Heading2"/>
         <w:rPr>
           <w:lang w:val="fr-CH"/>
         </w:rPr>
@@ -5043,7 +5043,7 @@
     </w:p>
     <w:p>
       <w:pPr>
-        <w:pStyle w:val="Titre3"/>
+        <w:pStyle w:val="Heading3"/>
         <w:rPr>
           <w:lang w:val="fr-CH"/>
         </w:rPr>
@@ -5115,7 +5115,7 @@
     </w:p>
     <w:p>
       <w:pPr>
-        <w:pStyle w:val="Titre3"/>
+        <w:pStyle w:val="Heading3"/>
         <w:rPr>
           <w:lang w:val="fr-CH"/>
         </w:rPr>
@@ -5217,7 +5217,7 @@
     </w:p>
     <w:p>
       <w:pPr>
-        <w:pStyle w:val="Titre2"/>
+        <w:pStyle w:val="Heading2"/>
       </w:pPr>
       <w:bookmarkStart w:id="16" w:name="_Toc229743628"/>
       <w:r>
@@ -5376,7 +5376,7 @@
     </w:p>
     <w:p>
       <w:pPr>
-        <w:pStyle w:val="Titre2"/>
+        <w:pStyle w:val="Heading2"/>
       </w:pPr>
       <w:bookmarkStart w:id="17" w:name="_Toc250790977"/>
       <w:bookmarkStart w:id="18" w:name="_Toc229743629"/>
@@ -5445,7 +5445,7 @@
     </w:p>
     <w:p>
       <w:pPr>
-        <w:pStyle w:val="Titre2"/>
+        <w:pStyle w:val="Heading2"/>
       </w:pPr>
       <w:bookmarkStart w:id="19" w:name="_Toc250790978"/>
       <w:bookmarkStart w:id="20" w:name="_Toc229743630"/>
@@ -5547,7 +5547,7 @@
     </w:p>
     <w:p>
       <w:pPr>
-        <w:pStyle w:val="Titre2"/>
+        <w:pStyle w:val="Heading2"/>
         <w:numPr>
           <w:ilvl w:val="1"/>
           <w:numId w:val="16"/>
@@ -5697,7 +5697,7 @@
     </w:p>
     <w:p>
       <w:pPr>
-        <w:pStyle w:val="Titre2"/>
+        <w:pStyle w:val="Heading2"/>
         <w:rPr>
           <w:lang w:val="fr-CH"/>
         </w:rPr>
@@ -5998,7 +5998,7 @@
     </w:p>
     <w:p>
       <w:pPr>
-        <w:pStyle w:val="Titre2"/>
+        <w:pStyle w:val="Heading2"/>
         <w:rPr>
           <w:lang w:val="fr-CH"/>
         </w:rPr>
@@ -6254,7 +6254,7 @@
     </w:p>
     <w:p>
       <w:pPr>
-        <w:pStyle w:val="Titre2"/>
+        <w:pStyle w:val="Heading2"/>
         <w:rPr>
           <w:lang w:val="fr-CH"/>
         </w:rPr>
@@ -6510,7 +6510,7 @@
     </w:p>
     <w:p>
       <w:pPr>
-        <w:pStyle w:val="Titre2"/>
+        <w:pStyle w:val="Heading2"/>
         <w:rPr>
           <w:lang w:val="fr-CH"/>
         </w:rPr>
@@ -6768,12 +6768,14 @@
       <w:r>
         <w:rPr>
           <w:b/>
+          <w:highlight w:val="yellow"/>
           <w:lang w:val="fr-CH"/>
         </w:rPr>
         <w:t xml:space="preserve">Paramètres API et modèles IA. </w:t>
       </w:r>
       <w:r>
         <w:rPr>
+          <w:highlight w:val="yellow"/>
           <w:lang w:val="fr-CH"/>
         </w:rPr>
         <w:t>L’écran de configuration permet à l’utilisateur de choisir le modèle d’IA utiliser pour analyser ses projets, ici « GPT-4 Turbo (Recommandé) ».</w:t>
@@ -7069,7 +7071,7 @@
     </w:p>
     <w:p>
       <w:pPr>
-        <w:pStyle w:val="Titre1"/>
+        <w:pStyle w:val="Heading1"/>
         <w:numPr>
           <w:ilvl w:val="0"/>
           <w:numId w:val="16"/>
@@ -7090,7 +7092,7 @@
     </w:p>
     <w:p>
       <w:pPr>
-        <w:pStyle w:val="Titre2"/>
+        <w:pStyle w:val="Heading2"/>
         <w:numPr>
           <w:ilvl w:val="1"/>
           <w:numId w:val="16"/>
@@ -7118,7 +7120,7 @@
     </w:p>
     <w:p>
       <w:pPr>
-        <w:pStyle w:val="Titre2"/>
+        <w:pStyle w:val="Heading2"/>
         <w:numPr>
           <w:ilvl w:val="1"/>
           <w:numId w:val="16"/>
@@ -7155,7 +7157,7 @@
     </w:p>
     <w:p>
       <w:pPr>
-        <w:pStyle w:val="Titre2"/>
+        <w:pStyle w:val="Heading2"/>
         <w:numPr>
           <w:ilvl w:val="1"/>
           <w:numId w:val="16"/>
@@ -7198,7 +7200,7 @@
     </w:p>
     <w:p>
       <w:pPr>
-        <w:pStyle w:val="Titre2"/>
+        <w:pStyle w:val="Heading2"/>
         <w:numPr>
           <w:ilvl w:val="1"/>
           <w:numId w:val="16"/>
@@ -7214,7 +7216,7 @@
     </w:p>
     <w:p>
       <w:pPr>
-        <w:pStyle w:val="Titre3"/>
+        <w:pStyle w:val="Heading3"/>
       </w:pPr>
       <w:r>
         <w:t>Conception de l’API REST</w:t>
@@ -7294,7 +7296,7 @@
           <w:b/>
           <w:bCs/>
         </w:rPr>
-        <w:t>GET /auth/github/login</w:t>
+        <w:t>GET /auth/login</w:t>
       </w:r>
       <w:r>
         <w:t xml:space="preserve"> : redirige vers le flux OAuth GitHub.</w:t>
@@ -7313,7 +7315,7 @@
           <w:bCs/>
           <w:lang w:val="fr-CH"/>
         </w:rPr>
-        <w:t>GET /auth/github/callback</w:t>
+        <w:t>GET /auth/callback</w:t>
       </w:r>
       <w:r>
         <w:rPr>
@@ -7346,6 +7348,28 @@
     </w:p>
     <w:p>
       <w:pPr>
+        <w:pStyle w:val="BITBullet1"/>
+        <w:rPr>
+          <w:lang w:val="fr-CH"/>
+        </w:rPr>
+      </w:pPr>
+      <w:r>
+        <w:rPr>
+          <w:b/>
+          <w:bCs/>
+          <w:lang w:val="fr-CH"/>
+        </w:rPr>
+        <w:t>GET /auth/me</w:t>
+      </w:r>
+      <w:r>
+        <w:rPr>
+          <w:lang w:val="fr-CH"/>
+        </w:rPr>
+        <w:t xml:space="preserve"> : retourne l’utilisateur connecté de la session (le token GitHub est exclu de la réponse).</w:t>
+      </w:r>
+    </w:p>
+    <w:p>
+      <w:pPr>
         <w:pStyle w:val="BITTextkrper"/>
         <w:jc w:val="both"/>
         <w:rPr>
@@ -7396,6 +7420,7 @@
           <w:bCs/>
           <w:lang w:val="fr-CH"/>
         </w:rPr>
+        <w:lastRenderedPageBreak/>
         <w:t>POST /projects</w:t>
       </w:r>
       <w:r>
@@ -7416,7 +7441,6 @@
         <w:rPr>
           <w:lang w:val="fr-CH"/>
         </w:rPr>
-        <w:lastRenderedPageBreak/>
         <w:t>GET /projects/:id : détail d’un projet, de ses métadonnées GitHub et de son historique d’analyses.</w:t>
       </w:r>
     </w:p>
@@ -7534,7 +7558,7 @@
     </w:p>
     <w:p>
       <w:pPr>
-        <w:pStyle w:val="Titre2"/>
+        <w:pStyle w:val="Heading2"/>
         <w:rPr>
           <w:lang w:val="fr-CH"/>
         </w:rPr>
@@ -7559,7 +7583,7 @@
         <w:rPr>
           <w:lang w:val="fr-CH"/>
         </w:rPr>
-        <w:t>Le schéma relationnel ci-dessous présente la base de données CodeMentor sous forme de diagramme en patte d’oie. Le schéma compte six tables reliées par des clés étrangères avec suppression en cascade : la suppression d’un utilisateur entraîne la suppression de ses projets, de leurs analyses, des fichiers analysés et des erreurs/corrections associées.</w:t>
+        <w:t>Le schéma relationnel ci-dessous présente la base de données CodeMentor sous forme de diagramme en patte d’oie. Le schéma compte cinq tables reliées par des clés étrangères avec suppression en cascade : la suppression d’un utilisateur entraîne la suppression de ses projets, de leurs analyses, des fichiers analysés et des erreurs/corrections associées.</w:t>
       </w:r>
     </w:p>
     <w:p>
@@ -7628,7 +7652,7 @@
     </w:p>
     <w:p>
       <w:pPr>
-        <w:pStyle w:val="Titre3"/>
+        <w:pStyle w:val="Heading3"/>
         <w:rPr>
           <w:lang w:val="fr-CH"/>
         </w:rPr>
@@ -8368,7 +8392,7 @@
     </w:p>
     <w:p>
       <w:pPr>
-        <w:pStyle w:val="Titre3"/>
+        <w:pStyle w:val="Heading3"/>
         <w:rPr>
           <w:lang w:val="fr-CH"/>
         </w:rPr>
@@ -9241,7 +9265,7 @@
     </w:p>
     <w:p>
       <w:pPr>
-        <w:pStyle w:val="Titre3"/>
+        <w:pStyle w:val="Heading3"/>
         <w:rPr>
           <w:lang w:val="fr-CH"/>
         </w:rPr>
@@ -10651,7 +10675,7 @@
     </w:p>
     <w:p>
       <w:pPr>
-        <w:pStyle w:val="Titre3"/>
+        <w:pStyle w:val="Heading3"/>
         <w:rPr>
           <w:lang w:val="fr-CH"/>
         </w:rPr>
@@ -11525,7 +11549,7 @@
     </w:p>
     <w:p>
       <w:pPr>
-        <w:pStyle w:val="Titre3"/>
+        <w:pStyle w:val="Heading3"/>
         <w:rPr>
           <w:lang w:val="fr-CH"/>
         </w:rPr>
@@ -12927,7 +12951,7 @@
     </w:tbl>
     <w:p>
       <w:pPr>
-        <w:pStyle w:val="Titre2"/>
+        <w:pStyle w:val="Heading2"/>
         <w:rPr>
           <w:lang w:val="fr-CH"/>
         </w:rPr>
@@ -13161,7 +13185,7 @@
     </w:p>
     <w:p>
       <w:pPr>
-        <w:pStyle w:val="Titre2"/>
+        <w:pStyle w:val="Heading2"/>
         <w:rPr>
           <w:lang w:val="fr-CH"/>
         </w:rPr>
@@ -13483,7 +13507,7 @@
     </w:p>
     <w:p>
       <w:pPr>
-        <w:pStyle w:val="Titre2"/>
+        <w:pStyle w:val="Heading2"/>
         <w:numPr>
           <w:ilvl w:val="1"/>
           <w:numId w:val="16"/>
@@ -13523,7 +13547,7 @@
     </w:p>
     <w:p>
       <w:pPr>
-        <w:pStyle w:val="Titre2"/>
+        <w:pStyle w:val="Heading2"/>
         <w:numPr>
           <w:ilvl w:val="1"/>
           <w:numId w:val="16"/>
@@ -13562,7 +13586,7 @@
     </w:p>
     <w:tbl>
       <w:tblPr>
-        <w:tblStyle w:val="Grilledutableau"/>
+        <w:tblStyle w:val="TableGrid"/>
         <w:tblW w:w="0" w:type="auto"/>
         <w:tblLook w:val="04A0" w:firstRow="1" w:lastRow="0" w:firstColumn="1" w:lastColumn="0" w:noHBand="0" w:noVBand="1"/>
       </w:tblPr>
@@ -14539,7 +14563,7 @@
     </w:p>
     <w:p>
       <w:pPr>
-        <w:pStyle w:val="Titre2"/>
+        <w:pStyle w:val="Heading2"/>
         <w:numPr>
           <w:ilvl w:val="1"/>
           <w:numId w:val="16"/>
@@ -14613,7 +14637,7 @@
     </w:p>
     <w:p>
       <w:pPr>
-        <w:pStyle w:val="Titre1"/>
+        <w:pStyle w:val="Heading1"/>
         <w:numPr>
           <w:ilvl w:val="0"/>
           <w:numId w:val="16"/>
@@ -14630,7 +14654,7 @@
     </w:p>
     <w:p>
       <w:pPr>
-        <w:pStyle w:val="Titre2"/>
+        <w:pStyle w:val="Heading2"/>
         <w:numPr>
           <w:ilvl w:val="1"/>
           <w:numId w:val="16"/>
@@ -14671,7 +14695,7 @@
     </w:p>
     <w:p>
       <w:pPr>
-        <w:pStyle w:val="Titre2"/>
+        <w:pStyle w:val="Heading2"/>
         <w:numPr>
           <w:ilvl w:val="1"/>
           <w:numId w:val="16"/>
@@ -14717,7 +14741,7 @@
     </w:p>
     <w:p>
       <w:pPr>
-        <w:pStyle w:val="Titre2"/>
+        <w:pStyle w:val="Heading2"/>
         <w:rPr>
           <w:lang w:val="fr-CH"/>
         </w:rPr>
@@ -14733,7 +14757,7 @@
     </w:p>
     <w:p>
       <w:pPr>
-        <w:pStyle w:val="Titre2"/>
+        <w:pStyle w:val="Heading2"/>
         <w:numPr>
           <w:ilvl w:val="1"/>
           <w:numId w:val="16"/>
@@ -14784,7 +14808,7 @@
     </w:p>
     <w:p>
       <w:pPr>
-        <w:pStyle w:val="Titre2"/>
+        <w:pStyle w:val="Heading2"/>
       </w:pPr>
       <w:bookmarkStart w:id="61" w:name="_Toc229743651"/>
       <w:r>
@@ -14794,7 +14818,7 @@
     </w:p>
     <w:p>
       <w:pPr>
-        <w:pStyle w:val="Titre1"/>
+        <w:pStyle w:val="Heading1"/>
         <w:numPr>
           <w:ilvl w:val="0"/>
           <w:numId w:val="16"/>
@@ -14815,7 +14839,7 @@
     </w:p>
     <w:p>
       <w:pPr>
-        <w:pStyle w:val="Titre2"/>
+        <w:pStyle w:val="Heading2"/>
         <w:numPr>
           <w:ilvl w:val="1"/>
           <w:numId w:val="16"/>
@@ -14863,7 +14887,7 @@
     </w:p>
     <w:p>
       <w:pPr>
-        <w:pStyle w:val="Titre2"/>
+        <w:pStyle w:val="Heading2"/>
         <w:numPr>
           <w:ilvl w:val="1"/>
           <w:numId w:val="16"/>
@@ -15158,7 +15182,7 @@
     </w:p>
     <w:p>
       <w:pPr>
-        <w:pStyle w:val="Titre2"/>
+        <w:pStyle w:val="Heading2"/>
         <w:numPr>
           <w:ilvl w:val="1"/>
           <w:numId w:val="16"/>
@@ -15319,7 +15343,7 @@
     </w:p>
     <w:p>
       <w:pPr>
-        <w:pStyle w:val="Titre1"/>
+        <w:pStyle w:val="Heading1"/>
       </w:pPr>
       <w:bookmarkStart w:id="70" w:name="_Toc229743656"/>
       <w:bookmarkStart w:id="71" w:name="_Toc250790996"/>
@@ -15342,7 +15366,7 @@
     </w:p>
     <w:p>
       <w:pPr>
-        <w:pStyle w:val="Titre2"/>
+        <w:pStyle w:val="Heading2"/>
       </w:pPr>
       <w:bookmarkStart w:id="72" w:name="_Toc229743657"/>
       <w:r>
@@ -15370,7 +15394,7 @@
     </w:p>
     <w:p>
       <w:pPr>
-        <w:pStyle w:val="Titre2"/>
+        <w:pStyle w:val="Heading2"/>
       </w:pPr>
       <w:bookmarkStart w:id="73" w:name="_Toc229743658"/>
       <w:r>
@@ -15424,7 +15448,7 @@
     </w:p>
     <w:p>
       <w:pPr>
-        <w:pStyle w:val="Titre2"/>
+        <w:pStyle w:val="Heading2"/>
       </w:pPr>
       <w:bookmarkStart w:id="74" w:name="_Toc229743659"/>
       <w:r>
@@ -15473,7 +15497,7 @@
     </w:p>
     <w:p>
       <w:pPr>
-        <w:pStyle w:val="Titre1"/>
+        <w:pStyle w:val="Heading1"/>
         <w:numPr>
           <w:ilvl w:val="0"/>
           <w:numId w:val="16"/>
@@ -15542,7 +15566,7 @@
     </w:p>
     <w:p>
       <w:pPr>
-        <w:pStyle w:val="Titre1"/>
+        <w:pStyle w:val="Heading1"/>
         <w:numPr>
           <w:ilvl w:val="0"/>
           <w:numId w:val="16"/>
@@ -15809,7 +15833,7 @@
     </w:p>
     <w:p>
       <w:pPr>
-        <w:pStyle w:val="Titre1"/>
+        <w:pStyle w:val="Heading1"/>
         <w:numPr>
           <w:ilvl w:val="0"/>
           <w:numId w:val="16"/>
@@ -16032,7 +16056,7 @@
     </w:p>
     <w:p>
       <w:pPr>
-        <w:pStyle w:val="Titre1"/>
+        <w:pStyle w:val="Heading1"/>
         <w:numPr>
           <w:ilvl w:val="0"/>
           <w:numId w:val="16"/>
@@ -16210,11 +16234,11 @@
   <w:comment w:id="4" w:author="Stéphane Schwab" w:date="2025-07-07T16:49:00Z" w:initials="SS">
     <w:p>
       <w:pPr>
-        <w:pStyle w:val="Commentaire"/>
-      </w:pPr>
-      <w:r>
-        <w:rPr>
-          <w:rStyle w:val="Marquedecommentaire"/>
+        <w:pStyle w:val="CommentText"/>
+      </w:pPr>
+      <w:r>
+        <w:rPr>
+          <w:rStyle w:val="CommentReference"/>
         </w:rPr>
         <w:annotationRef/>
       </w:r>
@@ -16283,7 +16307,7 @@
 <w:ftr xmlns:wpc="http://schemas.microsoft.com/office/word/2010/wordprocessingCanvas" xmlns:cx="http://schemas.microsoft.com/office/drawing/2014/chartex" xmlns:cx1="http://schemas.microsoft.com/office/drawing/2015/9/8/chartex" xmlns:cx2="http://schemas.microsoft.com/office/drawing/2015/10/21/chartex" xmlns:cx3="http://schemas.microsoft.com/office/drawing/2016/5/9/chartex" xmlns:cx4="http://schemas.microsoft.com/office/drawing/2016/5/10/chartex" xmlns:cx5="http://schemas.microsoft.com/office/drawing/2016/5/11/chartex" xmlns:cx6="http://schemas.microsoft.com/office/drawing/2016/5/12/chartex" xmlns:cx7="http://schemas.microsoft.com/office/drawing/2016/5/13/chartex" xmlns:cx8="http://schemas.microsoft.com/office/drawing/2016/5/14/chartex" xmlns:mc="http://schemas.openxmlformats.org/markup-compatibility/2006" xmlns:aink="http://schemas.microsoft.com/office/drawing/2016/ink" xmlns:am3d="http://schemas.microsoft.com/office/drawing/2017/model3d" xmlns:o="urn:schemas-microsoft-com:office:office" xmlns:oel="http://schemas.microsoft.com/office/2019/extlst" xmlns:r="http://schemas.openxmlformats.org/officeDocument/2006/relationships" xmlns:m="http://schemas.openxmlformats.org/officeDocument/2006/math" xmlns:v="urn:schemas-microsoft-com:vml" xmlns:wp14="http://schemas.microsoft.com/office/word/2010/wordprocessingDrawing" xmlns:wp="http://schemas.openxmlformats.org/drawingml/2006/wordprocessingDrawing" xmlns:w10="urn:schemas-microsoft-com:office:word" xmlns:w="http://schemas.openxmlformats.org/wordprocessingml/2006/main" xmlns:w14="http://schemas.microsoft.com/office/word/2010/wordml" xmlns:w15="http://schemas.microsoft.com/office/word/2012/wordml" xmlns:w16cex="http://schemas.microsoft.com/office/word/2018/wordml/cex" xmlns:w16cid="http://schemas.microsoft.com/office/word/2016/wordml/cid" xmlns:w16="http://schemas.microsoft.com/office/word/2018/wordml" xmlns:w16du="http://schemas.microsoft.com/office/word/2023/wordml/word16du" xmlns:w16sdtdh="http://schemas.microsoft.com/office/word/2020/wordml/sdtdatahash" xmlns:w16sdtfl="http://schemas.microsoft.com/office/word/2024/wordml/sdtformatlock" xmlns:w16se="http://schemas.microsoft.com/office/word/2015/wordml/symex" xmlns:wpg="http://schemas.microsoft.com/office/word/2010/wordprocessingGroup" xmlns:wpi="http://schemas.microsoft.com/office/word/2010/wordprocessingInk" xmlns:wne="http://schemas.microsoft.com/office/word/2006/wordml" xmlns:wps="http://schemas.microsoft.com/office/word/2010/wordprocessingShape" mc:Ignorable="w14 w15 w16se w16cid w16 w16cex w16sdtdh w16sdtfl w16du wp14">
   <w:p>
     <w:pPr>
-      <w:pStyle w:val="Pieddepage"/>
+      <w:pStyle w:val="Footer"/>
     </w:pPr>
   </w:p>
 </w:ftr>
@@ -16317,7 +16341,7 @@
         </w:tcPr>
         <w:tbl>
           <w:tblPr>
-            <w:tblStyle w:val="Grilledutableau"/>
+            <w:tblStyle w:val="TableGrid"/>
             <w:tblW w:w="9781" w:type="dxa"/>
             <w:tblBorders>
               <w:top w:val="none" w:sz="0" w:space="0" w:color="auto"/>
@@ -16526,7 +16550,7 @@
                   <w:rPr>
                     <w:lang w:val="fr-CH"/>
                   </w:rPr>
-                  <w:t>29.05.2026 13:22</w:t>
+                  <w:t>29.05.2026 16:02</w:t>
                 </w:r>
                 <w:r>
                   <w:rPr>
@@ -16555,7 +16579,7 @@
   </w:tbl>
   <w:p>
     <w:pPr>
-      <w:pStyle w:val="Pieddepage"/>
+      <w:pStyle w:val="Footer"/>
     </w:pPr>
   </w:p>
 </w:ftr>
@@ -16565,7 +16589,7 @@
 <w:ftr xmlns:wpc="http://schemas.microsoft.com/office/word/2010/wordprocessingCanvas" xmlns:cx="http://schemas.microsoft.com/office/drawing/2014/chartex" xmlns:cx1="http://schemas.microsoft.com/office/drawing/2015/9/8/chartex" xmlns:cx2="http://schemas.microsoft.com/office/drawing/2015/10/21/chartex" xmlns:cx3="http://schemas.microsoft.com/office/drawing/2016/5/9/chartex" xmlns:cx4="http://schemas.microsoft.com/office/drawing/2016/5/10/chartex" xmlns:cx5="http://schemas.microsoft.com/office/drawing/2016/5/11/chartex" xmlns:cx6="http://schemas.microsoft.com/office/drawing/2016/5/12/chartex" xmlns:cx7="http://schemas.microsoft.com/office/drawing/2016/5/13/chartex" xmlns:cx8="http://schemas.microsoft.com/office/drawing/2016/5/14/chartex" xmlns:mc="http://schemas.openxmlformats.org/markup-compatibility/2006" xmlns:aink="http://schemas.microsoft.com/office/drawing/2016/ink" xmlns:am3d="http://schemas.microsoft.com/office/drawing/2017/model3d" xmlns:o="urn:schemas-microsoft-com:office:office" xmlns:oel="http://schemas.microsoft.com/office/2019/extlst" xmlns:r="http://schemas.openxmlformats.org/officeDocument/2006/relationships" xmlns:m="http://schemas.openxmlformats.org/officeDocument/2006/math" xmlns:v="urn:schemas-microsoft-com:vml" xmlns:wp14="http://schemas.microsoft.com/office/word/2010/wordprocessingDrawing" xmlns:wp="http://schemas.openxmlformats.org/drawingml/2006/wordprocessingDrawing" xmlns:w10="urn:schemas-microsoft-com:office:word" xmlns:w="http://schemas.openxmlformats.org/wordprocessingml/2006/main" xmlns:w14="http://schemas.microsoft.com/office/word/2010/wordml" xmlns:w15="http://schemas.microsoft.com/office/word/2012/wordml" xmlns:w16cex="http://schemas.microsoft.com/office/word/2018/wordml/cex" xmlns:w16cid="http://schemas.microsoft.com/office/word/2016/wordml/cid" xmlns:w16="http://schemas.microsoft.com/office/word/2018/wordml" xmlns:w16du="http://schemas.microsoft.com/office/word/2023/wordml/word16du" xmlns:w16sdtdh="http://schemas.microsoft.com/office/word/2020/wordml/sdtdatahash" xmlns:w16sdtfl="http://schemas.microsoft.com/office/word/2024/wordml/sdtformatlock" xmlns:w16se="http://schemas.microsoft.com/office/word/2015/wordml/symex" xmlns:wpg="http://schemas.microsoft.com/office/word/2010/wordprocessingGroup" xmlns:wpi="http://schemas.microsoft.com/office/word/2010/wordprocessingInk" xmlns:wne="http://schemas.microsoft.com/office/word/2006/wordml" xmlns:wps="http://schemas.microsoft.com/office/word/2010/wordprocessingShape" mc:Ignorable="w14 w15 w16se w16cid w16 w16cex w16sdtdh w16sdtfl w16du wp14">
   <w:p>
     <w:pPr>
-      <w:pStyle w:val="Pieddepage"/>
+      <w:pStyle w:val="Footer"/>
     </w:pPr>
     <w:r>
       <w:fldChar w:fldCharType="begin"/>
@@ -16665,7 +16689,7 @@
         </w:tcPr>
         <w:tbl>
           <w:tblPr>
-            <w:tblStyle w:val="Grilledutableau"/>
+            <w:tblStyle w:val="TableGrid"/>
             <w:tblW w:w="0" w:type="auto"/>
             <w:tblBorders>
               <w:top w:val="none" w:sz="0" w:space="0" w:color="auto"/>
@@ -16853,7 +16877,7 @@
                   <w:rPr>
                     <w:lang w:val="fr-CH"/>
                   </w:rPr>
-                  <w:t>29.05.2026 13:22</w:t>
+                  <w:t>29.05.2026 16:02</w:t>
                 </w:r>
                 <w:r>
                   <w:rPr>
@@ -16914,7 +16938,7 @@
         </w:tcPr>
         <w:tbl>
           <w:tblPr>
-            <w:tblStyle w:val="Grilledutableau"/>
+            <w:tblStyle w:val="TableGrid"/>
             <w:tblW w:w="0" w:type="auto"/>
             <w:tblBorders>
               <w:top w:val="none" w:sz="0" w:space="0" w:color="auto"/>
@@ -17104,7 +17128,7 @@
                   <w:rPr>
                     <w:lang w:val="fr-CH"/>
                   </w:rPr>
-                  <w:t>29.05.2026 13:22</w:t>
+                  <w:t>29.05.2026 16:02</w:t>
                 </w:r>
                 <w:r>
                   <w:rPr>
@@ -17183,7 +17207,7 @@
 <w:hdr xmlns:wpc="http://schemas.microsoft.com/office/word/2010/wordprocessingCanvas" xmlns:cx="http://schemas.microsoft.com/office/drawing/2014/chartex" xmlns:cx1="http://schemas.microsoft.com/office/drawing/2015/9/8/chartex" xmlns:cx2="http://schemas.microsoft.com/office/drawing/2015/10/21/chartex" xmlns:cx3="http://schemas.microsoft.com/office/drawing/2016/5/9/chartex" xmlns:cx4="http://schemas.microsoft.com/office/drawing/2016/5/10/chartex" xmlns:cx5="http://schemas.microsoft.com/office/drawing/2016/5/11/chartex" xmlns:cx6="http://schemas.microsoft.com/office/drawing/2016/5/12/chartex" xmlns:cx7="http://schemas.microsoft.com/office/drawing/2016/5/13/chartex" xmlns:cx8="http://schemas.microsoft.com/office/drawing/2016/5/14/chartex" xmlns:mc="http://schemas.openxmlformats.org/markup-compatibility/2006" xmlns:aink="http://schemas.microsoft.com/office/drawing/2016/ink" xmlns:am3d="http://schemas.microsoft.com/office/drawing/2017/model3d" xmlns:o="urn:schemas-microsoft-com:office:office" xmlns:oel="http://schemas.microsoft.com/office/2019/extlst" xmlns:r="http://schemas.openxmlformats.org/officeDocument/2006/relationships" xmlns:m="http://schemas.openxmlformats.org/officeDocument/2006/math" xmlns:v="urn:schemas-microsoft-com:vml" xmlns:wp14="http://schemas.microsoft.com/office/word/2010/wordprocessingDrawing" xmlns:wp="http://schemas.openxmlformats.org/drawingml/2006/wordprocessingDrawing" xmlns:w10="urn:schemas-microsoft-com:office:word" xmlns:w="http://schemas.openxmlformats.org/wordprocessingml/2006/main" xmlns:w14="http://schemas.microsoft.com/office/word/2010/wordml" xmlns:w15="http://schemas.microsoft.com/office/word/2012/wordml" xmlns:w16cex="http://schemas.microsoft.com/office/word/2018/wordml/cex" xmlns:w16cid="http://schemas.microsoft.com/office/word/2016/wordml/cid" xmlns:w16="http://schemas.microsoft.com/office/word/2018/wordml" xmlns:w16du="http://schemas.microsoft.com/office/word/2023/wordml/word16du" xmlns:w16sdtdh="http://schemas.microsoft.com/office/word/2020/wordml/sdtdatahash" xmlns:w16sdtfl="http://schemas.microsoft.com/office/word/2024/wordml/sdtformatlock" xmlns:w16se="http://schemas.microsoft.com/office/word/2015/wordml/symex" xmlns:wpg="http://schemas.microsoft.com/office/word/2010/wordprocessingGroup" xmlns:wpi="http://schemas.microsoft.com/office/word/2010/wordprocessingInk" xmlns:wne="http://schemas.microsoft.com/office/word/2006/wordml" xmlns:wps="http://schemas.microsoft.com/office/word/2010/wordprocessingShape" mc:Ignorable="w14 w15 w16se w16cid w16 w16cex w16sdtdh w16sdtfl w16du wp14">
   <w:p>
     <w:pPr>
-      <w:pStyle w:val="En-tte"/>
+      <w:pStyle w:val="Header"/>
     </w:pPr>
   </w:p>
 </w:hdr>
@@ -17193,7 +17217,7 @@
 <w:hdr xmlns:wpc="http://schemas.microsoft.com/office/word/2010/wordprocessingCanvas" xmlns:cx="http://schemas.microsoft.com/office/drawing/2014/chartex" xmlns:cx1="http://schemas.microsoft.com/office/drawing/2015/9/8/chartex" xmlns:cx2="http://schemas.microsoft.com/office/drawing/2015/10/21/chartex" xmlns:cx3="http://schemas.microsoft.com/office/drawing/2016/5/9/chartex" xmlns:cx4="http://schemas.microsoft.com/office/drawing/2016/5/10/chartex" xmlns:cx5="http://schemas.microsoft.com/office/drawing/2016/5/11/chartex" xmlns:cx6="http://schemas.microsoft.com/office/drawing/2016/5/12/chartex" xmlns:cx7="http://schemas.microsoft.com/office/drawing/2016/5/13/chartex" xmlns:cx8="http://schemas.microsoft.com/office/drawing/2016/5/14/chartex" xmlns:mc="http://schemas.openxmlformats.org/markup-compatibility/2006" xmlns:aink="http://schemas.microsoft.com/office/drawing/2016/ink" xmlns:am3d="http://schemas.microsoft.com/office/drawing/2017/model3d" xmlns:o="urn:schemas-microsoft-com:office:office" xmlns:oel="http://schemas.microsoft.com/office/2019/extlst" xmlns:r="http://schemas.openxmlformats.org/officeDocument/2006/relationships" xmlns:m="http://schemas.openxmlformats.org/officeDocument/2006/math" xmlns:v="urn:schemas-microsoft-com:vml" xmlns:wp14="http://schemas.microsoft.com/office/word/2010/wordprocessingDrawing" xmlns:wp="http://schemas.openxmlformats.org/drawingml/2006/wordprocessingDrawing" xmlns:w10="urn:schemas-microsoft-com:office:word" xmlns:w="http://schemas.openxmlformats.org/wordprocessingml/2006/main" xmlns:w14="http://schemas.microsoft.com/office/word/2010/wordml" xmlns:w15="http://schemas.microsoft.com/office/word/2012/wordml" xmlns:w16cex="http://schemas.microsoft.com/office/word/2018/wordml/cex" xmlns:w16cid="http://schemas.microsoft.com/office/word/2016/wordml/cid" xmlns:w16="http://schemas.microsoft.com/office/word/2018/wordml" xmlns:w16du="http://schemas.microsoft.com/office/word/2023/wordml/word16du" xmlns:w16sdtdh="http://schemas.microsoft.com/office/word/2020/wordml/sdtdatahash" xmlns:w16sdtfl="http://schemas.microsoft.com/office/word/2024/wordml/sdtformatlock" xmlns:w16se="http://schemas.microsoft.com/office/word/2015/wordml/symex" xmlns:wpg="http://schemas.microsoft.com/office/word/2010/wordprocessingGroup" xmlns:wpi="http://schemas.microsoft.com/office/word/2010/wordprocessingInk" xmlns:wne="http://schemas.microsoft.com/office/word/2006/wordml" xmlns:wps="http://schemas.microsoft.com/office/word/2010/wordprocessingShape" mc:Ignorable="w14 w15 w16se w16cid w16 w16cex w16sdtdh w16sdtfl w16du wp14">
   <w:p>
     <w:pPr>
-      <w:pStyle w:val="En-tte"/>
+      <w:pStyle w:val="Header"/>
     </w:pPr>
   </w:p>
 </w:hdr>
@@ -17203,7 +17227,7 @@
 <w:hdr xmlns:wpc="http://schemas.microsoft.com/office/word/2010/wordprocessingCanvas" xmlns:cx="http://schemas.microsoft.com/office/drawing/2014/chartex" xmlns:cx1="http://schemas.microsoft.com/office/drawing/2015/9/8/chartex" xmlns:cx2="http://schemas.microsoft.com/office/drawing/2015/10/21/chartex" xmlns:cx3="http://schemas.microsoft.com/office/drawing/2016/5/9/chartex" xmlns:cx4="http://schemas.microsoft.com/office/drawing/2016/5/10/chartex" xmlns:cx5="http://schemas.microsoft.com/office/drawing/2016/5/11/chartex" xmlns:cx6="http://schemas.microsoft.com/office/drawing/2016/5/12/chartex" xmlns:cx7="http://schemas.microsoft.com/office/drawing/2016/5/13/chartex" xmlns:cx8="http://schemas.microsoft.com/office/drawing/2016/5/14/chartex" xmlns:mc="http://schemas.openxmlformats.org/markup-compatibility/2006" xmlns:aink="http://schemas.microsoft.com/office/drawing/2016/ink" xmlns:am3d="http://schemas.microsoft.com/office/drawing/2017/model3d" xmlns:o="urn:schemas-microsoft-com:office:office" xmlns:oel="http://schemas.microsoft.com/office/2019/extlst" xmlns:r="http://schemas.openxmlformats.org/officeDocument/2006/relationships" xmlns:m="http://schemas.openxmlformats.org/officeDocument/2006/math" xmlns:v="urn:schemas-microsoft-com:vml" xmlns:wp14="http://schemas.microsoft.com/office/word/2010/wordprocessingDrawing" xmlns:wp="http://schemas.openxmlformats.org/drawingml/2006/wordprocessingDrawing" xmlns:w10="urn:schemas-microsoft-com:office:word" xmlns:w="http://schemas.openxmlformats.org/wordprocessingml/2006/main" xmlns:w14="http://schemas.microsoft.com/office/word/2010/wordml" xmlns:w15="http://schemas.microsoft.com/office/word/2012/wordml" xmlns:w16cex="http://schemas.microsoft.com/office/word/2018/wordml/cex" xmlns:w16cid="http://schemas.microsoft.com/office/word/2016/wordml/cid" xmlns:w16="http://schemas.microsoft.com/office/word/2018/wordml" xmlns:w16du="http://schemas.microsoft.com/office/word/2023/wordml/word16du" xmlns:w16sdtdh="http://schemas.microsoft.com/office/word/2020/wordml/sdtdatahash" xmlns:w16sdtfl="http://schemas.microsoft.com/office/word/2024/wordml/sdtformatlock" xmlns:w16se="http://schemas.microsoft.com/office/word/2015/wordml/symex" xmlns:wpg="http://schemas.microsoft.com/office/word/2010/wordprocessingGroup" xmlns:wpi="http://schemas.microsoft.com/office/word/2010/wordprocessingInk" xmlns:wne="http://schemas.microsoft.com/office/word/2006/wordml" xmlns:wps="http://schemas.microsoft.com/office/word/2010/wordprocessingShape" mc:Ignorable="w14 w15 w16se w16cid w16 w16cex w16sdtdh w16sdtfl w16du wp14">
   <w:p>
     <w:pPr>
-      <w:pStyle w:val="En-tte"/>
+      <w:pStyle w:val="Header"/>
     </w:pPr>
   </w:p>
 </w:hdr>
@@ -17455,7 +17479,7 @@
   </w:p>
   <w:p>
     <w:pPr>
-      <w:pStyle w:val="En-tte"/>
+      <w:pStyle w:val="Header"/>
       <w:tabs>
         <w:tab w:val="left" w:pos="5550"/>
       </w:tabs>
@@ -17807,7 +17831,7 @@
     <w:lvl w:ilvl="0">
       <w:start w:val="1"/>
       <w:numFmt w:val="decimal"/>
-      <w:pStyle w:val="Titre1"/>
+      <w:pStyle w:val="Heading1"/>
       <w:lvlText w:val="%1"/>
       <w:lvlJc w:val="left"/>
       <w:pPr>
@@ -17823,7 +17847,7 @@
     <w:lvl w:ilvl="1">
       <w:start w:val="1"/>
       <w:numFmt w:val="decimal"/>
-      <w:pStyle w:val="Titre2"/>
+      <w:pStyle w:val="Heading2"/>
       <w:lvlText w:val="%1.%2"/>
       <w:lvlJc w:val="left"/>
       <w:pPr>
@@ -17836,7 +17860,7 @@
     <w:lvl w:ilvl="2">
       <w:start w:val="1"/>
       <w:numFmt w:val="decimal"/>
-      <w:pStyle w:val="Titre3"/>
+      <w:pStyle w:val="Heading3"/>
       <w:lvlText w:val="%1.%2.%3"/>
       <w:lvlJc w:val="left"/>
       <w:pPr>
@@ -17849,7 +17873,7 @@
     <w:lvl w:ilvl="3">
       <w:start w:val="1"/>
       <w:numFmt w:val="decimal"/>
-      <w:pStyle w:val="Titre4"/>
+      <w:pStyle w:val="Heading4"/>
       <w:lvlText w:val="%1.%2.%3.%4"/>
       <w:lvlJc w:val="left"/>
       <w:pPr>
@@ -17862,7 +17886,7 @@
     <w:lvl w:ilvl="4">
       <w:start w:val="1"/>
       <w:numFmt w:val="decimal"/>
-      <w:pStyle w:val="Titre5"/>
+      <w:pStyle w:val="Heading5"/>
       <w:lvlText w:val="%1.%2.%3.%4.%5"/>
       <w:lvlJc w:val="left"/>
       <w:pPr>
@@ -17875,7 +17899,7 @@
     <w:lvl w:ilvl="5">
       <w:start w:val="1"/>
       <w:numFmt w:val="decimal"/>
-      <w:pStyle w:val="Titre6"/>
+      <w:pStyle w:val="Heading6"/>
       <w:lvlText w:val="%1.%2.%3.%4.%5.%6"/>
       <w:lvlJc w:val="left"/>
       <w:pPr>
@@ -17888,7 +17912,7 @@
     <w:lvl w:ilvl="6">
       <w:start w:val="1"/>
       <w:numFmt w:val="decimal"/>
-      <w:pStyle w:val="Titre7"/>
+      <w:pStyle w:val="Heading7"/>
       <w:lvlText w:val="%1.%2.%3.%4.%5.%6.%7"/>
       <w:lvlJc w:val="left"/>
       <w:pPr>
@@ -17901,7 +17925,7 @@
     <w:lvl w:ilvl="7">
       <w:start w:val="1"/>
       <w:numFmt w:val="decimal"/>
-      <w:pStyle w:val="Titre8"/>
+      <w:pStyle w:val="Heading8"/>
       <w:lvlText w:val="%1.%2.%3.%4.%5.%6.%7.%8"/>
       <w:lvlJc w:val="left"/>
       <w:pPr>
@@ -17914,7 +17938,7 @@
     <w:lvl w:ilvl="8">
       <w:start w:val="1"/>
       <w:numFmt w:val="decimal"/>
-      <w:pStyle w:val="Titre9"/>
+      <w:pStyle w:val="Heading9"/>
       <w:lvlText w:val="%1.%2.%3.%4.%5.%6.%7.%8.%9"/>
       <w:lvlJc w:val="left"/>
       <w:pPr>
@@ -20480,7 +20504,7 @@
       <w:lang w:eastAsia="de-DE"/>
     </w:rPr>
   </w:style>
-  <w:style w:type="paragraph" w:styleId="Titre1">
+  <w:style w:type="paragraph" w:styleId="Heading1">
     <w:name w:val="heading 1"/>
     <w:basedOn w:val="Normal"/>
     <w:next w:val="BITTextkrper"/>
@@ -20508,7 +20532,7 @@
       <w:lang w:val="de-DE"/>
     </w:rPr>
   </w:style>
-  <w:style w:type="paragraph" w:styleId="Titre2">
+  <w:style w:type="paragraph" w:styleId="Heading2">
     <w:name w:val="heading 2"/>
     <w:basedOn w:val="Normal"/>
     <w:next w:val="BITTextkrper"/>
@@ -20532,7 +20556,7 @@
       <w:sz w:val="28"/>
     </w:rPr>
   </w:style>
-  <w:style w:type="paragraph" w:styleId="Titre3">
+  <w:style w:type="paragraph" w:styleId="Heading3">
     <w:name w:val="heading 3"/>
     <w:basedOn w:val="Normal"/>
     <w:next w:val="BITTextkrper"/>
@@ -20554,7 +20578,7 @@
       <w:sz w:val="22"/>
     </w:rPr>
   </w:style>
-  <w:style w:type="paragraph" w:styleId="Titre4">
+  <w:style w:type="paragraph" w:styleId="Heading4">
     <w:name w:val="heading 4"/>
     <w:basedOn w:val="Normal"/>
     <w:next w:val="BITTextkrper"/>
@@ -20576,7 +20600,7 @@
       <w:szCs w:val="28"/>
     </w:rPr>
   </w:style>
-  <w:style w:type="paragraph" w:styleId="Titre5">
+  <w:style w:type="paragraph" w:styleId="Heading5">
     <w:name w:val="heading 5"/>
     <w:basedOn w:val="Normal"/>
     <w:next w:val="BITTextkrper"/>
@@ -20599,7 +20623,7 @@
       <w:szCs w:val="26"/>
     </w:rPr>
   </w:style>
-  <w:style w:type="paragraph" w:styleId="Titre6">
+  <w:style w:type="paragraph" w:styleId="Heading6">
     <w:name w:val="heading 6"/>
     <w:basedOn w:val="Normal"/>
     <w:next w:val="Normal"/>
@@ -20620,7 +20644,7 @@
       <w:szCs w:val="22"/>
     </w:rPr>
   </w:style>
-  <w:style w:type="paragraph" w:styleId="Titre7">
+  <w:style w:type="paragraph" w:styleId="Heading7">
     <w:name w:val="heading 7"/>
     <w:basedOn w:val="Normal"/>
     <w:next w:val="Normal"/>
@@ -20638,7 +20662,7 @@
       <w:sz w:val="22"/>
     </w:rPr>
   </w:style>
-  <w:style w:type="paragraph" w:styleId="Titre8">
+  <w:style w:type="paragraph" w:styleId="Heading8">
     <w:name w:val="heading 8"/>
     <w:basedOn w:val="Normal"/>
     <w:next w:val="Normal"/>
@@ -20657,7 +20681,7 @@
       <w:sz w:val="22"/>
     </w:rPr>
   </w:style>
-  <w:style w:type="paragraph" w:styleId="Titre9">
+  <w:style w:type="paragraph" w:styleId="Heading9">
     <w:name w:val="heading 9"/>
     <w:basedOn w:val="Normal"/>
     <w:next w:val="Normal"/>
@@ -20677,13 +20701,13 @@
       <w:szCs w:val="22"/>
     </w:rPr>
   </w:style>
-  <w:style w:type="character" w:default="1" w:styleId="Policepardfaut">
+  <w:style w:type="character" w:default="1" w:styleId="DefaultParagraphFont">
     <w:name w:val="Default Paragraph Font"/>
     <w:uiPriority w:val="1"/>
     <w:semiHidden/>
     <w:unhideWhenUsed/>
   </w:style>
-  <w:style w:type="table" w:default="1" w:styleId="TableauNormal">
+  <w:style w:type="table" w:default="1" w:styleId="TableNormal">
     <w:name w:val="Normal Table"/>
     <w:uiPriority w:val="99"/>
     <w:semiHidden/>
@@ -20698,7 +20722,7 @@
       </w:tblCellMar>
     </w:tblPr>
   </w:style>
-  <w:style w:type="numbering" w:default="1" w:styleId="Aucuneliste">
+  <w:style w:type="numbering" w:default="1" w:styleId="NoList">
     <w:name w:val="No List"/>
     <w:uiPriority w:val="99"/>
     <w:semiHidden/>
@@ -20715,7 +20739,7 @@
       <w:sz w:val="22"/>
     </w:rPr>
   </w:style>
-  <w:style w:type="paragraph" w:styleId="En-tte">
+  <w:style w:type="paragraph" w:styleId="Header">
     <w:name w:val="header"/>
     <w:basedOn w:val="Normal"/>
     <w:rsid w:val="006F1A78"/>
@@ -20729,7 +20753,7 @@
       <w:lang w:eastAsia="de-CH"/>
     </w:rPr>
   </w:style>
-  <w:style w:type="paragraph" w:styleId="Pieddepage">
+  <w:style w:type="paragraph" w:styleId="Footer">
     <w:name w:val="footer"/>
     <w:basedOn w:val="Normal"/>
     <w:rsid w:val="006F1A78"/>
@@ -20767,7 +20791,7 @@
       <w:sz w:val="15"/>
     </w:rPr>
   </w:style>
-  <w:style w:type="paragraph" w:styleId="Titre">
+  <w:style w:type="paragraph" w:styleId="Title">
     <w:name w:val="Title"/>
     <w:basedOn w:val="Normal"/>
     <w:next w:val="Normal"/>
@@ -20786,9 +20810,9 @@
       <w:szCs w:val="32"/>
     </w:rPr>
   </w:style>
-  <w:style w:type="paragraph" w:styleId="Sous-titre">
+  <w:style w:type="paragraph" w:styleId="Subtitle">
     <w:name w:val="Subtitle"/>
-    <w:basedOn w:val="Titre"/>
+    <w:basedOn w:val="Title"/>
     <w:next w:val="Normal"/>
     <w:qFormat/>
     <w:rsid w:val="006F1A78"/>
@@ -20838,10 +20862,10 @@
   </w:style>
   <w:style w:type="paragraph" w:customStyle="1" w:styleId="CDBHierarchie">
     <w:name w:val="CDB_Hierarchie"/>
-    <w:basedOn w:val="En-tte"/>
+    <w:basedOn w:val="Header"/>
     <w:rsid w:val="006F1A78"/>
   </w:style>
-  <w:style w:type="paragraph" w:styleId="TM4">
+  <w:style w:type="paragraph" w:styleId="TOC4">
     <w:name w:val="toc 4"/>
     <w:basedOn w:val="Normal"/>
     <w:next w:val="Normal"/>
@@ -20969,7 +20993,7 @@
       <w:lang w:eastAsia="en-US"/>
     </w:rPr>
   </w:style>
-  <w:style w:type="paragraph" w:styleId="TM1">
+  <w:style w:type="paragraph" w:styleId="TOC1">
     <w:name w:val="toc 1"/>
     <w:basedOn w:val="Normal"/>
     <w:next w:val="Normal"/>
@@ -20988,7 +21012,7 @@
       <w:sz w:val="22"/>
     </w:rPr>
   </w:style>
-  <w:style w:type="paragraph" w:styleId="TM2">
+  <w:style w:type="paragraph" w:styleId="TOC2">
     <w:name w:val="toc 2"/>
     <w:basedOn w:val="Normal"/>
     <w:next w:val="Normal"/>
@@ -21030,7 +21054,7 @@
       <w:bCs/>
     </w:rPr>
   </w:style>
-  <w:style w:type="paragraph" w:styleId="TM3">
+  <w:style w:type="paragraph" w:styleId="TOC3">
     <w:name w:val="toc 3"/>
     <w:basedOn w:val="Normal"/>
     <w:next w:val="Normal"/>
@@ -21047,9 +21071,9 @@
       <w:sz w:val="22"/>
     </w:rPr>
   </w:style>
-  <w:style w:type="character" w:styleId="Lienhypertexte">
+  <w:style w:type="character" w:styleId="Hyperlink">
     <w:name w:val="Hyperlink"/>
-    <w:basedOn w:val="Policepardfaut"/>
+    <w:basedOn w:val="DefaultParagraphFont"/>
     <w:uiPriority w:val="99"/>
     <w:rsid w:val="006F1A78"/>
     <w:rPr>
@@ -21057,7 +21081,7 @@
       <w:u w:val="single"/>
     </w:rPr>
   </w:style>
-  <w:style w:type="paragraph" w:styleId="Lgende">
+  <w:style w:type="paragraph" w:styleId="Caption">
     <w:name w:val="caption"/>
     <w:basedOn w:val="Normal"/>
     <w:next w:val="BITTextkrper"/>
@@ -21105,7 +21129,7 @@
   </w:style>
   <w:style w:type="character" w:customStyle="1" w:styleId="BITTextkrperfettChar">
     <w:name w:val="_BIT_Textkörper_fett Char"/>
-    <w:basedOn w:val="Policepardfaut"/>
+    <w:basedOn w:val="DefaultParagraphFont"/>
     <w:rsid w:val="006F1A78"/>
     <w:rPr>
       <w:rFonts w:ascii="Arial" w:hAnsi="Arial"/>
@@ -21117,7 +21141,7 @@
   </w:style>
   <w:style w:type="character" w:customStyle="1" w:styleId="BITTextkrperkursivChar">
     <w:name w:val="_BIT_Textkörper_kursiv Char"/>
-    <w:basedOn w:val="Policepardfaut"/>
+    <w:basedOn w:val="DefaultParagraphFont"/>
     <w:rsid w:val="006F1A78"/>
     <w:rPr>
       <w:rFonts w:ascii="Arial" w:hAnsi="Arial"/>
@@ -21166,7 +21190,7 @@
       <w:sz w:val="22"/>
     </w:rPr>
   </w:style>
-  <w:style w:type="paragraph" w:styleId="TM5">
+  <w:style w:type="paragraph" w:styleId="TOC5">
     <w:name w:val="toc 5"/>
     <w:basedOn w:val="Normal"/>
     <w:next w:val="Normal"/>
@@ -21177,7 +21201,7 @@
       <w:ind w:left="800"/>
     </w:pPr>
   </w:style>
-  <w:style w:type="paragraph" w:styleId="TM6">
+  <w:style w:type="paragraph" w:styleId="TOC6">
     <w:name w:val="toc 6"/>
     <w:basedOn w:val="Normal"/>
     <w:next w:val="Normal"/>
@@ -21188,7 +21212,7 @@
       <w:ind w:left="1000"/>
     </w:pPr>
   </w:style>
-  <w:style w:type="paragraph" w:styleId="TM7">
+  <w:style w:type="paragraph" w:styleId="TOC7">
     <w:name w:val="toc 7"/>
     <w:basedOn w:val="Normal"/>
     <w:next w:val="Normal"/>
@@ -21199,7 +21223,7 @@
       <w:ind w:left="1200"/>
     </w:pPr>
   </w:style>
-  <w:style w:type="paragraph" w:styleId="TM8">
+  <w:style w:type="paragraph" w:styleId="TOC8">
     <w:name w:val="toc 8"/>
     <w:basedOn w:val="Normal"/>
     <w:next w:val="Normal"/>
@@ -21210,7 +21234,7 @@
       <w:ind w:left="1400"/>
     </w:pPr>
   </w:style>
-  <w:style w:type="paragraph" w:styleId="TM9">
+  <w:style w:type="paragraph" w:styleId="TOC9">
     <w:name w:val="toc 9"/>
     <w:basedOn w:val="Normal"/>
     <w:next w:val="Normal"/>
@@ -21276,7 +21300,7 @@
   </w:style>
   <w:style w:type="character" w:customStyle="1" w:styleId="Hinweistext">
     <w:name w:val="Hinweistext"/>
-    <w:basedOn w:val="Policepardfaut"/>
+    <w:basedOn w:val="DefaultParagraphFont"/>
     <w:rsid w:val="00D344D9"/>
     <w:rPr>
       <w:rFonts w:ascii="Arial" w:hAnsi="Arial" w:cs="Arial"/>
@@ -21308,7 +21332,7 @@
   </w:style>
   <w:style w:type="paragraph" w:customStyle="1" w:styleId="TitelohneNummer">
     <w:name w:val="Titel ohne Nummer"/>
-    <w:basedOn w:val="Titre"/>
+    <w:basedOn w:val="Title"/>
     <w:next w:val="BITTextkrper"/>
     <w:rsid w:val="005479BD"/>
     <w:pPr>
@@ -21359,7 +21383,7 @@
   </w:style>
   <w:style w:type="character" w:customStyle="1" w:styleId="Verzeichnisberschrift2Char">
     <w:name w:val="Verzeichnisüberschrift 2 Char"/>
-    <w:basedOn w:val="Policepardfaut"/>
+    <w:basedOn w:val="DefaultParagraphFont"/>
     <w:link w:val="Verzeichnisberschrift2"/>
     <w:rsid w:val="008E791F"/>
     <w:rPr>
@@ -21370,9 +21394,9 @@
       <w:lang w:val="de-CH" w:eastAsia="de-DE" w:bidi="ar-SA"/>
     </w:rPr>
   </w:style>
-  <w:style w:type="table" w:styleId="Grilledutableau">
+  <w:style w:type="table" w:styleId="TableGrid">
     <w:name w:val="Table Grid"/>
-    <w:basedOn w:val="TableauNormal"/>
+    <w:basedOn w:val="TableNormal"/>
     <w:rsid w:val="00391E8B"/>
     <w:pPr>
       <w:spacing w:before="60" w:after="60"/>
@@ -21388,10 +21412,10 @@
       </w:tblBorders>
     </w:tblPr>
   </w:style>
-  <w:style w:type="paragraph" w:styleId="Textedebulles">
+  <w:style w:type="paragraph" w:styleId="BalloonText">
     <w:name w:val="Balloon Text"/>
     <w:basedOn w:val="Normal"/>
-    <w:link w:val="TextedebullesCar"/>
+    <w:link w:val="BalloonTextChar"/>
     <w:uiPriority w:val="99"/>
     <w:semiHidden/>
     <w:unhideWhenUsed/>
@@ -21405,10 +21429,10 @@
       <w:szCs w:val="16"/>
     </w:rPr>
   </w:style>
-  <w:style w:type="character" w:customStyle="1" w:styleId="TextedebullesCar">
-    <w:name w:val="Texte de bulles Car"/>
-    <w:basedOn w:val="Policepardfaut"/>
-    <w:link w:val="Textedebulles"/>
+  <w:style w:type="character" w:customStyle="1" w:styleId="BalloonTextChar">
+    <w:name w:val="Balloon Text Char"/>
+    <w:basedOn w:val="DefaultParagraphFont"/>
+    <w:link w:val="BalloonText"/>
     <w:uiPriority w:val="99"/>
     <w:semiHidden/>
     <w:rsid w:val="00383EAE"/>
@@ -21439,7 +21463,7 @@
   </w:style>
   <w:style w:type="character" w:customStyle="1" w:styleId="Puce1Car">
     <w:name w:val="Puce 1 Car"/>
-    <w:basedOn w:val="Policepardfaut"/>
+    <w:basedOn w:val="DefaultParagraphFont"/>
     <w:link w:val="Puce1"/>
     <w:rsid w:val="00030FFE"/>
     <w:rPr>
@@ -21449,9 +21473,9 @@
       <w:lang w:val="fr-FR" w:eastAsia="en-US"/>
     </w:rPr>
   </w:style>
-  <w:style w:type="character" w:styleId="Textedelespacerserv">
+  <w:style w:type="character" w:styleId="PlaceholderText">
     <w:name w:val="Placeholder Text"/>
-    <w:basedOn w:val="Policepardfaut"/>
+    <w:basedOn w:val="DefaultParagraphFont"/>
     <w:uiPriority w:val="99"/>
     <w:semiHidden/>
     <w:rsid w:val="00920673"/>
@@ -21459,9 +21483,9 @@
       <w:color w:val="808080"/>
     </w:rPr>
   </w:style>
-  <w:style w:type="character" w:styleId="Marquedecommentaire">
+  <w:style w:type="character" w:styleId="CommentReference">
     <w:name w:val="annotation reference"/>
-    <w:basedOn w:val="Policepardfaut"/>
+    <w:basedOn w:val="DefaultParagraphFont"/>
     <w:uiPriority w:val="99"/>
     <w:semiHidden/>
     <w:unhideWhenUsed/>
@@ -21471,10 +21495,10 @@
       <w:szCs w:val="16"/>
     </w:rPr>
   </w:style>
-  <w:style w:type="paragraph" w:styleId="Commentaire">
+  <w:style w:type="paragraph" w:styleId="CommentText">
     <w:name w:val="annotation text"/>
     <w:basedOn w:val="Normal"/>
-    <w:link w:val="CommentaireCar"/>
+    <w:link w:val="CommentTextChar"/>
     <w:uiPriority w:val="99"/>
     <w:unhideWhenUsed/>
     <w:rsid w:val="00245BBE"/>
@@ -21482,10 +21506,10 @@
       <w:szCs w:val="20"/>
     </w:rPr>
   </w:style>
-  <w:style w:type="character" w:customStyle="1" w:styleId="CommentaireCar">
-    <w:name w:val="Commentaire Car"/>
-    <w:basedOn w:val="Policepardfaut"/>
-    <w:link w:val="Commentaire"/>
+  <w:style w:type="character" w:customStyle="1" w:styleId="CommentTextChar">
+    <w:name w:val="Comment Text Char"/>
+    <w:basedOn w:val="DefaultParagraphFont"/>
+    <w:link w:val="CommentText"/>
     <w:uiPriority w:val="99"/>
     <w:rsid w:val="00245BBE"/>
     <w:rPr>
@@ -21493,11 +21517,11 @@
       <w:lang w:eastAsia="de-DE"/>
     </w:rPr>
   </w:style>
-  <w:style w:type="paragraph" w:styleId="Objetducommentaire">
+  <w:style w:type="paragraph" w:styleId="CommentSubject">
     <w:name w:val="annotation subject"/>
-    <w:basedOn w:val="Commentaire"/>
-    <w:next w:val="Commentaire"/>
-    <w:link w:val="ObjetducommentaireCar"/>
+    <w:basedOn w:val="CommentText"/>
+    <w:next w:val="CommentText"/>
+    <w:link w:val="CommentSubjectChar"/>
     <w:uiPriority w:val="99"/>
     <w:semiHidden/>
     <w:unhideWhenUsed/>
@@ -21507,10 +21531,10 @@
       <w:bCs/>
     </w:rPr>
   </w:style>
-  <w:style w:type="character" w:customStyle="1" w:styleId="ObjetducommentaireCar">
-    <w:name w:val="Objet du commentaire Car"/>
-    <w:basedOn w:val="CommentaireCar"/>
-    <w:link w:val="Objetducommentaire"/>
+  <w:style w:type="character" w:customStyle="1" w:styleId="CommentSubjectChar">
+    <w:name w:val="Comment Subject Char"/>
+    <w:basedOn w:val="CommentTextChar"/>
+    <w:link w:val="CommentSubject"/>
     <w:uiPriority w:val="99"/>
     <w:semiHidden/>
     <w:rsid w:val="00245BBE"/>
@@ -21536,9 +21560,9 @@
       <w:sz w:val="24"/>
     </w:rPr>
   </w:style>
-  <w:style w:type="character" w:styleId="Mentionnonrsolue">
+  <w:style w:type="character" w:styleId="UnresolvedMention">
     <w:name w:val="Unresolved Mention"/>
-    <w:basedOn w:val="Policepardfaut"/>
+    <w:basedOn w:val="DefaultParagraphFont"/>
     <w:uiPriority w:val="99"/>
     <w:semiHidden/>
     <w:unhideWhenUsed/>
@@ -21576,7 +21600,7 @@
           </w:pPr>
           <w:r>
             <w:rPr>
-              <w:rStyle w:val="Textedelespacerserv"/>
+              <w:rStyle w:val="PlaceholderText"/>
             </w:rPr>
             <w:t>[Auteur ]</w:t>
           </w:r>
@@ -21711,9 +21735,11 @@
     <w:rsid w:val="00B250B0"/>
     <w:rsid w:val="00B503AF"/>
     <w:rsid w:val="00B515CE"/>
+    <w:rsid w:val="00BA5CCB"/>
     <w:rsid w:val="00BC344B"/>
     <w:rsid w:val="00BD620C"/>
     <w:rsid w:val="00BE5347"/>
+    <w:rsid w:val="00CC3E92"/>
     <w:rsid w:val="00CD64D8"/>
     <w:rsid w:val="00CE2A4B"/>
     <w:rsid w:val="00D0033D"/>
@@ -21743,7 +21769,7 @@
   </m:mathPr>
   <w:themeFontLang w:val="fr-CH"/>
   <w:clrSchemeMapping w:bg1="light1" w:t1="dark1" w:bg2="light2" w:t2="dark2" w:accent1="accent1" w:accent2="accent2" w:accent3="accent3" w:accent4="accent4" w:accent5="accent5" w:accent6="accent6" w:hyperlink="hyperlink" w:followedHyperlink="followedHyperlink"/>
-  <w:decimalSymbol w:val="."/>
+  <w:decimalSymbol w:val=","/>
   <w:listSeparator w:val=";"/>
   <w15:chartTrackingRefBased/>
 </w:settings>
@@ -22154,13 +22180,13 @@
       <w:szCs w:val="3276"/>
     </w:rPr>
   </w:style>
-  <w:style w:type="character" w:default="1" w:styleId="Policepardfaut">
+  <w:style w:type="character" w:default="1" w:styleId="DefaultParagraphFont">
     <w:name w:val="Default Paragraph Font"/>
     <w:uiPriority w:val="1"/>
     <w:semiHidden/>
     <w:unhideWhenUsed/>
   </w:style>
-  <w:style w:type="table" w:default="1" w:styleId="TableauNormal">
+  <w:style w:type="table" w:default="1" w:styleId="TableNormal">
     <w:name w:val="Normal Table"/>
     <w:uiPriority w:val="99"/>
     <w:semiHidden/>
@@ -22175,15 +22201,15 @@
       </w:tblCellMar>
     </w:tblPr>
   </w:style>
-  <w:style w:type="numbering" w:default="1" w:styleId="Aucuneliste">
+  <w:style w:type="numbering" w:default="1" w:styleId="NoList">
     <w:name w:val="No List"/>
     <w:uiPriority w:val="99"/>
     <w:semiHidden/>
     <w:unhideWhenUsed/>
   </w:style>
-  <w:style w:type="character" w:styleId="Textedelespacerserv">
+  <w:style w:type="character" w:styleId="PlaceholderText">
     <w:name w:val="Placeholder Text"/>
-    <w:basedOn w:val="Policepardfaut"/>
+    <w:basedOn w:val="DefaultParagraphFont"/>
     <w:uiPriority w:val="99"/>
     <w:semiHidden/>
     <w:rsid w:val="00540217"/>

</xml_diff>